<commit_message>
Add WiFi scanning, editable mDNS and recovery AP for Den Deco 1.1.0
</commit_message>
<xml_diff>
--- a/HUONG_DAN.docx
+++ b/HUONG_DAN.docx
@@ -7,7 +7,7 @@
         <w:pStyle w:val="Heading1"/>
       </w:pPr>
       <w:r>
-        <w:t>Hướng dẫn Đèn Deco 1.0.0</w:t>
+        <w:t>Hướng dẫn Đèn Deco 1.1.0</w:t>
       </w:r>
     </w:p>
     <w:p>
@@ -60,7 +60,7 @@
         <w:pStyle w:val="ListBullet"/>
       </w:pPr>
       <w:r>
-        <w:t>Web tiếng Việt nằm trong firmware. WiFi nhà 2,4 GHz và AP dự phòng.</w:t>
+        <w:t>Web tiếng Việt nằm trong firmware. Quét/chọn WiFi nhà 2,4 GHz, AP dự phòng không mật khẩu và địa chỉ mặc định http://den-deco.local chỉnh được.</w:t>
       </w:r>
     </w:p>
     <w:p>
@@ -701,7 +701,7 @@
     </w:p>
     <w:p>
       <w:r>
-        <w:t>TTP223 phải cho OUT cao khi chạm và thấp khi thả. Nếu module đang toggle/latch, đổi pad theo chính module đó. Tránh dùng GPIO 2/8/9 cho các nút vì liên quan khởi động; giữ 18/19 cho USB. GPIO 4/5 ở đây dùng GPIO, không đồng thời dùng JTAG ngoài.</w:t>
+        <w:t>TTP223 phải cho OUT cao khi chạm và thấp khi thả. Nếu module đang toggle/latch, đổi pad theo chính module đó. Bốn đầu vào trong firmware dùng INPUT_PULLDOWN: chân chưa đấu cảm ứng được kéo về mức thấp để không tự phát lệnh. Sau khi đấu TTP223 vẫn cần kiểm tra OUT và thử chạm/giữ qua vỏ thực tế; kéo xuống không thay cho hiệu chỉnh độ nhạy cảm ứng. Tránh dùng GPIO 2/8/9 cho các nút vì liên quan khởi động; giữ 18/19 cho USB. GPIO 4/5 ở đây dùng GPIO, không đồng thời dùng JTAG ngoài.</w:t>
       </w:r>
     </w:p>
     <w:p>
@@ -714,12 +714,12 @@
     </w:p>
     <w:p>
       <w:r>
-        <w:t>1. Giải nén cả gói; giữ DenDeco.ino, Config.h, Core.h, Storage.h, WebUI.h trong cùng thư mục DenDeco.</w:t>
+        <w:t>1. Giải nén cả gói; giữ DenDeco.ino, Config.h, Core.h, NetworkPolicy.h, Storage.h, WebUI.h trong cùng thư mục DenDeco.</w:t>
       </w:r>
     </w:p>
     <w:p>
       <w:r>
-        <w:t>2. Trong Boards Manager, cài esp32 by Espressif Systems, chọn phiên bản 2.0.17. Nếu IDE chưa có nguồn package, thêm URL sau vào Preferences → Additional Boards Manager URLs:</w:t>
+        <w:t>2. Trong Boards Manager, giữ/cài esp32 by Espressif Systems 3.3.1 như bộ IDE bạn đang dùng. Nếu IDE chưa có nguồn package, thêm URL sau vào Preferences → Additional Boards Manager URLs:</w:t>
       </w:r>
     </w:p>
     <w:p>
@@ -736,7 +736,7 @@
     </w:p>
     <w:p>
       <w:r>
-        <w:t>3. Trong Library Manager, cài Adafruit NeoPixel 1.12.5 và ArduinoJson 7.4.2. WiFi, WebServer, Preferences, ESPmDNS và Update đi kèm core ESP32.</w:t>
+        <w:t>3. Trong Library Manager, giữ/cài Adafruit NeoPixel 1.15.5 và ArduinoJson 7.4.3. WiFi, WebServer, Preferences, ESPmDNS và Update đi kèm core ESP32.</w:t>
       </w:r>
     </w:p>
     <w:p>
@@ -1141,7 +1141,7 @@
     </w:p>
     <w:p>
       <w:r>
-        <w:t>Các kiểm tra biên dịch trong gói dùng PlatformIO và cùng phiên bản core/thư viện trên. Chưa kiểm chứng trực tiếp thao tác Upload trong Arduino IDE trên bo của bạn. Nếu bo có dung lượng flash khác 4 MB, không dùng sẵn file OTA 4 MB; chỉnh cấu hình và biên dịch lại cho bo thực tế.</w:t>
+        <w:t>Mã nguồn đã biên dịch với Arduino CLI, core 3.3.1 và các phiên bản thư viện trên; file OTA 1.1.0 trong gói dùng bộ này. Profile PlatformIO trong repo cũng đã build với core 2.0.17, NeoPixel 1.12.5 và ArduinoJson 7.4.2. Bạn có thể giữ bộ 3.3.1 hiện tại, không cần đổi về 2.0.17. Chưa kiểm chứng trực tiếp thao tác Upload trên bo của bạn. Nếu bo có dung lượng flash khác 4 MB, chỉnh cấu hình và biên dịch lại cho bo thực tế.</w:t>
       </w:r>
     </w:p>
     <w:p>
@@ -1154,48 +1154,7 @@
     </w:p>
     <w:p>
       <w:r>
-        <w:t>Khi chưa có WiFi, ESP mở AP tên DenDeco-XXXXXX. Mật khẩu AP ngẫu nhiên riêng, 12 ký tự, được lưu trên đèn và in trong Serial Monitor khi AP mở:</w:t>
-      </w:r>
-    </w:p>
-    <w:p>
-      <w:pPr>
-        <w:spacing w:after="0"/>
-      </w:pPr>
-      <w:r>
-        <w:rPr>
-          <w:rFonts w:ascii="Consolas" w:hAnsi="Consolas"/>
-          <w:sz w:val="16"/>
-        </w:rPr>
-        <w:t>AP: DenDeco-XXXXXX</w:t>
-      </w:r>
-    </w:p>
-    <w:p>
-      <w:pPr>
-        <w:spacing w:after="0"/>
-      </w:pPr>
-      <w:r>
-        <w:rPr>
-          <w:rFonts w:ascii="Consolas" w:hAnsi="Consolas"/>
-          <w:sz w:val="16"/>
-        </w:rPr>
-        <w:t>AP password: &lt;mật khẩu riêng được đèn tạo&gt;</w:t>
-      </w:r>
-    </w:p>
-    <w:p>
-      <w:pPr>
-        <w:spacing w:after="0"/>
-      </w:pPr>
-      <w:r>
-        <w:rPr>
-          <w:rFonts w:ascii="Consolas" w:hAnsi="Consolas"/>
-          <w:sz w:val="16"/>
-        </w:rPr>
-        <w:t>Open http://192.168.4.1</w:t>
-      </w:r>
-    </w:p>
-    <w:p>
-      <w:r>
-        <w:t>Ghi lại mật khẩu để dùng khi AP dự phòng mở. Firmware không dùng mật khẩu chung cho mọi đèn. Nếu cửa sổ Serial mở quá muộn, mở sẵn rồi bấm RESET để xem lại dòng AP.</w:t>
+        <w:t>Khi chưa có WiFi đã lưu, ESP mở AP tên DenDeco-XXXXXX, không có mật khẩu. XXXXXX là mã riêng của từng bo. Nối trực tiếp AP rồi mở http://192.168.4.1; không cần lấy mật khẩu AP từ Serial Monitor.</w:t>
       </w:r>
     </w:p>
     <w:p>
@@ -1210,27 +1169,42 @@
     </w:p>
     <w:p>
       <w:r>
-        <w:t>3. Mở Cài đặt &amp; kết nối, nhập WiFi nhà 2,4 GHz và mật khẩu rồi bấm Lưu &amp; kết nối. Mật khẩu đã lưu không được gửi lại cho trình duyệt.</w:t>
+        <w:t>3. Mở Cài đặt &amp; kết nối → Quét WiFi xung quanh. Đợi kết quả rồi chọn mạng để điền tên WiFi. ESP32-C3 chỉ quét và kết nối 2,4 GHz; với mạng ẩn, nhập đúng SSID thủ công. Trang báo đang quét, danh sách tìm thấy hoặc lỗi để thử lại. Quét chạy bất đồng bộ; hiệu ứng và cảm ứng tiếp tục hoạt động, nhưng thời gian phản hồi qua mạng cần kiểm chứng trên bo thật.</w:t>
       </w:r>
     </w:p>
     <w:p>
       <w:r>
-        <w:t>4. Sau khoảng 1–2 giây, đèn thử kết nối. Nếu vẫn ở AP, bạn có thể xem IP WiFi trong trang. Trên WiFi nhà, mở IP đó hoặc http://den-deco-xxxxxx.local nếu Windows/điện thoại hỗ trợ mDNS.</w:t>
+        <w:t>4. Nhập mật khẩu WiFi nhà rồi bấm Lưu &amp; kết nối. Để trống mật khẩu với cùng SSID sẽ giữ mật khẩu đang lưu; chỉ chọn Mạng không có mật khẩu nếu mạng nhà là mạng mở. Mật khẩu đã lưu không được gửi lại cho trình duyệt.</w:t>
       </w:r>
     </w:p>
     <w:p>
       <w:r>
-        <w:t>5. Khi không kết nối được sau 30 giây, AP dự phòng mở. Cảm ứng và hiệu ứng vẫn hoạt động trong quá trình thử kết nối.</w:t>
+        <w:t>5. Theo dõi trạng thái kết nối trên trang. Ngay khi đèn kết nối WiFi nhà và nhận IP từ DHCP, AP tự tắt, nên trang đang mở qua AP sẽ mất kết nối. Chuyển điện thoại/PC về WiFi nhà và mở http://den-deco.local, hoặc địa chỉ đã chỉnh trước đó.</w:t>
       </w:r>
     </w:p>
     <w:p>
       <w:r>
-        <w:t>AP đã mở sẽ được giữ đến lần khởi động lại để tránh ngắt phiên cấu hình. Khi khởi động lại và WiFi nhà kết nối bình thường trong 30 giây, AP không mở. Có thể xem IP trong Serial Monitor hoặc danh sách DHCP của router. IP phụ thuộc router; đặt DHCP reservation theo MAC nếu muốn ổn định.</w:t>
+        <w:t>6. Nếu kết nối thất bại sau 30 giây, AP dự phòng mở để sửa mạng/mật khẩu. Nếu router mất kết nối, đèn thử nối lại và mở AP sau 30 giây chưa khôi phục; khi nhận IP WiFi nhà trở lại, AP tự tắt ngay. Điều khiển cảm ứng vẫn dùng được trong lúc đèn thử kết nối.</w:t>
       </w:r>
     </w:p>
     <w:p>
       <w:r>
-        <w:t>Đổi tên đèn chỉ đổi nhãn hiển thị; AP và hostname dùng mã thiết bị để nhiều bộ Đèn Deco không trùng tên mạng. Để trống mật khẩu khi nhập cùng SSID sẽ giữ mật khẩu đang lưu; chọn Mạng không có mật khẩu khi dùng mạng mở.</w:t>
+        <w:t>AP chỉ mở khi chưa cấu hình WiFi nhà, khi không kết nối được trong 30 giây hoặc khi bạn xóa/reset WiFi để cấu hình lại. AP không bật thường trực khi WiFi nhà hoạt động. Có thể xóa mạng từ web bằng Xóa WiFi đã lưu, hoặc giữ đúng + và − đồng thời 5 giây như mục 5.</w:t>
+      </w:r>
+    </w:p>
+    <w:p>
+      <w:r>
+        <w:t>Tên đèn là nhãn hiển thị. Tên truy cập trong WiFi nhà quyết định địa chỉ .local: mặc định den-deco cho http://den-deco.local. Có thể đổi thành den-phong-ngu, den-ban… bằng nút Lưu tên &amp; địa chỉ. Dùng 1–48 ký tự chữ thường a–z, số hoặc dấu gạch ngang; không bắt đầu/kết thúc bằng gạch ngang, không có khoảng trắng và không nhập .local. Sau khi đổi, dùng địa chỉ hiển thị trong Địa chỉ trong WiFi nhà. AP vẫn dùng mã bo DenDeco-XXXXXX.</w:t>
+      </w:r>
+    </w:p>
+    <w:p>
+      <w:r>
+        <w:t>Với nhiều đèn trên cùng mạng, đặt tên truy cập khác nhau cho từng đèn. Khi mDNS phát hiện trùng tên, firmware tự thêm mã bo sáu ký tự viết thường vào địa chỉ đang dùng, ví dụ http://den-deco-a1b2c3.local; nếu vẫn trùng, thêm tiếp -2, -3… Đèn giữ nguyên tên truy cập bạn đã lưu và chỉ thay tên thực tế của phiên kết nối, nên địa chỉ sau khi kết nối lại có thể thay đổi. Dùng địa chỉ trong Địa chỉ trong WiFi nhà hoặc Serial Monitor, không suy ra địa chỉ từ ô tên đã lưu. Cơ chế trùng tên còn cần thử với nhiều đèn thật; địa chỉ IP là cách truy cập dự phòng.</w:t>
+      </w:r>
+    </w:p>
+    <w:p>
+      <w:r>
+        <w:t>Địa chỉ .local dùng mDNS và chỉ có hiệu lực trong mạng nội bộ có hỗ trợ; điện thoại/PC phải ở cùng mạng với đèn. Mạng khách có cách ly thiết bị, router chặn multicast hoặc máy chưa hỗ trợ mDNS có thể không mở được địa chỉ này. Khi đó xem IP trong Serial Monitor 115200 baud hoặc danh sách DHCP của router rồi mở http://&lt;IP-của-đèn&gt;. IP phụ thuộc router; có thể đặt DHCP reservation theo MAC nếu muốn giữ IP ổn định.</w:t>
       </w:r>
     </w:p>
     <w:p>
@@ -1524,12 +1498,17 @@
     <w:p/>
     <w:p>
       <w:r>
-        <w:t>Giữ rồi thả không phát thêm chạm ngắn. Nhiều nút cùng lúc sẽ hủy phần thao tác tiếp theo và chờ thả hết; lệnh giữ đã thực hiện trước đó không thể thu hồi. Sau cấp nguồn, firmware bỏ qua cảm ứng ít nhất 1 giây và chờ tất cả nút được thả.</w:t>
+        <w:t>Giữ rồi thả không phát thêm chạm ngắn. Ngoại lệ cho hai nút + và −: giữ đúng hai nút này đồng thời liên tục 5 giây để reset WiFi nhà. Thao tác chỉ xóa SSID/mật khẩu WiFi nhà và mở AP không mật khẩu; giữ trạng thái ánh sáng, mục yêu thích, tên đèn và tên truy cập. Thả trước 5 giây hoặc chạm thêm Nguồn/M sẽ hủy thao tác reset. Sau reset cần thả hết các nút mới nhận thao tác tiếp theo.</w:t>
       </w:r>
     </w:p>
     <w:p>
       <w:r>
-        <w:t>Khi tắt, +/−/M được bỏ qua. Giữ Nguồn vẫn bật chế độ ngủ. Nút tăng/giảm dừng ở 1 và 100, không tự tắt.</w:t>
+        <w:t>Các tổ hợp nhiều nút khác sẽ hủy phần thao tác tiếp theo và chờ thả hết; lệnh giữ đã thực hiện trước đó không thể thu hồi. Sau cấp nguồn, firmware bỏ qua cảm ứng ít nhất 1 giây và chờ tất cả nút được thả. Vì vậy không dùng việc giữ +/− sẵn lúc cấp nguồn để reset mạng; đợi hết giai đoạn khởi động, thả hết rồi giữ lại.</w:t>
+      </w:r>
+    </w:p>
+    <w:p>
+      <w:r>
+        <w:t>Khi tắt, các thao tác riêng +/−/M được bỏ qua; tổ hợp +/− giữ 5 giây vẫn reset được WiFi. Giữ Nguồn vẫn bật chế độ ngủ. Nút tăng/giảm dừng ở 1 và 100, không tự tắt.</w:t>
       </w:r>
     </w:p>
     <w:p>
@@ -1628,7 +1607,7 @@
     </w:p>
     <w:p>
       <w:r>
-        <w:t>Lưu: bật/tắt, RGB, chế độ, độ sáng, tốc độ, mức ngủ riêng, trần đầu ra và ba mục yêu thích. Tên đèn, mạng và mật khẩu AP lưu riêng khi bấm áp dụng. Không lưu pha hiệu ứng, khung hình hoặc thời gian hẹn giờ còn lại.</w:t>
+        <w:t>Lưu: bật/tắt, RGB, chế độ, độ sáng, tốc độ, mức ngủ riêng, trần đầu ra và ba mục yêu thích. Tên đèn, tên truy cập, SSID và mật khẩu WiFi nhà lưu riêng khi bấm áp dụng. AP không có mật khẩu. Reset WiFi chỉ xóa SSID/mật khẩu mạng nhà; giữ cấu hình ánh sáng và tên. Không lưu pha hiệu ứng, khung hình hoặc thời gian hẹn giờ còn lại.</w:t>
       </w:r>
     </w:p>
     <w:p>
@@ -1661,7 +1640,7 @@
     </w:p>
     <w:p>
       <w:r>
-        <w:t>2. Tìm file ứng dụng DenDeco.ino.bin hoặc tên tương đương do IDE xuất. Không chọn .bootloader.bin, .partitions.bin, .merged.bin hoặc file dùng cho ESP32/S2/S3 khác. Gói bàn giao cũng có firmware/DenDeco-1.0.0-ota.bin.</w:t>
+        <w:t>2. Tìm file ứng dụng DenDeco.ino.bin hoặc tên tương đương do IDE xuất. Không chọn .bootloader.bin, .partitions.bin, .merged.bin hoặc file dùng cho ESP32/S2/S3 khác. Gói bàn giao cũng có firmware/DenDeco-1.1.0-ota.bin.</w:t>
       </w:r>
     </w:p>
     <w:p>
@@ -1686,7 +1665,7 @@
     </w:p>
     <w:p>
       <w:r>
-        <w:t>7. Đèn khôi phục trạng thái đã lưu và WiFi. Hẹn giờ không tiếp tục sau khởi động, giống quy tắc mất điện.</w:t>
+        <w:t>7. Đèn khôi phục trạng thái đã lưu, tên/tên truy cập và WiFi. Hẹn giờ không tiếp tục sau khởi động, giống quy tắc mất điện. Nếu đang OTA qua AP và đã lưu WiFi nhà hợp lệ, sau reboot đèn nối mạng nhà rồi tắt AP; chuyển điện thoại/PC về mạng nhà và mở địa chỉ .local hoặc IP.</w:t>
       </w:r>
     </w:p>
     <w:p>
@@ -1724,7 +1703,7 @@
     </w:p>
     <w:p>
       <w:r>
-        <w:t>4. Thử từng nút, chạm 20 lần, giữ và chạm đồng thời qua vỏ.</w:t>
+        <w:t>4. Thử từng nút, chạm 20 lần, giữ và chạm đồng thời qua vỏ. Kiểm tra thêm giữ đúng +/− 5 giây reset WiFi và giữ ngắn hơn/chạm nút thứ ba không reset. Khi chưa đấu cảm ứng, các chân bỏ trống phải không tự phát lệnh.</w:t>
       </w:r>
     </w:p>
     <w:p>
@@ -1734,7 +1713,7 @@
     </w:p>
     <w:p>
       <w:r>
-        <w:t>6. Nhập sai WiFi để kiểm tra AP dự phòng; dùng AP cập nhật lại thông tin.</w:t>
+        <w:t>6. Quét/chọn mạng, thử mật khẩu sai để kiểm tra AP dự phòng; dùng AP cập nhật lại thông tin. Khi nhập đúng và nhận IP, xác nhận AP tắt ngay. Thử tắt/bật router để kiểm tra mở AP sau 30 giây và tự tắt khi mạng khôi phục. Thử địa chỉ .local, IP và tên riêng nếu dùng nhiều đèn.</w:t>
       </w:r>
     </w:p>
     <w:p>
@@ -1749,12 +1728,12 @@
     </w:p>
     <w:p>
       <w:r>
-        <w:t>Không thấy AP: đợi 30 giây nếu đã lưu mạng; nếu WiFi nhà đang kết nối, xem IP router/Serial. Không hiện mật khẩu AP: mở Serial Monitor trước rồi bấm RESET. Đèn chạm tự bật: kiểm tra module direct active high, dây và vùng cảm ứng/vỏ. OTA báo file sai: chọn đúng ứng dụng .ino.bin, không dùng bootloader/merged.</w:t>
+        <w:t>Không thấy AP: đợi 30 giây nếu đã lưu mạng; nếu WiFi nhà đang kết nối, AP đã tắt đúng thiết kế. Muốn cấu hình lại từ cảm ứng, giữ đúng +/− 5 giây sau khi đã khởi động và thả hết nút. AP không yêu cầu mật khẩu. Trang AP mất kết nối ngay sau Lưu &amp; kết nối: chuyển sang WiFi nhà và mở .local hoặc IP. Không mở được .local: kiểm tra cùng mạng, tên truy cập và dùng IP từ router/Serial. Không thấy mạng khi quét: xác nhận mạng 2,4 GHz, thử lại hoặc nhập SSID thủ công. Đèn chạm tự bật: kiểm tra module direct active high, dây và vùng cảm ứng/vỏ. OTA báo file sai: chọn đúng ứng dụng .ino.bin, không dùng bootloader/merged.</w:t>
       </w:r>
     </w:p>
     <w:p>
       <w:r>
-        <w:t>Bộ bàn giao đã kiểm tra biên dịch, logic và giao diện bằng mô phỏng. Các kiểm tra điện, độ nhạy, nhiệt, truyền dữ liệu và OTA thật cần thực hiện trên thiết bị của bạn; xem KIEM_THU.md để ghi kết quả.</w:t>
+        <w:t>Thông tin biên dịch và kiểm tra logic/giao diện bằng mô phỏng được ghi trong BUILD_INFO.md và KIEM_THU.md. Các kiểm tra điện, độ nhạy/chạm qua vỏ, WiFi/mDNS, truyền dữ liệu và OTA trên phần cứng đều đang chờ thực hiện trên bộ đèn của bạn; xem KIEM_THU.md để ghi kết quả.</w:t>
       </w:r>
     </w:p>
     <w:p>
@@ -1767,7 +1746,7 @@
         <w:pStyle w:val="Heading1"/>
       </w:pPr>
       <w:r>
-        <w:t>Cấu hình và kế hoạch Đèn Deco</w:t>
+        <w:t>Cấu hình và kế hoạch Đèn Deco 1.1.0</w:t>
       </w:r>
     </w:p>
     <w:p>
@@ -1781,6 +1760,21 @@
     <w:p>
       <w:r>
         <w:t>Phạm vi: firmware, web trên ESP và hướng dẫn đấu nối/nạp. Người dùng tự xử lý cơ khí/vỏ. ESP32-C3 SuperMini, bốn TTP223, 20 WS2812B và nguồn 5 V–2 A. Tên Đèn Deco; WiFi nhà + AP dự phòng. Máy nạp Windows, Arduino IDE. Bổ sung OTA qua web theo yêu cầu mới.</w:t>
+      </w:r>
+    </w:p>
+    <w:p>
+      <w:r>
+        <w:t>Bản 1.1.0 bổ sung quét/chọn WiFi 2,4 GHz bất đồng bộ và trạng thái kết nối trên web. Địa chỉ mặc định http://den-deco.local; tên truy cập chỉnh được riêng với nhãn tên đèn. Với nhiều đèn, đặt tên truy cập khác nhau và dùng địa chỉ thực tế hiển thị trên trang. Khi phát hiện trùng tên mDNS, tên thực tế được thêm mã bo sáu ký tự viết thường rồi -2, -3… nếu còn trùng; tên người dùng đã lưu không bị đổi. Kiểm tra định kỳ theo trạng thái mDNS SDK, nhưng thử trùng tên trên phần cứng còn chờ. Địa chỉ .local phụ thuộc mDNS trong mạng nội bộ; IP DHCP là cách truy cập dự phòng.</w:t>
+      </w:r>
+    </w:p>
+    <w:p>
+      <w:r>
+        <w:t>AP DenDeco-XXXXXX không có mật khẩu, chỉ mở khi chưa lưu WiFi, chưa kết nối được trong 30 giây hoặc xóa/reset WiFi để cấu hình lại. WiFi nhà kết nối thành công và nhận IP từ DHCP sẽ tắt AP ngay, kể cả phiên cấu hình đang dùng AP. Khi router mất kết nối, đèn thử nối lại, mở AP sau 30 giây chưa khôi phục và tắt AP khi nhận IP trở lại.</w:t>
+      </w:r>
+    </w:p>
+    <w:p>
+      <w:r>
+        <w:t>Giữ đúng hai nút + và − đồng thời liên tục 5 giây chỉ xóa SSID/mật khẩu WiFi nhà; giữ cấu hình ánh sáng, ba mục yêu thích, tên đèn và tên truy cập. Thả sớm hoặc thêm nút khác hủy reset. Bốn đầu vào cảm ứng dùng INPUT_PULLDOWN để chân chưa đấu không tự sinh lệnh; chạm/giữ và độ nhạy qua vỏ vẫn cần thử trên phần cứng.</w:t>
       </w:r>
     </w:p>
     <w:p>
@@ -2058,7 +2052,7 @@
                 <w:b w:val="0"/>
                 <w:sz w:val="18"/>
               </w:rPr>
-              <w:t>Web nhúng, polling 250 ms, AP dự phòng và cài đặt mạng</w:t>
+              <w:t>Web nhúng, polling 250 ms; quét 2,4 GHz, trạng thái mạng, hostname và AP dự phòng</w:t>
             </w:r>
           </w:p>
         </w:tc>
@@ -2075,7 +2069,60 @@
                 <w:b w:val="0"/>
                 <w:sz w:val="18"/>
               </w:rPr>
-              <w:t>Hoàn tất; giao diện đã kiểm tra với API mô phỏng</w:t>
+              <w:t>Bản 1.1.0 cập nhật; kết quả kiểm tra ghi ở KIEM_THU.md</w:t>
+            </w:r>
+          </w:p>
+        </w:tc>
+      </w:tr>
+      <w:tr>
+        <w:tc>
+          <w:tcPr>
+            <w:tcW w:type="dxa" w:w="3213"/>
+          </w:tcPr>
+          <w:p>
+            <w:pPr>
+              <w:spacing w:after="60"/>
+            </w:pPr>
+            <w:r>
+              <w:rPr>
+                <w:b w:val="0"/>
+                <w:sz w:val="18"/>
+              </w:rPr>
+              <w:t>Reset WiFi từ cảm ứng</w:t>
+            </w:r>
+          </w:p>
+        </w:tc>
+        <w:tc>
+          <w:tcPr>
+            <w:tcW w:type="dxa" w:w="3213"/>
+          </w:tcPr>
+          <w:p>
+            <w:pPr>
+              <w:spacing w:after="60"/>
+            </w:pPr>
+            <w:r>
+              <w:rPr>
+                <w:b w:val="0"/>
+                <w:sz w:val="18"/>
+              </w:rPr>
+              <w:t>Giữ đúng +/− 5 giây, giữ cấu hình đèn và tên</w:t>
+            </w:r>
+          </w:p>
+        </w:tc>
+        <w:tc>
+          <w:tcPr>
+            <w:tcW w:type="dxa" w:w="3213"/>
+          </w:tcPr>
+          <w:p>
+            <w:pPr>
+              <w:spacing w:after="60"/>
+            </w:pPr>
+            <w:r>
+              <w:rPr>
+                <w:b w:val="0"/>
+                <w:sz w:val="18"/>
+              </w:rPr>
+              <w:t>Bản 1.1.0 cập nhật; thao tác vật lý qua vỏ chưa thử</w:t>
             </w:r>
           </w:p>
         </w:tc>
@@ -2164,7 +2211,7 @@
                 <w:b w:val="0"/>
                 <w:sz w:val="18"/>
               </w:rPr>
-              <w:t>Sketch, .bin OTA, hướng dẫn và checklist</w:t>
+              <w:t>Sketch, .bin OTA 1.1.0, hướng dẫn và checklist</w:t>
             </w:r>
           </w:p>
         </w:tc>
@@ -2181,7 +2228,7 @@
                 <w:b w:val="0"/>
                 <w:sz w:val="18"/>
               </w:rPr>
-              <w:t>Hoàn tất</w:t>
+              <w:t>Thông tin gói/build ghi ở BUILD_INFO.md</w:t>
             </w:r>
           </w:p>
         </w:tc>
@@ -2217,7 +2264,7 @@
                 <w:b w:val="0"/>
                 <w:sz w:val="18"/>
               </w:rPr>
-              <w:t>LED, TTP223, độ sáng, nguồn, nhiệt, AP và OTA</w:t>
+              <w:t>LED, TTP223 qua vỏ, độ sáng, nguồn, nhiệt, quét/WiFi/mDNS, AP và OTA</w:t>
             </w:r>
           </w:p>
         </w:tc>
@@ -2234,7 +2281,7 @@
                 <w:b w:val="0"/>
                 <w:sz w:val="18"/>
               </w:rPr>
-              <w:t>Người dùng thực hiện trên bộ lắp thật</w:t>
+              <w:t>Chưa thử; người dùng thực hiện trên bộ lắp thật</w:t>
             </w:r>
           </w:p>
         </w:tc>
@@ -2290,6 +2337,30 @@
       </w:r>
     </w:p>
     <w:p>
+      <w:pPr>
+        <w:pStyle w:val="ListBullet"/>
+      </w:pPr>
+      <w:r>
+        <w:t>Quét/chọn WiFi trên 2,4 GHz; AP tắt ngay khi nhận IP và mở lại sau 30 giây mất kết nối.</w:t>
+      </w:r>
+    </w:p>
+    <w:p>
+      <w:pPr>
+        <w:pStyle w:val="ListBullet"/>
+      </w:pPr>
+      <w:r>
+        <w:t>.local trên PC/điện thoại cùng mạng; các tên riêng khi dùng nhiều đèn và phương án IP nếu mDNS bị chặn.</w:t>
+      </w:r>
+    </w:p>
+    <w:p>
+      <w:pPr>
+        <w:pStyle w:val="ListBullet"/>
+      </w:pPr>
+      <w:r>
+        <w:t>Reset đúng +/− 5 giây qua vỏ, không nhận nhầm nút và giữ nguyên cấu hình/tên sau reset.</w:t>
+      </w:r>
+    </w:p>
+    <w:p>
       <w:r>
         <w:t>Cấu hình SSID/mật khẩu trực tiếp tại thiết bị. Toàn bộ dự án và gói tải được đưa lên repo GitHub NguyenPhat-NT/den_trang_tri theo yêu cầu của chủ dự án. Web điều khiển nằm trên ESP; không xuất bản website điều khiển ra ngoài. Chưa nạp thiết bị từ cloud.</w:t>
       </w:r>
@@ -2309,7 +2380,7 @@
     </w:p>
     <w:p>
       <w:r>
-        <w:t>Không có tác vụ chờ kết nối WiFi trong vòng lặp. WebServer xử lý request tuần tự; HTTP chậm hoặc upload OTA có thể tạm chiếm vòng lặp. Mục tiêu phản hồi và đồng bộ trong tài liệu cần đo trên mạng/bo thật; kiểm tra trình duyệt mô phỏng không chứng minh các mốc 100/500 ms của thiết bị.</w:t>
+        <w:t>Không có tác vụ chờ kết nối WiFi hoặc đợi quét WiFi trong vòng lặp. Web yêu cầu quét rồi đọc kết quả/trạng thái bằng API; phần STA/AP theo dõi kết nối và IP được cấp. WebServer xử lý request tuần tự; HTTP chậm hoặc upload OTA có thể tạm chiếm vòng lặp. Mục tiêu phản hồi và đồng bộ trong tài liệu cần đo trên mạng/bo thật; kiểm tra trình duyệt mô phỏng không chứng minh các mốc 100/500 ms của thiết bị.</w:t>
       </w:r>
     </w:p>
     <w:p>
@@ -2322,7 +2393,7 @@
         <w:pStyle w:val="Heading1"/>
       </w:pPr>
       <w:r>
-        <w:t>Kiểm thử và nghiệm thu</w:t>
+        <w:t>Kiểm thử và nghiệm thu Đèn Deco 1.1.0</w:t>
       </w:r>
     </w:p>
     <w:p>
@@ -2331,6 +2402,11 @@
       </w:pPr>
       <w:r>
         <w:t>Đã thực hiện trên phần mềm</w:t>
+      </w:r>
+    </w:p>
+    <w:p>
+      <w:r>
+        <w:t>Các kiểm tra dưới đây đã chạy lại thành công cho mã nguồn 1.1.0. Thông tin build ghi trong BUILD_INFO.md. Các thử nghiệm trên ESP và router vẫn đang chờ; build và web mock không thay cho thử phần cứng.</w:t>
       </w:r>
     </w:p>
     <w:p>
@@ -2347,6 +2423,14 @@
       </w:pPr>
       <w:r>
         <w:t>Build thực tế ESP32-C3: PlatformIO espressif32 6.12.0, Arduino ESP32 2.0.17, NeoPixel 1.12.5, ArduinoJson 7.4.2; USB CDC bật và phân vùng OTA 4 MB.</w:t>
+      </w:r>
+    </w:p>
+    <w:p>
+      <w:pPr>
+        <w:pStyle w:val="ListBullet"/>
+      </w:pPr>
+      <w:r>
+        <w:t>Build thêm bằng Arduino CLI với đúng ESP32 3.3.1, NeoPixel 1.15.5 và ArduinoJson 7.4.3 người dùng đang có; SUCCESS. File OTA 1.1.0 dùng bộ phiên bản này.</w:t>
       </w:r>
     </w:p>
     <w:p>
@@ -2392,6 +2476,62 @@
     <w:p>
       <w:r>
         <w:t>Các kiểm tra trên không thay cho flash/nạp USB, truyền OTA vào ESP, đo phản hồi mạng hoặc đo điện của thiết bị thật. Web mock kiểm tra giao diện và request, không mô phỏng stack WiFi, flash hoặc điện.</w:t>
+      </w:r>
+    </w:p>
+    <w:p>
+      <w:pPr>
+        <w:pStyle w:val="Heading2"/>
+      </w:pPr>
+      <w:r>
+        <w:t>Kiểm tra bổ sung bản 1.1.0</w:t>
+      </w:r>
+    </w:p>
+    <w:p>
+      <w:pPr>
+        <w:pStyle w:val="ListBullet"/>
+      </w:pPr>
+      <w:r>
+        <w:t>PASS kiểm tra lõi: giữ đúng +/− 5 giây, chỉ phát reset một lần, không phát thêm chạm +/− khi thả; thả sớm/chạm nút thứ ba hủy; chờ thả hết sau boot/reset; thời gian giữ qua tràn millis.</w:t>
+      </w:r>
+    </w:p>
+    <w:p>
+      <w:pPr>
+        <w:pStyle w:val="ListBullet"/>
+      </w:pPr>
+      <w:r>
+        <w:t>PASS kiểm tra chính sách mạng: chờ IP, thời hạn 30 giây, AP dự phòng, chu kỳ thử lại, hoãn thử lại khi đang quét, khôi phục và tràn millis; kiểm tra định dạng hostname.</w:t>
+      </w:r>
+    </w:p>
+    <w:p>
+      <w:pPr>
+        <w:pStyle w:val="ListBullet"/>
+      </w:pPr>
+      <w:r>
+        <w:t>PASS kiểm tra lưu/migration mạng bằng Preferences mô phỏng: schema 1 giữ tên/SSID/mật khẩu, schema 2 lưu hostname và bỏ mật khẩu AP; CRC, mạng mở, từ chối hostname sai và bảo vệ schema tương lai.</w:t>
+      </w:r>
+    </w:p>
+    <w:p>
+      <w:pPr>
+        <w:pStyle w:val="ListBullet"/>
+      </w:pPr>
+      <w:r>
+        <w:t>PASS web mock: quét/đọc kết quả bất đồng bộ, chọn SSID/bảo mật, lỗi/mất kết nối, giữ ô đang nhập khi polling và khi phản hồi lưu đến muộn, lưu hostname và sao chép trên HTTP, retry cùng SSID, không phát lại lệnh.</w:t>
+      </w:r>
+    </w:p>
+    <w:p>
+      <w:pPr>
+        <w:pStyle w:val="ListBullet"/>
+      </w:pPr>
+      <w:r>
+        <w:t>Firmware thực: quét 2,4 GHz, lấy IP DHCP, AP tắt ngay khi STA nhận IP, mở AP sau 30 giây thất bại/mất mạng rồi tắt khi khôi phục. Những mục này cần ESP và router thật; mock không xác nhận được.</w:t>
+      </w:r>
+    </w:p>
+    <w:p>
+      <w:pPr>
+        <w:pStyle w:val="ListBullet"/>
+      </w:pPr>
+      <w:r>
+        <w:t>mDNS trong LAN và nhiều đèn cùng mạng: địa chỉ mặc định, tên tự đặt, truy cập IP dự phòng và xử lý trùng tên theo địa chỉ thực tế firmware trả về. Tên trùng phải thêm mã bo sáu ký tự viết thường, rồi -2, -3… nếu còn trùng, đồng thời giữ nguyên tên người dùng đã lưu.</w:t>
       </w:r>
     </w:p>
     <w:p>
@@ -2663,7 +2803,7 @@
                 <w:b w:val="0"/>
                 <w:sz w:val="18"/>
               </w:rPr>
-              <w:t>Mỗi nút 20 chạm qua vỏ</w:t>
+              <w:t>Mỗi nút 20 chạm qua vỏ đã lắp</w:t>
             </w:r>
           </w:p>
         </w:tc>
@@ -2680,7 +2820,7 @@
                 <w:b w:val="0"/>
                 <w:sz w:val="18"/>
               </w:rPr>
-              <w:t>Một chạm/một lệnh, không chạm giả nút cạnh</w:t>
+              <w:t>Một chạm/một lệnh, không chạm giả nút cạnh; phải thử vật lý, không thay bằng mock</w:t>
             </w:r>
           </w:p>
         </w:tc>
@@ -3310,7 +3450,7 @@
                 <w:b w:val="0"/>
                 <w:sz w:val="18"/>
               </w:rPr>
-              <w:t>AP mở sau 30 giây, đèn vẫn điều khiển cảm ứng được</w:t>
+              <w:t>AP không mật khẩu mở sau 30 giây, đèn vẫn điều khiển cảm ứng được</w:t>
             </w:r>
           </w:p>
         </w:tc>
@@ -3626,6 +3766,776 @@
                 <w:b w:val="0"/>
                 <w:sz w:val="18"/>
               </w:rPr>
+              <w:t>N01</w:t>
+            </w:r>
+          </w:p>
+        </w:tc>
+        <w:tc>
+          <w:tcPr>
+            <w:tcW w:type="dxa" w:w="2409"/>
+          </w:tcPr>
+          <w:p>
+            <w:pPr>
+              <w:spacing w:after="60"/>
+            </w:pPr>
+            <w:r>
+              <w:rPr>
+                <w:b w:val="0"/>
+                <w:sz w:val="18"/>
+              </w:rPr>
+              <w:t>Chưa nối bốn module cảm ứng</w:t>
+            </w:r>
+          </w:p>
+        </w:tc>
+        <w:tc>
+          <w:tcPr>
+            <w:tcW w:type="dxa" w:w="2409"/>
+          </w:tcPr>
+          <w:p>
+            <w:pPr>
+              <w:spacing w:after="60"/>
+            </w:pPr>
+            <w:r>
+              <w:rPr>
+                <w:b w:val="0"/>
+                <w:sz w:val="18"/>
+              </w:rPr>
+              <w:t>Chân INPUT_PULLDOWN không tự sinh lệnh sau boot</w:t>
+            </w:r>
+          </w:p>
+        </w:tc>
+        <w:tc>
+          <w:tcPr>
+            <w:tcW w:type="dxa" w:w="2409"/>
+          </w:tcPr>
+          <w:p>
+            <w:pPr>
+              <w:spacing w:after="60"/>
+            </w:pPr>
+            <w:r>
+              <w:rPr>
+                <w:b w:val="0"/>
+                <w:sz w:val="18"/>
+              </w:rPr>
+              <w:t>Chưa thử</w:t>
+            </w:r>
+          </w:p>
+        </w:tc>
+      </w:tr>
+      <w:tr>
+        <w:tc>
+          <w:tcPr>
+            <w:tcW w:type="dxa" w:w="2409"/>
+          </w:tcPr>
+          <w:p>
+            <w:pPr>
+              <w:spacing w:after="60"/>
+            </w:pPr>
+            <w:r>
+              <w:rPr>
+                <w:b w:val="0"/>
+                <w:sz w:val="18"/>
+              </w:rPr>
+              <w:t>N02</w:t>
+            </w:r>
+          </w:p>
+        </w:tc>
+        <w:tc>
+          <w:tcPr>
+            <w:tcW w:type="dxa" w:w="2409"/>
+          </w:tcPr>
+          <w:p>
+            <w:pPr>
+              <w:spacing w:after="60"/>
+            </w:pPr>
+            <w:r>
+              <w:rPr>
+                <w:b w:val="0"/>
+                <w:sz w:val="18"/>
+              </w:rPr>
+              <w:t>Lần đầu hoặc xóa WiFi</w:t>
+            </w:r>
+          </w:p>
+        </w:tc>
+        <w:tc>
+          <w:tcPr>
+            <w:tcW w:type="dxa" w:w="2409"/>
+          </w:tcPr>
+          <w:p>
+            <w:pPr>
+              <w:spacing w:after="60"/>
+            </w:pPr>
+            <w:r>
+              <w:rPr>
+                <w:b w:val="0"/>
+                <w:sz w:val="18"/>
+              </w:rPr>
+              <w:t>AP DenDeco-XXXXXX mở không mật khẩu; web http://192.168.4.1 dùng được</w:t>
+            </w:r>
+          </w:p>
+        </w:tc>
+        <w:tc>
+          <w:tcPr>
+            <w:tcW w:type="dxa" w:w="2409"/>
+          </w:tcPr>
+          <w:p>
+            <w:pPr>
+              <w:spacing w:after="60"/>
+            </w:pPr>
+            <w:r>
+              <w:rPr>
+                <w:b w:val="0"/>
+                <w:sz w:val="18"/>
+              </w:rPr>
+              <w:t>Chưa thử</w:t>
+            </w:r>
+          </w:p>
+        </w:tc>
+      </w:tr>
+      <w:tr>
+        <w:tc>
+          <w:tcPr>
+            <w:tcW w:type="dxa" w:w="2409"/>
+          </w:tcPr>
+          <w:p>
+            <w:pPr>
+              <w:spacing w:after="60"/>
+            </w:pPr>
+            <w:r>
+              <w:rPr>
+                <w:b w:val="0"/>
+                <w:sz w:val="18"/>
+              </w:rPr>
+              <w:t>N03</w:t>
+            </w:r>
+          </w:p>
+        </w:tc>
+        <w:tc>
+          <w:tcPr>
+            <w:tcW w:type="dxa" w:w="2409"/>
+          </w:tcPr>
+          <w:p>
+            <w:pPr>
+              <w:spacing w:after="60"/>
+            </w:pPr>
+            <w:r>
+              <w:rPr>
+                <w:b w:val="0"/>
+                <w:sz w:val="18"/>
+              </w:rPr>
+              <w:t>Quét/chọn mạng 2,4 GHz</w:t>
+            </w:r>
+          </w:p>
+        </w:tc>
+        <w:tc>
+          <w:tcPr>
+            <w:tcW w:type="dxa" w:w="2409"/>
+          </w:tcPr>
+          <w:p>
+            <w:pPr>
+              <w:spacing w:after="60"/>
+            </w:pPr>
+            <w:r>
+              <w:rPr>
+                <w:b w:val="0"/>
+                <w:sz w:val="18"/>
+              </w:rPr>
+              <w:t>Hiển thị đang quét/kết quả/lỗi; chọn điền SSID; cảm ứng và hiệu ứng tiếp tục</w:t>
+            </w:r>
+          </w:p>
+        </w:tc>
+        <w:tc>
+          <w:tcPr>
+            <w:tcW w:type="dxa" w:w="2409"/>
+          </w:tcPr>
+          <w:p>
+            <w:pPr>
+              <w:spacing w:after="60"/>
+            </w:pPr>
+            <w:r>
+              <w:rPr>
+                <w:b w:val="0"/>
+                <w:sz w:val="18"/>
+              </w:rPr>
+              <w:t>Chưa thử</w:t>
+            </w:r>
+          </w:p>
+        </w:tc>
+      </w:tr>
+      <w:tr>
+        <w:tc>
+          <w:tcPr>
+            <w:tcW w:type="dxa" w:w="2409"/>
+          </w:tcPr>
+          <w:p>
+            <w:pPr>
+              <w:spacing w:after="60"/>
+            </w:pPr>
+            <w:r>
+              <w:rPr>
+                <w:b w:val="0"/>
+                <w:sz w:val="18"/>
+              </w:rPr>
+              <w:t>N04</w:t>
+            </w:r>
+          </w:p>
+        </w:tc>
+        <w:tc>
+          <w:tcPr>
+            <w:tcW w:type="dxa" w:w="2409"/>
+          </w:tcPr>
+          <w:p>
+            <w:pPr>
+              <w:spacing w:after="60"/>
+            </w:pPr>
+            <w:r>
+              <w:rPr>
+                <w:b w:val="0"/>
+                <w:sz w:val="18"/>
+              </w:rPr>
+              <w:t>Mạng ẩn, mạng mở, mật khẩu sai</w:t>
+            </w:r>
+          </w:p>
+        </w:tc>
+        <w:tc>
+          <w:tcPr>
+            <w:tcW w:type="dxa" w:w="2409"/>
+          </w:tcPr>
+          <w:p>
+            <w:pPr>
+              <w:spacing w:after="60"/>
+            </w:pPr>
+            <w:r>
+              <w:rPr>
+                <w:b w:val="0"/>
+                <w:sz w:val="18"/>
+              </w:rPr>
+              <w:t>Nhập SSID thủ công; mạng mở không mật khẩu; sai mật khẩu có trạng thái và AP dự phòng</w:t>
+            </w:r>
+          </w:p>
+        </w:tc>
+        <w:tc>
+          <w:tcPr>
+            <w:tcW w:type="dxa" w:w="2409"/>
+          </w:tcPr>
+          <w:p>
+            <w:pPr>
+              <w:spacing w:after="60"/>
+            </w:pPr>
+            <w:r>
+              <w:rPr>
+                <w:b w:val="0"/>
+                <w:sz w:val="18"/>
+              </w:rPr>
+              <w:t>Chưa thử</w:t>
+            </w:r>
+          </w:p>
+        </w:tc>
+      </w:tr>
+      <w:tr>
+        <w:tc>
+          <w:tcPr>
+            <w:tcW w:type="dxa" w:w="2409"/>
+          </w:tcPr>
+          <w:p>
+            <w:pPr>
+              <w:spacing w:after="60"/>
+            </w:pPr>
+            <w:r>
+              <w:rPr>
+                <w:b w:val="0"/>
+                <w:sz w:val="18"/>
+              </w:rPr>
+              <w:t>N05</w:t>
+            </w:r>
+          </w:p>
+        </w:tc>
+        <w:tc>
+          <w:tcPr>
+            <w:tcW w:type="dxa" w:w="2409"/>
+          </w:tcPr>
+          <w:p>
+            <w:pPr>
+              <w:spacing w:after="60"/>
+            </w:pPr>
+            <w:r>
+              <w:rPr>
+                <w:b w:val="0"/>
+                <w:sz w:val="18"/>
+              </w:rPr>
+              <w:t>Lưu WiFi đúng khi đang dùng AP</w:t>
+            </w:r>
+          </w:p>
+        </w:tc>
+        <w:tc>
+          <w:tcPr>
+            <w:tcW w:type="dxa" w:w="2409"/>
+          </w:tcPr>
+          <w:p>
+            <w:pPr>
+              <w:spacing w:after="60"/>
+            </w:pPr>
+            <w:r>
+              <w:rPr>
+                <w:b w:val="0"/>
+                <w:sz w:val="18"/>
+              </w:rPr>
+              <w:t>Khi nhận IP DHCP, AP tắt ngay; chuyển về WiFi nhà mở được web</w:t>
+            </w:r>
+          </w:p>
+        </w:tc>
+        <w:tc>
+          <w:tcPr>
+            <w:tcW w:type="dxa" w:w="2409"/>
+          </w:tcPr>
+          <w:p>
+            <w:pPr>
+              <w:spacing w:after="60"/>
+            </w:pPr>
+            <w:r>
+              <w:rPr>
+                <w:b w:val="0"/>
+                <w:sz w:val="18"/>
+              </w:rPr>
+              <w:t>Chưa thử</w:t>
+            </w:r>
+          </w:p>
+        </w:tc>
+      </w:tr>
+      <w:tr>
+        <w:tc>
+          <w:tcPr>
+            <w:tcW w:type="dxa" w:w="2409"/>
+          </w:tcPr>
+          <w:p>
+            <w:pPr>
+              <w:spacing w:after="60"/>
+            </w:pPr>
+            <w:r>
+              <w:rPr>
+                <w:b w:val="0"/>
+                <w:sz w:val="18"/>
+              </w:rPr>
+              <w:t>N06</w:t>
+            </w:r>
+          </w:p>
+        </w:tc>
+        <w:tc>
+          <w:tcPr>
+            <w:tcW w:type="dxa" w:w="2409"/>
+          </w:tcPr>
+          <w:p>
+            <w:pPr>
+              <w:spacing w:after="60"/>
+            </w:pPr>
+            <w:r>
+              <w:rPr>
+                <w:b w:val="0"/>
+                <w:sz w:val="18"/>
+              </w:rPr>
+              <w:t>Router tắt rồi bật lại</w:t>
+            </w:r>
+          </w:p>
+        </w:tc>
+        <w:tc>
+          <w:tcPr>
+            <w:tcW w:type="dxa" w:w="2409"/>
+          </w:tcPr>
+          <w:p>
+            <w:pPr>
+              <w:spacing w:after="60"/>
+            </w:pPr>
+            <w:r>
+              <w:rPr>
+                <w:b w:val="0"/>
+                <w:sz w:val="18"/>
+              </w:rPr>
+              <w:t>AP mở sau 30 giây mất mạng; tự nối lại và AP tắt khi nhận IP, không cần reboot</w:t>
+            </w:r>
+          </w:p>
+        </w:tc>
+        <w:tc>
+          <w:tcPr>
+            <w:tcW w:type="dxa" w:w="2409"/>
+          </w:tcPr>
+          <w:p>
+            <w:pPr>
+              <w:spacing w:after="60"/>
+            </w:pPr>
+            <w:r>
+              <w:rPr>
+                <w:b w:val="0"/>
+                <w:sz w:val="18"/>
+              </w:rPr>
+              <w:t>Chưa thử</w:t>
+            </w:r>
+          </w:p>
+        </w:tc>
+      </w:tr>
+      <w:tr>
+        <w:tc>
+          <w:tcPr>
+            <w:tcW w:type="dxa" w:w="2409"/>
+          </w:tcPr>
+          <w:p>
+            <w:pPr>
+              <w:spacing w:after="60"/>
+            </w:pPr>
+            <w:r>
+              <w:rPr>
+                <w:b w:val="0"/>
+                <w:sz w:val="18"/>
+              </w:rPr>
+              <w:t>N07</w:t>
+            </w:r>
+          </w:p>
+        </w:tc>
+        <w:tc>
+          <w:tcPr>
+            <w:tcW w:type="dxa" w:w="2409"/>
+          </w:tcPr>
+          <w:p>
+            <w:pPr>
+              <w:spacing w:after="60"/>
+            </w:pPr>
+            <w:r>
+              <w:rPr>
+                <w:b w:val="0"/>
+                <w:sz w:val="18"/>
+              </w:rPr>
+              <w:t>http://den-deco.local và đổi hostname</w:t>
+            </w:r>
+          </w:p>
+        </w:tc>
+        <w:tc>
+          <w:tcPr>
+            <w:tcW w:type="dxa" w:w="2409"/>
+          </w:tcPr>
+          <w:p>
+            <w:pPr>
+              <w:spacing w:after="60"/>
+            </w:pPr>
+            <w:r>
+              <w:rPr>
+                <w:b w:val="0"/>
+                <w:sz w:val="18"/>
+              </w:rPr>
+              <w:t>Cùng LAN mở được tên hỗ trợ mDNS; địa chỉ mới đúng; IP dự phòng truy cập được</w:t>
+            </w:r>
+          </w:p>
+        </w:tc>
+        <w:tc>
+          <w:tcPr>
+            <w:tcW w:type="dxa" w:w="2409"/>
+          </w:tcPr>
+          <w:p>
+            <w:pPr>
+              <w:spacing w:after="60"/>
+            </w:pPr>
+            <w:r>
+              <w:rPr>
+                <w:b w:val="0"/>
+                <w:sz w:val="18"/>
+              </w:rPr>
+              <w:t>Chưa thử</w:t>
+            </w:r>
+          </w:p>
+        </w:tc>
+      </w:tr>
+      <w:tr>
+        <w:tc>
+          <w:tcPr>
+            <w:tcW w:type="dxa" w:w="2409"/>
+          </w:tcPr>
+          <w:p>
+            <w:pPr>
+              <w:spacing w:after="60"/>
+            </w:pPr>
+            <w:r>
+              <w:rPr>
+                <w:b w:val="0"/>
+                <w:sz w:val="18"/>
+              </w:rPr>
+              <w:t>N08</w:t>
+            </w:r>
+          </w:p>
+        </w:tc>
+        <w:tc>
+          <w:tcPr>
+            <w:tcW w:type="dxa" w:w="2409"/>
+          </w:tcPr>
+          <w:p>
+            <w:pPr>
+              <w:spacing w:after="60"/>
+            </w:pPr>
+            <w:r>
+              <w:rPr>
+                <w:b w:val="0"/>
+                <w:sz w:val="18"/>
+              </w:rPr>
+              <w:t>Hai đèn trên cùng LAN</w:t>
+            </w:r>
+          </w:p>
+        </w:tc>
+        <w:tc>
+          <w:tcPr>
+            <w:tcW w:type="dxa" w:w="2409"/>
+          </w:tcPr>
+          <w:p>
+            <w:pPr>
+              <w:spacing w:after="60"/>
+            </w:pPr>
+            <w:r>
+              <w:rPr>
+                <w:b w:val="0"/>
+                <w:sz w:val="18"/>
+              </w:rPr>
+              <w:t>Đặt hostname riêng; địa chỉ thực tế mở đúng từng đèn, kiểm tra cả trường hợp trùng tên</w:t>
+            </w:r>
+          </w:p>
+        </w:tc>
+        <w:tc>
+          <w:tcPr>
+            <w:tcW w:type="dxa" w:w="2409"/>
+          </w:tcPr>
+          <w:p>
+            <w:pPr>
+              <w:spacing w:after="60"/>
+            </w:pPr>
+            <w:r>
+              <w:rPr>
+                <w:b w:val="0"/>
+                <w:sz w:val="18"/>
+              </w:rPr>
+              <w:t>Chưa thử</w:t>
+            </w:r>
+          </w:p>
+        </w:tc>
+      </w:tr>
+      <w:tr>
+        <w:tc>
+          <w:tcPr>
+            <w:tcW w:type="dxa" w:w="2409"/>
+          </w:tcPr>
+          <w:p>
+            <w:pPr>
+              <w:spacing w:after="60"/>
+            </w:pPr>
+            <w:r>
+              <w:rPr>
+                <w:b w:val="0"/>
+                <w:sz w:val="18"/>
+              </w:rPr>
+              <w:t>N09</w:t>
+            </w:r>
+          </w:p>
+        </w:tc>
+        <w:tc>
+          <w:tcPr>
+            <w:tcW w:type="dxa" w:w="2409"/>
+          </w:tcPr>
+          <w:p>
+            <w:pPr>
+              <w:spacing w:after="60"/>
+            </w:pPr>
+            <w:r>
+              <w:rPr>
+                <w:b w:val="0"/>
+                <w:sz w:val="18"/>
+              </w:rPr>
+              <w:t>Giữ đúng +/− 5 giây qua vỏ</w:t>
+            </w:r>
+          </w:p>
+        </w:tc>
+        <w:tc>
+          <w:tcPr>
+            <w:tcW w:type="dxa" w:w="2409"/>
+          </w:tcPr>
+          <w:p>
+            <w:pPr>
+              <w:spacing w:after="60"/>
+            </w:pPr>
+            <w:r>
+              <w:rPr>
+                <w:b w:val="0"/>
+                <w:sz w:val="18"/>
+              </w:rPr>
+              <w:t>Xóa chỉ WiFi nhà, mở AP; LED, favorites, tên đèn/hostname giữ nguyên; chỉ reset một lần</w:t>
+            </w:r>
+          </w:p>
+        </w:tc>
+        <w:tc>
+          <w:tcPr>
+            <w:tcW w:type="dxa" w:w="2409"/>
+          </w:tcPr>
+          <w:p>
+            <w:pPr>
+              <w:spacing w:after="60"/>
+            </w:pPr>
+            <w:r>
+              <w:rPr>
+                <w:b w:val="0"/>
+                <w:sz w:val="18"/>
+              </w:rPr>
+              <w:t>Chưa thử</w:t>
+            </w:r>
+          </w:p>
+        </w:tc>
+      </w:tr>
+      <w:tr>
+        <w:tc>
+          <w:tcPr>
+            <w:tcW w:type="dxa" w:w="2409"/>
+          </w:tcPr>
+          <w:p>
+            <w:pPr>
+              <w:spacing w:after="60"/>
+            </w:pPr>
+            <w:r>
+              <w:rPr>
+                <w:b w:val="0"/>
+                <w:sz w:val="18"/>
+              </w:rPr>
+              <w:t>N10</w:t>
+            </w:r>
+          </w:p>
+        </w:tc>
+        <w:tc>
+          <w:tcPr>
+            <w:tcW w:type="dxa" w:w="2409"/>
+          </w:tcPr>
+          <w:p>
+            <w:pPr>
+              <w:spacing w:after="60"/>
+            </w:pPr>
+            <w:r>
+              <w:rPr>
+                <w:b w:val="0"/>
+                <w:sz w:val="18"/>
+              </w:rPr>
+              <w:t>Giữ +/− dưới 5 giây, thêm Nguồn/M, giữ lúc boot</w:t>
+            </w:r>
+          </w:p>
+        </w:tc>
+        <w:tc>
+          <w:tcPr>
+            <w:tcW w:type="dxa" w:w="2409"/>
+          </w:tcPr>
+          <w:p>
+            <w:pPr>
+              <w:spacing w:after="60"/>
+            </w:pPr>
+            <w:r>
+              <w:rPr>
+                <w:b w:val="0"/>
+                <w:sz w:val="18"/>
+              </w:rPr>
+              <w:t>Không reset nhầm; thả hết rồi thao tác lại bình thường</w:t>
+            </w:r>
+          </w:p>
+        </w:tc>
+        <w:tc>
+          <w:tcPr>
+            <w:tcW w:type="dxa" w:w="2409"/>
+          </w:tcPr>
+          <w:p>
+            <w:pPr>
+              <w:spacing w:after="60"/>
+            </w:pPr>
+            <w:r>
+              <w:rPr>
+                <w:b w:val="0"/>
+                <w:sz w:val="18"/>
+              </w:rPr>
+              <w:t>Chưa thử</w:t>
+            </w:r>
+          </w:p>
+        </w:tc>
+      </w:tr>
+      <w:tr>
+        <w:tc>
+          <w:tcPr>
+            <w:tcW w:type="dxa" w:w="2409"/>
+          </w:tcPr>
+          <w:p>
+            <w:pPr>
+              <w:spacing w:after="60"/>
+            </w:pPr>
+            <w:r>
+              <w:rPr>
+                <w:b w:val="0"/>
+                <w:sz w:val="18"/>
+              </w:rPr>
+              <w:t>N11</w:t>
+            </w:r>
+          </w:p>
+        </w:tc>
+        <w:tc>
+          <w:tcPr>
+            <w:tcW w:type="dxa" w:w="2409"/>
+          </w:tcPr>
+          <w:p>
+            <w:pPr>
+              <w:spacing w:after="60"/>
+            </w:pPr>
+            <w:r>
+              <w:rPr>
+                <w:b w:val="0"/>
+                <w:sz w:val="18"/>
+              </w:rPr>
+              <w:t>Hai đèn cùng hostname; tạo thêm trùng tên với hậu tố</w:t>
+            </w:r>
+          </w:p>
+        </w:tc>
+        <w:tc>
+          <w:tcPr>
+            <w:tcW w:type="dxa" w:w="2409"/>
+          </w:tcPr>
+          <w:p>
+            <w:pPr>
+              <w:spacing w:after="60"/>
+            </w:pPr>
+            <w:r>
+              <w:rPr>
+                <w:b w:val="0"/>
+                <w:sz w:val="18"/>
+              </w:rPr>
+              <w:t>Tên thực tế thêm mã bo viết thường rồi số khi cần; web/Serial báo đúng; tên đã lưu giữ nguyên, mở đúng từng đèn</w:t>
+            </w:r>
+          </w:p>
+        </w:tc>
+        <w:tc>
+          <w:tcPr>
+            <w:tcW w:type="dxa" w:w="2409"/>
+          </w:tcPr>
+          <w:p>
+            <w:pPr>
+              <w:spacing w:after="60"/>
+            </w:pPr>
+            <w:r>
+              <w:rPr>
+                <w:b w:val="0"/>
+                <w:sz w:val="18"/>
+              </w:rPr>
+              <w:t>Chưa thử</w:t>
+            </w:r>
+          </w:p>
+        </w:tc>
+      </w:tr>
+      <w:tr>
+        <w:tc>
+          <w:tcPr>
+            <w:tcW w:type="dxa" w:w="2409"/>
+          </w:tcPr>
+          <w:p>
+            <w:pPr>
+              <w:spacing w:after="60"/>
+            </w:pPr>
+            <w:r>
+              <w:rPr>
+                <w:b w:val="0"/>
+                <w:sz w:val="18"/>
+              </w:rPr>
               <w:t>O01</w:t>
             </w:r>
           </w:p>
@@ -3730,7 +4640,7 @@
                 <w:b w:val="0"/>
                 <w:sz w:val="18"/>
               </w:rPr>
-              <w:t>Thành công như WiFi nhà</w:t>
+              <w:t>Thành công; sau reboot AP/STA đúng cấu hình; nếu nhận IP WiFi nhà, AP tắt</w:t>
             </w:r>
           </w:p>
         </w:tc>
@@ -4092,6 +5002,30 @@
           <w:rFonts w:ascii="Consolas" w:hAnsi="Consolas"/>
           <w:sz w:val="16"/>
         </w:rPr>
+        <w:t>c++ -std=c++11 -Wall -Wextra -Werror -fsanitize=address,undefined tests/network_test.cpp -o network-test</w:t>
+      </w:r>
+    </w:p>
+    <w:p>
+      <w:pPr>
+        <w:spacing w:after="0"/>
+      </w:pPr>
+      <w:r>
+        <w:rPr>
+          <w:rFonts w:ascii="Consolas" w:hAnsi="Consolas"/>
+          <w:sz w:val="16"/>
+        </w:rPr>
+        <w:t>./network-test</w:t>
+      </w:r>
+    </w:p>
+    <w:p>
+      <w:pPr>
+        <w:spacing w:after="0"/>
+      </w:pPr>
+      <w:r>
+        <w:rPr>
+          <w:rFonts w:ascii="Consolas" w:hAnsi="Consolas"/>
+          <w:sz w:val="16"/>
+        </w:rPr>
         <w:t>c++ -std=c++11 -Wall -Wextra -fsanitize=address,undefined -Itests/stubs -I.pio/libdeps/esp32c3/ArduinoJson/src tests/storage_test.cpp -o storage-test</w:t>
       </w:r>
     </w:p>
@@ -4122,6 +5056,11 @@
     <w:p>
       <w:r>
         <w:t>Kiểm tra web cần package Playwright và Chromium. Đặt biến DECO_BROWSER bằng đường dẫn executable nếu Chromium không ở /usr/bin/chromium. Ảnh chụp web từ mock chỉ minh họa UI, không là bằng chứng thiết bị đã chạy.</w:t>
+      </w:r>
+    </w:p>
+    <w:p>
+      <w:r>
+        <w:t>Tất cả các dòng thử trên thiết bị hiện là Chưa thử, đặc biệt cảm ứng/reset WiFi sau khi đã lắp vỏ. Chỉ ghi Đạt khi có kết quả đo/thử trên bộ đèn thật.</w:t>
       </w:r>
     </w:p>
     <w:sectPr>
@@ -4158,7 +5097,7 @@
       <w:pStyle w:val="Caption"/>
     </w:pPr>
     <w:r>
-      <w:t>ĐÈN DECO  |  ESP32-C3  |  FIRMWARE 1.0.0</w:t>
+      <w:t>ĐÈN DECO  |  ESP32-C3  |  FIRMWARE 1.1.0</w:t>
     </w:r>
   </w:p>
 </w:hdr>

</xml_diff>

<commit_message>
Add eight lighting effects and in-web user guide for Den Deco 1.2.0
</commit_message>
<xml_diff>
--- a/HUONG_DAN.docx
+++ b/HUONG_DAN.docx
@@ -7,12 +7,12 @@
         <w:pStyle w:val="Heading1"/>
       </w:pPr>
       <w:r>
-        <w:t>Hướng dẫn Đèn Deco 1.1.0</w:t>
+        <w:t>Hướng dẫn Đèn Deco 1.2.0</w:t>
       </w:r>
     </w:p>
     <w:p>
       <w:r>
-        <w:t>Ngày bàn giao: 10/10/2026. Dành cho Windows và Arduino IDE.</w:t>
+        <w:t>Ngày bàn giao: 12/10/2026. Dành cho Windows và Arduino IDE.</w:t>
       </w:r>
     </w:p>
     <w:p>
@@ -69,6 +69,14 @@
       </w:pPr>
       <w:r>
         <w:t>Hẹn giờ, ba mục yêu thích, lưu trạng thái và cập nhật OTA qua trình duyệt.</w:t>
+      </w:r>
+    </w:p>
+    <w:p>
+      <w:pPr>
+        <w:pStyle w:val="ListBullet"/>
+      </w:pPr>
+      <w:r>
+        <w:t>14 chế độ: sáu chế độ cũ cùng tám hiệu ứng mới; mục Hướng dẫn sử dụng nằm ngay trên web.</w:t>
       </w:r>
     </w:p>
     <w:p>
@@ -1141,7 +1149,7 @@
     </w:p>
     <w:p>
       <w:r>
-        <w:t>Mã nguồn đã biên dịch với Arduino CLI, core 3.3.1 và các phiên bản thư viện trên; file OTA 1.1.0 trong gói dùng bộ này. Profile PlatformIO trong repo cũng đã build với core 2.0.17, NeoPixel 1.12.5 và ArduinoJson 7.4.2. Bạn có thể giữ bộ 3.3.1 hiện tại, không cần đổi về 2.0.17. Chưa kiểm chứng trực tiếp thao tác Upload trên bo của bạn. Nếu bo có dung lượng flash khác 4 MB, chỉnh cấu hình và biên dịch lại cho bo thực tế.</w:t>
+        <w:t>Bộ core/thư viện người dùng đang có là ESP32 3.3.1, NeoPixel 1.15.5 và ArduinoJson 7.4.3; giữ bộ này để biên dịch. Thông tin build và file OTA 1.2.0 ghi trong BUILD_INFO.md. Profile PlatformIO 2.0.17 là phương án build bổ sung; không cần đổi bộ Arduino IDE hiện tại về phiên bản đó. Người dùng đã lắp và dùng các bản trước; bản 1.2.0 mới chưa được thử trên bo. Nếu bo có dung lượng flash khác 4 MB, chỉnh cấu hình và biên dịch lại cho bo thực tế.</w:t>
       </w:r>
     </w:p>
     <w:p>
@@ -1513,7 +1521,12 @@
     </w:p>
     <w:p>
       <w:r>
-        <w:t>Thứ tự M: Ngủ → Một màu → Chuyển màu chậm → Ánh nến → Cầu vồng chậm → Ánh sáng dâng lên → Ngủ.</w:t>
+        <w:t>Thứ tự M: Ngủ → Một màu → Chuyển màu chậm → Ánh nến → Cầu vồng chậm → Ánh sáng dâng lên → Thở nhẹ → Lấp lánh → Cực quang → Biển xanh → Rừng xanh → Hoàng hôn → Sao băng → Sóng màu → Ngủ. Chạm M đi qua cả 14 chế độ; web cho chọn trực tiếp.</w:t>
+      </w:r>
+    </w:p>
+    <w:p>
+      <w:r>
+        <w:t>Sáu mã chế độ cũ 0–5 được giữ nguyên; tám chế độ mới nối tiếp ở 6–13 để nâng cấp không đổi ý nghĩa cấu hình/mục yêu thích đã lưu.</w:t>
       </w:r>
     </w:p>
     <w:p>
@@ -1535,6 +1548,1083 @@
       </w:r>
     </w:p>
     <w:p>
+      <w:r>
+        <w:t>Trang có mục Hướng dẫn sử dụng ngay trên web để xem nhanh cách chạm/giữ, chọn chế độ và màu, chỉnh tốc độ, lưu mục yêu thích, hẹn giờ, kết nối và OTA.</w:t>
+      </w:r>
+    </w:p>
+    <w:tbl>
+      <w:tblPr>
+        <w:tblStyle w:val="LightShading-Accent1"/>
+        <w:tblW w:type="auto" w:w="0"/>
+        <w:tblLook w:firstColumn="1" w:firstRow="1" w:lastColumn="0" w:lastRow="0" w:noHBand="0" w:noVBand="1" w:val="04A0"/>
+      </w:tblPr>
+      <w:tblGrid>
+        <w:gridCol w:w="2409"/>
+        <w:gridCol w:w="2409"/>
+        <w:gridCol w:w="2409"/>
+        <w:gridCol w:w="2409"/>
+      </w:tblGrid>
+      <w:tr>
+        <w:trPr>
+          <w:tblHeader/>
+        </w:trPr>
+        <w:tc>
+          <w:tcPr>
+            <w:tcW w:type="dxa" w:w="2409"/>
+          </w:tcPr>
+          <w:p>
+            <w:pPr>
+              <w:spacing w:after="60"/>
+            </w:pPr>
+            <w:r>
+              <w:rPr>
+                <w:b/>
+                <w:sz w:val="18"/>
+              </w:rPr>
+              <w:t>Mã</w:t>
+            </w:r>
+          </w:p>
+        </w:tc>
+        <w:tc>
+          <w:tcPr>
+            <w:tcW w:type="dxa" w:w="2409"/>
+          </w:tcPr>
+          <w:p>
+            <w:pPr>
+              <w:spacing w:after="60"/>
+            </w:pPr>
+            <w:r>
+              <w:rPr>
+                <w:b/>
+                <w:sz w:val="18"/>
+              </w:rPr>
+              <w:t>Chế độ</w:t>
+            </w:r>
+          </w:p>
+        </w:tc>
+        <w:tc>
+          <w:tcPr>
+            <w:tcW w:type="dxa" w:w="2409"/>
+          </w:tcPr>
+          <w:p>
+            <w:pPr>
+              <w:spacing w:after="60"/>
+            </w:pPr>
+            <w:r>
+              <w:rPr>
+                <w:b/>
+                <w:sz w:val="18"/>
+              </w:rPr>
+              <w:t>Chỉnh tốc độ 1–100</w:t>
+            </w:r>
+          </w:p>
+        </w:tc>
+        <w:tc>
+          <w:tcPr>
+            <w:tcW w:type="dxa" w:w="2409"/>
+          </w:tcPr>
+          <w:p>
+            <w:pPr>
+              <w:spacing w:after="60"/>
+            </w:pPr>
+            <w:r>
+              <w:rPr>
+                <w:b/>
+                <w:sz w:val="18"/>
+              </w:rPr>
+              <w:t>Khi chọn màu RGB</w:t>
+            </w:r>
+          </w:p>
+        </w:tc>
+      </w:tr>
+      <w:tr>
+        <w:tc>
+          <w:tcPr>
+            <w:tcW w:type="dxa" w:w="2409"/>
+          </w:tcPr>
+          <w:p>
+            <w:pPr>
+              <w:spacing w:after="60"/>
+            </w:pPr>
+            <w:r>
+              <w:rPr>
+                <w:b w:val="0"/>
+                <w:sz w:val="18"/>
+              </w:rPr>
+              <w:t>0</w:t>
+            </w:r>
+          </w:p>
+        </w:tc>
+        <w:tc>
+          <w:tcPr>
+            <w:tcW w:type="dxa" w:w="2409"/>
+          </w:tcPr>
+          <w:p>
+            <w:pPr>
+              <w:spacing w:after="60"/>
+            </w:pPr>
+            <w:r>
+              <w:rPr>
+                <w:b w:val="0"/>
+                <w:sz w:val="18"/>
+              </w:rPr>
+              <w:t>Ngủ</w:t>
+            </w:r>
+          </w:p>
+        </w:tc>
+        <w:tc>
+          <w:tcPr>
+            <w:tcW w:type="dxa" w:w="2409"/>
+          </w:tcPr>
+          <w:p>
+            <w:pPr>
+              <w:spacing w:after="60"/>
+            </w:pPr>
+            <w:r>
+              <w:rPr>
+                <w:b w:val="0"/>
+                <w:sz w:val="18"/>
+              </w:rPr>
+              <w:t>Không</w:t>
+            </w:r>
+          </w:p>
+        </w:tc>
+        <w:tc>
+          <w:tcPr>
+            <w:tcW w:type="dxa" w:w="2409"/>
+          </w:tcPr>
+          <w:p>
+            <w:pPr>
+              <w:spacing w:after="60"/>
+            </w:pPr>
+            <w:r>
+              <w:rPr>
+                <w:b w:val="0"/>
+                <w:sz w:val="18"/>
+              </w:rPr>
+              <w:t>Chuyển sang Một màu</w:t>
+            </w:r>
+          </w:p>
+        </w:tc>
+      </w:tr>
+      <w:tr>
+        <w:tc>
+          <w:tcPr>
+            <w:tcW w:type="dxa" w:w="2409"/>
+          </w:tcPr>
+          <w:p>
+            <w:pPr>
+              <w:spacing w:after="60"/>
+            </w:pPr>
+            <w:r>
+              <w:rPr>
+                <w:b w:val="0"/>
+                <w:sz w:val="18"/>
+              </w:rPr>
+              <w:t>1</w:t>
+            </w:r>
+          </w:p>
+        </w:tc>
+        <w:tc>
+          <w:tcPr>
+            <w:tcW w:type="dxa" w:w="2409"/>
+          </w:tcPr>
+          <w:p>
+            <w:pPr>
+              <w:spacing w:after="60"/>
+            </w:pPr>
+            <w:r>
+              <w:rPr>
+                <w:b w:val="0"/>
+                <w:sz w:val="18"/>
+              </w:rPr>
+              <w:t>Một màu</w:t>
+            </w:r>
+          </w:p>
+        </w:tc>
+        <w:tc>
+          <w:tcPr>
+            <w:tcW w:type="dxa" w:w="2409"/>
+          </w:tcPr>
+          <w:p>
+            <w:pPr>
+              <w:spacing w:after="60"/>
+            </w:pPr>
+            <w:r>
+              <w:rPr>
+                <w:b w:val="0"/>
+                <w:sz w:val="18"/>
+              </w:rPr>
+              <w:t>Không</w:t>
+            </w:r>
+          </w:p>
+        </w:tc>
+        <w:tc>
+          <w:tcPr>
+            <w:tcW w:type="dxa" w:w="2409"/>
+          </w:tcPr>
+          <w:p>
+            <w:pPr>
+              <w:spacing w:after="60"/>
+            </w:pPr>
+            <w:r>
+              <w:rPr>
+                <w:b w:val="0"/>
+                <w:sz w:val="18"/>
+              </w:rPr>
+              <w:t>Giữ Một màu</w:t>
+            </w:r>
+          </w:p>
+        </w:tc>
+      </w:tr>
+      <w:tr>
+        <w:tc>
+          <w:tcPr>
+            <w:tcW w:type="dxa" w:w="2409"/>
+          </w:tcPr>
+          <w:p>
+            <w:pPr>
+              <w:spacing w:after="60"/>
+            </w:pPr>
+            <w:r>
+              <w:rPr>
+                <w:b w:val="0"/>
+                <w:sz w:val="18"/>
+              </w:rPr>
+              <w:t>2</w:t>
+            </w:r>
+          </w:p>
+        </w:tc>
+        <w:tc>
+          <w:tcPr>
+            <w:tcW w:type="dxa" w:w="2409"/>
+          </w:tcPr>
+          <w:p>
+            <w:pPr>
+              <w:spacing w:after="60"/>
+            </w:pPr>
+            <w:r>
+              <w:rPr>
+                <w:b w:val="0"/>
+                <w:sz w:val="18"/>
+              </w:rPr>
+              <w:t>Chuyển màu chậm</w:t>
+            </w:r>
+          </w:p>
+        </w:tc>
+        <w:tc>
+          <w:tcPr>
+            <w:tcW w:type="dxa" w:w="2409"/>
+          </w:tcPr>
+          <w:p>
+            <w:pPr>
+              <w:spacing w:after="60"/>
+            </w:pPr>
+            <w:r>
+              <w:rPr>
+                <w:b w:val="0"/>
+                <w:sz w:val="18"/>
+              </w:rPr>
+              <w:t>Có</w:t>
+            </w:r>
+          </w:p>
+        </w:tc>
+        <w:tc>
+          <w:tcPr>
+            <w:tcW w:type="dxa" w:w="2409"/>
+          </w:tcPr>
+          <w:p>
+            <w:pPr>
+              <w:spacing w:after="60"/>
+            </w:pPr>
+            <w:r>
+              <w:rPr>
+                <w:b w:val="0"/>
+                <w:sz w:val="18"/>
+              </w:rPr>
+              <w:t>Chuyển sang Một màu</w:t>
+            </w:r>
+          </w:p>
+        </w:tc>
+      </w:tr>
+      <w:tr>
+        <w:tc>
+          <w:tcPr>
+            <w:tcW w:type="dxa" w:w="2409"/>
+          </w:tcPr>
+          <w:p>
+            <w:pPr>
+              <w:spacing w:after="60"/>
+            </w:pPr>
+            <w:r>
+              <w:rPr>
+                <w:b w:val="0"/>
+                <w:sz w:val="18"/>
+              </w:rPr>
+              <w:t>3</w:t>
+            </w:r>
+          </w:p>
+        </w:tc>
+        <w:tc>
+          <w:tcPr>
+            <w:tcW w:type="dxa" w:w="2409"/>
+          </w:tcPr>
+          <w:p>
+            <w:pPr>
+              <w:spacing w:after="60"/>
+            </w:pPr>
+            <w:r>
+              <w:rPr>
+                <w:b w:val="0"/>
+                <w:sz w:val="18"/>
+              </w:rPr>
+              <w:t>Ánh nến</w:t>
+            </w:r>
+          </w:p>
+        </w:tc>
+        <w:tc>
+          <w:tcPr>
+            <w:tcW w:type="dxa" w:w="2409"/>
+          </w:tcPr>
+          <w:p>
+            <w:pPr>
+              <w:spacing w:after="60"/>
+            </w:pPr>
+            <w:r>
+              <w:rPr>
+                <w:b w:val="0"/>
+                <w:sz w:val="18"/>
+              </w:rPr>
+              <w:t>Không</w:t>
+            </w:r>
+          </w:p>
+        </w:tc>
+        <w:tc>
+          <w:tcPr>
+            <w:tcW w:type="dxa" w:w="2409"/>
+          </w:tcPr>
+          <w:p>
+            <w:pPr>
+              <w:spacing w:after="60"/>
+            </w:pPr>
+            <w:r>
+              <w:rPr>
+                <w:b w:val="0"/>
+                <w:sz w:val="18"/>
+              </w:rPr>
+              <w:t>Chuyển sang Một màu</w:t>
+            </w:r>
+          </w:p>
+        </w:tc>
+      </w:tr>
+      <w:tr>
+        <w:tc>
+          <w:tcPr>
+            <w:tcW w:type="dxa" w:w="2409"/>
+          </w:tcPr>
+          <w:p>
+            <w:pPr>
+              <w:spacing w:after="60"/>
+            </w:pPr>
+            <w:r>
+              <w:rPr>
+                <w:b w:val="0"/>
+                <w:sz w:val="18"/>
+              </w:rPr>
+              <w:t>4</w:t>
+            </w:r>
+          </w:p>
+        </w:tc>
+        <w:tc>
+          <w:tcPr>
+            <w:tcW w:type="dxa" w:w="2409"/>
+          </w:tcPr>
+          <w:p>
+            <w:pPr>
+              <w:spacing w:after="60"/>
+            </w:pPr>
+            <w:r>
+              <w:rPr>
+                <w:b w:val="0"/>
+                <w:sz w:val="18"/>
+              </w:rPr>
+              <w:t>Cầu vồng chậm</w:t>
+            </w:r>
+          </w:p>
+        </w:tc>
+        <w:tc>
+          <w:tcPr>
+            <w:tcW w:type="dxa" w:w="2409"/>
+          </w:tcPr>
+          <w:p>
+            <w:pPr>
+              <w:spacing w:after="60"/>
+            </w:pPr>
+            <w:r>
+              <w:rPr>
+                <w:b w:val="0"/>
+                <w:sz w:val="18"/>
+              </w:rPr>
+              <w:t>Có</w:t>
+            </w:r>
+          </w:p>
+        </w:tc>
+        <w:tc>
+          <w:tcPr>
+            <w:tcW w:type="dxa" w:w="2409"/>
+          </w:tcPr>
+          <w:p>
+            <w:pPr>
+              <w:spacing w:after="60"/>
+            </w:pPr>
+            <w:r>
+              <w:rPr>
+                <w:b w:val="0"/>
+                <w:sz w:val="18"/>
+              </w:rPr>
+              <w:t>Chuyển sang Một màu</w:t>
+            </w:r>
+          </w:p>
+        </w:tc>
+      </w:tr>
+      <w:tr>
+        <w:tc>
+          <w:tcPr>
+            <w:tcW w:type="dxa" w:w="2409"/>
+          </w:tcPr>
+          <w:p>
+            <w:pPr>
+              <w:spacing w:after="60"/>
+            </w:pPr>
+            <w:r>
+              <w:rPr>
+                <w:b w:val="0"/>
+                <w:sz w:val="18"/>
+              </w:rPr>
+              <w:t>5</w:t>
+            </w:r>
+          </w:p>
+        </w:tc>
+        <w:tc>
+          <w:tcPr>
+            <w:tcW w:type="dxa" w:w="2409"/>
+          </w:tcPr>
+          <w:p>
+            <w:pPr>
+              <w:spacing w:after="60"/>
+            </w:pPr>
+            <w:r>
+              <w:rPr>
+                <w:b w:val="0"/>
+                <w:sz w:val="18"/>
+              </w:rPr>
+              <w:t>Ánh sáng dâng lên</w:t>
+            </w:r>
+          </w:p>
+        </w:tc>
+        <w:tc>
+          <w:tcPr>
+            <w:tcW w:type="dxa" w:w="2409"/>
+          </w:tcPr>
+          <w:p>
+            <w:pPr>
+              <w:spacing w:after="60"/>
+            </w:pPr>
+            <w:r>
+              <w:rPr>
+                <w:b w:val="0"/>
+                <w:sz w:val="18"/>
+              </w:rPr>
+              <w:t>Có</w:t>
+            </w:r>
+          </w:p>
+        </w:tc>
+        <w:tc>
+          <w:tcPr>
+            <w:tcW w:type="dxa" w:w="2409"/>
+          </w:tcPr>
+          <w:p>
+            <w:pPr>
+              <w:spacing w:after="60"/>
+            </w:pPr>
+            <w:r>
+              <w:rPr>
+                <w:b w:val="0"/>
+                <w:sz w:val="18"/>
+              </w:rPr>
+              <w:t>Chuyển sang Một màu</w:t>
+            </w:r>
+          </w:p>
+        </w:tc>
+      </w:tr>
+      <w:tr>
+        <w:tc>
+          <w:tcPr>
+            <w:tcW w:type="dxa" w:w="2409"/>
+          </w:tcPr>
+          <w:p>
+            <w:pPr>
+              <w:spacing w:after="60"/>
+            </w:pPr>
+            <w:r>
+              <w:rPr>
+                <w:b w:val="0"/>
+                <w:sz w:val="18"/>
+              </w:rPr>
+              <w:t>6</w:t>
+            </w:r>
+          </w:p>
+        </w:tc>
+        <w:tc>
+          <w:tcPr>
+            <w:tcW w:type="dxa" w:w="2409"/>
+          </w:tcPr>
+          <w:p>
+            <w:pPr>
+              <w:spacing w:after="60"/>
+            </w:pPr>
+            <w:r>
+              <w:rPr>
+                <w:b w:val="0"/>
+                <w:sz w:val="18"/>
+              </w:rPr>
+              <w:t>Thở nhẹ</w:t>
+            </w:r>
+          </w:p>
+        </w:tc>
+        <w:tc>
+          <w:tcPr>
+            <w:tcW w:type="dxa" w:w="2409"/>
+          </w:tcPr>
+          <w:p>
+            <w:pPr>
+              <w:spacing w:after="60"/>
+            </w:pPr>
+            <w:r>
+              <w:rPr>
+                <w:b w:val="0"/>
+                <w:sz w:val="18"/>
+              </w:rPr>
+              <w:t>Có</w:t>
+            </w:r>
+          </w:p>
+        </w:tc>
+        <w:tc>
+          <w:tcPr>
+            <w:tcW w:type="dxa" w:w="2409"/>
+          </w:tcPr>
+          <w:p>
+            <w:pPr>
+              <w:spacing w:after="60"/>
+            </w:pPr>
+            <w:r>
+              <w:rPr>
+                <w:b w:val="0"/>
+                <w:sz w:val="18"/>
+              </w:rPr>
+              <w:t>Đổi màu, giữ Thở nhẹ</w:t>
+            </w:r>
+          </w:p>
+        </w:tc>
+      </w:tr>
+      <w:tr>
+        <w:tc>
+          <w:tcPr>
+            <w:tcW w:type="dxa" w:w="2409"/>
+          </w:tcPr>
+          <w:p>
+            <w:pPr>
+              <w:spacing w:after="60"/>
+            </w:pPr>
+            <w:r>
+              <w:rPr>
+                <w:b w:val="0"/>
+                <w:sz w:val="18"/>
+              </w:rPr>
+              <w:t>7</w:t>
+            </w:r>
+          </w:p>
+        </w:tc>
+        <w:tc>
+          <w:tcPr>
+            <w:tcW w:type="dxa" w:w="2409"/>
+          </w:tcPr>
+          <w:p>
+            <w:pPr>
+              <w:spacing w:after="60"/>
+            </w:pPr>
+            <w:r>
+              <w:rPr>
+                <w:b w:val="0"/>
+                <w:sz w:val="18"/>
+              </w:rPr>
+              <w:t>Lấp lánh</w:t>
+            </w:r>
+          </w:p>
+        </w:tc>
+        <w:tc>
+          <w:tcPr>
+            <w:tcW w:type="dxa" w:w="2409"/>
+          </w:tcPr>
+          <w:p>
+            <w:pPr>
+              <w:spacing w:after="60"/>
+            </w:pPr>
+            <w:r>
+              <w:rPr>
+                <w:b w:val="0"/>
+                <w:sz w:val="18"/>
+              </w:rPr>
+              <w:t>Có</w:t>
+            </w:r>
+          </w:p>
+        </w:tc>
+        <w:tc>
+          <w:tcPr>
+            <w:tcW w:type="dxa" w:w="2409"/>
+          </w:tcPr>
+          <w:p>
+            <w:pPr>
+              <w:spacing w:after="60"/>
+            </w:pPr>
+            <w:r>
+              <w:rPr>
+                <w:b w:val="0"/>
+                <w:sz w:val="18"/>
+              </w:rPr>
+              <w:t>Đổi màu, giữ Lấp lánh</w:t>
+            </w:r>
+          </w:p>
+        </w:tc>
+      </w:tr>
+      <w:tr>
+        <w:tc>
+          <w:tcPr>
+            <w:tcW w:type="dxa" w:w="2409"/>
+          </w:tcPr>
+          <w:p>
+            <w:pPr>
+              <w:spacing w:after="60"/>
+            </w:pPr>
+            <w:r>
+              <w:rPr>
+                <w:b w:val="0"/>
+                <w:sz w:val="18"/>
+              </w:rPr>
+              <w:t>8</w:t>
+            </w:r>
+          </w:p>
+        </w:tc>
+        <w:tc>
+          <w:tcPr>
+            <w:tcW w:type="dxa" w:w="2409"/>
+          </w:tcPr>
+          <w:p>
+            <w:pPr>
+              <w:spacing w:after="60"/>
+            </w:pPr>
+            <w:r>
+              <w:rPr>
+                <w:b w:val="0"/>
+                <w:sz w:val="18"/>
+              </w:rPr>
+              <w:t>Cực quang</w:t>
+            </w:r>
+          </w:p>
+        </w:tc>
+        <w:tc>
+          <w:tcPr>
+            <w:tcW w:type="dxa" w:w="2409"/>
+          </w:tcPr>
+          <w:p>
+            <w:pPr>
+              <w:spacing w:after="60"/>
+            </w:pPr>
+            <w:r>
+              <w:rPr>
+                <w:b w:val="0"/>
+                <w:sz w:val="18"/>
+              </w:rPr>
+              <w:t>Có</w:t>
+            </w:r>
+          </w:p>
+        </w:tc>
+        <w:tc>
+          <w:tcPr>
+            <w:tcW w:type="dxa" w:w="2409"/>
+          </w:tcPr>
+          <w:p>
+            <w:pPr>
+              <w:spacing w:after="60"/>
+            </w:pPr>
+            <w:r>
+              <w:rPr>
+                <w:b w:val="0"/>
+                <w:sz w:val="18"/>
+              </w:rPr>
+              <w:t>Chuyển sang Một màu</w:t>
+            </w:r>
+          </w:p>
+        </w:tc>
+      </w:tr>
+      <w:tr>
+        <w:tc>
+          <w:tcPr>
+            <w:tcW w:type="dxa" w:w="2409"/>
+          </w:tcPr>
+          <w:p>
+            <w:pPr>
+              <w:spacing w:after="60"/>
+            </w:pPr>
+            <w:r>
+              <w:rPr>
+                <w:b w:val="0"/>
+                <w:sz w:val="18"/>
+              </w:rPr>
+              <w:t>9</w:t>
+            </w:r>
+          </w:p>
+        </w:tc>
+        <w:tc>
+          <w:tcPr>
+            <w:tcW w:type="dxa" w:w="2409"/>
+          </w:tcPr>
+          <w:p>
+            <w:pPr>
+              <w:spacing w:after="60"/>
+            </w:pPr>
+            <w:r>
+              <w:rPr>
+                <w:b w:val="0"/>
+                <w:sz w:val="18"/>
+              </w:rPr>
+              <w:t>Biển xanh</w:t>
+            </w:r>
+          </w:p>
+        </w:tc>
+        <w:tc>
+          <w:tcPr>
+            <w:tcW w:type="dxa" w:w="2409"/>
+          </w:tcPr>
+          <w:p>
+            <w:pPr>
+              <w:spacing w:after="60"/>
+            </w:pPr>
+            <w:r>
+              <w:rPr>
+                <w:b w:val="0"/>
+                <w:sz w:val="18"/>
+              </w:rPr>
+              <w:t>Có</w:t>
+            </w:r>
+          </w:p>
+        </w:tc>
+        <w:tc>
+          <w:tcPr>
+            <w:tcW w:type="dxa" w:w="2409"/>
+          </w:tcPr>
+          <w:p>
+            <w:pPr>
+              <w:spacing w:after="60"/>
+            </w:pPr>
+            <w:r>
+              <w:rPr>
+                <w:b w:val="0"/>
+                <w:sz w:val="18"/>
+              </w:rPr>
+              <w:t>Chuyển sang Một màu</w:t>
+            </w:r>
+          </w:p>
+        </w:tc>
+      </w:tr>
+      <w:tr>
+        <w:tc>
+          <w:tcPr>
+            <w:tcW w:type="dxa" w:w="2409"/>
+          </w:tcPr>
+          <w:p>
+            <w:pPr>
+              <w:spacing w:after="60"/>
+            </w:pPr>
+            <w:r>
+              <w:rPr>
+                <w:b w:val="0"/>
+                <w:sz w:val="18"/>
+              </w:rPr>
+              <w:t>10</w:t>
+            </w:r>
+          </w:p>
+        </w:tc>
+        <w:tc>
+          <w:tcPr>
+            <w:tcW w:type="dxa" w:w="2409"/>
+          </w:tcPr>
+          <w:p>
+            <w:pPr>
+              <w:spacing w:after="60"/>
+            </w:pPr>
+            <w:r>
+              <w:rPr>
+                <w:b w:val="0"/>
+                <w:sz w:val="18"/>
+              </w:rPr>
+              <w:t>Rừng xanh</w:t>
+            </w:r>
+          </w:p>
+        </w:tc>
+        <w:tc>
+          <w:tcPr>
+            <w:tcW w:type="dxa" w:w="2409"/>
+          </w:tcPr>
+          <w:p>
+            <w:pPr>
+              <w:spacing w:after="60"/>
+            </w:pPr>
+            <w:r>
+              <w:rPr>
+                <w:b w:val="0"/>
+                <w:sz w:val="18"/>
+              </w:rPr>
+              <w:t>Có</w:t>
+            </w:r>
+          </w:p>
+        </w:tc>
+        <w:tc>
+          <w:tcPr>
+            <w:tcW w:type="dxa" w:w="2409"/>
+          </w:tcPr>
+          <w:p>
+            <w:pPr>
+              <w:spacing w:after="60"/>
+            </w:pPr>
+            <w:r>
+              <w:rPr>
+                <w:b w:val="0"/>
+                <w:sz w:val="18"/>
+              </w:rPr>
+              <w:t>Chuyển sang Một màu</w:t>
+            </w:r>
+          </w:p>
+        </w:tc>
+      </w:tr>
+      <w:tr>
+        <w:tc>
+          <w:tcPr>
+            <w:tcW w:type="dxa" w:w="2409"/>
+          </w:tcPr>
+          <w:p>
+            <w:pPr>
+              <w:spacing w:after="60"/>
+            </w:pPr>
+            <w:r>
+              <w:rPr>
+                <w:b w:val="0"/>
+                <w:sz w:val="18"/>
+              </w:rPr>
+              <w:t>11</w:t>
+            </w:r>
+          </w:p>
+        </w:tc>
+        <w:tc>
+          <w:tcPr>
+            <w:tcW w:type="dxa" w:w="2409"/>
+          </w:tcPr>
+          <w:p>
+            <w:pPr>
+              <w:spacing w:after="60"/>
+            </w:pPr>
+            <w:r>
+              <w:rPr>
+                <w:b w:val="0"/>
+                <w:sz w:val="18"/>
+              </w:rPr>
+              <w:t>Hoàng hôn</w:t>
+            </w:r>
+          </w:p>
+        </w:tc>
+        <w:tc>
+          <w:tcPr>
+            <w:tcW w:type="dxa" w:w="2409"/>
+          </w:tcPr>
+          <w:p>
+            <w:pPr>
+              <w:spacing w:after="60"/>
+            </w:pPr>
+            <w:r>
+              <w:rPr>
+                <w:b w:val="0"/>
+                <w:sz w:val="18"/>
+              </w:rPr>
+              <w:t>Có</w:t>
+            </w:r>
+          </w:p>
+        </w:tc>
+        <w:tc>
+          <w:tcPr>
+            <w:tcW w:type="dxa" w:w="2409"/>
+          </w:tcPr>
+          <w:p>
+            <w:pPr>
+              <w:spacing w:after="60"/>
+            </w:pPr>
+            <w:r>
+              <w:rPr>
+                <w:b w:val="0"/>
+                <w:sz w:val="18"/>
+              </w:rPr>
+              <w:t>Chuyển sang Một màu</w:t>
+            </w:r>
+          </w:p>
+        </w:tc>
+      </w:tr>
+      <w:tr>
+        <w:tc>
+          <w:tcPr>
+            <w:tcW w:type="dxa" w:w="2409"/>
+          </w:tcPr>
+          <w:p>
+            <w:pPr>
+              <w:spacing w:after="60"/>
+            </w:pPr>
+            <w:r>
+              <w:rPr>
+                <w:b w:val="0"/>
+                <w:sz w:val="18"/>
+              </w:rPr>
+              <w:t>12</w:t>
+            </w:r>
+          </w:p>
+        </w:tc>
+        <w:tc>
+          <w:tcPr>
+            <w:tcW w:type="dxa" w:w="2409"/>
+          </w:tcPr>
+          <w:p>
+            <w:pPr>
+              <w:spacing w:after="60"/>
+            </w:pPr>
+            <w:r>
+              <w:rPr>
+                <w:b w:val="0"/>
+                <w:sz w:val="18"/>
+              </w:rPr>
+              <w:t>Sao băng</w:t>
+            </w:r>
+          </w:p>
+        </w:tc>
+        <w:tc>
+          <w:tcPr>
+            <w:tcW w:type="dxa" w:w="2409"/>
+          </w:tcPr>
+          <w:p>
+            <w:pPr>
+              <w:spacing w:after="60"/>
+            </w:pPr>
+            <w:r>
+              <w:rPr>
+                <w:b w:val="0"/>
+                <w:sz w:val="18"/>
+              </w:rPr>
+              <w:t>Có</w:t>
+            </w:r>
+          </w:p>
+        </w:tc>
+        <w:tc>
+          <w:tcPr>
+            <w:tcW w:type="dxa" w:w="2409"/>
+          </w:tcPr>
+          <w:p>
+            <w:pPr>
+              <w:spacing w:after="60"/>
+            </w:pPr>
+            <w:r>
+              <w:rPr>
+                <w:b w:val="0"/>
+                <w:sz w:val="18"/>
+              </w:rPr>
+              <w:t>Đổi màu, giữ Sao băng</w:t>
+            </w:r>
+          </w:p>
+        </w:tc>
+      </w:tr>
+      <w:tr>
+        <w:tc>
+          <w:tcPr>
+            <w:tcW w:type="dxa" w:w="2409"/>
+          </w:tcPr>
+          <w:p>
+            <w:pPr>
+              <w:spacing w:after="60"/>
+            </w:pPr>
+            <w:r>
+              <w:rPr>
+                <w:b w:val="0"/>
+                <w:sz w:val="18"/>
+              </w:rPr>
+              <w:t>13</w:t>
+            </w:r>
+          </w:p>
+        </w:tc>
+        <w:tc>
+          <w:tcPr>
+            <w:tcW w:type="dxa" w:w="2409"/>
+          </w:tcPr>
+          <w:p>
+            <w:pPr>
+              <w:spacing w:after="60"/>
+            </w:pPr>
+            <w:r>
+              <w:rPr>
+                <w:b w:val="0"/>
+                <w:sz w:val="18"/>
+              </w:rPr>
+              <w:t>Sóng màu</w:t>
+            </w:r>
+          </w:p>
+        </w:tc>
+        <w:tc>
+          <w:tcPr>
+            <w:tcW w:type="dxa" w:w="2409"/>
+          </w:tcPr>
+          <w:p>
+            <w:pPr>
+              <w:spacing w:after="60"/>
+            </w:pPr>
+            <w:r>
+              <w:rPr>
+                <w:b w:val="0"/>
+                <w:sz w:val="18"/>
+              </w:rPr>
+              <w:t>Có</w:t>
+            </w:r>
+          </w:p>
+        </w:tc>
+        <w:tc>
+          <w:tcPr>
+            <w:tcW w:type="dxa" w:w="2409"/>
+          </w:tcPr>
+          <w:p>
+            <w:pPr>
+              <w:spacing w:after="60"/>
+            </w:pPr>
+            <w:r>
+              <w:rPr>
+                <w:b w:val="0"/>
+                <w:sz w:val="18"/>
+              </w:rPr>
+              <w:t>Chuyển sang Một màu</w:t>
+            </w:r>
+          </w:p>
+        </w:tc>
+      </w:tr>
+    </w:tbl>
+    <w:p/>
+    <w:p>
+      <w:r>
+        <w:t>Thở nhẹ, Lấp lánh và Sao băng dùng màu RGB bạn chọn làm màu hiệu ứng. Cực quang, Biển xanh, Rừng xanh, Hoàng hôn và Sóng màu dùng bảng màu riêng. Cả tám hiệu ứng mới đều dùng thanh tốc độ; tăng giá trị làm hiệu ứng chạy nhanh hơn. Độ sáng chính và trần đầu ra vẫn áp dụng cho mọi chế độ.</w:t>
+      </w:r>
+    </w:p>
+    <w:p>
       <w:pPr>
         <w:pStyle w:val="ListBullet"/>
       </w:pPr>
@@ -1547,7 +2637,15 @@
         <w:pStyle w:val="ListBullet"/>
       </w:pPr>
       <w:r>
-        <w:t>Chọn màu chuyển sang Một màu. Tốc độ 1–100 dùng cho Chuyển màu, Cầu vồng và Dâng lên.</w:t>
+        <w:t>Chọn RGB giữ chế độ ở Một màu, Thở nhẹ, Lấp lánh và Sao băng; ở các chế độ khác sẽ chuyển sang Một màu. Chọn lại hiệu ứng dùng bảng màu riêng để trở về hiệu ứng đó.</w:t>
+      </w:r>
+    </w:p>
+    <w:p>
+      <w:pPr>
+        <w:pStyle w:val="ListBullet"/>
+      </w:pPr>
+      <w:r>
+        <w:t>Tốc độ 1–100 dùng cho Chuyển màu, Cầu vồng, Dâng lên và cả tám hiệu ứng mới; không làm đổi chế độ hoặc màu.</w:t>
       </w:r>
     </w:p>
     <w:p>
@@ -1617,7 +2715,12 @@
     </w:p>
     <w:p>
       <w:r>
-        <w:t>Firmware có hai bản NVS, CRC và số thế hệ; boot chọn bản hợp lệ mới nhất. Khi ghi lỗi, giữ RAM và thử lại sau 5 giây. Khi gặp schema mới hơn, không tự ghi đè bằng firmware cũ. OTA cùng schema giữ dữ liệu; thay đổi firmware tương lai cần quy tắc migration nếu đổi schema, gamma hoặc cách hiểu thông số.</w:t>
+        <w:t>Firmware có hai bản NVS, CRC và số thế hệ; boot chọn bản hợp lệ mới nhất. Khi ghi lỗi, giữ RAM và thử lại sau 5 giây. Khi gặp schema mới hơn, không tự ghi đè bằng firmware cũ.</w:t>
+      </w:r>
+    </w:p>
+    <w:p>
+      <w:r>
+        <w:t>Bản 1.2.0 đọc dữ liệu ánh sáng schema 1 và 2, ghi schema 2 cho các lần lưu mới. Nâng cấp OTA từ 1.1.0 giữ cấu hình đèn và ba mục yêu thích vì sáu mã chế độ cũ không đổi; WiFi, tên và tên truy cập cũng được giữ. Nếu cần quay lại 1.1.0 sau khi dữ liệu đã lưu schema 2, dùng USB: firmware cũ có thể không đọc được schema mới và sẽ không ghi đè dữ liệu đó.</w:t>
       </w:r>
     </w:p>
     <w:p>
@@ -1640,7 +2743,7 @@
     </w:p>
     <w:p>
       <w:r>
-        <w:t>2. Tìm file ứng dụng DenDeco.ino.bin hoặc tên tương đương do IDE xuất. Không chọn .bootloader.bin, .partitions.bin, .merged.bin hoặc file dùng cho ESP32/S2/S3 khác. Gói bàn giao cũng có firmware/DenDeco-1.1.0-ota.bin.</w:t>
+        <w:t>2. Tìm file ứng dụng DenDeco.ino.bin hoặc tên tương đương do IDE xuất. Không chọn .bootloader.bin, .partitions.bin, .merged.bin hoặc file dùng cho ESP32/S2/S3 khác. Gói bàn giao cũng có firmware/DenDeco-1.2.0-ota.bin; có thể dùng để nâng cấp đèn đang chạy 1.1.0.</w:t>
       </w:r>
     </w:p>
     <w:p>
@@ -1670,7 +2773,7 @@
     </w:p>
     <w:p>
       <w:r>
-        <w:t>File của bản này nhỏ hơn giới hạn 1.310.720 byte mỗi phân vùng. Nếu dùng sơ đồ phân vùng khác, giới hạn trên trang lấy từ phân vùng thực tế. Đổi bảng phân vùng phải nạp USB; OTA chỉ thay ứng dụng.</w:t>
+        <w:t>Giới hạn của phân vùng ứng dụng mặc định là 1.310.720 byte; kích thước file 1.2.0 được ghi trong BUILD_INFO.md. Nếu dùng sơ đồ phân vùng khác, giới hạn trên trang lấy từ phân vùng thực tế. Đổi bảng phân vùng phải nạp USB; OTA chỉ thay ứng dụng.</w:t>
       </w:r>
     </w:p>
     <w:p>
@@ -1728,12 +2831,17 @@
     </w:p>
     <w:p>
       <w:r>
+        <w:t>9. Với bản 1.2.0, chọn đủ tám hiệu ứng mới trên web và đi đủ 14 chế độ bằng M. Thử tốc độ 1/50/100, đổi RGB khi đang Thở nhẹ/Lấp lánh/Sao băng, kiểm tra các hiệu ứng khác chuyển sang Một màu khi chọn RGB, rồi lưu/khôi phục mục yêu thích. Mở Hướng dẫn sử dụng trên điện thoại để đọc ngay tại trang.</w:t>
+      </w:r>
+    </w:p>
+    <w:p>
+      <w:r>
         <w:t>Không thấy AP: đợi 30 giây nếu đã lưu mạng; nếu WiFi nhà đang kết nối, AP đã tắt đúng thiết kế. Muốn cấu hình lại từ cảm ứng, giữ đúng +/− 5 giây sau khi đã khởi động và thả hết nút. AP không yêu cầu mật khẩu. Trang AP mất kết nối ngay sau Lưu &amp; kết nối: chuyển sang WiFi nhà và mở .local hoặc IP. Không mở được .local: kiểm tra cùng mạng, tên truy cập và dùng IP từ router/Serial. Không thấy mạng khi quét: xác nhận mạng 2,4 GHz, thử lại hoặc nhập SSID thủ công. Đèn chạm tự bật: kiểm tra module direct active high, dây và vùng cảm ứng/vỏ. OTA báo file sai: chọn đúng ứng dụng .ino.bin, không dùng bootloader/merged.</w:t>
       </w:r>
     </w:p>
     <w:p>
       <w:r>
-        <w:t>Thông tin biên dịch và kiểm tra logic/giao diện bằng mô phỏng được ghi trong BUILD_INFO.md và KIEM_THU.md. Các kiểm tra điện, độ nhạy/chạm qua vỏ, WiFi/mDNS, truyền dữ liệu và OTA trên phần cứng đều đang chờ thực hiện trên bộ đèn của bạn; xem KIEM_THU.md để ghi kết quả.</w:t>
+        <w:t>Thông tin biên dịch và kiểm tra logic/giao diện bằng mô phỏng được ghi trong BUILD_INFO.md và KIEM_THU.md. Người dùng đã lắp đèn và báo các bản trước chạy mượt. Bản 1.2.0 mới chưa thử trên bo; bảng nghiệm thu chưa có kết quả riêng cho từng ca đo điện, chạm qua vỏ, WiFi/mDNS và OTA. Sau nâng cấp, ưu tiên thử tám hiệu ứng mới, màu, tốc độ, hướng dẫn trên web và giữ cấu hình/mục yêu thích; ghi kết quả trong KIEM_THU.md.</w:t>
       </w:r>
     </w:p>
     <w:p>
@@ -1746,7 +2854,7 @@
         <w:pStyle w:val="Heading1"/>
       </w:pPr>
       <w:r>
-        <w:t>Cấu hình và kế hoạch Đèn Deco 1.1.0</w:t>
+        <w:t>Cấu hình và kế hoạch Đèn Deco 1.2.0</w:t>
       </w:r>
     </w:p>
     <w:p>
@@ -1760,6 +2868,16 @@
     <w:p>
       <w:r>
         <w:t>Phạm vi: firmware, web trên ESP và hướng dẫn đấu nối/nạp. Người dùng tự xử lý cơ khí/vỏ. ESP32-C3 SuperMini, bốn TTP223, 20 WS2812B và nguồn 5 V–2 A. Tên Đèn Deco; WiFi nhà + AP dự phòng. Máy nạp Windows, Arduino IDE. Bổ sung OTA qua web theo yêu cầu mới.</w:t>
+      </w:r>
+    </w:p>
+    <w:p>
+      <w:r>
+        <w:t>Bản 1.2.0 giữ sáu chế độ cũ ở mã 0–5 và thêm tám chế độ theo đúng thứ tự: 6 Thở nhẹ, 7 Lấp lánh, 8 Cực quang, 9 Biển xanh, 10 Rừng xanh, 11 Hoàng hôn, 12 Sao băng, 13 Sóng màu. Nút M đi qua cả 14 chế độ rồi trở về Ngủ. Cả tám chế độ mới chỉnh được tốc độ; RGB giữ hiệu ứng ở Thở nhẹ, Lấp lánh và Sao băng. Một màu giữ hành vi RGB cũ; các chế độ còn lại chuyển sang Một màu khi chọn RGB. Web có mục Hướng dẫn sử dụng hiển thị trong trang điều khiển.</w:t>
+      </w:r>
+    </w:p>
+    <w:p>
+      <w:r>
+        <w:t>Nâng cấp OTA 1.1.0 → 1.2.0 giữ cấu hình đèn, các mục yêu thích cũ, WiFi và tên. Dữ liệu ánh sáng schema 2 đọc được schema 1/2, giữ nguyên mã chế độ cũ; firmware cũ không được ghi đè schema mới. Nếu cần quay về 1.1.0 sau khi lưu schema 2, dùng USB vì phiên bản cũ có thể không đọc được dữ liệu ánh sáng mới. WiFi/AP, thao tác cảm ứng và các thông số nguồn không đổi ở 1.2.0.</w:t>
       </w:r>
     </w:p>
     <w:p>
@@ -1784,7 +2902,7 @@
     </w:p>
     <w:p>
       <w:r>
-        <w:t>Chế độ ngủ nhớ riêng mức đã chỉnh, ban đầu 5%. Các mặc định giữ/nút, 6 chế độ, timer và gamma lấy từ đề xuất trong tài liệu đã được người dùng đồng ý. Mức tối thiểu hiệu chỉnh khởi đầu 6/255 để cam ngủ không chỉ còn kênh đỏ; phải thử trên đèn thật.</w:t>
+        <w:t>Chế độ ngủ nhớ riêng mức đã chỉnh, ban đầu 5%. Các mặc định giữ/nút, sáu chế độ gốc, timer và gamma lấy từ đề xuất trong tài liệu đã được người dùng đồng ý; tám hiệu ứng bổ sung thuộc bản 1.2.0. Mức tối thiểu hiệu chỉnh khởi đầu 6/255 để cam ngủ không chỉ còn kênh đỏ; hiệu chỉnh theo vỏ/đèn thật.</w:t>
       </w:r>
     </w:p>
     <w:p>
@@ -1999,7 +3117,7 @@
                 <w:b w:val="0"/>
                 <w:sz w:val="18"/>
               </w:rPr>
-              <w:t>Hai slot, CRC, kiểm tra ghi và retry; không lưu khung hình</w:t>
+              <w:t>Hai slot, CRC, kiểm tra ghi và retry; ánh sáng schema 2 đọc schema 1/2</w:t>
             </w:r>
           </w:p>
         </w:tc>
@@ -2016,7 +3134,7 @@
                 <w:b w:val="0"/>
                 <w:sz w:val="18"/>
               </w:rPr>
-              <w:t>Hoàn tất và kiểm tra mô phỏng lỗi</w:t>
+              <w:t>Bản 1.2.0 cập nhật; kết quả kiểm tra ghi ở KIEM_THU.md</w:t>
             </w:r>
           </w:p>
         </w:tc>
@@ -2035,7 +3153,7 @@
                 <w:b w:val="0"/>
                 <w:sz w:val="18"/>
               </w:rPr>
-              <w:t>Web/WiFi</w:t>
+              <w:t>Tám hiệu ứng mới</w:t>
             </w:r>
           </w:p>
         </w:tc>
@@ -2052,7 +3170,7 @@
                 <w:b w:val="0"/>
                 <w:sz w:val="18"/>
               </w:rPr>
-              <w:t>Web nhúng, polling 250 ms; quét 2,4 GHz, trạng thái mạng, hostname và AP dự phòng</w:t>
+              <w:t>14 mã chế độ, tốc độ cho tám hiệu ứng mới, RGB giữ ba hiệu ứng dùng màu tự chọn</w:t>
             </w:r>
           </w:p>
         </w:tc>
@@ -2069,7 +3187,7 @@
                 <w:b w:val="0"/>
                 <w:sz w:val="18"/>
               </w:rPr>
-              <w:t>Bản 1.1.0 cập nhật; kết quả kiểm tra ghi ở KIEM_THU.md</w:t>
+              <w:t>Bản 1.2.0 cập nhật; chưa thử trên bo</w:t>
             </w:r>
           </w:p>
         </w:tc>
@@ -2088,7 +3206,7 @@
                 <w:b w:val="0"/>
                 <w:sz w:val="18"/>
               </w:rPr>
-              <w:t>Reset WiFi từ cảm ứng</w:t>
+              <w:t>Hướng dẫn trong web</w:t>
             </w:r>
           </w:p>
         </w:tc>
@@ -2105,7 +3223,7 @@
                 <w:b w:val="0"/>
                 <w:sz w:val="18"/>
               </w:rPr>
-              <w:t>Giữ đúng +/− 5 giây, giữ cấu hình đèn và tên</w:t>
+              <w:t>Thao tác cảm ứng, chế độ/màu/tốc độ, lưu, mạng và OTA</w:t>
             </w:r>
           </w:p>
         </w:tc>
@@ -2122,7 +3240,7 @@
                 <w:b w:val="0"/>
                 <w:sz w:val="18"/>
               </w:rPr>
-              <w:t>Bản 1.1.0 cập nhật; thao tác vật lý qua vỏ chưa thử</w:t>
+              <w:t>Bản 1.2.0 cập nhật; kiểm tra trên điện thoại sau nâng cấp</w:t>
             </w:r>
           </w:p>
         </w:tc>
@@ -2141,7 +3259,7 @@
                 <w:b w:val="0"/>
                 <w:sz w:val="18"/>
               </w:rPr>
-              <w:t>OTA</w:t>
+              <w:t>Web/WiFi</w:t>
             </w:r>
           </w:p>
         </w:tc>
@@ -2158,7 +3276,7 @@
                 <w:b w:val="0"/>
                 <w:sz w:val="18"/>
               </w:rPr>
-              <w:t>File ứng dụng C3, phân vùng còn lại, giữ NVS, reboot sau thành công</w:t>
+              <w:t>Web nhúng, polling 250 ms; quét 2,4 GHz, trạng thái mạng, hostname và AP dự phòng</w:t>
             </w:r>
           </w:p>
         </w:tc>
@@ -2175,7 +3293,7 @@
                 <w:b w:val="0"/>
                 <w:sz w:val="18"/>
               </w:rPr>
-              <w:t>Đã viết/biên dịch; cần thử truyền và reboot thật</w:t>
+              <w:t>Bản 1.1.0 cập nhật; kết quả kiểm tra ghi ở KIEM_THU.md</w:t>
             </w:r>
           </w:p>
         </w:tc>
@@ -2194,7 +3312,7 @@
                 <w:b w:val="0"/>
                 <w:sz w:val="18"/>
               </w:rPr>
-              <w:t>Bàn giao Windows</w:t>
+              <w:t>Reset WiFi từ cảm ứng</w:t>
             </w:r>
           </w:p>
         </w:tc>
@@ -2211,7 +3329,7 @@
                 <w:b w:val="0"/>
                 <w:sz w:val="18"/>
               </w:rPr>
-              <w:t>Sketch, .bin OTA 1.1.0, hướng dẫn và checklist</w:t>
+              <w:t>Giữ đúng +/− 5 giây, giữ cấu hình đèn và tên</w:t>
             </w:r>
           </w:p>
         </w:tc>
@@ -2228,7 +3346,7 @@
                 <w:b w:val="0"/>
                 <w:sz w:val="18"/>
               </w:rPr>
-              <w:t>Thông tin gói/build ghi ở BUILD_INFO.md</w:t>
+              <w:t>Có từ bản 1.1.0; chưa có kết quả riêng từng ca qua vỏ</w:t>
             </w:r>
           </w:p>
         </w:tc>
@@ -2247,6 +3365,112 @@
                 <w:b w:val="0"/>
                 <w:sz w:val="18"/>
               </w:rPr>
+              <w:t>OTA</w:t>
+            </w:r>
+          </w:p>
+        </w:tc>
+        <w:tc>
+          <w:tcPr>
+            <w:tcW w:type="dxa" w:w="3213"/>
+          </w:tcPr>
+          <w:p>
+            <w:pPr>
+              <w:spacing w:after="60"/>
+            </w:pPr>
+            <w:r>
+              <w:rPr>
+                <w:b w:val="0"/>
+                <w:sz w:val="18"/>
+              </w:rPr>
+              <w:t>File ứng dụng C3, phân vùng còn lại, giữ NVS, reboot sau thành công</w:t>
+            </w:r>
+          </w:p>
+        </w:tc>
+        <w:tc>
+          <w:tcPr>
+            <w:tcW w:type="dxa" w:w="3213"/>
+          </w:tcPr>
+          <w:p>
+            <w:pPr>
+              <w:spacing w:after="60"/>
+            </w:pPr>
+            <w:r>
+              <w:rPr>
+                <w:b w:val="0"/>
+                <w:sz w:val="18"/>
+              </w:rPr>
+              <w:t>Nâng cấp 1.1.0 → 1.2.0 cần thử trên bo</w:t>
+            </w:r>
+          </w:p>
+        </w:tc>
+      </w:tr>
+      <w:tr>
+        <w:tc>
+          <w:tcPr>
+            <w:tcW w:type="dxa" w:w="3213"/>
+          </w:tcPr>
+          <w:p>
+            <w:pPr>
+              <w:spacing w:after="60"/>
+            </w:pPr>
+            <w:r>
+              <w:rPr>
+                <w:b w:val="0"/>
+                <w:sz w:val="18"/>
+              </w:rPr>
+              <w:t>Bàn giao Windows</w:t>
+            </w:r>
+          </w:p>
+        </w:tc>
+        <w:tc>
+          <w:tcPr>
+            <w:tcW w:type="dxa" w:w="3213"/>
+          </w:tcPr>
+          <w:p>
+            <w:pPr>
+              <w:spacing w:after="60"/>
+            </w:pPr>
+            <w:r>
+              <w:rPr>
+                <w:b w:val="0"/>
+                <w:sz w:val="18"/>
+              </w:rPr>
+              <w:t>Sketch, .bin OTA 1.2.0, hướng dẫn và checklist</w:t>
+            </w:r>
+          </w:p>
+        </w:tc>
+        <w:tc>
+          <w:tcPr>
+            <w:tcW w:type="dxa" w:w="3213"/>
+          </w:tcPr>
+          <w:p>
+            <w:pPr>
+              <w:spacing w:after="60"/>
+            </w:pPr>
+            <w:r>
+              <w:rPr>
+                <w:b w:val="0"/>
+                <w:sz w:val="18"/>
+              </w:rPr>
+              <w:t>Thông tin gói/build ghi ở BUILD_INFO.md</w:t>
+            </w:r>
+          </w:p>
+        </w:tc>
+      </w:tr>
+      <w:tr>
+        <w:tc>
+          <w:tcPr>
+            <w:tcW w:type="dxa" w:w="3213"/>
+          </w:tcPr>
+          <w:p>
+            <w:pPr>
+              <w:spacing w:after="60"/>
+            </w:pPr>
+            <w:r>
+              <w:rPr>
+                <w:b w:val="0"/>
+                <w:sz w:val="18"/>
+              </w:rPr>
               <w:t>Nạp và đo trên thiết bị</w:t>
             </w:r>
           </w:p>
@@ -2281,7 +3505,7 @@
                 <w:b w:val="0"/>
                 <w:sz w:val="18"/>
               </w:rPr>
-              <w:t>Chưa thử; người dùng thực hiện trên bộ lắp thật</w:t>
+              <w:t>Người dùng đã lắp đèn, báo bản trước chạy mượt; bản 1.2.0 mới chưa thử trên bo</w:t>
             </w:r>
           </w:p>
         </w:tc>
@@ -2361,6 +3585,22 @@
       </w:r>
     </w:p>
     <w:p>
+      <w:pPr>
+        <w:pStyle w:val="ListBullet"/>
+      </w:pPr>
+      <w:r>
+        <w:t>Tốc độ, màu và độ mượt của tám hiệu ứng mới qua vỏ; vòng M đủ 14 chế độ và hướng dẫn web trên màn hình điện thoại.</w:t>
+      </w:r>
+    </w:p>
+    <w:p>
+      <w:pPr>
+        <w:pStyle w:val="ListBullet"/>
+      </w:pPr>
+      <w:r>
+        <w:t>Cấu hình/mục yêu thích trước khi OTA 1.1.0 → 1.2.0 và sau reboot/lưu schema mới.</w:t>
+      </w:r>
+    </w:p>
+    <w:p>
       <w:r>
         <w:t>Cấu hình SSID/mật khẩu trực tiếp tại thiết bị. Toàn bộ dự án và gói tải được đưa lên repo GitHub NguyenPhat-NT/den_trang_tri theo yêu cầu của chủ dự án. Web điều khiển nằm trên ESP; không xuất bản website điều khiển ra ngoài. Chưa nạp thiết bị từ cloud.</w:t>
       </w:r>
@@ -2393,7 +3633,7 @@
         <w:pStyle w:val="Heading1"/>
       </w:pPr>
       <w:r>
-        <w:t>Kiểm thử và nghiệm thu Đèn Deco 1.1.0</w:t>
+        <w:t>Kiểm thử và nghiệm thu Đèn Deco 1.2.0</w:t>
       </w:r>
     </w:p>
     <w:p>
@@ -2406,7 +3646,7 @@
     </w:p>
     <w:p>
       <w:r>
-        <w:t>Các kiểm tra dưới đây đã chạy lại thành công cho mã nguồn 1.1.0. Thông tin build ghi trong BUILD_INFO.md. Các thử nghiệm trên ESP và router vẫn đang chờ; build và web mock không thay cho thử phần cứng.</w:t>
+        <w:t>Các kiểm tra nền dưới đây đã chạy thành công cho mã nguồn 1.1.0. Thông tin build và kết quả chạy mới cho 1.2.0 ghi trong BUILD_INFO.md và phần bổ sung bên dưới; không coi kết quả cũ là kết quả bản mới. Người dùng đã lắp đèn và báo các bản trước chạy mượt, nhưng chưa có ghi nhận riêng cho từng ca nghiệm thu. Bản 1.2.0 mới chưa thử trên bo; build và web mock không thay cho thử phần cứng.</w:t>
       </w:r>
     </w:p>
     <w:p>
@@ -2539,12 +3779,52 @@
         <w:pStyle w:val="Heading2"/>
       </w:pPr>
       <w:r>
-        <w:t>Bảng chạy thử trên thiết bị</w:t>
+        <w:t>Kiểm tra bổ sung bản 1.2.0</w:t>
       </w:r>
     </w:p>
     <w:p>
       <w:r>
-        <w:t>Ghi Ngày / Kết quả / Ghi chú cho từng dòng. Mục tiêu về thời gian cần đo trên mạng thực tế.</w:t>
+        <w:t>Các kiểm tra phần mềm dưới đây đã chạy thành công cho bản mới; thử nghiệm trên bo ở bảng E01–E08 vẫn cần người dùng thực hiện.</w:t>
+      </w:r>
+    </w:p>
+    <w:p>
+      <w:pPr>
+        <w:pStyle w:val="ListBullet"/>
+      </w:pPr>
+      <w:r>
+        <w:t>PASS lõi/render (ASan/UBSan): đủ 14 mã đúng thứ tự và mục yêu thích, tint giữ chế độ/hủy timer đúng, mọi mode có trần/tắt/fade/timer; tám hiệu ứng mới khác nhau, dùng tốc độ, có độ liên tục tại 33 ms và uptime dài, đối xứng hai nhánh LED.</w:t>
+      </w:r>
+    </w:p>
+    <w:p>
+      <w:pPr>
+        <w:pStyle w:val="ListBullet"/>
+      </w:pPr>
+      <w:r>
+        <w:t>PASS lưu/migration ánh sáng: đọc schema 1 và 2, ghi schema 2, giữ toàn bộ cấu hình/mục yêu thích ở sáu mã cũ; lưu/khôi phục mode và mục yêu thích mới; chọn slot qua tràn số thế hệ; ghi dở schema mới vẫn đọc slot cũ; bảo vệ schema tương lai. Lưu mạng không đổi và các kiểm tra mạng cũng PASS.</w:t>
+      </w:r>
+    </w:p>
+    <w:p>
+      <w:pPr>
+        <w:pStyle w:val="ListBullet"/>
+      </w:pPr>
+      <w:r>
+        <w:t>PASS Playwright/Chromium với API mô phỏng: đủ 14 ID/tên/mô tả/tốc độ; đổi RGB giữ ba hiệu ứng tint, palette riêng chuyển Một màu; tương tác mode/màu khi phản hồi chậm; mục hướng dẫn dùng được qua bàn phím và offline, mô tả đúng bật/tắt đã lưu. Các kiểm tra cũ cho WiFi, draft, timer và OTA cũng PASS.</w:t>
+      </w:r>
+    </w:p>
+    <w:p>
+      <w:pPr>
+        <w:pStyle w:val="ListBullet"/>
+      </w:pPr>
+      <w:r>
+        <w:t>SUCCESS build ESP32-C3 với core 3.3.1, NeoPixel 1.15.5 và ArduinoJson 7.4.3; profile PlatformIO 2.0.17 cũng SUCCESS. Ảnh ứng dụng, giới hạn phân vùng và SHA-256 ghi trong BUILD_INFO.md.</w:t>
+      </w:r>
+    </w:p>
+    <w:p>
+      <w:pPr>
+        <w:pStyle w:val="Heading2"/>
+      </w:pPr>
+      <w:r>
+        <w:t>Chạy thử bổ sung bản 1.2.0 trên đèn</w:t>
       </w:r>
     </w:p>
     <w:tbl>
@@ -2646,7 +3926,7 @@
                 <w:b w:val="0"/>
                 <w:sz w:val="18"/>
               </w:rPr>
-              <w:t>T01</w:t>
+              <w:t>E01</w:t>
             </w:r>
           </w:p>
         </w:tc>
@@ -2663,7 +3943,7 @@
                 <w:b w:val="0"/>
                 <w:sz w:val="18"/>
               </w:rPr>
-              <w:t>Nạp LED_Check để sáng riêng LED 0/9/10/19</w:t>
+              <w:t>Chọn tám hiệu ứng mới trên web, đi vòng bằng M</w:t>
             </w:r>
           </w:p>
         </w:tc>
@@ -2680,7 +3960,7 @@
                 <w:b w:val="0"/>
                 <w:sz w:val="18"/>
               </w:rPr>
-              <w:t>Đúng đáy/đỉnh theo mapping</w:t>
+              <w:t>Đúng tên/mã 6–13; M đi đủ 14 chế độ rồi về Ngủ, ánh sáng hiển thị qua vỏ ổn định</w:t>
             </w:r>
           </w:p>
         </w:tc>
@@ -2697,7 +3977,7 @@
                 <w:b w:val="0"/>
                 <w:sz w:val="18"/>
               </w:rPr>
-              <w:t>Chưa thử</w:t>
+              <w:t>Chưa thử 1.2.0</w:t>
             </w:r>
           </w:p>
         </w:tc>
@@ -2716,7 +3996,7 @@
                 <w:b w:val="0"/>
                 <w:sz w:val="18"/>
               </w:rPr>
-              <w:t>T02</w:t>
+              <w:t>E02</w:t>
             </w:r>
           </w:p>
         </w:tc>
@@ -2733,7 +4013,7 @@
                 <w:b w:val="0"/>
                 <w:sz w:val="18"/>
               </w:rPr>
-              <w:t>Dâng lên</w:t>
+              <w:t>Tốc độ 1/50/100 ở từng hiệu ứng mới</w:t>
             </w:r>
           </w:p>
         </w:tc>
@@ -2750,7 +4030,7 @@
                 <w:b w:val="0"/>
                 <w:sz w:val="18"/>
               </w:rPr>
-              <w:t>Hai đoạn cùng đi từ đáy lên</w:t>
+              <w:t>Tăng tốc độ thấy hiệu ứng chạy nhanh hơn; giữ mode, màu và độ sáng đang chọn</w:t>
             </w:r>
           </w:p>
         </w:tc>
@@ -2767,7 +4047,7 @@
                 <w:b w:val="0"/>
                 <w:sz w:val="18"/>
               </w:rPr>
-              <w:t>Chưa thử</w:t>
+              <w:t>Chưa thử 1.2.0</w:t>
             </w:r>
           </w:p>
         </w:tc>
@@ -2786,7 +4066,7 @@
                 <w:b w:val="0"/>
                 <w:sz w:val="18"/>
               </w:rPr>
-              <w:t>T03</w:t>
+              <w:t>E03</w:t>
             </w:r>
           </w:p>
         </w:tc>
@@ -2803,7 +4083,7 @@
                 <w:b w:val="0"/>
                 <w:sz w:val="18"/>
               </w:rPr>
-              <w:t>Mỗi nút 20 chạm qua vỏ đã lắp</w:t>
+              <w:t>Đổi RGB ở Thở nhẹ, Lấp lánh và Sao băng</w:t>
             </w:r>
           </w:p>
         </w:tc>
@@ -2820,7 +4100,7 @@
                 <w:b w:val="0"/>
                 <w:sz w:val="18"/>
               </w:rPr>
-              <w:t>Một chạm/một lệnh, không chạm giả nút cạnh; phải thử vật lý, không thay bằng mock</w:t>
+              <w:t>Hiệu ứng giữ nguyên, dùng màu mới; các trình duyệt đồng bộ đúng</w:t>
             </w:r>
           </w:p>
         </w:tc>
@@ -2837,7 +4117,7 @@
                 <w:b w:val="0"/>
                 <w:sz w:val="18"/>
               </w:rPr>
-              <w:t>Chưa thử</w:t>
+              <w:t>Chưa thử 1.2.0</w:t>
             </w:r>
           </w:p>
         </w:tc>
@@ -2856,7 +4136,7 @@
                 <w:b w:val="0"/>
                 <w:sz w:val="18"/>
               </w:rPr>
-              <w:t>T04</w:t>
+              <w:t>E04</w:t>
             </w:r>
           </w:p>
         </w:tc>
@@ -2873,7 +4153,7 @@
                 <w:b w:val="0"/>
                 <w:sz w:val="18"/>
               </w:rPr>
-              <w:t>Giữ Nguồn/M rồi thả</w:t>
+              <w:t>Đổi RGB ở các hiệu ứng dùng bảng màu riêng</w:t>
             </w:r>
           </w:p>
         </w:tc>
@@ -2890,7 +4170,7 @@
                 <w:b w:val="0"/>
                 <w:sz w:val="18"/>
               </w:rPr>
-              <w:t>Một lệnh giữ, không thêm chạm ngắn</w:t>
+              <w:t>Chuyển sang Một màu; chọn lại hiệu ứng trở về bảng màu của hiệu ứng</w:t>
             </w:r>
           </w:p>
         </w:tc>
@@ -2907,7 +4187,7 @@
                 <w:b w:val="0"/>
                 <w:sz w:val="18"/>
               </w:rPr>
-              <w:t>Chưa thử</w:t>
+              <w:t>Chưa thử 1.2.0</w:t>
             </w:r>
           </w:p>
         </w:tc>
@@ -2926,7 +4206,7 @@
                 <w:b w:val="0"/>
                 <w:sz w:val="18"/>
               </w:rPr>
-              <w:t>T05</w:t>
+              <w:t>E05</w:t>
             </w:r>
           </w:p>
         </w:tc>
@@ -2943,7 +4223,7 @@
                 <w:b w:val="0"/>
                 <w:sz w:val="18"/>
               </w:rPr>
-              <w:t>Giữ +/− tới hai biên</w:t>
+              <w:t>Lưu/áp dụng mục yêu thích chứa hiệu ứng mới, chờ lưu rồi reboot</w:t>
             </w:r>
           </w:p>
         </w:tc>
@@ -2960,7 +4240,7 @@
                 <w:b w:val="0"/>
                 <w:sz w:val="18"/>
               </w:rPr>
-              <w:t>Dừng 1/100 và dừng khi thả</w:t>
+              <w:t>Khôi phục đúng mode, RGB, độ sáng và tốc độ; không đổi cờ bật/tắt ngoài quy tắc hiện có</w:t>
             </w:r>
           </w:p>
         </w:tc>
@@ -2977,7 +4257,7 @@
                 <w:b w:val="0"/>
                 <w:sz w:val="18"/>
               </w:rPr>
-              <w:t>Chưa thử</w:t>
+              <w:t>Chưa thử 1.2.0</w:t>
             </w:r>
           </w:p>
         </w:tc>
@@ -2996,7 +4276,7 @@
                 <w:b w:val="0"/>
                 <w:sz w:val="18"/>
               </w:rPr>
-              <w:t>T06</w:t>
+              <w:t>E06</w:t>
             </w:r>
           </w:p>
         </w:tc>
@@ -3013,7 +4293,7 @@
                 <w:b w:val="0"/>
                 <w:sz w:val="18"/>
               </w:rPr>
-              <w:t>Khi tắt chạm +/−/M</w:t>
+              <w:t>OTA 1.1.0 → 1.2.0 với cấu hình và ba mục yêu thích cũ</w:t>
             </w:r>
           </w:p>
         </w:tc>
@@ -3030,7 +4310,7 @@
                 <w:b w:val="0"/>
                 <w:sz w:val="18"/>
               </w:rPr>
-              <w:t>Không tự bật; Nguồn bật cấu hình cũ</w:t>
+              <w:t>Giữ mã chế độ cũ, cấu hình đèn, WiFi, tên và hostname sau reboot/lưu mới</w:t>
             </w:r>
           </w:p>
         </w:tc>
@@ -3047,7 +4327,7 @@
                 <w:b w:val="0"/>
                 <w:sz w:val="18"/>
               </w:rPr>
-              <w:t>Chưa thử</w:t>
+              <w:t>Chưa thử 1.2.0</w:t>
             </w:r>
           </w:p>
         </w:tc>
@@ -3066,7 +4346,7 @@
                 <w:b w:val="0"/>
                 <w:sz w:val="18"/>
               </w:rPr>
-              <w:t>T07</w:t>
+              <w:t>E07</w:t>
             </w:r>
           </w:p>
         </w:tc>
@@ -3083,7 +4363,7 @@
                 <w:b w:val="0"/>
                 <w:sz w:val="18"/>
               </w:rPr>
-              <w:t>Hai trình duyệt và cảm ứng</w:t>
+              <w:t>Đọc Hướng dẫn sử dụng trên điện thoại và PC</w:t>
             </w:r>
           </w:p>
         </w:tc>
@@ -3100,7 +4380,7 @@
                 <w:b w:val="0"/>
                 <w:sz w:val="18"/>
               </w:rPr>
-              <w:t>Cùng trạng thái; mục tiêu ≤500 ms ở LAN ổn định</w:t>
+              <w:t>Mở được ngay trong web, thao tác và bảng chế độ đúng; nội dung đọc được, không tràn ngang</w:t>
             </w:r>
           </w:p>
         </w:tc>
@@ -3117,7 +4397,7 @@
                 <w:b w:val="0"/>
                 <w:sz w:val="18"/>
               </w:rPr>
-              <w:t>Chưa thử</w:t>
+              <w:t>Chưa thử 1.2.0</w:t>
             </w:r>
           </w:p>
         </w:tc>
@@ -3136,7 +4416,7 @@
                 <w:b w:val="0"/>
                 <w:sz w:val="18"/>
               </w:rPr>
-              <w:t>T08</w:t>
+              <w:t>E08</w:t>
             </w:r>
           </w:p>
         </w:tc>
@@ -3153,7 +4433,7 @@
                 <w:b w:val="0"/>
                 <w:sz w:val="18"/>
               </w:rPr>
-              <w:t>Chỉnh giây 0 và giây 6</w:t>
+              <w:t>Bật/tắt, chỉnh sáng và hẹn giờ khi chạy hiệu ứng mới</w:t>
             </w:r>
           </w:p>
         </w:tc>
@@ -3170,7 +4450,7 @@
                 <w:b w:val="0"/>
                 <w:sz w:val="18"/>
               </w:rPr>
-              <w:t>Chỉ lưu khoảng giây 16</w:t>
+              <w:t>Trần và độ sáng áp dụng; tắt RGB 0; giảm/tắt theo timer và hủy timer đúng quy tắc</w:t>
             </w:r>
           </w:p>
         </w:tc>
@@ -3187,7 +4467,107 @@
                 <w:b w:val="0"/>
                 <w:sz w:val="18"/>
               </w:rPr>
-              <w:t>Chưa thử</w:t>
+              <w:t>Chưa thử 1.2.0</w:t>
+            </w:r>
+          </w:p>
+        </w:tc>
+      </w:tr>
+    </w:tbl>
+    <w:p/>
+    <w:p>
+      <w:pPr>
+        <w:pStyle w:val="Heading2"/>
+      </w:pPr>
+      <w:r>
+        <w:t>Bảng chạy thử trên thiết bị</w:t>
+      </w:r>
+    </w:p>
+    <w:p>
+      <w:r>
+        <w:t>Ghi Ngày / Kết quả / Ghi chú cho từng dòng. Các ca nền T/N/O giữ lại để bổ sung kết quả cụ thể; trạng thái chưa ghi kết quả không phủ nhận việc người dùng đã lắp và dùng đèn. Mục tiêu về thời gian cần đo trên mạng thực tế.</w:t>
+      </w:r>
+    </w:p>
+    <w:tbl>
+      <w:tblPr>
+        <w:tblStyle w:val="LightShading-Accent1"/>
+        <w:tblW w:type="auto" w:w="0"/>
+        <w:tblLook w:firstColumn="1" w:firstRow="1" w:lastColumn="0" w:lastRow="0" w:noHBand="0" w:noVBand="1" w:val="04A0"/>
+      </w:tblPr>
+      <w:tblGrid>
+        <w:gridCol w:w="2409"/>
+        <w:gridCol w:w="2409"/>
+        <w:gridCol w:w="2409"/>
+        <w:gridCol w:w="2409"/>
+      </w:tblGrid>
+      <w:tr>
+        <w:trPr>
+          <w:tblHeader/>
+        </w:trPr>
+        <w:tc>
+          <w:tcPr>
+            <w:tcW w:type="dxa" w:w="2409"/>
+          </w:tcPr>
+          <w:p>
+            <w:pPr>
+              <w:spacing w:after="60"/>
+            </w:pPr>
+            <w:r>
+              <w:rPr>
+                <w:b/>
+                <w:sz w:val="18"/>
+              </w:rPr>
+              <w:t>Mã</w:t>
+            </w:r>
+          </w:p>
+        </w:tc>
+        <w:tc>
+          <w:tcPr>
+            <w:tcW w:type="dxa" w:w="2409"/>
+          </w:tcPr>
+          <w:p>
+            <w:pPr>
+              <w:spacing w:after="60"/>
+            </w:pPr>
+            <w:r>
+              <w:rPr>
+                <w:b/>
+                <w:sz w:val="18"/>
+              </w:rPr>
+              <w:t>Kiểm tra</w:t>
+            </w:r>
+          </w:p>
+        </w:tc>
+        <w:tc>
+          <w:tcPr>
+            <w:tcW w:type="dxa" w:w="2409"/>
+          </w:tcPr>
+          <w:p>
+            <w:pPr>
+              <w:spacing w:after="60"/>
+            </w:pPr>
+            <w:r>
+              <w:rPr>
+                <w:b/>
+                <w:sz w:val="18"/>
+              </w:rPr>
+              <w:t>Cần đạt</w:t>
+            </w:r>
+          </w:p>
+        </w:tc>
+        <w:tc>
+          <w:tcPr>
+            <w:tcW w:type="dxa" w:w="2409"/>
+          </w:tcPr>
+          <w:p>
+            <w:pPr>
+              <w:spacing w:after="60"/>
+            </w:pPr>
+            <w:r>
+              <w:rPr>
+                <w:b/>
+                <w:sz w:val="18"/>
+              </w:rPr>
+              <w:t>Kết quả thực tế</w:t>
             </w:r>
           </w:p>
         </w:tc>
@@ -3206,7 +4586,7 @@
                 <w:b w:val="0"/>
                 <w:sz w:val="18"/>
               </w:rPr>
-              <w:t>T09</w:t>
+              <w:t>T01</w:t>
             </w:r>
           </w:p>
         </w:tc>
@@ -3223,7 +4603,7 @@
                 <w:b w:val="0"/>
                 <w:sz w:val="18"/>
               </w:rPr>
-              <w:t>Rút nguồn trước/sau mốc lưu</w:t>
+              <w:t>Nạp LED_Check để sáng riêng LED 0/9/10/19</w:t>
             </w:r>
           </w:p>
         </w:tc>
@@ -3240,7 +4620,7 @@
                 <w:b w:val="0"/>
                 <w:sz w:val="18"/>
               </w:rPr>
-              <w:t>Về bản cũ/bản mới tương ứng</w:t>
+              <w:t>Đúng đáy/đỉnh theo mapping</w:t>
             </w:r>
           </w:p>
         </w:tc>
@@ -3257,7 +4637,7 @@
                 <w:b w:val="0"/>
                 <w:sz w:val="18"/>
               </w:rPr>
-              <w:t>Chưa thử</w:t>
+              <w:t>Chưa ghi kết quả từng ca</w:t>
             </w:r>
           </w:p>
         </w:tc>
@@ -3276,7 +4656,7 @@
                 <w:b w:val="0"/>
                 <w:sz w:val="18"/>
               </w:rPr>
-              <w:t>T10</w:t>
+              <w:t>T02</w:t>
             </w:r>
           </w:p>
         </w:tc>
@@ -3293,7 +4673,7 @@
                 <w:b w:val="0"/>
                 <w:sz w:val="18"/>
               </w:rPr>
-              <w:t>Chạy hiệu ứng không thao tác</w:t>
+              <w:t>Dâng lên</w:t>
             </w:r>
           </w:p>
         </w:tc>
@@ -3310,7 +4690,7 @@
                 <w:b w:val="0"/>
                 <w:sz w:val="18"/>
               </w:rPr>
-              <w:t>Bộ đếm writes không tăng theo frame</w:t>
+              <w:t>Hai đoạn cùng đi từ đáy lên</w:t>
             </w:r>
           </w:p>
         </w:tc>
@@ -3327,7 +4707,7 @@
                 <w:b w:val="0"/>
                 <w:sz w:val="18"/>
               </w:rPr>
-              <w:t>Chưa thử</w:t>
+              <w:t>Chưa ghi kết quả từng ca</w:t>
             </w:r>
           </w:p>
         </w:tc>
@@ -3346,7 +4726,7 @@
                 <w:b w:val="0"/>
                 <w:sz w:val="18"/>
               </w:rPr>
-              <w:t>T11</w:t>
+              <w:t>T03</w:t>
             </w:r>
           </w:p>
         </w:tc>
@@ -3363,7 +4743,7 @@
                 <w:b w:val="0"/>
                 <w:sz w:val="18"/>
               </w:rPr>
-              <w:t>Hẹn/hủy/hết giờ</w:t>
+              <w:t>Mỗi nút 20 chạm qua vỏ đã lắp</w:t>
             </w:r>
           </w:p>
         </w:tc>
@@ -3380,7 +4760,7 @@
                 <w:b w:val="0"/>
                 <w:sz w:val="18"/>
               </w:rPr>
-              <w:t>Giảm sáng và tắt; timer không khôi phục qua reset</w:t>
+              <w:t>Một chạm/một lệnh, không chạm giả nút cạnh; phải thử vật lý, không thay bằng mock</w:t>
             </w:r>
           </w:p>
         </w:tc>
@@ -3397,7 +4777,7 @@
                 <w:b w:val="0"/>
                 <w:sz w:val="18"/>
               </w:rPr>
-              <w:t>Chưa thử</w:t>
+              <w:t>Chưa ghi kết quả từng ca</w:t>
             </w:r>
           </w:p>
         </w:tc>
@@ -3416,7 +4796,7 @@
                 <w:b w:val="0"/>
                 <w:sz w:val="18"/>
               </w:rPr>
-              <w:t>T12</w:t>
+              <w:t>T04</w:t>
             </w:r>
           </w:p>
         </w:tc>
@@ -3433,7 +4813,7 @@
                 <w:b w:val="0"/>
                 <w:sz w:val="18"/>
               </w:rPr>
-              <w:t>Tắt router/nhập sai WiFi</w:t>
+              <w:t>Giữ Nguồn/M rồi thả</w:t>
             </w:r>
           </w:p>
         </w:tc>
@@ -3450,7 +4830,7 @@
                 <w:b w:val="0"/>
                 <w:sz w:val="18"/>
               </w:rPr>
-              <w:t>AP không mật khẩu mở sau 30 giây, đèn vẫn điều khiển cảm ứng được</w:t>
+              <w:t>Một lệnh giữ, không thêm chạm ngắn</w:t>
             </w:r>
           </w:p>
         </w:tc>
@@ -3467,7 +4847,7 @@
                 <w:b w:val="0"/>
                 <w:sz w:val="18"/>
               </w:rPr>
-              <w:t>Chưa thử</w:t>
+              <w:t>Chưa ghi kết quả từng ca</w:t>
             </w:r>
           </w:p>
         </w:tc>
@@ -3486,7 +4866,7 @@
                 <w:b w:val="0"/>
                 <w:sz w:val="18"/>
               </w:rPr>
-              <w:t>T13</w:t>
+              <w:t>T05</w:t>
             </w:r>
           </w:p>
         </w:tc>
@@ -3503,7 +4883,7 @@
                 <w:b w:val="0"/>
                 <w:sz w:val="18"/>
               </w:rPr>
-              <w:t>Tải trắng cap 30% và WiFi 30 phút</w:t>
+              <w:t>Giữ +/− tới hai biên</w:t>
             </w:r>
           </w:p>
         </w:tc>
@@ -3520,7 +4900,7 @@
                 <w:b w:val="0"/>
                 <w:sz w:val="18"/>
               </w:rPr>
-              <w:t>Ghi dòng/áp/nhiệt; không reset hoặc sai màu</w:t>
+              <w:t>Dừng 1/100 và dừng khi thả</w:t>
             </w:r>
           </w:p>
         </w:tc>
@@ -3537,7 +4917,7 @@
                 <w:b w:val="0"/>
                 <w:sz w:val="18"/>
               </w:rPr>
-              <w:t>Chưa thử</w:t>
+              <w:t>Chưa ghi kết quả từng ca</w:t>
             </w:r>
           </w:p>
         </w:tc>
@@ -3556,7 +4936,7 @@
                 <w:b w:val="0"/>
                 <w:sz w:val="18"/>
               </w:rPr>
-              <w:t>T14</w:t>
+              <w:t>T06</w:t>
             </w:r>
           </w:p>
         </w:tc>
@@ -3573,7 +4953,7 @@
                 <w:b w:val="0"/>
                 <w:sz w:val="18"/>
               </w:rPr>
-              <w:t>Tắt, đợi lưu, nạp USB giữ NVS</w:t>
+              <w:t>Khi tắt chạm +/−/M</w:t>
             </w:r>
           </w:p>
         </w:tc>
@@ -3590,7 +4970,7 @@
                 <w:b w:val="0"/>
                 <w:sz w:val="18"/>
               </w:rPr>
-              <w:t>Sau boot vẫn tắt, cảm ứng bật được</w:t>
+              <w:t>Không tự bật; Nguồn bật cấu hình cũ</w:t>
             </w:r>
           </w:p>
         </w:tc>
@@ -3607,7 +4987,7 @@
                 <w:b w:val="0"/>
                 <w:sz w:val="18"/>
               </w:rPr>
-              <w:t>Chưa thử</w:t>
+              <w:t>Chưa ghi kết quả từng ca</w:t>
             </w:r>
           </w:p>
         </w:tc>
@@ -3626,7 +5006,7 @@
                 <w:b w:val="0"/>
                 <w:sz w:val="18"/>
               </w:rPr>
-              <w:t>T15</w:t>
+              <w:t>T07</w:t>
             </w:r>
           </w:p>
         </w:tc>
@@ -3643,7 +5023,7 @@
                 <w:b w:val="0"/>
                 <w:sz w:val="18"/>
               </w:rPr>
-              <w:t>Quét sáng 1–100</w:t>
+              <w:t>Hai trình duyệt và cảm ứng</w:t>
             </w:r>
           </w:p>
         </w:tc>
@@ -3660,7 +5040,7 @@
                 <w:b w:val="0"/>
                 <w:sz w:val="18"/>
               </w:rPr>
-              <w:t>Không giảm hoặc vượt cap; cho phép mức trùng</w:t>
+              <w:t>Cùng trạng thái; mục tiêu ≤500 ms ở LAN ổn định</w:t>
             </w:r>
           </w:p>
         </w:tc>
@@ -3677,7 +5057,7 @@
                 <w:b w:val="0"/>
                 <w:sz w:val="18"/>
               </w:rPr>
-              <w:t>Chưa thử</w:t>
+              <w:t>Chưa ghi kết quả từng ca</w:t>
             </w:r>
           </w:p>
         </w:tc>
@@ -3696,7 +5076,7 @@
                 <w:b w:val="0"/>
                 <w:sz w:val="18"/>
               </w:rPr>
-              <w:t>T16</w:t>
+              <w:t>T08</w:t>
             </w:r>
           </w:p>
         </w:tc>
@@ -3713,7 +5093,7 @@
                 <w:b w:val="0"/>
                 <w:sz w:val="18"/>
               </w:rPr>
-              <w:t>Ngủ, giữ sáng và fade trong phòng tối</w:t>
+              <w:t>Chỉnh giây 0 và giây 6</w:t>
             </w:r>
           </w:p>
         </w:tc>
@@ -3730,7 +5110,7 @@
                 <w:b w:val="0"/>
                 <w:sz w:val="18"/>
               </w:rPr>
-              <w:t>Ghi màu/bước nhảy/nhấp nháy để hiệu chỉnh</w:t>
+              <w:t>Chỉ lưu khoảng giây 16</w:t>
             </w:r>
           </w:p>
         </w:tc>
@@ -3747,7 +5127,7 @@
                 <w:b w:val="0"/>
                 <w:sz w:val="18"/>
               </w:rPr>
-              <w:t>Chưa thử</w:t>
+              <w:t>Chưa ghi kết quả từng ca</w:t>
             </w:r>
           </w:p>
         </w:tc>
@@ -3766,7 +5146,7 @@
                 <w:b w:val="0"/>
                 <w:sz w:val="18"/>
               </w:rPr>
-              <w:t>N01</w:t>
+              <w:t>T09</w:t>
             </w:r>
           </w:p>
         </w:tc>
@@ -3783,7 +5163,7 @@
                 <w:b w:val="0"/>
                 <w:sz w:val="18"/>
               </w:rPr>
-              <w:t>Chưa nối bốn module cảm ứng</w:t>
+              <w:t>Rút nguồn trước/sau mốc lưu</w:t>
             </w:r>
           </w:p>
         </w:tc>
@@ -3800,7 +5180,7 @@
                 <w:b w:val="0"/>
                 <w:sz w:val="18"/>
               </w:rPr>
-              <w:t>Chân INPUT_PULLDOWN không tự sinh lệnh sau boot</w:t>
+              <w:t>Về bản cũ/bản mới tương ứng</w:t>
             </w:r>
           </w:p>
         </w:tc>
@@ -3817,7 +5197,7 @@
                 <w:b w:val="0"/>
                 <w:sz w:val="18"/>
               </w:rPr>
-              <w:t>Chưa thử</w:t>
+              <w:t>Chưa ghi kết quả từng ca</w:t>
             </w:r>
           </w:p>
         </w:tc>
@@ -3836,7 +5216,7 @@
                 <w:b w:val="0"/>
                 <w:sz w:val="18"/>
               </w:rPr>
-              <w:t>N02</w:t>
+              <w:t>T10</w:t>
             </w:r>
           </w:p>
         </w:tc>
@@ -3853,7 +5233,7 @@
                 <w:b w:val="0"/>
                 <w:sz w:val="18"/>
               </w:rPr>
-              <w:t>Lần đầu hoặc xóa WiFi</w:t>
+              <w:t>Chạy hiệu ứng không thao tác</w:t>
             </w:r>
           </w:p>
         </w:tc>
@@ -3870,7 +5250,7 @@
                 <w:b w:val="0"/>
                 <w:sz w:val="18"/>
               </w:rPr>
-              <w:t>AP DenDeco-XXXXXX mở không mật khẩu; web http://192.168.4.1 dùng được</w:t>
+              <w:t>Bộ đếm writes không tăng theo frame</w:t>
             </w:r>
           </w:p>
         </w:tc>
@@ -3887,7 +5267,7 @@
                 <w:b w:val="0"/>
                 <w:sz w:val="18"/>
               </w:rPr>
-              <w:t>Chưa thử</w:t>
+              <w:t>Chưa ghi kết quả từng ca</w:t>
             </w:r>
           </w:p>
         </w:tc>
@@ -3906,7 +5286,7 @@
                 <w:b w:val="0"/>
                 <w:sz w:val="18"/>
               </w:rPr>
-              <w:t>N03</w:t>
+              <w:t>T11</w:t>
             </w:r>
           </w:p>
         </w:tc>
@@ -3923,7 +5303,7 @@
                 <w:b w:val="0"/>
                 <w:sz w:val="18"/>
               </w:rPr>
-              <w:t>Quét/chọn mạng 2,4 GHz</w:t>
+              <w:t>Hẹn/hủy/hết giờ</w:t>
             </w:r>
           </w:p>
         </w:tc>
@@ -3940,7 +5320,7 @@
                 <w:b w:val="0"/>
                 <w:sz w:val="18"/>
               </w:rPr>
-              <w:t>Hiển thị đang quét/kết quả/lỗi; chọn điền SSID; cảm ứng và hiệu ứng tiếp tục</w:t>
+              <w:t>Giảm sáng và tắt; timer không khôi phục qua reset</w:t>
             </w:r>
           </w:p>
         </w:tc>
@@ -3957,7 +5337,7 @@
                 <w:b w:val="0"/>
                 <w:sz w:val="18"/>
               </w:rPr>
-              <w:t>Chưa thử</w:t>
+              <w:t>Chưa ghi kết quả từng ca</w:t>
             </w:r>
           </w:p>
         </w:tc>
@@ -3976,7 +5356,7 @@
                 <w:b w:val="0"/>
                 <w:sz w:val="18"/>
               </w:rPr>
-              <w:t>N04</w:t>
+              <w:t>T12</w:t>
             </w:r>
           </w:p>
         </w:tc>
@@ -3993,7 +5373,7 @@
                 <w:b w:val="0"/>
                 <w:sz w:val="18"/>
               </w:rPr>
-              <w:t>Mạng ẩn, mạng mở, mật khẩu sai</w:t>
+              <w:t>Tắt router/nhập sai WiFi</w:t>
             </w:r>
           </w:p>
         </w:tc>
@@ -4010,7 +5390,7 @@
                 <w:b w:val="0"/>
                 <w:sz w:val="18"/>
               </w:rPr>
-              <w:t>Nhập SSID thủ công; mạng mở không mật khẩu; sai mật khẩu có trạng thái và AP dự phòng</w:t>
+              <w:t>AP không mật khẩu mở sau 30 giây, đèn vẫn điều khiển cảm ứng được</w:t>
             </w:r>
           </w:p>
         </w:tc>
@@ -4027,7 +5407,7 @@
                 <w:b w:val="0"/>
                 <w:sz w:val="18"/>
               </w:rPr>
-              <w:t>Chưa thử</w:t>
+              <w:t>Chưa ghi kết quả từng ca</w:t>
             </w:r>
           </w:p>
         </w:tc>
@@ -4046,7 +5426,7 @@
                 <w:b w:val="0"/>
                 <w:sz w:val="18"/>
               </w:rPr>
-              <w:t>N05</w:t>
+              <w:t>T13</w:t>
             </w:r>
           </w:p>
         </w:tc>
@@ -4063,7 +5443,7 @@
                 <w:b w:val="0"/>
                 <w:sz w:val="18"/>
               </w:rPr>
-              <w:t>Lưu WiFi đúng khi đang dùng AP</w:t>
+              <w:t>Tải trắng cap 30% và WiFi 30 phút</w:t>
             </w:r>
           </w:p>
         </w:tc>
@@ -4080,7 +5460,7 @@
                 <w:b w:val="0"/>
                 <w:sz w:val="18"/>
               </w:rPr>
-              <w:t>Khi nhận IP DHCP, AP tắt ngay; chuyển về WiFi nhà mở được web</w:t>
+              <w:t>Ghi dòng/áp/nhiệt; không reset hoặc sai màu</w:t>
             </w:r>
           </w:p>
         </w:tc>
@@ -4097,7 +5477,7 @@
                 <w:b w:val="0"/>
                 <w:sz w:val="18"/>
               </w:rPr>
-              <w:t>Chưa thử</w:t>
+              <w:t>Chưa ghi kết quả từng ca</w:t>
             </w:r>
           </w:p>
         </w:tc>
@@ -4116,7 +5496,7 @@
                 <w:b w:val="0"/>
                 <w:sz w:val="18"/>
               </w:rPr>
-              <w:t>N06</w:t>
+              <w:t>T14</w:t>
             </w:r>
           </w:p>
         </w:tc>
@@ -4133,7 +5513,7 @@
                 <w:b w:val="0"/>
                 <w:sz w:val="18"/>
               </w:rPr>
-              <w:t>Router tắt rồi bật lại</w:t>
+              <w:t>Tắt, đợi lưu, nạp USB giữ NVS</w:t>
             </w:r>
           </w:p>
         </w:tc>
@@ -4150,7 +5530,7 @@
                 <w:b w:val="0"/>
                 <w:sz w:val="18"/>
               </w:rPr>
-              <w:t>AP mở sau 30 giây mất mạng; tự nối lại và AP tắt khi nhận IP, không cần reboot</w:t>
+              <w:t>Sau boot vẫn tắt, cảm ứng bật được</w:t>
             </w:r>
           </w:p>
         </w:tc>
@@ -4167,7 +5547,7 @@
                 <w:b w:val="0"/>
                 <w:sz w:val="18"/>
               </w:rPr>
-              <w:t>Chưa thử</w:t>
+              <w:t>Chưa ghi kết quả từng ca</w:t>
             </w:r>
           </w:p>
         </w:tc>
@@ -4186,7 +5566,7 @@
                 <w:b w:val="0"/>
                 <w:sz w:val="18"/>
               </w:rPr>
-              <w:t>N07</w:t>
+              <w:t>T15</w:t>
             </w:r>
           </w:p>
         </w:tc>
@@ -4203,7 +5583,7 @@
                 <w:b w:val="0"/>
                 <w:sz w:val="18"/>
               </w:rPr>
-              <w:t>http://den-deco.local và đổi hostname</w:t>
+              <w:t>Quét sáng 1–100</w:t>
             </w:r>
           </w:p>
         </w:tc>
@@ -4220,7 +5600,7 @@
                 <w:b w:val="0"/>
                 <w:sz w:val="18"/>
               </w:rPr>
-              <w:t>Cùng LAN mở được tên hỗ trợ mDNS; địa chỉ mới đúng; IP dự phòng truy cập được</w:t>
+              <w:t>Không giảm hoặc vượt cap; cho phép mức trùng</w:t>
             </w:r>
           </w:p>
         </w:tc>
@@ -4237,7 +5617,7 @@
                 <w:b w:val="0"/>
                 <w:sz w:val="18"/>
               </w:rPr>
-              <w:t>Chưa thử</w:t>
+              <w:t>Chưa ghi kết quả từng ca</w:t>
             </w:r>
           </w:p>
         </w:tc>
@@ -4256,7 +5636,7 @@
                 <w:b w:val="0"/>
                 <w:sz w:val="18"/>
               </w:rPr>
-              <w:t>N08</w:t>
+              <w:t>T16</w:t>
             </w:r>
           </w:p>
         </w:tc>
@@ -4273,7 +5653,7 @@
                 <w:b w:val="0"/>
                 <w:sz w:val="18"/>
               </w:rPr>
-              <w:t>Hai đèn trên cùng LAN</w:t>
+              <w:t>Ngủ, giữ sáng và fade trong phòng tối</w:t>
             </w:r>
           </w:p>
         </w:tc>
@@ -4290,7 +5670,7 @@
                 <w:b w:val="0"/>
                 <w:sz w:val="18"/>
               </w:rPr>
-              <w:t>Đặt hostname riêng; địa chỉ thực tế mở đúng từng đèn, kiểm tra cả trường hợp trùng tên</w:t>
+              <w:t>Ghi màu/bước nhảy/nhấp nháy để hiệu chỉnh</w:t>
             </w:r>
           </w:p>
         </w:tc>
@@ -4307,7 +5687,7 @@
                 <w:b w:val="0"/>
                 <w:sz w:val="18"/>
               </w:rPr>
-              <w:t>Chưa thử</w:t>
+              <w:t>Chưa ghi kết quả từng ca</w:t>
             </w:r>
           </w:p>
         </w:tc>
@@ -4326,7 +5706,7 @@
                 <w:b w:val="0"/>
                 <w:sz w:val="18"/>
               </w:rPr>
-              <w:t>N09</w:t>
+              <w:t>N01</w:t>
             </w:r>
           </w:p>
         </w:tc>
@@ -4343,7 +5723,7 @@
                 <w:b w:val="0"/>
                 <w:sz w:val="18"/>
               </w:rPr>
-              <w:t>Giữ đúng +/− 5 giây qua vỏ</w:t>
+              <w:t>Chưa nối bốn module cảm ứng</w:t>
             </w:r>
           </w:p>
         </w:tc>
@@ -4360,7 +5740,7 @@
                 <w:b w:val="0"/>
                 <w:sz w:val="18"/>
               </w:rPr>
-              <w:t>Xóa chỉ WiFi nhà, mở AP; LED, favorites, tên đèn/hostname giữ nguyên; chỉ reset một lần</w:t>
+              <w:t>Chân INPUT_PULLDOWN không tự sinh lệnh sau boot</w:t>
             </w:r>
           </w:p>
         </w:tc>
@@ -4377,7 +5757,7 @@
                 <w:b w:val="0"/>
                 <w:sz w:val="18"/>
               </w:rPr>
-              <w:t>Chưa thử</w:t>
+              <w:t>Chưa ghi kết quả từng ca</w:t>
             </w:r>
           </w:p>
         </w:tc>
@@ -4396,7 +5776,7 @@
                 <w:b w:val="0"/>
                 <w:sz w:val="18"/>
               </w:rPr>
-              <w:t>N10</w:t>
+              <w:t>N02</w:t>
             </w:r>
           </w:p>
         </w:tc>
@@ -4413,7 +5793,7 @@
                 <w:b w:val="0"/>
                 <w:sz w:val="18"/>
               </w:rPr>
-              <w:t>Giữ +/− dưới 5 giây, thêm Nguồn/M, giữ lúc boot</w:t>
+              <w:t>Lần đầu hoặc xóa WiFi</w:t>
             </w:r>
           </w:p>
         </w:tc>
@@ -4430,7 +5810,7 @@
                 <w:b w:val="0"/>
                 <w:sz w:val="18"/>
               </w:rPr>
-              <w:t>Không reset nhầm; thả hết rồi thao tác lại bình thường</w:t>
+              <w:t>AP DenDeco-XXXXXX mở không mật khẩu; web http://192.168.4.1 dùng được</w:t>
             </w:r>
           </w:p>
         </w:tc>
@@ -4447,7 +5827,7 @@
                 <w:b w:val="0"/>
                 <w:sz w:val="18"/>
               </w:rPr>
-              <w:t>Chưa thử</w:t>
+              <w:t>Chưa ghi kết quả từng ca</w:t>
             </w:r>
           </w:p>
         </w:tc>
@@ -4466,7 +5846,7 @@
                 <w:b w:val="0"/>
                 <w:sz w:val="18"/>
               </w:rPr>
-              <w:t>N11</w:t>
+              <w:t>N03</w:t>
             </w:r>
           </w:p>
         </w:tc>
@@ -4483,7 +5863,7 @@
                 <w:b w:val="0"/>
                 <w:sz w:val="18"/>
               </w:rPr>
-              <w:t>Hai đèn cùng hostname; tạo thêm trùng tên với hậu tố</w:t>
+              <w:t>Quét/chọn mạng 2,4 GHz</w:t>
             </w:r>
           </w:p>
         </w:tc>
@@ -4500,7 +5880,7 @@
                 <w:b w:val="0"/>
                 <w:sz w:val="18"/>
               </w:rPr>
-              <w:t>Tên thực tế thêm mã bo viết thường rồi số khi cần; web/Serial báo đúng; tên đã lưu giữ nguyên, mở đúng từng đèn</w:t>
+              <w:t>Hiển thị đang quét/kết quả/lỗi; chọn điền SSID; cảm ứng và hiệu ứng tiếp tục</w:t>
             </w:r>
           </w:p>
         </w:tc>
@@ -4517,7 +5897,7 @@
                 <w:b w:val="0"/>
                 <w:sz w:val="18"/>
               </w:rPr>
-              <w:t>Chưa thử</w:t>
+              <w:t>Chưa ghi kết quả từng ca</w:t>
             </w:r>
           </w:p>
         </w:tc>
@@ -4536,7 +5916,7 @@
                 <w:b w:val="0"/>
                 <w:sz w:val="18"/>
               </w:rPr>
-              <w:t>O01</w:t>
+              <w:t>N04</w:t>
             </w:r>
           </w:p>
         </w:tc>
@@ -4553,7 +5933,7 @@
                 <w:b w:val="0"/>
                 <w:sz w:val="18"/>
               </w:rPr>
-              <w:t>OTA đúng file qua WiFi nhà</w:t>
+              <w:t>Mạng ẩn, mạng mở, mật khẩu sai</w:t>
             </w:r>
           </w:p>
         </w:tc>
@@ -4570,7 +5950,7 @@
                 <w:b w:val="0"/>
                 <w:sz w:val="18"/>
               </w:rPr>
-              <w:t>Thành công, reboot, đúng phiên bản, giữ cấu hình/WiFi</w:t>
+              <w:t>Nhập SSID thủ công; mạng mở không mật khẩu; sai mật khẩu có trạng thái và AP dự phòng</w:t>
             </w:r>
           </w:p>
         </w:tc>
@@ -4587,7 +5967,7 @@
                 <w:b w:val="0"/>
                 <w:sz w:val="18"/>
               </w:rPr>
-              <w:t>Chưa thử</w:t>
+              <w:t>Chưa ghi kết quả từng ca</w:t>
             </w:r>
           </w:p>
         </w:tc>
@@ -4606,7 +5986,7 @@
                 <w:b w:val="0"/>
                 <w:sz w:val="18"/>
               </w:rPr>
-              <w:t>O02</w:t>
+              <w:t>N05</w:t>
             </w:r>
           </w:p>
         </w:tc>
@@ -4623,7 +6003,7 @@
                 <w:b w:val="0"/>
                 <w:sz w:val="18"/>
               </w:rPr>
-              <w:t>OTA qua AP</w:t>
+              <w:t>Lưu WiFi đúng khi đang dùng AP</w:t>
             </w:r>
           </w:p>
         </w:tc>
@@ -4640,7 +6020,7 @@
                 <w:b w:val="0"/>
                 <w:sz w:val="18"/>
               </w:rPr>
-              <w:t>Thành công; sau reboot AP/STA đúng cấu hình; nếu nhận IP WiFi nhà, AP tắt</w:t>
+              <w:t>Khi nhận IP DHCP, AP tắt ngay; chuyển về WiFi nhà mở được web</w:t>
             </w:r>
           </w:p>
         </w:tc>
@@ -4657,7 +6037,7 @@
                 <w:b w:val="0"/>
                 <w:sz w:val="18"/>
               </w:rPr>
-              <w:t>Chưa thử</w:t>
+              <w:t>Chưa ghi kết quả từng ca</w:t>
             </w:r>
           </w:p>
         </w:tc>
@@ -4676,7 +6056,7 @@
                 <w:b w:val="0"/>
                 <w:sz w:val="18"/>
               </w:rPr>
-              <w:t>O03</w:t>
+              <w:t>N06</w:t>
             </w:r>
           </w:p>
         </w:tc>
@@ -4693,7 +6073,7 @@
                 <w:b w:val="0"/>
                 <w:sz w:val="18"/>
               </w:rPr>
-              <w:t>File sai chip/bootloader/merged/quá lớn</w:t>
+              <w:t>Router tắt rồi bật lại</w:t>
             </w:r>
           </w:p>
         </w:tc>
@@ -4710,7 +6090,7 @@
                 <w:b w:val="0"/>
                 <w:sz w:val="18"/>
               </w:rPr>
-              <w:t>Từ chối; firmware hiện tại còn hoạt động</w:t>
+              <w:t>AP mở sau 30 giây mất mạng; tự nối lại và AP tắt khi nhận IP, không cần reboot</w:t>
             </w:r>
           </w:p>
         </w:tc>
@@ -4727,7 +6107,7 @@
                 <w:b w:val="0"/>
                 <w:sz w:val="18"/>
               </w:rPr>
-              <w:t>Chưa thử</w:t>
+              <w:t>Chưa ghi kết quả từng ca</w:t>
             </w:r>
           </w:p>
         </w:tc>
@@ -4746,7 +6126,7 @@
                 <w:b w:val="0"/>
                 <w:sz w:val="18"/>
               </w:rPr>
-              <w:t>O04</w:t>
+              <w:t>N07</w:t>
             </w:r>
           </w:p>
         </w:tc>
@@ -4763,7 +6143,7 @@
                 <w:b w:val="0"/>
                 <w:sz w:val="18"/>
               </w:rPr>
-              <w:t>Ngắt upload giữa chừng</w:t>
+              <w:t>http://den-deco.local và đổi hostname</w:t>
             </w:r>
           </w:p>
         </w:tc>
@@ -4780,7 +6160,7 @@
                 <w:b w:val="0"/>
                 <w:sz w:val="18"/>
               </w:rPr>
-              <w:t>Ứng dụng đang chạy được giữ, điều khiển hoạt động lại</w:t>
+              <w:t>Cùng LAN mở được tên hỗ trợ mDNS; địa chỉ mới đúng; IP dự phòng truy cập được</w:t>
             </w:r>
           </w:p>
         </w:tc>
@@ -4797,7 +6177,7 @@
                 <w:b w:val="0"/>
                 <w:sz w:val="18"/>
               </w:rPr>
-              <w:t>Chưa thử</w:t>
+              <w:t>Chưa ghi kết quả từng ca</w:t>
             </w:r>
           </w:p>
         </w:tc>
@@ -4816,7 +6196,7 @@
                 <w:b w:val="0"/>
                 <w:sz w:val="18"/>
               </w:rPr>
-              <w:t>O05</w:t>
+              <w:t>N08</w:t>
             </w:r>
           </w:p>
         </w:tc>
@@ -4833,7 +6213,7 @@
                 <w:b w:val="0"/>
                 <w:sz w:val="18"/>
               </w:rPr>
-              <w:t>Chỉnh chưa đủ 10 giây rồi OTA</w:t>
+              <w:t>Hai đèn trên cùng LAN</w:t>
             </w:r>
           </w:p>
         </w:tc>
@@ -4850,7 +6230,7 @@
                 <w:b w:val="0"/>
                 <w:sz w:val="18"/>
               </w:rPr>
-              <w:t>Lưu trước cập nhật, boot phục hồi cấu hình đó</w:t>
+              <w:t>Đặt hostname riêng; địa chỉ thực tế mở đúng từng đèn, kiểm tra cả trường hợp trùng tên</w:t>
             </w:r>
           </w:p>
         </w:tc>
@@ -4867,7 +6247,7 @@
                 <w:b w:val="0"/>
                 <w:sz w:val="18"/>
               </w:rPr>
-              <w:t>Chưa thử</w:t>
+              <w:t>Chưa ghi kết quả từng ca</w:t>
             </w:r>
           </w:p>
         </w:tc>
@@ -4886,6 +6266,566 @@
                 <w:b w:val="0"/>
                 <w:sz w:val="18"/>
               </w:rPr>
+              <w:t>N09</w:t>
+            </w:r>
+          </w:p>
+        </w:tc>
+        <w:tc>
+          <w:tcPr>
+            <w:tcW w:type="dxa" w:w="2409"/>
+          </w:tcPr>
+          <w:p>
+            <w:pPr>
+              <w:spacing w:after="60"/>
+            </w:pPr>
+            <w:r>
+              <w:rPr>
+                <w:b w:val="0"/>
+                <w:sz w:val="18"/>
+              </w:rPr>
+              <w:t>Giữ đúng +/− 5 giây qua vỏ</w:t>
+            </w:r>
+          </w:p>
+        </w:tc>
+        <w:tc>
+          <w:tcPr>
+            <w:tcW w:type="dxa" w:w="2409"/>
+          </w:tcPr>
+          <w:p>
+            <w:pPr>
+              <w:spacing w:after="60"/>
+            </w:pPr>
+            <w:r>
+              <w:rPr>
+                <w:b w:val="0"/>
+                <w:sz w:val="18"/>
+              </w:rPr>
+              <w:t>Xóa chỉ WiFi nhà, mở AP; LED, favorites, tên đèn/hostname giữ nguyên; chỉ reset một lần</w:t>
+            </w:r>
+          </w:p>
+        </w:tc>
+        <w:tc>
+          <w:tcPr>
+            <w:tcW w:type="dxa" w:w="2409"/>
+          </w:tcPr>
+          <w:p>
+            <w:pPr>
+              <w:spacing w:after="60"/>
+            </w:pPr>
+            <w:r>
+              <w:rPr>
+                <w:b w:val="0"/>
+                <w:sz w:val="18"/>
+              </w:rPr>
+              <w:t>Chưa ghi kết quả từng ca</w:t>
+            </w:r>
+          </w:p>
+        </w:tc>
+      </w:tr>
+      <w:tr>
+        <w:tc>
+          <w:tcPr>
+            <w:tcW w:type="dxa" w:w="2409"/>
+          </w:tcPr>
+          <w:p>
+            <w:pPr>
+              <w:spacing w:after="60"/>
+            </w:pPr>
+            <w:r>
+              <w:rPr>
+                <w:b w:val="0"/>
+                <w:sz w:val="18"/>
+              </w:rPr>
+              <w:t>N10</w:t>
+            </w:r>
+          </w:p>
+        </w:tc>
+        <w:tc>
+          <w:tcPr>
+            <w:tcW w:type="dxa" w:w="2409"/>
+          </w:tcPr>
+          <w:p>
+            <w:pPr>
+              <w:spacing w:after="60"/>
+            </w:pPr>
+            <w:r>
+              <w:rPr>
+                <w:b w:val="0"/>
+                <w:sz w:val="18"/>
+              </w:rPr>
+              <w:t>Giữ +/− dưới 5 giây, thêm Nguồn/M, giữ lúc boot</w:t>
+            </w:r>
+          </w:p>
+        </w:tc>
+        <w:tc>
+          <w:tcPr>
+            <w:tcW w:type="dxa" w:w="2409"/>
+          </w:tcPr>
+          <w:p>
+            <w:pPr>
+              <w:spacing w:after="60"/>
+            </w:pPr>
+            <w:r>
+              <w:rPr>
+                <w:b w:val="0"/>
+                <w:sz w:val="18"/>
+              </w:rPr>
+              <w:t>Không reset nhầm; thả hết rồi thao tác lại bình thường</w:t>
+            </w:r>
+          </w:p>
+        </w:tc>
+        <w:tc>
+          <w:tcPr>
+            <w:tcW w:type="dxa" w:w="2409"/>
+          </w:tcPr>
+          <w:p>
+            <w:pPr>
+              <w:spacing w:after="60"/>
+            </w:pPr>
+            <w:r>
+              <w:rPr>
+                <w:b w:val="0"/>
+                <w:sz w:val="18"/>
+              </w:rPr>
+              <w:t>Chưa ghi kết quả từng ca</w:t>
+            </w:r>
+          </w:p>
+        </w:tc>
+      </w:tr>
+      <w:tr>
+        <w:tc>
+          <w:tcPr>
+            <w:tcW w:type="dxa" w:w="2409"/>
+          </w:tcPr>
+          <w:p>
+            <w:pPr>
+              <w:spacing w:after="60"/>
+            </w:pPr>
+            <w:r>
+              <w:rPr>
+                <w:b w:val="0"/>
+                <w:sz w:val="18"/>
+              </w:rPr>
+              <w:t>N11</w:t>
+            </w:r>
+          </w:p>
+        </w:tc>
+        <w:tc>
+          <w:tcPr>
+            <w:tcW w:type="dxa" w:w="2409"/>
+          </w:tcPr>
+          <w:p>
+            <w:pPr>
+              <w:spacing w:after="60"/>
+            </w:pPr>
+            <w:r>
+              <w:rPr>
+                <w:b w:val="0"/>
+                <w:sz w:val="18"/>
+              </w:rPr>
+              <w:t>Hai đèn cùng hostname; tạo thêm trùng tên với hậu tố</w:t>
+            </w:r>
+          </w:p>
+        </w:tc>
+        <w:tc>
+          <w:tcPr>
+            <w:tcW w:type="dxa" w:w="2409"/>
+          </w:tcPr>
+          <w:p>
+            <w:pPr>
+              <w:spacing w:after="60"/>
+            </w:pPr>
+            <w:r>
+              <w:rPr>
+                <w:b w:val="0"/>
+                <w:sz w:val="18"/>
+              </w:rPr>
+              <w:t>Tên thực tế thêm mã bo viết thường rồi số khi cần; web/Serial báo đúng; tên đã lưu giữ nguyên, mở đúng từng đèn</w:t>
+            </w:r>
+          </w:p>
+        </w:tc>
+        <w:tc>
+          <w:tcPr>
+            <w:tcW w:type="dxa" w:w="2409"/>
+          </w:tcPr>
+          <w:p>
+            <w:pPr>
+              <w:spacing w:after="60"/>
+            </w:pPr>
+            <w:r>
+              <w:rPr>
+                <w:b w:val="0"/>
+                <w:sz w:val="18"/>
+              </w:rPr>
+              <w:t>Chưa ghi kết quả từng ca</w:t>
+            </w:r>
+          </w:p>
+        </w:tc>
+      </w:tr>
+      <w:tr>
+        <w:tc>
+          <w:tcPr>
+            <w:tcW w:type="dxa" w:w="2409"/>
+          </w:tcPr>
+          <w:p>
+            <w:pPr>
+              <w:spacing w:after="60"/>
+            </w:pPr>
+            <w:r>
+              <w:rPr>
+                <w:b w:val="0"/>
+                <w:sz w:val="18"/>
+              </w:rPr>
+              <w:t>O01</w:t>
+            </w:r>
+          </w:p>
+        </w:tc>
+        <w:tc>
+          <w:tcPr>
+            <w:tcW w:type="dxa" w:w="2409"/>
+          </w:tcPr>
+          <w:p>
+            <w:pPr>
+              <w:spacing w:after="60"/>
+            </w:pPr>
+            <w:r>
+              <w:rPr>
+                <w:b w:val="0"/>
+                <w:sz w:val="18"/>
+              </w:rPr>
+              <w:t>OTA đúng file qua WiFi nhà</w:t>
+            </w:r>
+          </w:p>
+        </w:tc>
+        <w:tc>
+          <w:tcPr>
+            <w:tcW w:type="dxa" w:w="2409"/>
+          </w:tcPr>
+          <w:p>
+            <w:pPr>
+              <w:spacing w:after="60"/>
+            </w:pPr>
+            <w:r>
+              <w:rPr>
+                <w:b w:val="0"/>
+                <w:sz w:val="18"/>
+              </w:rPr>
+              <w:t>Thành công, reboot, đúng phiên bản, giữ cấu hình/WiFi</w:t>
+            </w:r>
+          </w:p>
+        </w:tc>
+        <w:tc>
+          <w:tcPr>
+            <w:tcW w:type="dxa" w:w="2409"/>
+          </w:tcPr>
+          <w:p>
+            <w:pPr>
+              <w:spacing w:after="60"/>
+            </w:pPr>
+            <w:r>
+              <w:rPr>
+                <w:b w:val="0"/>
+                <w:sz w:val="18"/>
+              </w:rPr>
+              <w:t>Chưa ghi kết quả từng ca</w:t>
+            </w:r>
+          </w:p>
+        </w:tc>
+      </w:tr>
+      <w:tr>
+        <w:tc>
+          <w:tcPr>
+            <w:tcW w:type="dxa" w:w="2409"/>
+          </w:tcPr>
+          <w:p>
+            <w:pPr>
+              <w:spacing w:after="60"/>
+            </w:pPr>
+            <w:r>
+              <w:rPr>
+                <w:b w:val="0"/>
+                <w:sz w:val="18"/>
+              </w:rPr>
+              <w:t>O02</w:t>
+            </w:r>
+          </w:p>
+        </w:tc>
+        <w:tc>
+          <w:tcPr>
+            <w:tcW w:type="dxa" w:w="2409"/>
+          </w:tcPr>
+          <w:p>
+            <w:pPr>
+              <w:spacing w:after="60"/>
+            </w:pPr>
+            <w:r>
+              <w:rPr>
+                <w:b w:val="0"/>
+                <w:sz w:val="18"/>
+              </w:rPr>
+              <w:t>OTA qua AP</w:t>
+            </w:r>
+          </w:p>
+        </w:tc>
+        <w:tc>
+          <w:tcPr>
+            <w:tcW w:type="dxa" w:w="2409"/>
+          </w:tcPr>
+          <w:p>
+            <w:pPr>
+              <w:spacing w:after="60"/>
+            </w:pPr>
+            <w:r>
+              <w:rPr>
+                <w:b w:val="0"/>
+                <w:sz w:val="18"/>
+              </w:rPr>
+              <w:t>Thành công; sau reboot AP/STA đúng cấu hình; nếu nhận IP WiFi nhà, AP tắt</w:t>
+            </w:r>
+          </w:p>
+        </w:tc>
+        <w:tc>
+          <w:tcPr>
+            <w:tcW w:type="dxa" w:w="2409"/>
+          </w:tcPr>
+          <w:p>
+            <w:pPr>
+              <w:spacing w:after="60"/>
+            </w:pPr>
+            <w:r>
+              <w:rPr>
+                <w:b w:val="0"/>
+                <w:sz w:val="18"/>
+              </w:rPr>
+              <w:t>Chưa ghi kết quả từng ca</w:t>
+            </w:r>
+          </w:p>
+        </w:tc>
+      </w:tr>
+      <w:tr>
+        <w:tc>
+          <w:tcPr>
+            <w:tcW w:type="dxa" w:w="2409"/>
+          </w:tcPr>
+          <w:p>
+            <w:pPr>
+              <w:spacing w:after="60"/>
+            </w:pPr>
+            <w:r>
+              <w:rPr>
+                <w:b w:val="0"/>
+                <w:sz w:val="18"/>
+              </w:rPr>
+              <w:t>O03</w:t>
+            </w:r>
+          </w:p>
+        </w:tc>
+        <w:tc>
+          <w:tcPr>
+            <w:tcW w:type="dxa" w:w="2409"/>
+          </w:tcPr>
+          <w:p>
+            <w:pPr>
+              <w:spacing w:after="60"/>
+            </w:pPr>
+            <w:r>
+              <w:rPr>
+                <w:b w:val="0"/>
+                <w:sz w:val="18"/>
+              </w:rPr>
+              <w:t>File sai chip/bootloader/merged/quá lớn</w:t>
+            </w:r>
+          </w:p>
+        </w:tc>
+        <w:tc>
+          <w:tcPr>
+            <w:tcW w:type="dxa" w:w="2409"/>
+          </w:tcPr>
+          <w:p>
+            <w:pPr>
+              <w:spacing w:after="60"/>
+            </w:pPr>
+            <w:r>
+              <w:rPr>
+                <w:b w:val="0"/>
+                <w:sz w:val="18"/>
+              </w:rPr>
+              <w:t>Từ chối; firmware hiện tại còn hoạt động</w:t>
+            </w:r>
+          </w:p>
+        </w:tc>
+        <w:tc>
+          <w:tcPr>
+            <w:tcW w:type="dxa" w:w="2409"/>
+          </w:tcPr>
+          <w:p>
+            <w:pPr>
+              <w:spacing w:after="60"/>
+            </w:pPr>
+            <w:r>
+              <w:rPr>
+                <w:b w:val="0"/>
+                <w:sz w:val="18"/>
+              </w:rPr>
+              <w:t>Chưa ghi kết quả từng ca</w:t>
+            </w:r>
+          </w:p>
+        </w:tc>
+      </w:tr>
+      <w:tr>
+        <w:tc>
+          <w:tcPr>
+            <w:tcW w:type="dxa" w:w="2409"/>
+          </w:tcPr>
+          <w:p>
+            <w:pPr>
+              <w:spacing w:after="60"/>
+            </w:pPr>
+            <w:r>
+              <w:rPr>
+                <w:b w:val="0"/>
+                <w:sz w:val="18"/>
+              </w:rPr>
+              <w:t>O04</w:t>
+            </w:r>
+          </w:p>
+        </w:tc>
+        <w:tc>
+          <w:tcPr>
+            <w:tcW w:type="dxa" w:w="2409"/>
+          </w:tcPr>
+          <w:p>
+            <w:pPr>
+              <w:spacing w:after="60"/>
+            </w:pPr>
+            <w:r>
+              <w:rPr>
+                <w:b w:val="0"/>
+                <w:sz w:val="18"/>
+              </w:rPr>
+              <w:t>Ngắt upload giữa chừng</w:t>
+            </w:r>
+          </w:p>
+        </w:tc>
+        <w:tc>
+          <w:tcPr>
+            <w:tcW w:type="dxa" w:w="2409"/>
+          </w:tcPr>
+          <w:p>
+            <w:pPr>
+              <w:spacing w:after="60"/>
+            </w:pPr>
+            <w:r>
+              <w:rPr>
+                <w:b w:val="0"/>
+                <w:sz w:val="18"/>
+              </w:rPr>
+              <w:t>Ứng dụng đang chạy được giữ, điều khiển hoạt động lại</w:t>
+            </w:r>
+          </w:p>
+        </w:tc>
+        <w:tc>
+          <w:tcPr>
+            <w:tcW w:type="dxa" w:w="2409"/>
+          </w:tcPr>
+          <w:p>
+            <w:pPr>
+              <w:spacing w:after="60"/>
+            </w:pPr>
+            <w:r>
+              <w:rPr>
+                <w:b w:val="0"/>
+                <w:sz w:val="18"/>
+              </w:rPr>
+              <w:t>Chưa ghi kết quả từng ca</w:t>
+            </w:r>
+          </w:p>
+        </w:tc>
+      </w:tr>
+      <w:tr>
+        <w:tc>
+          <w:tcPr>
+            <w:tcW w:type="dxa" w:w="2409"/>
+          </w:tcPr>
+          <w:p>
+            <w:pPr>
+              <w:spacing w:after="60"/>
+            </w:pPr>
+            <w:r>
+              <w:rPr>
+                <w:b w:val="0"/>
+                <w:sz w:val="18"/>
+              </w:rPr>
+              <w:t>O05</w:t>
+            </w:r>
+          </w:p>
+        </w:tc>
+        <w:tc>
+          <w:tcPr>
+            <w:tcW w:type="dxa" w:w="2409"/>
+          </w:tcPr>
+          <w:p>
+            <w:pPr>
+              <w:spacing w:after="60"/>
+            </w:pPr>
+            <w:r>
+              <w:rPr>
+                <w:b w:val="0"/>
+                <w:sz w:val="18"/>
+              </w:rPr>
+              <w:t>Chỉnh chưa đủ 10 giây rồi OTA</w:t>
+            </w:r>
+          </w:p>
+        </w:tc>
+        <w:tc>
+          <w:tcPr>
+            <w:tcW w:type="dxa" w:w="2409"/>
+          </w:tcPr>
+          <w:p>
+            <w:pPr>
+              <w:spacing w:after="60"/>
+            </w:pPr>
+            <w:r>
+              <w:rPr>
+                <w:b w:val="0"/>
+                <w:sz w:val="18"/>
+              </w:rPr>
+              <w:t>Lưu trước cập nhật, boot phục hồi cấu hình đó</w:t>
+            </w:r>
+          </w:p>
+        </w:tc>
+        <w:tc>
+          <w:tcPr>
+            <w:tcW w:type="dxa" w:w="2409"/>
+          </w:tcPr>
+          <w:p>
+            <w:pPr>
+              <w:spacing w:after="60"/>
+            </w:pPr>
+            <w:r>
+              <w:rPr>
+                <w:b w:val="0"/>
+                <w:sz w:val="18"/>
+              </w:rPr>
+              <w:t>Chưa ghi kết quả từng ca</w:t>
+            </w:r>
+          </w:p>
+        </w:tc>
+      </w:tr>
+      <w:tr>
+        <w:tc>
+          <w:tcPr>
+            <w:tcW w:type="dxa" w:w="2409"/>
+          </w:tcPr>
+          <w:p>
+            <w:pPr>
+              <w:spacing w:after="60"/>
+            </w:pPr>
+            <w:r>
+              <w:rPr>
+                <w:b w:val="0"/>
+                <w:sz w:val="18"/>
+              </w:rPr>
               <w:t>O06</w:t>
             </w:r>
           </w:p>
@@ -4937,7 +6877,7 @@
                 <w:b w:val="0"/>
                 <w:sz w:val="18"/>
               </w:rPr>
-              <w:t>Chưa thử</w:t>
+              <w:t>Chưa ghi kết quả từng ca</w:t>
             </w:r>
           </w:p>
         </w:tc>
@@ -5060,7 +7000,7 @@
     </w:p>
     <w:p>
       <w:r>
-        <w:t>Tất cả các dòng thử trên thiết bị hiện là Chưa thử, đặc biệt cảm ứng/reset WiFi sau khi đã lắp vỏ. Chỉ ghi Đạt khi có kết quả đo/thử trên bộ đèn thật.</w:t>
+        <w:t>Người dùng đã báo các bản trước hoạt động mượt; bảng chưa có kết quả từng ca để đánh dấu Đạt. Các thử bổ sung bản 1.2.0, đặc biệt tám hiệu ứng qua vỏ và nâng cấp giữ cấu hình, vẫn chờ thử trên bo thật.</w:t>
       </w:r>
     </w:p>
     <w:sectPr>
@@ -5097,7 +7037,7 @@
       <w:pStyle w:val="Caption"/>
     </w:pPr>
     <w:r>
-      <w:t>ĐÈN DECO  |  ESP32-C3  |  FIRMWARE 1.1.0</w:t>
+      <w:t>ĐÈN DECO  |  ESP32-C3  |  FIRMWARE 1.2.0</w:t>
     </w:r>
   </w:p>
 </w:hdr>

</xml_diff>

<commit_message>
Smooth color transitions and strengthen Twinkle contrast in Den Deco 1.2.1
</commit_message>
<xml_diff>
--- a/HUONG_DAN.docx
+++ b/HUONG_DAN.docx
@@ -7,7 +7,7 @@
         <w:pStyle w:val="Heading1"/>
       </w:pPr>
       <w:r>
-        <w:t>Hướng dẫn Đèn Deco 1.2.0</w:t>
+        <w:t>Hướng dẫn Đèn Deco 1.2.1</w:t>
       </w:r>
     </w:p>
     <w:p>
@@ -1149,7 +1149,7 @@
     </w:p>
     <w:p>
       <w:r>
-        <w:t>Bộ core/thư viện người dùng đang có là ESP32 3.3.1, NeoPixel 1.15.5 và ArduinoJson 7.4.3; giữ bộ này để biên dịch. Thông tin build và file OTA 1.2.0 ghi trong BUILD_INFO.md. Profile PlatformIO 2.0.17 là phương án build bổ sung; không cần đổi bộ Arduino IDE hiện tại về phiên bản đó. Người dùng đã lắp và dùng các bản trước; bản 1.2.0 mới chưa được thử trên bo. Nếu bo có dung lượng flash khác 4 MB, chỉnh cấu hình và biên dịch lại cho bo thực tế.</w:t>
+        <w:t>Bộ core/thư viện người dùng đang có là ESP32 3.3.1, NeoPixel 1.15.5 và ArduinoJson 7.4.3; giữ bộ này để biên dịch. Thông tin build và file OTA 1.2.1 ghi trong BUILD_INFO.md. Profile PlatformIO 2.0.17 là phương án build bổ sung; không cần đổi bộ Arduino IDE hiện tại về phiên bản đó. Người dùng đã lắp và thử bản 1.2.0; bản 1.2.1 mới cần thử lại trên bo/vỏ thực tế. Nếu bo có dung lượng flash khác 4 MB, chỉnh cấu hình và biên dịch lại cho bo thực tế.</w:t>
       </w:r>
     </w:p>
     <w:p>
@@ -2625,6 +2625,16 @@
       </w:r>
     </w:p>
     <w:p>
+      <w:r>
+        <w:t>Bản 1.2.1 giữ đủ 14 chế độ và sửa chuyển màu/Lấp lánh theo phản hồi trên đèn thật. Khung hình đặt cách nhau 16 ms, mục tiêu khoảng 60 khung hình/giây khi vòng lặp chạy bình thường. Pha hiệu ứng được giữ liên tục khi đổi tốc độ và qua các chu kỳ thời gian; thay tốc độ không đưa hiệu ứng nhảy sang một vị trí khác. Ở tốc độ 100, chu kỳ Chuyển màu chậm là 8 giây và Cầu vồng chậm là 12 giây, thay cho 1/5 giây ở bản 1.2.0.</w:t>
+      </w:r>
+    </w:p>
+    <w:p>
+      <w:r>
+        <w:t>Lấp lánh tạo cụm thưa bằng chính màu RGB đã chọn, khoảng 1–3 tầng chiều cao LED, xuất hiện và tắt dần trên nền gần đen. Hệ số nền giảm từ 20% ở bản 1.2.0 xuống khoảng 0,5%, rồi vẫn áp dụng độ sáng và trần đầu ra. Cách tán sáng của vỏ có thể làm cụm sáng hòa lại; thử màu, sáng và tốc độ trên vỏ đang dùng để đánh giá độ tương phản.</w:t>
+      </w:r>
+    </w:p>
+    <w:p>
       <w:pPr>
         <w:pStyle w:val="ListBullet"/>
       </w:pPr>
@@ -2682,7 +2692,12 @@
     </w:p>
     <w:p>
       <w:r>
-        <w:t>Thanh sáng 1–100 là thang cảm nhận, được ánh xạ gamma 2,2. Trần ban đầu 30% mã đầu ra; trang cài đặt cho chỉnh 3–30%. Mức thấp nhất dùng 6/255 để màu cam ngủ còn các kênh màu ở mức thấp; đây là thông số khởi đầu cần thử trong vỏ. Nhiều mức thấp có thể trùng mã do LED chỉ có 8 bit mỗi kênh. Không dùng dithering ở bản này.</w:t>
+        <w:t>Thanh sáng 1–100 là thang cảm nhận, được ánh xạ gamma 2,2. Trần ban đầu 30% mã đầu ra; trang cài đặt cho chỉnh 3–30%. Mức thấp nhất dùng 6/255 để màu cam ngủ còn các kênh màu ở mức thấp; đây là thông số khởi đầu cần thử trong vỏ. Nhiều mức thấp có thể trùng mã do LED chỉ có 8 bit mỗi kênh.</w:t>
+      </w:r>
+    </w:p>
+    <w:p>
+      <w:r>
+        <w:t>Để tạo màu tổng hợp gần các mức trung gian hơn, bản 1.2.1 dùng làm tròn phân bố theo vị trí cố định cho Chuyển màu chậm, Cầu vồng chậm, Cực quang, Biển xanh, Rừng xanh, Hoàng hôn và Sóng màu (mã 2/4/8/9/10/11/13). Với phần lẻ của mỗi kênh màu, mỗi tầng trong mười tầng chiều cao chọn một trong hai mã đầu ra 8 bit liền kề, chênh một mã. Hai LED cùng độ cao dùng cùng ngưỡng làm tròn; nếu màu nguồn của hiệu ứng giống nhau thì đầu ra cũng giống nhau. Cầu vồng vẫn giữ dải màu theo thứ tự chuỗi LED như bản trước. Đây là dithering không gian với mẫu cố định, không dùng dithering theo thời gian hoặc PWM phần mềm. Ngủ và Một màu giữ cách làm tròn tới mã gần nhất. Hiệu quả nhìn qua vỏ cần thử lại; việc tăng số khung hình và phân bố màu không bảo đảm mọi mức sáng đều hết bước màu.</w:t>
       </w:r>
     </w:p>
     <w:p>
@@ -2720,7 +2735,7 @@
     </w:p>
     <w:p>
       <w:r>
-        <w:t>Bản 1.2.0 đọc dữ liệu ánh sáng schema 1 và 2, ghi schema 2 cho các lần lưu mới. Nâng cấp OTA từ 1.1.0 giữ cấu hình đèn và ba mục yêu thích vì sáu mã chế độ cũ không đổi; WiFi, tên và tên truy cập cũng được giữ. Nếu cần quay lại 1.1.0 sau khi dữ liệu đã lưu schema 2, dùng USB: firmware cũ có thể không đọc được schema mới và sẽ không ghi đè dữ liệu đó.</w:t>
+        <w:t>Bản 1.2.1 tiếp tục đọc dữ liệu ánh sáng schema 1 và 2, ghi schema 2 như bản 1.2.0. Nâng cấp OTA 1.2.0 → 1.2.1 giữ cấu hình đèn, cả 14 mã chế độ, ba mục yêu thích, WiFi, tên và tên truy cập. Nâng cấp từ 1.1.0 giữ các cấu hình/mục yêu thích cũ vì sáu mã chế độ đầu không đổi. Nếu cần quay lại 1.1.0 sau khi dữ liệu đã lưu schema 2, dùng USB: firmware cũ có thể không đọc được schema mới và sẽ không ghi đè dữ liệu đó.</w:t>
       </w:r>
     </w:p>
     <w:p>
@@ -2743,7 +2758,7 @@
     </w:p>
     <w:p>
       <w:r>
-        <w:t>2. Tìm file ứng dụng DenDeco.ino.bin hoặc tên tương đương do IDE xuất. Không chọn .bootloader.bin, .partitions.bin, .merged.bin hoặc file dùng cho ESP32/S2/S3 khác. Gói bàn giao cũng có firmware/DenDeco-1.2.0-ota.bin; có thể dùng để nâng cấp đèn đang chạy 1.1.0.</w:t>
+        <w:t>2. Tìm file ứng dụng DenDeco.ino.bin hoặc tên tương đương do IDE xuất. Không chọn .bootloader.bin, .partitions.bin, .merged.bin hoặc file dùng cho ESP32/S2/S3 khác. Gói bàn giao cũng có firmware/DenDeco-1.2.1-ota.bin; dùng để nâng cấp đèn đang chạy 1.2.0 hoặc 1.1.0.</w:t>
       </w:r>
     </w:p>
     <w:p>
@@ -2773,7 +2788,7 @@
     </w:p>
     <w:p>
       <w:r>
-        <w:t>Giới hạn của phân vùng ứng dụng mặc định là 1.310.720 byte; kích thước file 1.2.0 được ghi trong BUILD_INFO.md. Nếu dùng sơ đồ phân vùng khác, giới hạn trên trang lấy từ phân vùng thực tế. Đổi bảng phân vùng phải nạp USB; OTA chỉ thay ứng dụng.</w:t>
+        <w:t>Giới hạn của phân vùng ứng dụng mặc định là 1.310.720 byte; kích thước file 1.2.1 được ghi trong BUILD_INFO.md. Nếu dùng sơ đồ phân vùng khác, giới hạn trên trang lấy từ phân vùng thực tế. Đổi bảng phân vùng phải nạp USB; OTA chỉ thay ứng dụng.</w:t>
       </w:r>
     </w:p>
     <w:p>
@@ -2831,7 +2846,12 @@
     </w:p>
     <w:p>
       <w:r>
-        <w:t>9. Với bản 1.2.0, chọn đủ tám hiệu ứng mới trên web và đi đủ 14 chế độ bằng M. Thử tốc độ 1/50/100, đổi RGB khi đang Thở nhẹ/Lấp lánh/Sao băng, kiểm tra các hiệu ứng khác chuyển sang Một màu khi chọn RGB, rồi lưu/khôi phục mục yêu thích. Mở Hướng dẫn sử dụng trên điện thoại để đọc ngay tại trang.</w:t>
+        <w:t>9. Chọn đủ tám hiệu ứng bổ sung trên web và đi đủ 14 chế độ bằng M. Thử tốc độ 1/50/100, đổi RGB khi đang Thở nhẹ/Lấp lánh/Sao băng, kiểm tra các hiệu ứng khác chuyển sang Một màu khi chọn RGB, rồi lưu/khôi phục mục yêu thích. Mở Hướng dẫn sử dụng trên điện thoại để đọc ngay tại trang.</w:t>
+      </w:r>
+    </w:p>
+    <w:p>
+      <w:r>
+        <w:t>10. Với bản 1.2.1, thử bảy chế độ chuyển màu ở sáng 5/50/100 và tốc độ 1/50/100 qua đúng vỏ đang dùng; đổi tốc độ trong lúc chạy để xem pha có liên tục. Thử Lấp lánh với vài màu RGB trên vỏ đang dùng, ghi độ tương phản và thời gian xuất hiện/tắt. Sau OTA 1.2.0 → 1.2.1 kiểm tra bật/tắt, mục yêu thích và WiFi giữ nguyên.</w:t>
       </w:r>
     </w:p>
     <w:p>
@@ -2841,7 +2861,7 @@
     </w:p>
     <w:p>
       <w:r>
-        <w:t>Thông tin biên dịch và kiểm tra logic/giao diện bằng mô phỏng được ghi trong BUILD_INFO.md và KIEM_THU.md. Người dùng đã lắp đèn và báo các bản trước chạy mượt. Bản 1.2.0 mới chưa thử trên bo; bảng nghiệm thu chưa có kết quả riêng cho từng ca đo điện, chạm qua vỏ, WiFi/mDNS và OTA. Sau nâng cấp, ưu tiên thử tám hiệu ứng mới, màu, tốc độ, hướng dẫn trên web và giữ cấu hình/mục yêu thích; ghi kết quả trong KIEM_THU.md.</w:t>
+        <w:t>Thông tin biên dịch và kiểm tra logic/giao diện bằng mô phỏng được ghi trong BUILD_INFO.md và KIEM_THU.md. Người dùng đã thử bản 1.2.0 trên đèn, báo bước chuyển màu còn lớn và Lấp lánh khó thấy do mật độ LED lớn. Bản 1.2.1 mới cần thử lại trên bo/vỏ đó; độ mượt/độ tương phản chưa được xác nhận từ mô phỏng. Sau nâng cấp, ưu tiên các ca F01–F04 về chuyển màu, pha khi đổi tốc độ, Lấp lánh và giữ cấu hình; ghi kết quả trong KIEM_THU.md.</w:t>
       </w:r>
     </w:p>
     <w:p>
@@ -2854,7 +2874,7 @@
         <w:pStyle w:val="Heading1"/>
       </w:pPr>
       <w:r>
-        <w:t>Cấu hình và kế hoạch Đèn Deco 1.2.0</w:t>
+        <w:t>Cấu hình và kế hoạch Đèn Deco 1.2.1</w:t>
       </w:r>
     </w:p>
     <w:p>
@@ -2868,6 +2888,16 @@
     <w:p>
       <w:r>
         <w:t>Phạm vi: firmware, web trên ESP và hướng dẫn đấu nối/nạp. Người dùng tự xử lý cơ khí/vỏ. ESP32-C3 SuperMini, bốn TTP223, 20 WS2812B và nguồn 5 V–2 A. Tên Đèn Deco; WiFi nhà + AP dự phòng. Máy nạp Windows, Arduino IDE. Bổ sung OTA qua web theo yêu cầu mới.</w:t>
+      </w:r>
+    </w:p>
+    <w:p>
+      <w:r>
+        <w:t>Bản 1.2.1 xử lý phản hồi từ lần thử 1.2.0 trên đèn thật: bước chuyển màu còn lớn và Lấp lánh khó thấy do mật độ LED lớn. Mục tiêu khung hình khoảng 60/s với FRAME_MS=16 thay cho 33 ms; bảy hiệu ứng chuyển màu mã 2/4/8/9/10/11/13 dùng làm tròn phân bố phần lẻ theo vị trí cố định giữa mười tầng LED, ngưỡng làm tròn đối xứng giữa hai nhánh. Dải màu Cầu vồng theo thứ tự LED giữ nguyên. Mỗi lựa chọn làm tròn chỉ khác một mã đầu ra 8 bit, không dùng dithering theo thời gian/PWM phần mềm; Ngủ và Một màu vẫn làm tròn tới mã gần nhất. Pha chạy liên tục khi đổi tốc độ và qua chu kỳ thời gian. Chu kỳ nhanh nhất Chuyển màu chậm/Cầu vồng tăng từ 1/5 giây lên 8/12 giây. Kết quả cảm nhận qua vỏ cần người dùng thử lại.</w:t>
+      </w:r>
+    </w:p>
+    <w:p>
+      <w:r>
+        <w:t>Lấp lánh ở 1.2.1 dùng màu RGB đã chọn cho cụm thưa khoảng 1–3 tầng chiều cao, xuất hiện/tắt dần trên nền gần đen; hệ số nền khoảng 0,5% thay cho 20% ở 1.2.0. Độ sáng/trần vẫn áp dụng cho nền và cụm. Không đổi 14 ID chế độ, quy tắc tint, mục yêu thích, schema ánh sáng 2 hay chính sách WiFi/AP. OTA 1.2.0 → 1.2.1 giữ cấu hình đã lưu.</w:t>
       </w:r>
     </w:p>
     <w:p>
@@ -3153,7 +3183,7 @@
                 <w:b w:val="0"/>
                 <w:sz w:val="18"/>
               </w:rPr>
-              <w:t>Tám hiệu ứng mới</w:t>
+              <w:t>Tám hiệu ứng</w:t>
             </w:r>
           </w:p>
         </w:tc>
@@ -3170,7 +3200,7 @@
                 <w:b w:val="0"/>
                 <w:sz w:val="18"/>
               </w:rPr>
-              <w:t>14 mã chế độ, tốc độ cho tám hiệu ứng mới, RGB giữ ba hiệu ứng dùng màu tự chọn</w:t>
+              <w:t>14 mã chế độ, tốc độ/tint giữ nguyên; 1.2.1 sửa chuyển màu và Lấp lánh</w:t>
             </w:r>
           </w:p>
         </w:tc>
@@ -3187,7 +3217,7 @@
                 <w:b w:val="0"/>
                 <w:sz w:val="18"/>
               </w:rPr>
-              <w:t>Bản 1.2.0 cập nhật; chưa thử trên bo</w:t>
+              <w:t>Người dùng đã thử 1.2.0; cần thử lại 1.2.1 qua vỏ</w:t>
             </w:r>
           </w:p>
         </w:tc>
@@ -3206,7 +3236,7 @@
                 <w:b w:val="0"/>
                 <w:sz w:val="18"/>
               </w:rPr>
-              <w:t>Hướng dẫn trong web</w:t>
+              <w:t>Chuyển màu/Lấp lánh 1.2.1</w:t>
             </w:r>
           </w:p>
         </w:tc>
@@ -3223,7 +3253,7 @@
                 <w:b w:val="0"/>
                 <w:sz w:val="18"/>
               </w:rPr>
-              <w:t>Thao tác cảm ứng, chế độ/màu/tốc độ, lưu, mạng và OTA</w:t>
+              <w:t>Khung 16 ms, làm tròn theo vị trí cố định, giữ pha và cụm thưa trên nền tối</w:t>
             </w:r>
           </w:p>
         </w:tc>
@@ -3240,7 +3270,7 @@
                 <w:b w:val="0"/>
                 <w:sz w:val="18"/>
               </w:rPr>
-              <w:t>Bản 1.2.0 cập nhật; kiểm tra trên điện thoại sau nâng cấp</w:t>
+              <w:t>Kết quả kiểm tra phần mềm ghi ở KIEM_THU.md; cảm nhận trên bo chờ thử lại</w:t>
             </w:r>
           </w:p>
         </w:tc>
@@ -3259,7 +3289,7 @@
                 <w:b w:val="0"/>
                 <w:sz w:val="18"/>
               </w:rPr>
-              <w:t>Web/WiFi</w:t>
+              <w:t>Hướng dẫn trong web</w:t>
             </w:r>
           </w:p>
         </w:tc>
@@ -3276,7 +3306,7 @@
                 <w:b w:val="0"/>
                 <w:sz w:val="18"/>
               </w:rPr>
-              <w:t>Web nhúng, polling 250 ms; quét 2,4 GHz, trạng thái mạng, hostname và AP dự phòng</w:t>
+              <w:t>Thao tác cảm ứng, chế độ/màu/tốc độ, lưu, mạng và OTA</w:t>
             </w:r>
           </w:p>
         </w:tc>
@@ -3293,7 +3323,7 @@
                 <w:b w:val="0"/>
                 <w:sz w:val="18"/>
               </w:rPr>
-              <w:t>Bản 1.1.0 cập nhật; kết quả kiểm tra ghi ở KIEM_THU.md</w:t>
+              <w:t>Bản 1.2.0 cập nhật; kiểm tra trên điện thoại sau nâng cấp</w:t>
             </w:r>
           </w:p>
         </w:tc>
@@ -3312,7 +3342,7 @@
                 <w:b w:val="0"/>
                 <w:sz w:val="18"/>
               </w:rPr>
-              <w:t>Reset WiFi từ cảm ứng</w:t>
+              <w:t>Web/WiFi</w:t>
             </w:r>
           </w:p>
         </w:tc>
@@ -3329,7 +3359,7 @@
                 <w:b w:val="0"/>
                 <w:sz w:val="18"/>
               </w:rPr>
-              <w:t>Giữ đúng +/− 5 giây, giữ cấu hình đèn và tên</w:t>
+              <w:t>Web nhúng, polling 250 ms; quét 2,4 GHz, trạng thái mạng, hostname và AP dự phòng</w:t>
             </w:r>
           </w:p>
         </w:tc>
@@ -3346,7 +3376,7 @@
                 <w:b w:val="0"/>
                 <w:sz w:val="18"/>
               </w:rPr>
-              <w:t>Có từ bản 1.1.0; chưa có kết quả riêng từng ca qua vỏ</w:t>
+              <w:t>Bản 1.1.0 cập nhật; kết quả kiểm tra ghi ở KIEM_THU.md</w:t>
             </w:r>
           </w:p>
         </w:tc>
@@ -3365,7 +3395,7 @@
                 <w:b w:val="0"/>
                 <w:sz w:val="18"/>
               </w:rPr>
-              <w:t>OTA</w:t>
+              <w:t>Reset WiFi từ cảm ứng</w:t>
             </w:r>
           </w:p>
         </w:tc>
@@ -3382,7 +3412,7 @@
                 <w:b w:val="0"/>
                 <w:sz w:val="18"/>
               </w:rPr>
-              <w:t>File ứng dụng C3, phân vùng còn lại, giữ NVS, reboot sau thành công</w:t>
+              <w:t>Giữ đúng +/− 5 giây, giữ cấu hình đèn và tên</w:t>
             </w:r>
           </w:p>
         </w:tc>
@@ -3399,7 +3429,7 @@
                 <w:b w:val="0"/>
                 <w:sz w:val="18"/>
               </w:rPr>
-              <w:t>Nâng cấp 1.1.0 → 1.2.0 cần thử trên bo</w:t>
+              <w:t>Có từ bản 1.1.0; chưa có kết quả riêng từng ca qua vỏ</w:t>
             </w:r>
           </w:p>
         </w:tc>
@@ -3418,7 +3448,7 @@
                 <w:b w:val="0"/>
                 <w:sz w:val="18"/>
               </w:rPr>
-              <w:t>Bàn giao Windows</w:t>
+              <w:t>OTA</w:t>
             </w:r>
           </w:p>
         </w:tc>
@@ -3435,7 +3465,7 @@
                 <w:b w:val="0"/>
                 <w:sz w:val="18"/>
               </w:rPr>
-              <w:t>Sketch, .bin OTA 1.2.0, hướng dẫn và checklist</w:t>
+              <w:t>File ứng dụng C3, phân vùng còn lại, giữ NVS, reboot sau thành công</w:t>
             </w:r>
           </w:p>
         </w:tc>
@@ -3452,7 +3482,7 @@
                 <w:b w:val="0"/>
                 <w:sz w:val="18"/>
               </w:rPr>
-              <w:t>Thông tin gói/build ghi ở BUILD_INFO.md</w:t>
+              <w:t>Kiểm tra nâng cấp 1.2.0 → 1.2.1 giữ cấu hình</w:t>
             </w:r>
           </w:p>
         </w:tc>
@@ -3471,6 +3501,59 @@
                 <w:b w:val="0"/>
                 <w:sz w:val="18"/>
               </w:rPr>
+              <w:t>Bàn giao Windows</w:t>
+            </w:r>
+          </w:p>
+        </w:tc>
+        <w:tc>
+          <w:tcPr>
+            <w:tcW w:type="dxa" w:w="3213"/>
+          </w:tcPr>
+          <w:p>
+            <w:pPr>
+              <w:spacing w:after="60"/>
+            </w:pPr>
+            <w:r>
+              <w:rPr>
+                <w:b w:val="0"/>
+                <w:sz w:val="18"/>
+              </w:rPr>
+              <w:t>Sketch, .bin OTA 1.2.1, hướng dẫn và checklist</w:t>
+            </w:r>
+          </w:p>
+        </w:tc>
+        <w:tc>
+          <w:tcPr>
+            <w:tcW w:type="dxa" w:w="3213"/>
+          </w:tcPr>
+          <w:p>
+            <w:pPr>
+              <w:spacing w:after="60"/>
+            </w:pPr>
+            <w:r>
+              <w:rPr>
+                <w:b w:val="0"/>
+                <w:sz w:val="18"/>
+              </w:rPr>
+              <w:t>Thông tin gói/build ghi ở BUILD_INFO.md</w:t>
+            </w:r>
+          </w:p>
+        </w:tc>
+      </w:tr>
+      <w:tr>
+        <w:tc>
+          <w:tcPr>
+            <w:tcW w:type="dxa" w:w="3213"/>
+          </w:tcPr>
+          <w:p>
+            <w:pPr>
+              <w:spacing w:after="60"/>
+            </w:pPr>
+            <w:r>
+              <w:rPr>
+                <w:b w:val="0"/>
+                <w:sz w:val="18"/>
+              </w:rPr>
               <w:t>Nạp và đo trên thiết bị</w:t>
             </w:r>
           </w:p>
@@ -3505,7 +3588,7 @@
                 <w:b w:val="0"/>
                 <w:sz w:val="18"/>
               </w:rPr>
-              <w:t>Người dùng đã lắp đèn, báo bản trước chạy mượt; bản 1.2.0 mới chưa thử trên bo</w:t>
+              <w:t>Người dùng đã thử 1.2.0; bản 1.2.1 cần thử lại trên bo/vỏ đó</w:t>
             </w:r>
           </w:p>
         </w:tc>
@@ -3589,7 +3672,7 @@
         <w:pStyle w:val="ListBullet"/>
       </w:pPr>
       <w:r>
-        <w:t>Tốc độ, màu và độ mượt của tám hiệu ứng mới qua vỏ; vòng M đủ 14 chế độ và hướng dẫn web trên màn hình điện thoại.</w:t>
+        <w:t>Tốc độ, màu và độ mượt qua vỏ, ưu tiên mã 2/4/8/9/10/11/13 ở sáng 5/50/100 và tốc độ 1/50/100; giữ pha khi đổi tốc độ.</w:t>
       </w:r>
     </w:p>
     <w:p>
@@ -3597,7 +3680,15 @@
         <w:pStyle w:val="ListBullet"/>
       </w:pPr>
       <w:r>
-        <w:t>Cấu hình/mục yêu thích trước khi OTA 1.1.0 → 1.2.0 và sau reboot/lưu schema mới.</w:t>
+        <w:t>Độ tương phản Lấp lánh trên vỏ dày với màu RGB đang chọn và nền gần đen.</w:t>
+      </w:r>
+    </w:p>
+    <w:p>
+      <w:pPr>
+        <w:pStyle w:val="ListBullet"/>
+      </w:pPr>
+      <w:r>
+        <w:t>Cấu hình/mục yêu thích/bật tắt trước khi OTA 1.2.0 → 1.2.1 và sau reboot; WiFi/tên giữ nguyên.</w:t>
       </w:r>
     </w:p>
     <w:p>
@@ -3633,7 +3724,7 @@
         <w:pStyle w:val="Heading1"/>
       </w:pPr>
       <w:r>
-        <w:t>Kiểm thử và nghiệm thu Đèn Deco 1.2.0</w:t>
+        <w:t>Kiểm thử và nghiệm thu Đèn Deco 1.2.1</w:t>
       </w:r>
     </w:p>
     <w:p>
@@ -3646,7 +3737,7 @@
     </w:p>
     <w:p>
       <w:r>
-        <w:t>Các kiểm tra nền dưới đây đã chạy thành công cho mã nguồn 1.1.0. Thông tin build và kết quả chạy mới cho 1.2.0 ghi trong BUILD_INFO.md và phần bổ sung bên dưới; không coi kết quả cũ là kết quả bản mới. Người dùng đã lắp đèn và báo các bản trước chạy mượt, nhưng chưa có ghi nhận riêng cho từng ca nghiệm thu. Bản 1.2.0 mới chưa thử trên bo; build và web mock không thay cho thử phần cứng.</w:t>
+        <w:t>Các kiểm tra nền dưới đây đã chạy thành công cho mã nguồn 1.1.0; phần 1.2.0 giữ kết quả lịch sử riêng. Thông tin build và kết quả chạy mới cho 1.2.1 ghi trong BUILD_INFO.md và phần bổ sung bên dưới; không coi kết quả cũ là kết quả bản mới. Người dùng đã thử 1.2.0 trên đèn thật, báo bước chuyển màu còn lớn và Lấp lánh khó thấy do mật độ LED lớn. Bản 1.2.1 cần thử lại trên bo/vỏ đó; build và web mock không xác nhận độ mượt cảm nhận.</w:t>
       </w:r>
     </w:p>
     <w:p>
@@ -3827,6 +3918,11 @@
         <w:t>Chạy thử bổ sung bản 1.2.0 trên đèn</w:t>
       </w:r>
     </w:p>
+    <w:p>
+      <w:r>
+        <w:t>Người dùng đã thử bản 1.2.0 và phản hồi về chuyển màu/Lấp lánh; chưa có kết quả riêng từng ca E01–E08 để ghi Đạt.</w:t>
+      </w:r>
+    </w:p>
     <w:tbl>
       <w:tblPr>
         <w:tblStyle w:val="LightShading-Accent1"/>
@@ -3977,7 +4073,7 @@
                 <w:b w:val="0"/>
                 <w:sz w:val="18"/>
               </w:rPr>
-              <w:t>Chưa thử 1.2.0</w:t>
+              <w:t>Chưa ghi kết quả từng ca</w:t>
             </w:r>
           </w:p>
         </w:tc>
@@ -4047,7 +4143,7 @@
                 <w:b w:val="0"/>
                 <w:sz w:val="18"/>
               </w:rPr>
-              <w:t>Chưa thử 1.2.0</w:t>
+              <w:t>Chưa ghi kết quả từng ca</w:t>
             </w:r>
           </w:p>
         </w:tc>
@@ -4117,7 +4213,7 @@
                 <w:b w:val="0"/>
                 <w:sz w:val="18"/>
               </w:rPr>
-              <w:t>Chưa thử 1.2.0</w:t>
+              <w:t>Chưa ghi kết quả từng ca</w:t>
             </w:r>
           </w:p>
         </w:tc>
@@ -4187,7 +4283,7 @@
                 <w:b w:val="0"/>
                 <w:sz w:val="18"/>
               </w:rPr>
-              <w:t>Chưa thử 1.2.0</w:t>
+              <w:t>Chưa ghi kết quả từng ca</w:t>
             </w:r>
           </w:p>
         </w:tc>
@@ -4257,7 +4353,7 @@
                 <w:b w:val="0"/>
                 <w:sz w:val="18"/>
               </w:rPr>
-              <w:t>Chưa thử 1.2.0</w:t>
+              <w:t>Chưa ghi kết quả từng ca</w:t>
             </w:r>
           </w:p>
         </w:tc>
@@ -4327,7 +4423,7 @@
                 <w:b w:val="0"/>
                 <w:sz w:val="18"/>
               </w:rPr>
-              <w:t>Chưa thử 1.2.0</w:t>
+              <w:t>Chưa ghi kết quả từng ca</w:t>
             </w:r>
           </w:p>
         </w:tc>
@@ -4397,7 +4493,7 @@
                 <w:b w:val="0"/>
                 <w:sz w:val="18"/>
               </w:rPr>
-              <w:t>Chưa thử 1.2.0</w:t>
+              <w:t>Chưa ghi kết quả từng ca</w:t>
             </w:r>
           </w:p>
         </w:tc>
@@ -4467,7 +4563,427 @@
                 <w:b w:val="0"/>
                 <w:sz w:val="18"/>
               </w:rPr>
-              <w:t>Chưa thử 1.2.0</w:t>
+              <w:t>Chưa ghi kết quả từng ca</w:t>
+            </w:r>
+          </w:p>
+        </w:tc>
+      </w:tr>
+    </w:tbl>
+    <w:p/>
+    <w:p>
+      <w:pPr>
+        <w:pStyle w:val="Heading2"/>
+      </w:pPr>
+      <w:r>
+        <w:t>Kiểm tra bổ sung bản 1.2.1</w:t>
+      </w:r>
+    </w:p>
+    <w:p>
+      <w:r>
+        <w:t>Các kiểm tra phần mềm bên dưới đã đạt cho bản 1.2.1; cảm nhận trên đèn/vỏ thật vẫn cần người dùng kiểm tra ở bảng F01–F04.</w:t>
+      </w:r>
+    </w:p>
+    <w:p>
+      <w:pPr>
+        <w:pStyle w:val="ListBullet"/>
+      </w:pPr>
+      <w:r>
+        <w:t>PASS Core (C++11, ASan/UBSan): khung mục tiêu 16 ms, phân bố làm tròn cố định ở mã 2/4/8/9/10/11/13; giữ đúng trần, Ngủ/Một màu đồng màu và ngưỡng làm tròn đối xứng giữa hai nhánh. Kiểm tra Chuyển màu ở mức sáng 5% có bước màu tổng hợp tối đa 0,1 mã/kênh/16 ms trên chuỗi LED mô phỏng. Mẫu làm tròn không đổi theo thời gian nên không tạo PWM phần mềm.</w:t>
+      </w:r>
+    </w:p>
+    <w:p>
+      <w:pPr>
+        <w:pStyle w:val="ListBullet"/>
+      </w:pPr>
+      <w:r>
+        <w:t>PASS pha/tốc độ: đổi tốc độ giữ pha và vị trí cụm, chu kỳ/uptime dài không làm mất độ chính xác chuyển động; Chuyển màu chậm/Cầu vồng có chu kỳ nhanh nhất 8/12 giây. Các kiểm tra fade, khung đầu chuyển tiếp, bật/tắt và timer vẫn đạt; sai số làm tròn ở mức timer 50% không quá một mã.</w:t>
+      </w:r>
+    </w:p>
+    <w:p>
+      <w:pPr>
+        <w:pStyle w:val="ListBullet"/>
+      </w:pPr>
+      <w:r>
+        <w:t>PASS Lấp lánh: cụm RGB thưa chỉ 1–3 tầng đang sáng, các vị trí còn lại gần đen; lên/xuống mềm, không vượt độ sáng/trần, tint giữ chế độ. Mô hình tán sáng Gaussian cho thấy tương phản tốt hơn bản cũ, nhưng không thay cho kiểm tra vỏ thật; tổng ánh sáng của chế độ này giảm vì ít LED sáng cùng lúc.</w:t>
+      </w:r>
+    </w:p>
+    <w:p>
+      <w:pPr>
+        <w:pStyle w:val="ListBullet"/>
+      </w:pPr>
+      <w:r>
+        <w:t>PASS web: mô tả cụm sáng/nền tối và lời khuyên chỉnh theo phòng/vỏ đúng; kiểm tra bàn phím/layout/hướng dẫn và các điều khiển cũ vẫn đạt. Giữ 14 ID, trường cấu hình, schema 2, mục yêu thích và WiFi/AP; lưu trữ không sửa ở bản này. Build ESP32-C3 dùng core/thư viện hiện tại; thông tin và SHA ở BUILD_INFO.md.</w:t>
+      </w:r>
+    </w:p>
+    <w:p>
+      <w:pPr>
+        <w:pStyle w:val="Heading2"/>
+      </w:pPr>
+      <w:r>
+        <w:t>Chạy thử bổ sung bản 1.2.1 trên đèn</w:t>
+      </w:r>
+    </w:p>
+    <w:tbl>
+      <w:tblPr>
+        <w:tblStyle w:val="LightShading-Accent1"/>
+        <w:tblW w:type="auto" w:w="0"/>
+        <w:tblLook w:firstColumn="1" w:firstRow="1" w:lastColumn="0" w:lastRow="0" w:noHBand="0" w:noVBand="1" w:val="04A0"/>
+      </w:tblPr>
+      <w:tblGrid>
+        <w:gridCol w:w="2409"/>
+        <w:gridCol w:w="2409"/>
+        <w:gridCol w:w="2409"/>
+        <w:gridCol w:w="2409"/>
+      </w:tblGrid>
+      <w:tr>
+        <w:trPr>
+          <w:tblHeader/>
+        </w:trPr>
+        <w:tc>
+          <w:tcPr>
+            <w:tcW w:type="dxa" w:w="2409"/>
+          </w:tcPr>
+          <w:p>
+            <w:pPr>
+              <w:spacing w:after="60"/>
+            </w:pPr>
+            <w:r>
+              <w:rPr>
+                <w:b/>
+                <w:sz w:val="18"/>
+              </w:rPr>
+              <w:t>Mã</w:t>
+            </w:r>
+          </w:p>
+        </w:tc>
+        <w:tc>
+          <w:tcPr>
+            <w:tcW w:type="dxa" w:w="2409"/>
+          </w:tcPr>
+          <w:p>
+            <w:pPr>
+              <w:spacing w:after="60"/>
+            </w:pPr>
+            <w:r>
+              <w:rPr>
+                <w:b/>
+                <w:sz w:val="18"/>
+              </w:rPr>
+              <w:t>Kiểm tra</w:t>
+            </w:r>
+          </w:p>
+        </w:tc>
+        <w:tc>
+          <w:tcPr>
+            <w:tcW w:type="dxa" w:w="2409"/>
+          </w:tcPr>
+          <w:p>
+            <w:pPr>
+              <w:spacing w:after="60"/>
+            </w:pPr>
+            <w:r>
+              <w:rPr>
+                <w:b/>
+                <w:sz w:val="18"/>
+              </w:rPr>
+              <w:t>Cần đạt / cần ghi nhận</w:t>
+            </w:r>
+          </w:p>
+        </w:tc>
+        <w:tc>
+          <w:tcPr>
+            <w:tcW w:type="dxa" w:w="2409"/>
+          </w:tcPr>
+          <w:p>
+            <w:pPr>
+              <w:spacing w:after="60"/>
+            </w:pPr>
+            <w:r>
+              <w:rPr>
+                <w:b/>
+                <w:sz w:val="18"/>
+              </w:rPr>
+              <w:t>Kết quả thực tế</w:t>
+            </w:r>
+          </w:p>
+        </w:tc>
+      </w:tr>
+      <w:tr>
+        <w:tc>
+          <w:tcPr>
+            <w:tcW w:type="dxa" w:w="2409"/>
+          </w:tcPr>
+          <w:p>
+            <w:pPr>
+              <w:spacing w:after="60"/>
+            </w:pPr>
+            <w:r>
+              <w:rPr>
+                <w:b w:val="0"/>
+                <w:sz w:val="18"/>
+              </w:rPr>
+              <w:t>F01</w:t>
+            </w:r>
+          </w:p>
+        </w:tc>
+        <w:tc>
+          <w:tcPr>
+            <w:tcW w:type="dxa" w:w="2409"/>
+          </w:tcPr>
+          <w:p>
+            <w:pPr>
+              <w:spacing w:after="60"/>
+            </w:pPr>
+            <w:r>
+              <w:rPr>
+                <w:b w:val="0"/>
+                <w:sz w:val="18"/>
+              </w:rPr>
+              <w:t>Các hiệu ứng tự chuyển màu mã 2/4/8/9/10/11/13; sáng 5/50/100 và tốc độ 1/50/100</w:t>
+            </w:r>
+          </w:p>
+        </w:tc>
+        <w:tc>
+          <w:tcPr>
+            <w:tcW w:type="dxa" w:w="2409"/>
+          </w:tcPr>
+          <w:p>
+            <w:pPr>
+              <w:spacing w:after="60"/>
+            </w:pPr>
+            <w:r>
+              <w:rPr>
+                <w:b w:val="0"/>
+                <w:sz w:val="18"/>
+              </w:rPr>
+              <w:t>So sánh bước màu qua đúng vỏ với 1.2.0, ghi mức còn thấy bước và hai nhánh cùng độ cao; không suy ra mượt từ FPS</w:t>
+            </w:r>
+          </w:p>
+        </w:tc>
+        <w:tc>
+          <w:tcPr>
+            <w:tcW w:type="dxa" w:w="2409"/>
+          </w:tcPr>
+          <w:p>
+            <w:pPr>
+              <w:spacing w:after="60"/>
+            </w:pPr>
+            <w:r>
+              <w:rPr>
+                <w:b w:val="0"/>
+                <w:sz w:val="18"/>
+              </w:rPr>
+              <w:t>Chưa thử 1.2.1</w:t>
+            </w:r>
+          </w:p>
+        </w:tc>
+      </w:tr>
+      <w:tr>
+        <w:tc>
+          <w:tcPr>
+            <w:tcW w:type="dxa" w:w="2409"/>
+          </w:tcPr>
+          <w:p>
+            <w:pPr>
+              <w:spacing w:after="60"/>
+            </w:pPr>
+            <w:r>
+              <w:rPr>
+                <w:b w:val="0"/>
+                <w:sz w:val="18"/>
+              </w:rPr>
+              <w:t>F02</w:t>
+            </w:r>
+          </w:p>
+        </w:tc>
+        <w:tc>
+          <w:tcPr>
+            <w:tcW w:type="dxa" w:w="2409"/>
+          </w:tcPr>
+          <w:p>
+            <w:pPr>
+              <w:spacing w:after="60"/>
+            </w:pPr>
+            <w:r>
+              <w:rPr>
+                <w:b w:val="0"/>
+                <w:sz w:val="18"/>
+              </w:rPr>
+              <w:t>Đổi tốc độ khi hiệu ứng đang chạy, theo dõi qua vòng chu kỳ</w:t>
+            </w:r>
+          </w:p>
+        </w:tc>
+        <w:tc>
+          <w:tcPr>
+            <w:tcW w:type="dxa" w:w="2409"/>
+          </w:tcPr>
+          <w:p>
+            <w:pPr>
+              <w:spacing w:after="60"/>
+            </w:pPr>
+            <w:r>
+              <w:rPr>
+                <w:b w:val="0"/>
+                <w:sz w:val="18"/>
+              </w:rPr>
+              <w:t>Pha không nhảy lúc đổi tốc độ; thay đổi tốc độ thấy được; ghi nếu còn giật qua chu kỳ</w:t>
+            </w:r>
+          </w:p>
+        </w:tc>
+        <w:tc>
+          <w:tcPr>
+            <w:tcW w:type="dxa" w:w="2409"/>
+          </w:tcPr>
+          <w:p>
+            <w:pPr>
+              <w:spacing w:after="60"/>
+            </w:pPr>
+            <w:r>
+              <w:rPr>
+                <w:b w:val="0"/>
+                <w:sz w:val="18"/>
+              </w:rPr>
+              <w:t>Chưa thử 1.2.1</w:t>
+            </w:r>
+          </w:p>
+        </w:tc>
+      </w:tr>
+      <w:tr>
+        <w:tc>
+          <w:tcPr>
+            <w:tcW w:type="dxa" w:w="2409"/>
+          </w:tcPr>
+          <w:p>
+            <w:pPr>
+              <w:spacing w:after="60"/>
+            </w:pPr>
+            <w:r>
+              <w:rPr>
+                <w:b w:val="0"/>
+                <w:sz w:val="18"/>
+              </w:rPr>
+              <w:t>F03</w:t>
+            </w:r>
+          </w:p>
+        </w:tc>
+        <w:tc>
+          <w:tcPr>
+            <w:tcW w:type="dxa" w:w="2409"/>
+          </w:tcPr>
+          <w:p>
+            <w:pPr>
+              <w:spacing w:after="60"/>
+            </w:pPr>
+            <w:r>
+              <w:rPr>
+                <w:b w:val="0"/>
+                <w:sz w:val="18"/>
+              </w:rPr>
+              <w:t>Lấp lánh qua vỏ dày với vài màu RGB, sáng/tốc độ khác nhau</w:t>
+            </w:r>
+          </w:p>
+        </w:tc>
+        <w:tc>
+          <w:tcPr>
+            <w:tcW w:type="dxa" w:w="2409"/>
+          </w:tcPr>
+          <w:p>
+            <w:pPr>
+              <w:spacing w:after="60"/>
+            </w:pPr>
+            <w:r>
+              <w:rPr>
+                <w:b w:val="0"/>
+                <w:sz w:val="18"/>
+              </w:rPr>
+              <w:t>Cụm xuất hiện/tắt dần thấy được trên nền gần đen, giữ màu đã chọn; ghi độ tương phản so với 1.2.0</w:t>
+            </w:r>
+          </w:p>
+        </w:tc>
+        <w:tc>
+          <w:tcPr>
+            <w:tcW w:type="dxa" w:w="2409"/>
+          </w:tcPr>
+          <w:p>
+            <w:pPr>
+              <w:spacing w:after="60"/>
+            </w:pPr>
+            <w:r>
+              <w:rPr>
+                <w:b w:val="0"/>
+                <w:sz w:val="18"/>
+              </w:rPr>
+              <w:t>Chưa thử 1.2.1</w:t>
+            </w:r>
+          </w:p>
+        </w:tc>
+      </w:tr>
+      <w:tr>
+        <w:tc>
+          <w:tcPr>
+            <w:tcW w:type="dxa" w:w="2409"/>
+          </w:tcPr>
+          <w:p>
+            <w:pPr>
+              <w:spacing w:after="60"/>
+            </w:pPr>
+            <w:r>
+              <w:rPr>
+                <w:b w:val="0"/>
+                <w:sz w:val="18"/>
+              </w:rPr>
+              <w:t>F04</w:t>
+            </w:r>
+          </w:p>
+        </w:tc>
+        <w:tc>
+          <w:tcPr>
+            <w:tcW w:type="dxa" w:w="2409"/>
+          </w:tcPr>
+          <w:p>
+            <w:pPr>
+              <w:spacing w:after="60"/>
+            </w:pPr>
+            <w:r>
+              <w:rPr>
+                <w:b w:val="0"/>
+                <w:sz w:val="18"/>
+              </w:rPr>
+              <w:t>OTA 1.2.0 → 1.2.1, reboot và áp dụng mục yêu thích</w:t>
+            </w:r>
+          </w:p>
+        </w:tc>
+        <w:tc>
+          <w:tcPr>
+            <w:tcW w:type="dxa" w:w="2409"/>
+          </w:tcPr>
+          <w:p>
+            <w:pPr>
+              <w:spacing w:after="60"/>
+            </w:pPr>
+            <w:r>
+              <w:rPr>
+                <w:b w:val="0"/>
+                <w:sz w:val="18"/>
+              </w:rPr>
+              <w:t>Giữ trạng thái bật/tắt, 14 mã chế độ, RGB, sáng/tốc độ, mục yêu thích, WiFi/tên/hostname; thử bật/tắt bình thường</w:t>
+            </w:r>
+          </w:p>
+        </w:tc>
+        <w:tc>
+          <w:tcPr>
+            <w:tcW w:type="dxa" w:w="2409"/>
+          </w:tcPr>
+          <w:p>
+            <w:pPr>
+              <w:spacing w:after="60"/>
+            </w:pPr>
+            <w:r>
+              <w:rPr>
+                <w:b w:val="0"/>
+                <w:sz w:val="18"/>
+              </w:rPr>
+              <w:t>Chưa thử 1.2.1</w:t>
             </w:r>
           </w:p>
         </w:tc>
@@ -7000,7 +7516,7 @@
     </w:p>
     <w:p>
       <w:r>
-        <w:t>Người dùng đã báo các bản trước hoạt động mượt; bảng chưa có kết quả từng ca để đánh dấu Đạt. Các thử bổ sung bản 1.2.0, đặc biệt tám hiệu ứng qua vỏ và nâng cấp giữ cấu hình, vẫn chờ thử trên bo thật.</w:t>
+        <w:t>Người dùng đã lắp và thử 1.2.0, có phản hồi chuyển màu/Lấp lánh; bảng nền chưa có kết quả từng ca để đánh dấu Đạt. Bản 1.2.1 ưu tiên F01–F04 trên bo/vỏ thật để xác nhận thay đổi và giữ cấu hình sau OTA.</w:t>
       </w:r>
     </w:p>
     <w:sectPr>
@@ -7037,7 +7553,7 @@
       <w:pStyle w:val="Caption"/>
     </w:pPr>
     <w:r>
-      <w:t>ĐÈN DECO  |  ESP32-C3  |  FIRMWARE 1.2.0</w:t>
+      <w:t>ĐÈN DECO  |  ESP32-C3  |  FIRMWARE 1.2.1</w:t>
     </w:r>
   </w:p>
 </w:hdr>

</xml_diff>

<commit_message>
Add Internet clock, weekly schedules and sunrise automation in Den Deco 1.3.0
</commit_message>
<xml_diff>
--- a/HUONG_DAN.docx
+++ b/HUONG_DAN.docx
@@ -7,7 +7,7 @@
         <w:pStyle w:val="Heading1"/>
       </w:pPr>
       <w:r>
-        <w:t>Hướng dẫn Đèn Deco 1.2.1</w:t>
+        <w:t>Hướng dẫn Đèn Deco 1.3.0</w:t>
       </w:r>
     </w:p>
     <w:p>
@@ -77,6 +77,14 @@
       </w:pPr>
       <w:r>
         <w:t>14 chế độ: sáu chế độ cũ cùng tám hiệu ứng mới; mục Hướng dẫn sử dụng nằm ngay trên web.</w:t>
+      </w:r>
+    </w:p>
+    <w:p>
+      <w:pPr>
+        <w:pStyle w:val="ListBullet"/>
+      </w:pPr>
+      <w:r>
+        <w:t>Tám dòng lịch tuần bật/tắt, giờ Internet Việt Nam UTC+7, bình minh tăng sáng và bật đèn lúc mặt trời lặn; mặc định các tự động mới tắt.</w:t>
       </w:r>
     </w:p>
     <w:p>
@@ -1149,7 +1157,7 @@
     </w:p>
     <w:p>
       <w:r>
-        <w:t>Bộ core/thư viện người dùng đang có là ESP32 3.3.1, NeoPixel 1.15.5 và ArduinoJson 7.4.3; giữ bộ này để biên dịch. Thông tin build và file OTA 1.2.1 ghi trong BUILD_INFO.md. Profile PlatformIO 2.0.17 là phương án build bổ sung; không cần đổi bộ Arduino IDE hiện tại về phiên bản đó. Người dùng đã lắp và thử bản 1.2.0; bản 1.2.1 mới cần thử lại trên bo/vỏ thực tế. Nếu bo có dung lượng flash khác 4 MB, chỉnh cấu hình và biên dịch lại cho bo thực tế.</w:t>
+        <w:t>Bộ core/thư viện người dùng đang có là ESP32 3.3.1, NeoPixel 1.15.5 và ArduinoJson 7.4.3; giữ bộ này để biên dịch. Thông tin build và file OTA 1.3.0 ghi trong BUILD_INFO.md. Profile PlatformIO 2.0.17 là phương án build bổ sung; không cần đổi bộ Arduino IDE hiện tại về phiên bản đó. Người dùng đã lắp và thử bản 1.2.0; các tính năng giờ/lịch của 1.3.0 mới cần thử trên bo thực tế. Nếu bo có dung lượng flash khác 4 MB, chỉnh cấu hình và biên dịch lại cho bo thực tế.</w:t>
       </w:r>
     </w:p>
     <w:p>
@@ -2710,7 +2718,357 @@
         <w:pStyle w:val="Heading2"/>
       </w:pPr>
       <w:r>
-        <w:t>7. Lưu trạng thái</w:t>
+        <w:t>7. Giờ Internet, lịch tuần và mặt trời</w:t>
+      </w:r>
+    </w:p>
+    <w:p>
+      <w:pPr>
+        <w:pStyle w:val="Heading3"/>
+      </w:pPr>
+      <w:r>
+        <w:t>Giờ Việt Nam và kết nối</w:t>
+      </w:r>
+    </w:p>
+    <w:p>
+      <w:r>
+        <w:t>Các lịch dùng giờ Việt Nam UTC+7, không đổi múi giờ theo tọa độ hoặc giờ của điện thoại. ESP đồng bộ giờ thực qua SNTP bất đồng bộ khi WiFi nhà có Internet; trang hiển thị giờ và trạng thái đồng bộ. Đèn chỉ đang phát AP lần đầu thì chưa có Internet để lấy giờ, nên các lịch chờ đến khi đồng bộ thành công. Cảm ứng, web và hiệu ứng vẫn dùng được trong lúc chờ.</w:t>
+      </w:r>
+    </w:p>
+    <w:p>
+      <w:r>
+        <w:t>Sau khi đã đồng bộ trong phiên chạy, mất WiFi/Internet vẫn tiếp tục giữ giờ bằng đồng hồ của ESP và các lịch vẫn hoạt động; độ chính xác có thể trôi nếu mất mạng lâu. Khi router có Internet trở lại, ESP tiếp tục đồng bộ. Sau mất nguồn/reboot, cần lấy giờ Internet lại trước khi lịch chạy; thiết bị không có RTC có pin để giữ giờ khi mất điện.</w:t>
+      </w:r>
+    </w:p>
+    <w:p>
+      <w:r>
+        <w:t>Không chạy bù sự kiện bị lỡ. Khi mới khởi động/đồng bộ lần đầu, lưu sửa kế hoạch, giờ bị nhảy hoặc kết thúc OTA, firmware lấy phút hiện tại làm mốc và chỉ chờ các phút kế tiếp. Vì vậy, lịch trùng phút đang cấu hình sẽ không bật đèn ngay; đặt giờ thử ít nhất một phút phía trước và lưu trước khi đến phút đó. Các lần đồng bộ định kỳ bình thường không chạy lại sự kiện đã thực hiện.</w:t>
+      </w:r>
+    </w:p>
+    <w:p>
+      <w:pPr>
+        <w:pStyle w:val="Heading3"/>
+      </w:pPr>
+      <w:r>
+        <w:t>Tám dòng lịch tuần</w:t>
+      </w:r>
+    </w:p>
+    <w:p>
+      <w:r>
+        <w:t>1. Trước khi tạo lịch bật, chuẩn bị ánh sáng rồi bấm Lưu hiện tại ở một trong ba mục yêu thích.</w:t>
+      </w:r>
+    </w:p>
+    <w:p>
+      <w:r>
+        <w:t>2. Trong mục lịch trên web, bật sử dụng lịch tuần. Có tối đa tám dòng; mỗi dòng chọn bật/tắt, giờ HH:MM, một hoặc nhiều thứ từ Thứ Hai đến Chủ nhật và bật sử dụng dòng đó.</w:t>
+      </w:r>
+    </w:p>
+    <w:p>
+      <w:r>
+        <w:t>3. Với dòng bật, chọn Mục 1/2/3; với dòng tắt không cần mục yêu thích. Bấm lưu kế hoạch và kiểm tra trạng thái lưu thành công.</w:t>
+      </w:r>
+    </w:p>
+    <w:p>
+      <w:r>
+        <w:t>Khi đến giờ bật, đèn đọc nội dung hiện đang lưu trong mục yêu thích đã chọn, áp dụng mode/màu/độ sáng/tốc độ và bật đèn. Sửa mục yêu thích trước lần lịch tiếp theo sẽ làm lần bật đó dùng cấu hình mới; lịch chỉ giữ số mục, không chép cố định màu vào dòng lịch. Nếu mục đã chọn trống hoặc dữ liệu ánh sáng không hợp lệ, sự kiện bật đó được bỏ qua an toàn. Muốn hủy một dòng, tắt sử dụng dòng rồi lưu; tắt lịch tuần không xóa các dòng đã nhập.</w:t>
+      </w:r>
+    </w:p>
+    <w:p>
+      <w:r>
+        <w:t>Ô đang chỉnh là bản nháp cho đến khi lưu thành công. Trang giữ các ô đang sửa khi cập nhật trạng thái định kỳ; giờ đèn vẫn chạy theo kế hoạch đã lưu. Các lịch/tọa độ được lưu riêng trong NVS, giữ qua reboot và OTA. Không phải chờ mốc lưu ánh sáng 10 giây để áp dụng kế hoạch đã lưu.</w:t>
+      </w:r>
+    </w:p>
+    <w:p>
+      <w:pPr>
+        <w:pStyle w:val="Heading3"/>
+      </w:pPr>
+      <w:r>
+        <w:t>Bình minh và bật lúc mặt trời lặn</w:t>
+      </w:r>
+    </w:p>
+    <w:p>
+      <w:r>
+        <w:t>Tọa độ đã chốt là TP.HCM: vĩ độ 10.776, kinh độ 106.7. Có thể nhập vĩ độ −89 đến 89, kinh độ −180 đến 180 nếu đổi nơi dùng đèn. Các giờ hiển thị vẫn là UTC+7. Bình minh và mặt trời lặn là hai lựa chọn độc lập, mặc định đều tắt; mỗi lựa chọn có các thứ hoạt động và độ lệch −120 đến +120 phút riêng. Độ lệch âm chạy sớm, dương chạy muộn so với giờ mặt trời.</w:t>
+      </w:r>
+    </w:p>
+    <w:tbl>
+      <w:tblPr>
+        <w:tblStyle w:val="LightShading-Accent1"/>
+        <w:tblW w:type="auto" w:w="0"/>
+        <w:tblLook w:firstColumn="1" w:firstRow="1" w:lastColumn="0" w:lastRow="0" w:noHBand="0" w:noVBand="1" w:val="04A0"/>
+      </w:tblPr>
+      <w:tblGrid>
+        <w:gridCol w:w="3213"/>
+        <w:gridCol w:w="3213"/>
+        <w:gridCol w:w="3213"/>
+      </w:tblGrid>
+      <w:tr>
+        <w:trPr>
+          <w:tblHeader/>
+        </w:trPr>
+        <w:tc>
+          <w:tcPr>
+            <w:tcW w:type="dxa" w:w="3213"/>
+          </w:tcPr>
+          <w:p>
+            <w:pPr>
+              <w:spacing w:after="60"/>
+            </w:pPr>
+            <w:r>
+              <w:rPr>
+                <w:b/>
+                <w:sz w:val="18"/>
+              </w:rPr>
+              <w:t>Tự động</w:t>
+            </w:r>
+          </w:p>
+        </w:tc>
+        <w:tc>
+          <w:tcPr>
+            <w:tcW w:type="dxa" w:w="3213"/>
+          </w:tcPr>
+          <w:p>
+            <w:pPr>
+              <w:spacing w:after="60"/>
+            </w:pPr>
+            <w:r>
+              <w:rPr>
+                <w:b/>
+                <w:sz w:val="18"/>
+              </w:rPr>
+              <w:t>Thời điểm bắt đầu</w:t>
+            </w:r>
+          </w:p>
+        </w:tc>
+        <w:tc>
+          <w:tcPr>
+            <w:tcW w:type="dxa" w:w="3213"/>
+          </w:tcPr>
+          <w:p>
+            <w:pPr>
+              <w:spacing w:after="60"/>
+            </w:pPr>
+            <w:r>
+              <w:rPr>
+                <w:b/>
+                <w:sz w:val="18"/>
+              </w:rPr>
+              <w:t>Ánh sáng</w:t>
+            </w:r>
+          </w:p>
+        </w:tc>
+      </w:tr>
+      <w:tr>
+        <w:tc>
+          <w:tcPr>
+            <w:tcW w:type="dxa" w:w="3213"/>
+          </w:tcPr>
+          <w:p>
+            <w:pPr>
+              <w:spacing w:after="60"/>
+            </w:pPr>
+            <w:r>
+              <w:rPr>
+                <w:b w:val="0"/>
+                <w:sz w:val="18"/>
+              </w:rPr>
+              <w:t>Bình minh</w:t>
+            </w:r>
+          </w:p>
+        </w:tc>
+        <w:tc>
+          <w:tcPr>
+            <w:tcW w:type="dxa" w:w="3213"/>
+          </w:tcPr>
+          <w:p>
+            <w:pPr>
+              <w:spacing w:after="60"/>
+            </w:pPr>
+            <w:r>
+              <w:rPr>
+                <w:b w:val="0"/>
+                <w:sz w:val="18"/>
+              </w:rPr>
+              <w:t>Đúng giờ mặt trời mọc, cộng độ lệch đã chọn</w:t>
+            </w:r>
+          </w:p>
+        </w:tc>
+        <w:tc>
+          <w:tcPr>
+            <w:tcW w:type="dxa" w:w="3213"/>
+          </w:tcPr>
+          <w:p>
+            <w:pPr>
+              <w:spacing w:after="60"/>
+            </w:pPr>
+            <w:r>
+              <w:rPr>
+                <w:b w:val="0"/>
+                <w:sz w:val="18"/>
+              </w:rPr>
+              <w:t>Khi đang tắt, tăng từ 0 lên mục yêu thích hoặc màu ấm có sẵn trong 30 phút, chỉnh được 1–120 phút</w:t>
+            </w:r>
+          </w:p>
+        </w:tc>
+      </w:tr>
+      <w:tr>
+        <w:tc>
+          <w:tcPr>
+            <w:tcW w:type="dxa" w:w="3213"/>
+          </w:tcPr>
+          <w:p>
+            <w:pPr>
+              <w:spacing w:after="60"/>
+            </w:pPr>
+            <w:r>
+              <w:rPr>
+                <w:b w:val="0"/>
+                <w:sz w:val="18"/>
+              </w:rPr>
+              <w:t>Mặt trời lặn</w:t>
+            </w:r>
+          </w:p>
+        </w:tc>
+        <w:tc>
+          <w:tcPr>
+            <w:tcW w:type="dxa" w:w="3213"/>
+          </w:tcPr>
+          <w:p>
+            <w:pPr>
+              <w:spacing w:after="60"/>
+            </w:pPr>
+            <w:r>
+              <w:rPr>
+                <w:b w:val="0"/>
+                <w:sz w:val="18"/>
+              </w:rPr>
+              <w:t>Đúng giờ mặt trời lặn, cộng độ lệch đã chọn</w:t>
+            </w:r>
+          </w:p>
+        </w:tc>
+        <w:tc>
+          <w:tcPr>
+            <w:tcW w:type="dxa" w:w="3213"/>
+          </w:tcPr>
+          <w:p>
+            <w:pPr>
+              <w:spacing w:after="60"/>
+            </w:pPr>
+            <w:r>
+              <w:rPr>
+                <w:b w:val="0"/>
+                <w:sz w:val="18"/>
+              </w:rPr>
+              <w:t>Bật mục yêu thích hoặc màu ấm có sẵn</w:t>
+            </w:r>
+          </w:p>
+        </w:tc>
+      </w:tr>
+    </w:tbl>
+    <w:p/>
+    <w:p>
+      <w:r>
+        <w:t>Màu ấm có sẵn là RGB (255,160,72), độ sáng 35% trên thang sáng chính, vẫn chịu trần đầu ra. Lựa chọn này dùng được dù chưa lưu mục yêu thích. Nếu chọn Mục 1/2/3, tự động đọc cấu hình mục đó khi bắt đầu sự kiện; mục trống/hỏng thì bỏ qua, không tự đổi sang màu ấm.</w:t>
+      </w:r>
+    </w:p>
+    <w:p>
+      <w:r>
+        <w:t>Bình minh bắt đầu tăng tại giờ mặt trời mọc, không tăng trước để đạt sáng tối đa đúng lúc mọc. Độ lệch cho phép dời thời điểm bắt đầu nếu muốn; kết thúc tăng sau thời lượng đã chọn. Các thao tác điều khiển ánh sáng bằng cảm ứng/web dừng lần tăng đang chạy và áp dụng lệnh tay. Việc này không tắt các lịch: sự kiện tương lai vẫn tiếp tục chạy.</w:t>
+      </w:r>
+    </w:p>
+    <w:p>
+      <w:r>
+        <w:t>Nếu đèn đã bật, Bình minh chuyển từ mức đang hiển thị tới mức đích. Các bước tăng sáng chạy trong RAM; cấu hình ánh sáng được lưu khi hoàn tất hoặc khi bạn dừng bằng tay. Lưu kế hoạch hoặc bắt đầu OTA cũng dừng lần tăng hiện tại ở mức gần nhất có thể lưu. Nếu mất nguồn trong lúc tăng, đèn khôi phục cấu hình trước khi bắt đầu, rồi chờ đồng bộ giờ và sự kiện tương lai; không tăng tiếp giữa chừng. Nếu chưa lưu được cấu hình nền, sự kiện Bình minh được bỏ qua và web báo lỗi.</w:t>
+      </w:r>
+    </w:p>
+    <w:p>
+      <w:r>
+        <w:t>Giờ mọc/lặn được tính trên ESP theo công thức thiên văn kiểu NOAA và tọa độ/ngày, với giả định đường chân trời chuẩn; giờ được làm tròn đến phút. Đây là ước tính thiên văn, không phải dự báo thời tiết; không cần tài khoản, API key hay dịch vụ thời tiết. Mây, địa hình, nhà cửa và cách nhìn mặt trời thực tế có thể làm thời điểm quan sát khác với giờ tính. Nếu vị trí/ngày không có sự kiện mọc hoặc lặn hợp lệ, tự động tương ứng không chạy ngày đó; lịch tuần theo giờ vẫn dùng được.</w:t>
+      </w:r>
+    </w:p>
+    <w:p>
+      <w:r>
+        <w:t>Hoàng hôn trong danh sách 14 hiệu ứng (mã 11) vẫn là một hiệu ứng màu. Tự động lúc mặt trời lặn là lịch bật theo giờ thiên văn; chỉ chọn mục yêu thích chứa hiệu ứng Hoàng hôn khi muốn lịch bật vào hiệu ứng này.</w:t>
+      </w:r>
+    </w:p>
+    <w:p>
+      <w:pPr>
+        <w:pStyle w:val="Heading3"/>
+      </w:pPr>
+      <w:r>
+        <w:t>Trùng lịch và hẹn giờ đếm ngược</w:t>
+      </w:r>
+    </w:p>
+    <w:p>
+      <w:r>
+        <w:t>Mỗi phút sự kiện chỉ được quyết định một lần theo thứ tự ưu tiên:</w:t>
+      </w:r>
+    </w:p>
+    <w:p>
+      <w:r>
+        <w:t>1. Có lịch tuần tắt: tắt thắng tất cả lịch bật và sự kiện mặt trời trùng phút.</w:t>
+      </w:r>
+    </w:p>
+    <w:p>
+      <w:r>
+        <w:t>2. Nếu không có lịch tắt, lịch tuần bật thắng sự kiện mặt trời; nhiều dòng bật cùng phút thì dòng bật sau cùng trong danh sách thắng.</w:t>
+      </w:r>
+    </w:p>
+    <w:p>
+      <w:r>
+        <w:t>3. Nếu chỉ có hai sự kiện mặt trời trùng phút, mặt trời lặn thắng bình minh.</w:t>
+      </w:r>
+    </w:p>
+    <w:p>
+      <w:r>
+        <w:t>Đèn áp dụng kết quả được chọn một lần, tránh bật rồi tắt do nhiều sự kiện cùng phút. Sự kiện lịch được áp dụng sẽ hủy hẹn giờ đếm ngược đang chạy. Hẹn giờ đếm ngược 1–180 phút vẫn là chức năng riêng; các lần lịch tương lai không bị hủy khi thao tác tay hoặc đặt/hủy đếm ngược.</w:t>
+      </w:r>
+    </w:p>
+    <w:p>
+      <w:pPr>
+        <w:pStyle w:val="Heading3"/>
+      </w:pPr>
+      <w:r>
+        <w:t>Thử nhanh trên đèn</w:t>
+      </w:r>
+    </w:p>
+    <w:p>
+      <w:pPr>
+        <w:pStyle w:val="ListBullet"/>
+      </w:pPr>
+      <w:r>
+        <w:t>Lịch tuần một phút: đợi trang có giờ đồng bộ, lưu Mục 1, đặt một dòng bật cho hôm nay ở phút kế tiếp và một dòng tắt một phút sau đó. Lưu trước giờ bật, giữ trang mở để đối chiếu giờ và trạng thái. Nếu đã sang phút bật lúc lưu, đặt lại sang phút sau; không sửa đồng hồ để ép chạy.</w:t>
+      </w:r>
+    </w:p>
+    <w:p>
+      <w:pPr>
+        <w:pStyle w:val="ListBullet"/>
+      </w:pPr>
+      <w:r>
+        <w:t>Giữ giờ khi mất WiFi: sau khi đã đồng bộ, đặt lịch tương lai rồi tắt router; kiểm tra giờ tiếp tục chạy và sự kiện đến đúng phút. Bật router lại, kiểm tra đồng bộ/khôi phục. Reboot khi không có Internet phải chờ giờ mới, không chạy bù lịch cũ.</w:t>
+      </w:r>
+    </w:p>
+    <w:p>
+      <w:pPr>
+        <w:pStyle w:val="ListBullet"/>
+      </w:pPr>
+      <w:r>
+        <w:t>Bình minh thử ngắn: bật bình minh cho hôm nay, chọn màu ấm có sẵn và thời lượng 1 phút. Dùng độ lệch ±120 phút để dời giờ mặt trời mọc sang một phút tương lai nếu thời điểm hiện tại nằm trong phạm vi đó; nếu không, thử gần giờ mọc ngày tiếp theo. Giữ đồng hồ thực; không giả giờ và không dùng chế độ mô phỏng để xác nhận phần cứng. Sau thử trả thời lượng/độ lệch về giá trị dùng hằng ngày.</w:t>
+      </w:r>
+    </w:p>
+    <w:p>
+      <w:pPr>
+        <w:pStyle w:val="ListBullet"/>
+      </w:pPr>
+      <w:r>
+        <w:t>OTA giữ kế hoạch: lưu các dòng/tọa độ, thực hiện OTA 1.3.0 rồi kiểm tra lại. Đợi SNTP đồng bộ sau reboot và đặt một sự kiện tương lai mới; sự kiện bị lỡ trong OTA không được chạy bù.</w:t>
+      </w:r>
+    </w:p>
+    <w:p>
+      <w:pPr>
+        <w:pStyle w:val="Heading2"/>
+      </w:pPr>
+      <w:r>
+        <w:t>8. Lưu trạng thái</w:t>
       </w:r>
     </w:p>
     <w:p>
@@ -2735,7 +3093,7 @@
     </w:p>
     <w:p>
       <w:r>
-        <w:t>Bản 1.2.1 tiếp tục đọc dữ liệu ánh sáng schema 1 và 2, ghi schema 2 như bản 1.2.0. Nâng cấp OTA 1.2.0 → 1.2.1 giữ cấu hình đèn, cả 14 mã chế độ, ba mục yêu thích, WiFi, tên và tên truy cập. Nâng cấp từ 1.1.0 giữ các cấu hình/mục yêu thích cũ vì sáu mã chế độ đầu không đổi. Nếu cần quay lại 1.1.0 sau khi dữ liệu đã lưu schema 2, dùng USB: firmware cũ có thể không đọc được schema mới và sẽ không ghi đè dữ liệu đó.</w:t>
+        <w:t>Bản 1.3.0 tiếp tục đọc dữ liệu ánh sáng schema 1 và 2, ghi schema 2 như bản 1.2.x. Nâng cấp OTA từ 1.2.x giữ cấu hình đèn, cả 14 mã chế độ, ba mục yêu thích, WiFi, tên và tên truy cập. Kế hoạch tuần/bình minh/mặt trời lặn và tọa độ lưu riêng trong namespace NVS deco-plan; không đổi schema ánh sáng. Nâng cấp từ 1.1.0 giữ các cấu hình/mục yêu thích cũ vì sáu mã chế độ đầu không đổi. Nếu cần quay lại 1.1.0 sau khi dữ liệu đã lưu schema 2, dùng USB: firmware cũ có thể không đọc được schema mới và sẽ không ghi đè dữ liệu đó.</w:t>
       </w:r>
     </w:p>
     <w:p>
@@ -2743,7 +3101,7 @@
         <w:pStyle w:val="Heading2"/>
       </w:pPr>
       <w:r>
-        <w:t>8. Cập nhật OTA</w:t>
+        <w:t>9. Cập nhật OTA</w:t>
       </w:r>
     </w:p>
     <w:p>
@@ -2758,7 +3116,7 @@
     </w:p>
     <w:p>
       <w:r>
-        <w:t>2. Tìm file ứng dụng DenDeco.ino.bin hoặc tên tương đương do IDE xuất. Không chọn .bootloader.bin, .partitions.bin, .merged.bin hoặc file dùng cho ESP32/S2/S3 khác. Gói bàn giao cũng có firmware/DenDeco-1.2.1-ota.bin; dùng để nâng cấp đèn đang chạy 1.2.0 hoặc 1.1.0.</w:t>
+        <w:t>2. Tìm file ứng dụng DenDeco.ino.bin hoặc tên tương đương do IDE xuất. Không chọn .bootloader.bin, .partitions.bin, .merged.bin hoặc file dùng cho ESP32/S2/S3 khác. Gói bàn giao cũng có firmware/DenDeco-1.3.0-ota.bin; dùng để nâng cấp đèn đang chạy 1.2.x hoặc 1.1.0.</w:t>
       </w:r>
     </w:p>
     <w:p>
@@ -2788,7 +3146,7 @@
     </w:p>
     <w:p>
       <w:r>
-        <w:t>Giới hạn của phân vùng ứng dụng mặc định là 1.310.720 byte; kích thước file 1.2.1 được ghi trong BUILD_INFO.md. Nếu dùng sơ đồ phân vùng khác, giới hạn trên trang lấy từ phân vùng thực tế. Đổi bảng phân vùng phải nạp USB; OTA chỉ thay ứng dụng.</w:t>
+        <w:t>Giới hạn của phân vùng ứng dụng mặc định là 1.310.720 byte; kích thước file 1.3.0 được ghi trong BUILD_INFO.md. Nếu dùng sơ đồ phân vùng khác, giới hạn trên trang lấy từ phân vùng thực tế. Đổi bảng phân vùng phải nạp USB; OTA chỉ thay ứng dụng.</w:t>
       </w:r>
     </w:p>
     <w:p>
@@ -2801,7 +3159,7 @@
         <w:pStyle w:val="Heading2"/>
       </w:pPr>
       <w:r>
-        <w:t>9. Thử lần đầu và chẩn đoán</w:t>
+        <w:t>10. Thử lần đầu và chẩn đoán</w:t>
       </w:r>
     </w:p>
     <w:p>
@@ -2861,7 +3219,7 @@
     </w:p>
     <w:p>
       <w:r>
-        <w:t>Thông tin biên dịch và kiểm tra logic/giao diện bằng mô phỏng được ghi trong BUILD_INFO.md và KIEM_THU.md. Người dùng đã thử bản 1.2.0 trên đèn, báo bước chuyển màu còn lớn và Lấp lánh khó thấy do mật độ LED lớn. Bản 1.2.1 mới cần thử lại trên bo/vỏ đó; độ mượt/độ tương phản chưa được xác nhận từ mô phỏng. Sau nâng cấp, ưu tiên các ca F01–F04 về chuyển màu, pha khi đổi tốc độ, Lấp lánh và giữ cấu hình; ghi kết quả trong KIEM_THU.md.</w:t>
+        <w:t>Thông tin biên dịch và kiểm tra logic/giao diện bằng mô phỏng được ghi trong BUILD_INFO.md và KIEM_THU.md. Người dùng đã thử bản 1.2.0 trên đèn, có phản hồi chuyển màu/Lấp lánh. Giờ SNTP, lịch tuần, bình minh và mặt trời lặn của bản 1.3.0 mới cần thử trên bo thật; mô phỏng không xác nhận đường mạng SNTP hoặc độ sáng cảm nhận. Sau nâng cấp, ưu tiên các ca A01–A12, giữ các ca ánh sáng/nguồn/cảm ứng để bổ sung kết quả; ghi kết quả trong KIEM_THU.md.</w:t>
       </w:r>
     </w:p>
     <w:p>
@@ -2874,7 +3232,7 @@
         <w:pStyle w:val="Heading1"/>
       </w:pPr>
       <w:r>
-        <w:t>Cấu hình và kế hoạch Đèn Deco 1.2.1</w:t>
+        <w:t>Cấu hình và kế hoạch Đèn Deco 1.3.0</w:t>
       </w:r>
     </w:p>
     <w:p>
@@ -2888,6 +3246,31 @@
     <w:p>
       <w:r>
         <w:t>Phạm vi: firmware, web trên ESP và hướng dẫn đấu nối/nạp. Người dùng tự xử lý cơ khí/vỏ. ESP32-C3 SuperMini, bốn TTP223, 20 WS2812B và nguồn 5 V–2 A. Tên Đèn Deco; WiFi nhà + AP dự phòng. Máy nạp Windows, Arduino IDE. Bổ sung OTA qua web theo yêu cầu mới.</w:t>
+      </w:r>
+    </w:p>
+    <w:p>
+      <w:r>
+        <w:t>Bản 1.3.0 thêm tối đa tám dòng lịch tuần ON/OFF theo giờ Internet Việt Nam UTC+7. Mỗi dòng ON tham chiếu trực tiếp một trong ba mục yêu thích (mã 0–2, hiển thị Mục 1–3), đọc nội dung lúc chạy; mục trống/hỏng thì bỏ qua an toàn. Kế hoạch lưu riêng trong NVS deco-plan, không đổi schema ánh sáng 2 và không sao chép lại màu của các mục yêu thích.</w:t>
+      </w:r>
+    </w:p>
+    <w:p>
+      <w:r>
+        <w:t>ESP đồng bộ SNTP bất đồng bộ khi WiFi nhà có Internet. AP lần đầu không có nguồn giờ Internet nên lịch chờ đồng bộ. Sau đồng bộ trong phiên chạy, mất mạng vẫn giữ giờ và chạy lịch; sau reboot/mất điện cần đồng bộ lại. Không chạy bù sự kiện bị lỡ sau boot/sửa lịch/nhảy giờ/OTA; lần đồng bộ đầu chỉ lấy phút hiện tại làm mốc, đợi phút tiếp theo. Web giữ bản nháp các ô đang sửa khi polling.</w:t>
+      </w:r>
+    </w:p>
+    <w:p>
+      <w:r>
+        <w:t>Tọa độ mặc định đã xác nhận: TP.HCM 10.776, 106.7. Vĩ độ chỉnh −89…89, kinh độ −180…180; giờ luôn UTC+7. Hai tự động mặt trời độc lập, mặc định tắt, đều có mask ngày trong tuần và offset ±120 phút. Bình minh bắt đầu tại mặt trời mọc cộng offset, khi đang tắt tăng từ 0 lên màu ấm RGB (255,160,72) ở mức 35% hoặc mục yêu thích; thời lượng mặc định 30 phút, chỉnh 1–120 phút. Mặt trời lặn cộng offset bật màu ấm này hoặc mục yêu thích. Công thức thiên văn kiểu NOAA tính tại ESP theo ngày/tọa độ, không dùng API/dự báo thời tiết; đường chân trời/khúc xạ là xấp xỉ và không xét mây/địa hình.</w:t>
+      </w:r>
+    </w:p>
+    <w:p>
+      <w:r>
+        <w:t>Nếu đã bật, ramp đi từ mức đang hiển thị tới mức đích. Trạng thái nền phải lưu được trước khi chạy Bình minh; nội suy chỉ trong RAM, lưu cấu hình cuối khi hoàn tất hoặc khi dừng bằng tay/lưu kế hoạch/OTA. Mất nguồn trong ramp khôi phục trạng thái nền, không chạy tiếp giữa chừng.</w:t>
+      </w:r>
+    </w:p>
+    <w:p>
+      <w:r>
+        <w:t>Các điều khiển ánh sáng tay dừng ramp bình minh đang chạy, không hủy các lịch tương lai. Sự kiện tự động được áp dụng hủy countdown đang chạy. Trong cùng phút, OFF tuần thắng; nếu không OFF thì ON tuần thắng mặt trời và dòng ON cuối thắng các dòng ON trước; nếu chỉ mặt trời xung đột thì dusk thắng dawn. Chỉ áp dụng một kết quả để không bật/tắt trung gian. Hiệu ứng Hoàng hôn mã 11 giữ nguyên và độc lập với lịch bật lúc mặt trời lặn.</w:t>
       </w:r>
     </w:p>
     <w:p>
@@ -3448,7 +3831,7 @@
                 <w:b w:val="0"/>
                 <w:sz w:val="18"/>
               </w:rPr>
-              <w:t>OTA</w:t>
+              <w:t>Đồng hồ/lịch tuần</w:t>
             </w:r>
           </w:p>
         </w:tc>
@@ -3465,7 +3848,7 @@
                 <w:b w:val="0"/>
                 <w:sz w:val="18"/>
               </w:rPr>
-              <w:t>File ứng dụng C3, phân vùng còn lại, giữ NVS, reboot sau thành công</w:t>
+              <w:t>SNTP, UTC+7, tám dòng ON/OFF, live favorite, không chạy bù</w:t>
             </w:r>
           </w:p>
         </w:tc>
@@ -3482,7 +3865,7 @@
                 <w:b w:val="0"/>
                 <w:sz w:val="18"/>
               </w:rPr>
-              <w:t>Kiểm tra nâng cấp 1.2.0 → 1.2.1 giữ cấu hình</w:t>
+              <w:t>Bản 1.3.0 bổ sung; kết quả host ghi ở KIEM_THU.md, mạng/bo thật chờ thử</w:t>
             </w:r>
           </w:p>
         </w:tc>
@@ -3501,7 +3884,7 @@
                 <w:b w:val="0"/>
                 <w:sz w:val="18"/>
               </w:rPr>
-              <w:t>Bàn giao Windows</w:t>
+              <w:t>Mặt trời</w:t>
             </w:r>
           </w:p>
         </w:tc>
@@ -3518,7 +3901,7 @@
                 <w:b w:val="0"/>
                 <w:sz w:val="18"/>
               </w:rPr>
-              <w:t>Sketch, .bin OTA 1.2.1, hướng dẫn và checklist</w:t>
+              <w:t>Tọa độ TP.HCM, bình minh ramp và dusk độc lập, offset/ngày/preset ấm</w:t>
             </w:r>
           </w:p>
         </w:tc>
@@ -3535,7 +3918,7 @@
                 <w:b w:val="0"/>
                 <w:sz w:val="18"/>
               </w:rPr>
-              <w:t>Thông tin gói/build ghi ở BUILD_INFO.md</w:t>
+              <w:t>Bản 1.3.0 bổ sung; thời điểm và ramp trên bo chờ thử</w:t>
             </w:r>
           </w:p>
         </w:tc>
@@ -3554,6 +3937,165 @@
                 <w:b w:val="0"/>
                 <w:sz w:val="18"/>
               </w:rPr>
+              <w:t>Lưu kế hoạch</w:t>
+            </w:r>
+          </w:p>
+        </w:tc>
+        <w:tc>
+          <w:tcPr>
+            <w:tcW w:type="dxa" w:w="3213"/>
+          </w:tcPr>
+          <w:p>
+            <w:pPr>
+              <w:spacing w:after="60"/>
+            </w:pPr>
+            <w:r>
+              <w:rPr>
+                <w:b w:val="0"/>
+                <w:sz w:val="18"/>
+              </w:rPr>
+              <w:t>Namespace deco-plan, giữ draft và kế hoạch qua reset/OTA</w:t>
+            </w:r>
+          </w:p>
+        </w:tc>
+        <w:tc>
+          <w:tcPr>
+            <w:tcW w:type="dxa" w:w="3213"/>
+          </w:tcPr>
+          <w:p>
+            <w:pPr>
+              <w:spacing w:after="60"/>
+            </w:pPr>
+            <w:r>
+              <w:rPr>
+                <w:b w:val="0"/>
+                <w:sz w:val="18"/>
+              </w:rPr>
+              <w:t>Bản 1.3.0 bổ sung; kiểm tra riêng ánh sáng/NVS và kế hoạch</w:t>
+            </w:r>
+          </w:p>
+        </w:tc>
+      </w:tr>
+      <w:tr>
+        <w:tc>
+          <w:tcPr>
+            <w:tcW w:type="dxa" w:w="3213"/>
+          </w:tcPr>
+          <w:p>
+            <w:pPr>
+              <w:spacing w:after="60"/>
+            </w:pPr>
+            <w:r>
+              <w:rPr>
+                <w:b w:val="0"/>
+                <w:sz w:val="18"/>
+              </w:rPr>
+              <w:t>OTA</w:t>
+            </w:r>
+          </w:p>
+        </w:tc>
+        <w:tc>
+          <w:tcPr>
+            <w:tcW w:type="dxa" w:w="3213"/>
+          </w:tcPr>
+          <w:p>
+            <w:pPr>
+              <w:spacing w:after="60"/>
+            </w:pPr>
+            <w:r>
+              <w:rPr>
+                <w:b w:val="0"/>
+                <w:sz w:val="18"/>
+              </w:rPr>
+              <w:t>File ứng dụng C3, phân vùng còn lại, giữ NVS, reboot sau thành công</w:t>
+            </w:r>
+          </w:p>
+        </w:tc>
+        <w:tc>
+          <w:tcPr>
+            <w:tcW w:type="dxa" w:w="3213"/>
+          </w:tcPr>
+          <w:p>
+            <w:pPr>
+              <w:spacing w:after="60"/>
+            </w:pPr>
+            <w:r>
+              <w:rPr>
+                <w:b w:val="0"/>
+                <w:sz w:val="18"/>
+              </w:rPr>
+              <w:t>Nâng cấp 1.2.x → 1.3.0 giữ cấu hình và kế hoạch đã lưu</w:t>
+            </w:r>
+          </w:p>
+        </w:tc>
+      </w:tr>
+      <w:tr>
+        <w:tc>
+          <w:tcPr>
+            <w:tcW w:type="dxa" w:w="3213"/>
+          </w:tcPr>
+          <w:p>
+            <w:pPr>
+              <w:spacing w:after="60"/>
+            </w:pPr>
+            <w:r>
+              <w:rPr>
+                <w:b w:val="0"/>
+                <w:sz w:val="18"/>
+              </w:rPr>
+              <w:t>Bàn giao Windows</w:t>
+            </w:r>
+          </w:p>
+        </w:tc>
+        <w:tc>
+          <w:tcPr>
+            <w:tcW w:type="dxa" w:w="3213"/>
+          </w:tcPr>
+          <w:p>
+            <w:pPr>
+              <w:spacing w:after="60"/>
+            </w:pPr>
+            <w:r>
+              <w:rPr>
+                <w:b w:val="0"/>
+                <w:sz w:val="18"/>
+              </w:rPr>
+              <w:t>Sketch, .bin OTA 1.3.0, hướng dẫn và checklist</w:t>
+            </w:r>
+          </w:p>
+        </w:tc>
+        <w:tc>
+          <w:tcPr>
+            <w:tcW w:type="dxa" w:w="3213"/>
+          </w:tcPr>
+          <w:p>
+            <w:pPr>
+              <w:spacing w:after="60"/>
+            </w:pPr>
+            <w:r>
+              <w:rPr>
+                <w:b w:val="0"/>
+                <w:sz w:val="18"/>
+              </w:rPr>
+              <w:t>Thông tin gói/build ghi ở BUILD_INFO.md</w:t>
+            </w:r>
+          </w:p>
+        </w:tc>
+      </w:tr>
+      <w:tr>
+        <w:tc>
+          <w:tcPr>
+            <w:tcW w:type="dxa" w:w="3213"/>
+          </w:tcPr>
+          <w:p>
+            <w:pPr>
+              <w:spacing w:after="60"/>
+            </w:pPr>
+            <w:r>
+              <w:rPr>
+                <w:b w:val="0"/>
+                <w:sz w:val="18"/>
+              </w:rPr>
               <w:t>Nạp và đo trên thiết bị</w:t>
             </w:r>
           </w:p>
@@ -3571,7 +4113,7 @@
                 <w:b w:val="0"/>
                 <w:sz w:val="18"/>
               </w:rPr>
-              <w:t>LED, TTP223 qua vỏ, độ sáng, nguồn, nhiệt, quét/WiFi/mDNS, AP và OTA</w:t>
+              <w:t>Ánh sáng/cảm ứng/nguồn, WiFi/mDNS, SNTP/lịch/mặt trời và OTA</w:t>
             </w:r>
           </w:p>
         </w:tc>
@@ -3588,7 +4130,7 @@
                 <w:b w:val="0"/>
                 <w:sz w:val="18"/>
               </w:rPr>
-              <w:t>Người dùng đã thử 1.2.0; bản 1.2.1 cần thử lại trên bo/vỏ đó</w:t>
+              <w:t>Người dùng đã thử 1.2.0; tính năng 1.3.0 cần thử trên bo thật</w:t>
             </w:r>
           </w:p>
         </w:tc>
@@ -3688,7 +4230,31 @@
         <w:pStyle w:val="ListBullet"/>
       </w:pPr>
       <w:r>
-        <w:t>Cấu hình/mục yêu thích/bật tắt trước khi OTA 1.2.0 → 1.2.1 và sau reboot; WiFi/tên giữ nguyên.</w:t>
+        <w:t>Cấu hình/mục yêu thích/bật tắt trước khi OTA 1.2.x → 1.3.0 và sau reboot; WiFi/tên giữ nguyên.</w:t>
+      </w:r>
+    </w:p>
+    <w:p>
+      <w:pPr>
+        <w:pStyle w:val="ListBullet"/>
+      </w:pPr>
+      <w:r>
+        <w:t>SNTP qua mạng nhà có Internet, lịch một phút tương lai và giữ giờ sau mất WiFi; no catch-up sau reset/sửa kế hoạch/OTA.</w:t>
+      </w:r>
+    </w:p>
+    <w:p>
+      <w:pPr>
+        <w:pStyle w:val="ListBullet"/>
+      </w:pPr>
+      <w:r>
+        <w:t>Các ưu tiên trùng lịch, mục yêu thích đổi nội dung/trống/hỏng, dừng ramp bằng tay và hủy countdown khi sự kiện tự động chạy.</w:t>
+      </w:r>
+    </w:p>
+    <w:p>
+      <w:pPr>
+        <w:pStyle w:val="ListBullet"/>
+      </w:pPr>
+      <w:r>
+        <w:t>Bình minh thử thời lượng 1 phút bằng offset hợp lệ vào thời điểm thật gần giờ mặt trời mọc, không giả giờ hiện tại.</w:t>
       </w:r>
     </w:p>
     <w:p>
@@ -3706,7 +4272,7 @@
     </w:p>
     <w:p>
       <w:r>
-        <w:t>Core.h chứa điều khiển, nhận cảm ứng, timer và renderer; không phụ thuộc Arduino. Storage.h encode dữ liệu rõ bằng JSON và envelope nhị phân; Preferences chỉ là lớp I/O. DenDeco.ino dùng WebServer tích hợp, WiFi và Update, mọi lệnh vào cùng Controller. WebUI.h chứa HTML/CSS/JS đầy đủ, không dùng CDN.</w:t>
+        <w:t>Core.h chứa điều khiển, nhận cảm ứng, timer và renderer; không phụ thuộc Arduino. Storage.h encode dữ liệu rõ bằng JSON và envelope nhị phân; Preferences chỉ là lớp I/O. Lịch/mặt trời dùng thời gian thực UTC rồi đổi cố định sang UTC+7, tách cấu hình kế hoạch khỏi dữ liệu ánh sáng. DenDeco.ino nối đồng hồ SNTP, lịch, Controller, WebServer, WiFi và Update. WebUI.h chứa HTML/CSS/JS đầy đủ, không dùng CDN; polling cập nhật trạng thái mà không ghi đè các ô kế hoạch đang sửa.</w:t>
       </w:r>
     </w:p>
     <w:p>
@@ -3724,7 +4290,7 @@
         <w:pStyle w:val="Heading1"/>
       </w:pPr>
       <w:r>
-        <w:t>Kiểm thử và nghiệm thu Đèn Deco 1.2.1</w:t>
+        <w:t>Kiểm thử và nghiệm thu Đèn Deco 1.3.0</w:t>
       </w:r>
     </w:p>
     <w:p>
@@ -3737,7 +4303,7 @@
     </w:p>
     <w:p>
       <w:r>
-        <w:t>Các kiểm tra nền dưới đây đã chạy thành công cho mã nguồn 1.1.0; phần 1.2.0 giữ kết quả lịch sử riêng. Thông tin build và kết quả chạy mới cho 1.2.1 ghi trong BUILD_INFO.md và phần bổ sung bên dưới; không coi kết quả cũ là kết quả bản mới. Người dùng đã thử 1.2.0 trên đèn thật, báo bước chuyển màu còn lớn và Lấp lánh khó thấy do mật độ LED lớn. Bản 1.2.1 cần thử lại trên bo/vỏ đó; build và web mock không xác nhận độ mượt cảm nhận.</w:t>
+        <w:t>Các kiểm tra nền dưới đây đã chạy thành công cho mã nguồn 1.1.0; phần 1.2.0/1.2.1 giữ kết quả lịch sử riêng. Thông tin build và kết quả chạy mới cho 1.3.0 ghi trong BUILD_INFO.md và phần bổ sung bên dưới; không coi kết quả cũ là kết quả bản mới. Người dùng đã thử 1.2.0 trên đèn thật, có phản hồi chuyển màu/Lấp lánh. SNTP, lịch tuần và tự động mặt trời của bản 1.3.0 cần thử trên bo thật; host/web mock không xác nhận Internet SNTP, đồng hồ ESP hoặc ramp thực tế.</w:t>
       </w:r>
     </w:p>
     <w:p>
@@ -4995,6 +5561,1009 @@
         <w:pStyle w:val="Heading2"/>
       </w:pPr>
       <w:r>
+        <w:t>Kiểm tra bổ sung bản 1.3.0</w:t>
+      </w:r>
+    </w:p>
+    <w:p>
+      <w:r>
+        <w:t>Các bộ kiểm tra C++11 với ASan/UBSan, cảnh báo nghiêm ngặt và web Playwright/Chromium đã chạy PASS cho bản 1.3.0. Arduino 3.3.1 và PlatformIO/core 2.0.17 đều build SUCCESS; chi tiết trong BUILD_INFO.md. Nội dung đã kiểm tra trên host:</w:t>
+      </w:r>
+    </w:p>
+    <w:p>
+      <w:pPr>
+        <w:pStyle w:val="ListBullet"/>
+      </w:pPr>
+      <w:r>
+        <w:t>PASS Lịch tuần: tám dòng, ngày/giờ UTC+7, tham chiếu mục yêu thích lúc chạy; chọn ON/OFF trùng phút đúng ưu tiên và chỉ áp dụng một kết quả. OFF tuần thắng, ON tuần cuối thắng mặt trời, dusk thắng dawn khi chỉ có hai mặt trời. Mục trống/hỏng bỏ qua an toàn.</w:t>
+      </w:r>
+    </w:p>
+    <w:p>
+      <w:pPr>
+        <w:pStyle w:val="ListBullet"/>
+      </w:pPr>
+      <w:r>
+        <w:t>PASS Mô hình đồng hồ: trạng thái chưa đồng bộ, phút đầu sau sync không chạy, holdover sau mất WiFi, tràn thời gian; không chạy bù/replay sau boot/sửa kế hoạch/nhảy giờ/OTA. Callback SNTP định kỳ bình thường không phát lại sự kiện cũ.</w:t>
+      </w:r>
+    </w:p>
+    <w:p>
+      <w:pPr>
+        <w:pStyle w:val="ListBullet"/>
+      </w:pPr>
+      <w:r>
+        <w:t>PASS Mặt trời: TP.HCM 10.776/106.7, giới hạn tọa độ/offset/ngày, sự kiện mọc/lặn có hoặc không hợp lệ; dawn bắt đầu tại giờ mọc cộng offset, ramp 0→preset/mục yêu thích theo 1–120 phút; dusk độc lập. Preset ấm RGB (255,160,72), 35% và trần đầu ra áp dụng.</w:t>
+      </w:r>
+    </w:p>
+    <w:p>
+      <w:pPr>
+        <w:pStyle w:val="ListBullet"/>
+      </w:pPr>
+      <w:r>
+        <w:t>PASS Điều khiển/renderer: thao tác ánh sáng tay dừng ramp, lịch tương lai giữ; sự kiện tự động áp dụng hủy countdown; không đổi 14 mode/tint/hiệu ứng Hoàng hôn mã 11.</w:t>
+      </w:r>
+    </w:p>
+    <w:p>
+      <w:pPr>
+        <w:pStyle w:val="ListBullet"/>
+      </w:pPr>
+      <w:r>
+        <w:t>PASS Lưu kế hoạch NVS riêng: CRC/validation theo bản triển khai, giữ qua reset/OTA, không đổi schema ánh sáng 2 hoặc cấu hình mạng. Web giữ draft khi polling/saving, hiển thị giờ/lịch/mặt trời; kiểm tra bàn phím và layout điện thoại.</w:t>
+      </w:r>
+    </w:p>
+    <w:p>
+      <w:r>
+        <w:t>PASS bổ sung baseline lưu bảo trì khi lần đầu/mặc định và lỗi mở/ghi/readback; tắt trong đoạn đầu Bình minh không tăng sáng thoáng qua. Rà soát luồng OTA thất bại lấy lại mốc phút tại điểm tiếp tục vòng lặp.</w:t>
+      </w:r>
+    </w:p>
+    <w:p>
+      <w:r>
+        <w:t>Các thử host chỉ xác nhận thuật toán/mô hình và tương tác web. Cần chạy riêng trên ESP/router để xác nhận đường SNTP thực, thời gian tiếp tục khi mất WiFi và sự kiện/ramp phát ánh sáng.</w:t>
+      </w:r>
+    </w:p>
+    <w:p>
+      <w:pPr>
+        <w:pStyle w:val="Heading2"/>
+      </w:pPr>
+      <w:r>
+        <w:t>Chạy thử bổ sung bản 1.3.0 trên đèn</w:t>
+      </w:r>
+    </w:p>
+    <w:tbl>
+      <w:tblPr>
+        <w:tblStyle w:val="LightShading-Accent1"/>
+        <w:tblW w:type="auto" w:w="0"/>
+        <w:tblLook w:firstColumn="1" w:firstRow="1" w:lastColumn="0" w:lastRow="0" w:noHBand="0" w:noVBand="1" w:val="04A0"/>
+      </w:tblPr>
+      <w:tblGrid>
+        <w:gridCol w:w="2409"/>
+        <w:gridCol w:w="2409"/>
+        <w:gridCol w:w="2409"/>
+        <w:gridCol w:w="2409"/>
+      </w:tblGrid>
+      <w:tr>
+        <w:trPr>
+          <w:tblHeader/>
+        </w:trPr>
+        <w:tc>
+          <w:tcPr>
+            <w:tcW w:type="dxa" w:w="2409"/>
+          </w:tcPr>
+          <w:p>
+            <w:pPr>
+              <w:spacing w:after="60"/>
+            </w:pPr>
+            <w:r>
+              <w:rPr>
+                <w:b/>
+                <w:sz w:val="18"/>
+              </w:rPr>
+              <w:t>Mã</w:t>
+            </w:r>
+          </w:p>
+        </w:tc>
+        <w:tc>
+          <w:tcPr>
+            <w:tcW w:type="dxa" w:w="2409"/>
+          </w:tcPr>
+          <w:p>
+            <w:pPr>
+              <w:spacing w:after="60"/>
+            </w:pPr>
+            <w:r>
+              <w:rPr>
+                <w:b/>
+                <w:sz w:val="18"/>
+              </w:rPr>
+              <w:t>Kiểm tra</w:t>
+            </w:r>
+          </w:p>
+        </w:tc>
+        <w:tc>
+          <w:tcPr>
+            <w:tcW w:type="dxa" w:w="2409"/>
+          </w:tcPr>
+          <w:p>
+            <w:pPr>
+              <w:spacing w:after="60"/>
+            </w:pPr>
+            <w:r>
+              <w:rPr>
+                <w:b/>
+                <w:sz w:val="18"/>
+              </w:rPr>
+              <w:t>Cần đạt / cần ghi nhận</w:t>
+            </w:r>
+          </w:p>
+        </w:tc>
+        <w:tc>
+          <w:tcPr>
+            <w:tcW w:type="dxa" w:w="2409"/>
+          </w:tcPr>
+          <w:p>
+            <w:pPr>
+              <w:spacing w:after="60"/>
+            </w:pPr>
+            <w:r>
+              <w:rPr>
+                <w:b/>
+                <w:sz w:val="18"/>
+              </w:rPr>
+              <w:t>Kết quả thực tế</w:t>
+            </w:r>
+          </w:p>
+        </w:tc>
+      </w:tr>
+      <w:tr>
+        <w:tc>
+          <w:tcPr>
+            <w:tcW w:type="dxa" w:w="2409"/>
+          </w:tcPr>
+          <w:p>
+            <w:pPr>
+              <w:spacing w:after="60"/>
+            </w:pPr>
+            <w:r>
+              <w:rPr>
+                <w:b w:val="0"/>
+                <w:sz w:val="18"/>
+              </w:rPr>
+              <w:t>A01</w:t>
+            </w:r>
+          </w:p>
+        </w:tc>
+        <w:tc>
+          <w:tcPr>
+            <w:tcW w:type="dxa" w:w="2409"/>
+          </w:tcPr>
+          <w:p>
+            <w:pPr>
+              <w:spacing w:after="60"/>
+            </w:pPr>
+            <w:r>
+              <w:rPr>
+                <w:b w:val="0"/>
+                <w:sz w:val="18"/>
+              </w:rPr>
+              <w:t>Nạp/boot lần đầu chỉ có AP, chưa có Internet</w:t>
+            </w:r>
+          </w:p>
+        </w:tc>
+        <w:tc>
+          <w:tcPr>
+            <w:tcW w:type="dxa" w:w="2409"/>
+          </w:tcPr>
+          <w:p>
+            <w:pPr>
+              <w:spacing w:after="60"/>
+            </w:pPr>
+            <w:r>
+              <w:rPr>
+                <w:b w:val="0"/>
+                <w:sz w:val="18"/>
+              </w:rPr>
+              <w:t>Web/cảm ứng hoạt động; giờ/lịch chờ đồng bộ, không tự bật theo giờ chưa xác thực</w:t>
+            </w:r>
+          </w:p>
+        </w:tc>
+        <w:tc>
+          <w:tcPr>
+            <w:tcW w:type="dxa" w:w="2409"/>
+          </w:tcPr>
+          <w:p>
+            <w:pPr>
+              <w:spacing w:after="60"/>
+            </w:pPr>
+            <w:r>
+              <w:rPr>
+                <w:b w:val="0"/>
+                <w:sz w:val="18"/>
+              </w:rPr>
+              <w:t>Chưa thử 1.3.0</w:t>
+            </w:r>
+          </w:p>
+        </w:tc>
+      </w:tr>
+      <w:tr>
+        <w:tc>
+          <w:tcPr>
+            <w:tcW w:type="dxa" w:w="2409"/>
+          </w:tcPr>
+          <w:p>
+            <w:pPr>
+              <w:spacing w:after="60"/>
+            </w:pPr>
+            <w:r>
+              <w:rPr>
+                <w:b w:val="0"/>
+                <w:sz w:val="18"/>
+              </w:rPr>
+              <w:t>A02</w:t>
+            </w:r>
+          </w:p>
+        </w:tc>
+        <w:tc>
+          <w:tcPr>
+            <w:tcW w:type="dxa" w:w="2409"/>
+          </w:tcPr>
+          <w:p>
+            <w:pPr>
+              <w:spacing w:after="60"/>
+            </w:pPr>
+            <w:r>
+              <w:rPr>
+                <w:b w:val="0"/>
+                <w:sz w:val="18"/>
+              </w:rPr>
+              <w:t>Nối WiFi nhà có Internet và chờ SNTP</w:t>
+            </w:r>
+          </w:p>
+        </w:tc>
+        <w:tc>
+          <w:tcPr>
+            <w:tcW w:type="dxa" w:w="2409"/>
+          </w:tcPr>
+          <w:p>
+            <w:pPr>
+              <w:spacing w:after="60"/>
+            </w:pPr>
+            <w:r>
+              <w:rPr>
+                <w:b w:val="0"/>
+                <w:sz w:val="18"/>
+              </w:rPr>
+              <w:t>Trang hiển thị ngày/giờ UTC+7 đúng; phút đồng bộ đầu không chạy sự kiện</w:t>
+            </w:r>
+          </w:p>
+        </w:tc>
+        <w:tc>
+          <w:tcPr>
+            <w:tcW w:type="dxa" w:w="2409"/>
+          </w:tcPr>
+          <w:p>
+            <w:pPr>
+              <w:spacing w:after="60"/>
+            </w:pPr>
+            <w:r>
+              <w:rPr>
+                <w:b w:val="0"/>
+                <w:sz w:val="18"/>
+              </w:rPr>
+              <w:t>Chưa thử 1.3.0</w:t>
+            </w:r>
+          </w:p>
+        </w:tc>
+      </w:tr>
+      <w:tr>
+        <w:tc>
+          <w:tcPr>
+            <w:tcW w:type="dxa" w:w="2409"/>
+          </w:tcPr>
+          <w:p>
+            <w:pPr>
+              <w:spacing w:after="60"/>
+            </w:pPr>
+            <w:r>
+              <w:rPr>
+                <w:b w:val="0"/>
+                <w:sz w:val="18"/>
+              </w:rPr>
+              <w:t>A03</w:t>
+            </w:r>
+          </w:p>
+        </w:tc>
+        <w:tc>
+          <w:tcPr>
+            <w:tcW w:type="dxa" w:w="2409"/>
+          </w:tcPr>
+          <w:p>
+            <w:pPr>
+              <w:spacing w:after="60"/>
+            </w:pPr>
+            <w:r>
+              <w:rPr>
+                <w:b w:val="0"/>
+                <w:sz w:val="18"/>
+              </w:rPr>
+              <w:t>Lịch ON hôm nay ở phút kế tiếp, OFF một phút sau</w:t>
+            </w:r>
+          </w:p>
+        </w:tc>
+        <w:tc>
+          <w:tcPr>
+            <w:tcW w:type="dxa" w:w="2409"/>
+          </w:tcPr>
+          <w:p>
+            <w:pPr>
+              <w:spacing w:after="60"/>
+            </w:pPr>
+            <w:r>
+              <w:rPr>
+                <w:b w:val="0"/>
+                <w:sz w:val="18"/>
+              </w:rPr>
+              <w:t>Dùng favorite đã lưu, đúng phút/đúng bật tắt; lưu trước phút chạy, không chỉnh giả giờ</w:t>
+            </w:r>
+          </w:p>
+        </w:tc>
+        <w:tc>
+          <w:tcPr>
+            <w:tcW w:type="dxa" w:w="2409"/>
+          </w:tcPr>
+          <w:p>
+            <w:pPr>
+              <w:spacing w:after="60"/>
+            </w:pPr>
+            <w:r>
+              <w:rPr>
+                <w:b w:val="0"/>
+                <w:sz w:val="18"/>
+              </w:rPr>
+              <w:t>Chưa thử 1.3.0</w:t>
+            </w:r>
+          </w:p>
+        </w:tc>
+      </w:tr>
+      <w:tr>
+        <w:tc>
+          <w:tcPr>
+            <w:tcW w:type="dxa" w:w="2409"/>
+          </w:tcPr>
+          <w:p>
+            <w:pPr>
+              <w:spacing w:after="60"/>
+            </w:pPr>
+            <w:r>
+              <w:rPr>
+                <w:b w:val="0"/>
+                <w:sz w:val="18"/>
+              </w:rPr>
+              <w:t>A04</w:t>
+            </w:r>
+          </w:p>
+        </w:tc>
+        <w:tc>
+          <w:tcPr>
+            <w:tcW w:type="dxa" w:w="2409"/>
+          </w:tcPr>
+          <w:p>
+            <w:pPr>
+              <w:spacing w:after="60"/>
+            </w:pPr>
+            <w:r>
+              <w:rPr>
+                <w:b w:val="0"/>
+                <w:sz w:val="18"/>
+              </w:rPr>
+              <w:t>Sửa nội dung favorite sau lưu dòng ON; thử favorite trống</w:t>
+            </w:r>
+          </w:p>
+        </w:tc>
+        <w:tc>
+          <w:tcPr>
+            <w:tcW w:type="dxa" w:w="2409"/>
+          </w:tcPr>
+          <w:p>
+            <w:pPr>
+              <w:spacing w:after="60"/>
+            </w:pPr>
+            <w:r>
+              <w:rPr>
+                <w:b w:val="0"/>
+                <w:sz w:val="18"/>
+              </w:rPr>
+              <w:t>ON dùng nội dung mới lúc chạy; mục trống/hỏng bỏ qua an toàn</w:t>
+            </w:r>
+          </w:p>
+        </w:tc>
+        <w:tc>
+          <w:tcPr>
+            <w:tcW w:type="dxa" w:w="2409"/>
+          </w:tcPr>
+          <w:p>
+            <w:pPr>
+              <w:spacing w:after="60"/>
+            </w:pPr>
+            <w:r>
+              <w:rPr>
+                <w:b w:val="0"/>
+                <w:sz w:val="18"/>
+              </w:rPr>
+              <w:t>Chưa thử 1.3.0</w:t>
+            </w:r>
+          </w:p>
+        </w:tc>
+      </w:tr>
+      <w:tr>
+        <w:tc>
+          <w:tcPr>
+            <w:tcW w:type="dxa" w:w="2409"/>
+          </w:tcPr>
+          <w:p>
+            <w:pPr>
+              <w:spacing w:after="60"/>
+            </w:pPr>
+            <w:r>
+              <w:rPr>
+                <w:b w:val="0"/>
+                <w:sz w:val="18"/>
+              </w:rPr>
+              <w:t>A05</w:t>
+            </w:r>
+          </w:p>
+        </w:tc>
+        <w:tc>
+          <w:tcPr>
+            <w:tcW w:type="dxa" w:w="2409"/>
+          </w:tcPr>
+          <w:p>
+            <w:pPr>
+              <w:spacing w:after="60"/>
+            </w:pPr>
+            <w:r>
+              <w:rPr>
+                <w:b w:val="0"/>
+                <w:sz w:val="18"/>
+              </w:rPr>
+              <w:t>Sau đồng bộ đặt lịch tương lai, tắt/bật router</w:t>
+            </w:r>
+          </w:p>
+        </w:tc>
+        <w:tc>
+          <w:tcPr>
+            <w:tcW w:type="dxa" w:w="2409"/>
+          </w:tcPr>
+          <w:p>
+            <w:pPr>
+              <w:spacing w:after="60"/>
+            </w:pPr>
+            <w:r>
+              <w:rPr>
+                <w:b w:val="0"/>
+                <w:sz w:val="18"/>
+              </w:rPr>
+              <w:t>Đồng hồ tiếp tục và lịch chạy khi mất WiFi; khôi phục SNTP không replay</w:t>
+            </w:r>
+          </w:p>
+        </w:tc>
+        <w:tc>
+          <w:tcPr>
+            <w:tcW w:type="dxa" w:w="2409"/>
+          </w:tcPr>
+          <w:p>
+            <w:pPr>
+              <w:spacing w:after="60"/>
+            </w:pPr>
+            <w:r>
+              <w:rPr>
+                <w:b w:val="0"/>
+                <w:sz w:val="18"/>
+              </w:rPr>
+              <w:t>Chưa thử 1.3.0</w:t>
+            </w:r>
+          </w:p>
+        </w:tc>
+      </w:tr>
+      <w:tr>
+        <w:tc>
+          <w:tcPr>
+            <w:tcW w:type="dxa" w:w="2409"/>
+          </w:tcPr>
+          <w:p>
+            <w:pPr>
+              <w:spacing w:after="60"/>
+            </w:pPr>
+            <w:r>
+              <w:rPr>
+                <w:b w:val="0"/>
+                <w:sz w:val="18"/>
+              </w:rPr>
+              <w:t>A06</w:t>
+            </w:r>
+          </w:p>
+        </w:tc>
+        <w:tc>
+          <w:tcPr>
+            <w:tcW w:type="dxa" w:w="2409"/>
+          </w:tcPr>
+          <w:p>
+            <w:pPr>
+              <w:spacing w:after="60"/>
+            </w:pPr>
+            <w:r>
+              <w:rPr>
+                <w:b w:val="0"/>
+                <w:sz w:val="18"/>
+              </w:rPr>
+              <w:t>Reboot không Internet, sửa lịch trùng phút hiện tại, lỡ giờ trong OTA</w:t>
+            </w:r>
+          </w:p>
+        </w:tc>
+        <w:tc>
+          <w:tcPr>
+            <w:tcW w:type="dxa" w:w="2409"/>
+          </w:tcPr>
+          <w:p>
+            <w:pPr>
+              <w:spacing w:after="60"/>
+            </w:pPr>
+            <w:r>
+              <w:rPr>
+                <w:b w:val="0"/>
+                <w:sz w:val="18"/>
+              </w:rPr>
+              <w:t>Chờ sync sau boot, không chạy bù/phát lại; thử tiếp bằng phút tương lai</w:t>
+            </w:r>
+          </w:p>
+        </w:tc>
+        <w:tc>
+          <w:tcPr>
+            <w:tcW w:type="dxa" w:w="2409"/>
+          </w:tcPr>
+          <w:p>
+            <w:pPr>
+              <w:spacing w:after="60"/>
+            </w:pPr>
+            <w:r>
+              <w:rPr>
+                <w:b w:val="0"/>
+                <w:sz w:val="18"/>
+              </w:rPr>
+              <w:t>Chưa thử 1.3.0</w:t>
+            </w:r>
+          </w:p>
+        </w:tc>
+      </w:tr>
+      <w:tr>
+        <w:tc>
+          <w:tcPr>
+            <w:tcW w:type="dxa" w:w="2409"/>
+          </w:tcPr>
+          <w:p>
+            <w:pPr>
+              <w:spacing w:after="60"/>
+            </w:pPr>
+            <w:r>
+              <w:rPr>
+                <w:b w:val="0"/>
+                <w:sz w:val="18"/>
+              </w:rPr>
+              <w:t>A07</w:t>
+            </w:r>
+          </w:p>
+        </w:tc>
+        <w:tc>
+          <w:tcPr>
+            <w:tcW w:type="dxa" w:w="2409"/>
+          </w:tcPr>
+          <w:p>
+            <w:pPr>
+              <w:spacing w:after="60"/>
+            </w:pPr>
+            <w:r>
+              <w:rPr>
+                <w:b w:val="0"/>
+                <w:sz w:val="18"/>
+              </w:rPr>
+              <w:t>TP.HCM, xem giờ mọc/lặn và chỉnh offset/ngày</w:t>
+            </w:r>
+          </w:p>
+        </w:tc>
+        <w:tc>
+          <w:tcPr>
+            <w:tcW w:type="dxa" w:w="2409"/>
+          </w:tcPr>
+          <w:p>
+            <w:pPr>
+              <w:spacing w:after="60"/>
+            </w:pPr>
+            <w:r>
+              <w:rPr>
+                <w:b w:val="0"/>
+                <w:sz w:val="18"/>
+              </w:rPr>
+              <w:t>Giờ tính hợp lý theo ngày, UTC+7; độc lập ngày/offset mỗi tự động, tọa độ lưu đúng</w:t>
+            </w:r>
+          </w:p>
+        </w:tc>
+        <w:tc>
+          <w:tcPr>
+            <w:tcW w:type="dxa" w:w="2409"/>
+          </w:tcPr>
+          <w:p>
+            <w:pPr>
+              <w:spacing w:after="60"/>
+            </w:pPr>
+            <w:r>
+              <w:rPr>
+                <w:b w:val="0"/>
+                <w:sz w:val="18"/>
+              </w:rPr>
+              <w:t>Chưa thử 1.3.0</w:t>
+            </w:r>
+          </w:p>
+        </w:tc>
+      </w:tr>
+      <w:tr>
+        <w:tc>
+          <w:tcPr>
+            <w:tcW w:type="dxa" w:w="2409"/>
+          </w:tcPr>
+          <w:p>
+            <w:pPr>
+              <w:spacing w:after="60"/>
+            </w:pPr>
+            <w:r>
+              <w:rPr>
+                <w:b w:val="0"/>
+                <w:sz w:val="18"/>
+              </w:rPr>
+              <w:t>A08</w:t>
+            </w:r>
+          </w:p>
+        </w:tc>
+        <w:tc>
+          <w:tcPr>
+            <w:tcW w:type="dxa" w:w="2409"/>
+          </w:tcPr>
+          <w:p>
+            <w:pPr>
+              <w:spacing w:after="60"/>
+            </w:pPr>
+            <w:r>
+              <w:rPr>
+                <w:b w:val="0"/>
+                <w:sz w:val="18"/>
+              </w:rPr>
+              <w:t>Dawn màu ấm, ramp 1 phút, offset đưa vào phút tương lai hợp lệ</w:t>
+            </w:r>
+          </w:p>
+        </w:tc>
+        <w:tc>
+          <w:tcPr>
+            <w:tcW w:type="dxa" w:w="2409"/>
+          </w:tcPr>
+          <w:p>
+            <w:pPr>
+              <w:spacing w:after="60"/>
+            </w:pPr>
+            <w:r>
+              <w:rPr>
+                <w:b w:val="0"/>
+                <w:sz w:val="18"/>
+              </w:rPr>
+              <w:t>Bắt đầu tại giờ mọc+offset, từ 0 lên RGB 255/160/72 ở mức 35%; ghi độ mượt thực, không giả đồng hồ</w:t>
+            </w:r>
+          </w:p>
+        </w:tc>
+        <w:tc>
+          <w:tcPr>
+            <w:tcW w:type="dxa" w:w="2409"/>
+          </w:tcPr>
+          <w:p>
+            <w:pPr>
+              <w:spacing w:after="60"/>
+            </w:pPr>
+            <w:r>
+              <w:rPr>
+                <w:b w:val="0"/>
+                <w:sz w:val="18"/>
+              </w:rPr>
+              <w:t>Chưa thử 1.3.0</w:t>
+            </w:r>
+          </w:p>
+        </w:tc>
+      </w:tr>
+      <w:tr>
+        <w:tc>
+          <w:tcPr>
+            <w:tcW w:type="dxa" w:w="2409"/>
+          </w:tcPr>
+          <w:p>
+            <w:pPr>
+              <w:spacing w:after="60"/>
+            </w:pPr>
+            <w:r>
+              <w:rPr>
+                <w:b w:val="0"/>
+                <w:sz w:val="18"/>
+              </w:rPr>
+              <w:t>A09</w:t>
+            </w:r>
+          </w:p>
+        </w:tc>
+        <w:tc>
+          <w:tcPr>
+            <w:tcW w:type="dxa" w:w="2409"/>
+          </w:tcPr>
+          <w:p>
+            <w:pPr>
+              <w:spacing w:after="60"/>
+            </w:pPr>
+            <w:r>
+              <w:rPr>
+                <w:b w:val="0"/>
+                <w:sz w:val="18"/>
+              </w:rPr>
+              <w:t>Dusk chọn màu ấm rồi favorite tại giờ lặn+offset</w:t>
+            </w:r>
+          </w:p>
+        </w:tc>
+        <w:tc>
+          <w:tcPr>
+            <w:tcW w:type="dxa" w:w="2409"/>
+          </w:tcPr>
+          <w:p>
+            <w:pPr>
+              <w:spacing w:after="60"/>
+            </w:pPr>
+            <w:r>
+              <w:rPr>
+                <w:b w:val="0"/>
+                <w:sz w:val="18"/>
+              </w:rPr>
+              <w:t>Bật đúng preset/mục yêu thích; không tự chọn hiệu ứng Hoàng hôn mã 11</w:t>
+            </w:r>
+          </w:p>
+        </w:tc>
+        <w:tc>
+          <w:tcPr>
+            <w:tcW w:type="dxa" w:w="2409"/>
+          </w:tcPr>
+          <w:p>
+            <w:pPr>
+              <w:spacing w:after="60"/>
+            </w:pPr>
+            <w:r>
+              <w:rPr>
+                <w:b w:val="0"/>
+                <w:sz w:val="18"/>
+              </w:rPr>
+              <w:t>Chưa thử 1.3.0</w:t>
+            </w:r>
+          </w:p>
+        </w:tc>
+      </w:tr>
+      <w:tr>
+        <w:tc>
+          <w:tcPr>
+            <w:tcW w:type="dxa" w:w="2409"/>
+          </w:tcPr>
+          <w:p>
+            <w:pPr>
+              <w:spacing w:after="60"/>
+            </w:pPr>
+            <w:r>
+              <w:rPr>
+                <w:b w:val="0"/>
+                <w:sz w:val="18"/>
+              </w:rPr>
+              <w:t>A10</w:t>
+            </w:r>
+          </w:p>
+        </w:tc>
+        <w:tc>
+          <w:tcPr>
+            <w:tcW w:type="dxa" w:w="2409"/>
+          </w:tcPr>
+          <w:p>
+            <w:pPr>
+              <w:spacing w:after="60"/>
+            </w:pPr>
+            <w:r>
+              <w:rPr>
+                <w:b w:val="0"/>
+                <w:sz w:val="18"/>
+              </w:rPr>
+              <w:t>Thao tác tay khi dawn đang tăng; đặt countdown trước sự kiện tự động</w:t>
+            </w:r>
+          </w:p>
+        </w:tc>
+        <w:tc>
+          <w:tcPr>
+            <w:tcW w:type="dxa" w:w="2409"/>
+          </w:tcPr>
+          <w:p>
+            <w:pPr>
+              <w:spacing w:after="60"/>
+            </w:pPr>
+            <w:r>
+              <w:rPr>
+                <w:b w:val="0"/>
+                <w:sz w:val="18"/>
+              </w:rPr>
+              <w:t>Tay dừng ramp, lịch tương lai vẫn chạy; sự kiện tự động áp dụng hủy countdown</w:t>
+            </w:r>
+          </w:p>
+        </w:tc>
+        <w:tc>
+          <w:tcPr>
+            <w:tcW w:type="dxa" w:w="2409"/>
+          </w:tcPr>
+          <w:p>
+            <w:pPr>
+              <w:spacing w:after="60"/>
+            </w:pPr>
+            <w:r>
+              <w:rPr>
+                <w:b w:val="0"/>
+                <w:sz w:val="18"/>
+              </w:rPr>
+              <w:t>Chưa thử 1.3.0</w:t>
+            </w:r>
+          </w:p>
+        </w:tc>
+      </w:tr>
+      <w:tr>
+        <w:tc>
+          <w:tcPr>
+            <w:tcW w:type="dxa" w:w="2409"/>
+          </w:tcPr>
+          <w:p>
+            <w:pPr>
+              <w:spacing w:after="60"/>
+            </w:pPr>
+            <w:r>
+              <w:rPr>
+                <w:b w:val="0"/>
+                <w:sz w:val="18"/>
+              </w:rPr>
+              <w:t>A11</w:t>
+            </w:r>
+          </w:p>
+        </w:tc>
+        <w:tc>
+          <w:tcPr>
+            <w:tcW w:type="dxa" w:w="2409"/>
+          </w:tcPr>
+          <w:p>
+            <w:pPr>
+              <w:spacing w:after="60"/>
+            </w:pPr>
+            <w:r>
+              <w:rPr>
+                <w:b w:val="0"/>
+                <w:sz w:val="18"/>
+              </w:rPr>
+              <w:t>Cùng phút nhiều ON/OFF, tuần+mặt trời, dawn+dusk</w:t>
+            </w:r>
+          </w:p>
+        </w:tc>
+        <w:tc>
+          <w:tcPr>
+            <w:tcW w:type="dxa" w:w="2409"/>
+          </w:tcPr>
+          <w:p>
+            <w:pPr>
+              <w:spacing w:after="60"/>
+            </w:pPr>
+            <w:r>
+              <w:rPr>
+                <w:b w:val="0"/>
+                <w:sz w:val="18"/>
+              </w:rPr>
+              <w:t>OFF thắng; không OFF thì ON tuần cuối thắng; chỉ mặt trời thì dusk thắng; không bật/tắt trung gian</w:t>
+            </w:r>
+          </w:p>
+        </w:tc>
+        <w:tc>
+          <w:tcPr>
+            <w:tcW w:type="dxa" w:w="2409"/>
+          </w:tcPr>
+          <w:p>
+            <w:pPr>
+              <w:spacing w:after="60"/>
+            </w:pPr>
+            <w:r>
+              <w:rPr>
+                <w:b w:val="0"/>
+                <w:sz w:val="18"/>
+              </w:rPr>
+              <w:t>Chưa thử 1.3.0</w:t>
+            </w:r>
+          </w:p>
+        </w:tc>
+      </w:tr>
+      <w:tr>
+        <w:tc>
+          <w:tcPr>
+            <w:tcW w:type="dxa" w:w="2409"/>
+          </w:tcPr>
+          <w:p>
+            <w:pPr>
+              <w:spacing w:after="60"/>
+            </w:pPr>
+            <w:r>
+              <w:rPr>
+                <w:b w:val="0"/>
+                <w:sz w:val="18"/>
+              </w:rPr>
+              <w:t>A12</w:t>
+            </w:r>
+          </w:p>
+        </w:tc>
+        <w:tc>
+          <w:tcPr>
+            <w:tcW w:type="dxa" w:w="2409"/>
+          </w:tcPr>
+          <w:p>
+            <w:pPr>
+              <w:spacing w:after="60"/>
+            </w:pPr>
+            <w:r>
+              <w:rPr>
+                <w:b w:val="0"/>
+                <w:sz w:val="18"/>
+              </w:rPr>
+              <w:t>Draft kế hoạch đang sửa khi polling, lưu rồi reset/OTA</w:t>
+            </w:r>
+          </w:p>
+        </w:tc>
+        <w:tc>
+          <w:tcPr>
+            <w:tcW w:type="dxa" w:w="2409"/>
+          </w:tcPr>
+          <w:p>
+            <w:pPr>
+              <w:spacing w:after="60"/>
+            </w:pPr>
+            <w:r>
+              <w:rPr>
+                <w:b w:val="0"/>
+                <w:sz w:val="18"/>
+              </w:rPr>
+              <w:t>Draft không bị ghi đè; kế hoạch đã lưu/tọa độ giữ, ánh sáng/favorites/WiFi/tên cũng giữ</w:t>
+            </w:r>
+          </w:p>
+        </w:tc>
+        <w:tc>
+          <w:tcPr>
+            <w:tcW w:type="dxa" w:w="2409"/>
+          </w:tcPr>
+          <w:p>
+            <w:pPr>
+              <w:spacing w:after="60"/>
+            </w:pPr>
+            <w:r>
+              <w:rPr>
+                <w:b w:val="0"/>
+                <w:sz w:val="18"/>
+              </w:rPr>
+              <w:t>Chưa thử 1.3.0</w:t>
+            </w:r>
+          </w:p>
+        </w:tc>
+      </w:tr>
+    </w:tbl>
+    <w:p/>
+    <w:p>
+      <w:r>
+        <w:t>Với A08/A09, chỉ dùng offset ±120 phút khi giờ hiện tại gần sự kiện mặt trời; nếu không, thử vào ngày/giờ thích hợp. Không giả đồng hồ để biến kiểm tra thuật toán thành kết quả phần cứng. Bảo vệ khỏi chạy bù sau clock jump được kiểm tra trên host; kết quả SNTP/ramp thật ghi riêng.</w:t>
+      </w:r>
+    </w:p>
+    <w:p>
+      <w:pPr>
+        <w:pStyle w:val="Heading2"/>
+      </w:pPr>
+      <w:r>
         <w:t>Bảng chạy thử trên thiết bị</w:t>
       </w:r>
     </w:p>
@@ -7482,7 +9051,7 @@
           <w:rFonts w:ascii="Consolas" w:hAnsi="Consolas"/>
           <w:sz w:val="16"/>
         </w:rPr>
-        <w:t>c++ -std=c++11 -Wall -Wextra -fsanitize=address,undefined -Itests/stubs -I.pio/libdeps/esp32c3/ArduinoJson/src tests/storage_test.cpp -o storage-test</w:t>
+        <w:t>c++ -std=c++11 -Wall -Wextra -Werror -fsanitize=address,undefined -Itests/stubs -I.pio/libdeps/esp32c3/ArduinoJson/src tests/storage_test.cpp -o storage-test</w:t>
       </w:r>
     </w:p>
     <w:p>
@@ -7506,6 +9075,102 @@
           <w:rFonts w:ascii="Consolas" w:hAnsi="Consolas"/>
           <w:sz w:val="16"/>
         </w:rPr>
+        <w:t>c++ -std=c++11 -Wall -Wextra -Werror -fsanitize=address,undefined tests/schedule_test.cpp -o schedule-test</w:t>
+      </w:r>
+    </w:p>
+    <w:p>
+      <w:pPr>
+        <w:spacing w:after="0"/>
+      </w:pPr>
+      <w:r>
+        <w:rPr>
+          <w:rFonts w:ascii="Consolas" w:hAnsi="Consolas"/>
+          <w:sz w:val="16"/>
+        </w:rPr>
+        <w:t>./schedule-test</w:t>
+      </w:r>
+    </w:p>
+    <w:p>
+      <w:pPr>
+        <w:spacing w:after="0"/>
+      </w:pPr>
+      <w:r>
+        <w:rPr>
+          <w:rFonts w:ascii="Consolas" w:hAnsi="Consolas"/>
+          <w:sz w:val="16"/>
+        </w:rPr>
+        <w:t>c++ -std=c++11 -Wall -Wextra -Werror -fsanitize=address,undefined tests/solar_test.cpp -o solar-test</w:t>
+      </w:r>
+    </w:p>
+    <w:p>
+      <w:pPr>
+        <w:spacing w:after="0"/>
+      </w:pPr>
+      <w:r>
+        <w:rPr>
+          <w:rFonts w:ascii="Consolas" w:hAnsi="Consolas"/>
+          <w:sz w:val="16"/>
+        </w:rPr>
+        <w:t>./solar-test</w:t>
+      </w:r>
+    </w:p>
+    <w:p>
+      <w:pPr>
+        <w:spacing w:after="0"/>
+      </w:pPr>
+      <w:r>
+        <w:rPr>
+          <w:rFonts w:ascii="Consolas" w:hAnsi="Consolas"/>
+          <w:sz w:val="16"/>
+        </w:rPr>
+        <w:t>c++ -std=c++11 -Wall -Wextra -Werror -fsanitize=address,undefined tests/automation_test.cpp -o automation-test</w:t>
+      </w:r>
+    </w:p>
+    <w:p>
+      <w:pPr>
+        <w:spacing w:after="0"/>
+      </w:pPr>
+      <w:r>
+        <w:rPr>
+          <w:rFonts w:ascii="Consolas" w:hAnsi="Consolas"/>
+          <w:sz w:val="16"/>
+        </w:rPr>
+        <w:t>./automation-test</w:t>
+      </w:r>
+    </w:p>
+    <w:p>
+      <w:pPr>
+        <w:spacing w:after="0"/>
+      </w:pPr>
+      <w:r>
+        <w:rPr>
+          <w:rFonts w:ascii="Consolas" w:hAnsi="Consolas"/>
+          <w:sz w:val="16"/>
+        </w:rPr>
+        <w:t>c++ -std=c++11 -Wall -Wextra -Werror -fsanitize=address,undefined -Itests/stubs -I.pio/libdeps/esp32c3/ArduinoJson/src tests/schedule_storage_test.cpp -o schedule-storage-test</w:t>
+      </w:r>
+    </w:p>
+    <w:p>
+      <w:pPr>
+        <w:spacing w:after="0"/>
+      </w:pPr>
+      <w:r>
+        <w:rPr>
+          <w:rFonts w:ascii="Consolas" w:hAnsi="Consolas"/>
+          <w:sz w:val="16"/>
+        </w:rPr>
+        <w:t>./schedule-storage-test</w:t>
+      </w:r>
+    </w:p>
+    <w:p>
+      <w:pPr>
+        <w:spacing w:after="0"/>
+      </w:pPr>
+      <w:r>
+        <w:rPr>
+          <w:rFonts w:ascii="Consolas" w:hAnsi="Consolas"/>
+          <w:sz w:val="16"/>
+        </w:rPr>
         <w:t>node tests/web_test.cjs</w:t>
       </w:r>
     </w:p>
@@ -7516,7 +9181,7 @@
     </w:p>
     <w:p>
       <w:r>
-        <w:t>Người dùng đã lắp và thử 1.2.0, có phản hồi chuyển màu/Lấp lánh; bảng nền chưa có kết quả từng ca để đánh dấu Đạt. Bản 1.2.1 ưu tiên F01–F04 trên bo/vỏ thật để xác nhận thay đổi và giữ cấu hình sau OTA.</w:t>
+        <w:t>Người dùng đã lắp và thử 1.2.0, có phản hồi chuyển màu/Lấp lánh; bảng nền chưa có kết quả từng ca để đánh dấu Đạt. Bản 1.3.0 ưu tiên A01–A12 trên ESP/router thật, đồng thời giữ F01–F04 để ghi kết quả ánh sáng khi thử lại.</w:t>
       </w:r>
     </w:p>
     <w:sectPr>
@@ -7553,7 +9218,7 @@
       <w:pStyle w:val="Caption"/>
     </w:pPr>
     <w:r>
-      <w:t>ĐÈN DECO  |  ESP32-C3  |  FIRMWARE 1.2.1</w:t>
+      <w:t>ĐÈN DECO  |  ESP32-C3  |  FIRMWARE 1.3.0</w:t>
     </w:r>
   </w:p>
 </w:hdr>

</xml_diff>

<commit_message>
Release 1.3.1: recover WiFi retries and trace schedule saves
</commit_message>
<xml_diff>
--- a/HUONG_DAN.docx
+++ b/HUONG_DAN.docx
@@ -7,7 +7,7 @@
         <w:pStyle w:val="Heading1"/>
       </w:pPr>
       <w:r>
-        <w:t>Hướng dẫn Đèn Deco 1.3.0</w:t>
+        <w:t>Hướng dẫn Đèn Deco 1.3.1</w:t>
       </w:r>
     </w:p>
     <w:p>
@@ -730,7 +730,7 @@
     </w:p>
     <w:p>
       <w:r>
-        <w:t>1. Giải nén cả gói; giữ DenDeco.ino, Config.h, Core.h, NetworkPolicy.h, Storage.h, WebUI.h trong cùng thư mục DenDeco.</w:t>
+        <w:t>1. Giải nén cả gói; giữ nguyên toàn bộ thư mục DenDeco, gồm DenDeco.ino và các header Config.h, Core.h, NetworkPolicy.h, Storage.h, WebUI.h, Schedule.h, Solar.h, Automation.h, ScheduleStorage.h.</w:t>
       </w:r>
     </w:p>
     <w:p>
@@ -1157,7 +1157,7 @@
     </w:p>
     <w:p>
       <w:r>
-        <w:t>Bộ core/thư viện người dùng đang có là ESP32 3.3.1, NeoPixel 1.15.5 và ArduinoJson 7.4.3; giữ bộ này để biên dịch. Thông tin build và file OTA 1.3.0 ghi trong BUILD_INFO.md. Profile PlatformIO 2.0.17 là phương án build bổ sung; không cần đổi bộ Arduino IDE hiện tại về phiên bản đó. Người dùng đã lắp và thử bản 1.2.0; các tính năng giờ/lịch của 1.3.0 mới cần thử trên bo thực tế. Nếu bo có dung lượng flash khác 4 MB, chỉnh cấu hình và biên dịch lại cho bo thực tế.</w:t>
+        <w:t>Bộ core/thư viện người dùng đang có là ESP32 3.3.1, NeoPixel 1.15.5 và ArduinoJson 7.4.3; giữ bộ này để biên dịch. Thông tin build và file OTA 1.3.1 ghi trong BUILD_INFO.md. Profile PlatformIO 2.0.17 là phương án build bổ sung; không cần đổi bộ Arduino IDE hiện tại về phiên bản đó. Người dùng đã nạp 1.3.0 và báo lỗi WiFi/web; cần xác nhận phục hồi 1.3.1 trên bo thực tế. Nếu bo có dung lượng flash khác 4 MB, chỉnh cấu hình và biên dịch lại cho bo thực tế.</w:t>
       </w:r>
     </w:p>
     <w:p>
@@ -1200,7 +1200,7 @@
     </w:p>
     <w:p>
       <w:r>
-        <w:t>6. Nếu kết nối thất bại sau 30 giây, AP dự phòng mở để sửa mạng/mật khẩu. Nếu router mất kết nối, đèn thử nối lại và mở AP sau 30 giây chưa khôi phục; khi nhận IP WiFi nhà trở lại, AP tự tắt ngay. Điều khiển cảm ứng vẫn dùng được trong lúc đèn thử kết nối.</w:t>
+        <w:t>6. Nếu kết nối thất bại sau 30 giây, AP dự phòng mở để sửa mạng/mật khẩu. Nếu router mất kết nối, đèn thử nối lại và mở AP sau 30 giây chưa khôi phục; khi liên kết với router và nhận IP WiFi nhà trở lại, AP tự tắt ngay. Khi lỗi kéo dài, chu kỳ thử lại khoảng 60 giây; nếu bước hủy kết nối driver bị kẹt, firmware có thể mở AP sớm hơn để giữ đường cấu hình. Điều khiển cảm ứng vẫn dùng được trong lúc đèn thử kết nối.</w:t>
       </w:r>
     </w:p>
     <w:p>
@@ -1221,6 +1221,11 @@
     <w:p>
       <w:r>
         <w:t>Địa chỉ .local dùng mDNS và chỉ có hiệu lực trong mạng nội bộ có hỗ trợ; điện thoại/PC phải ở cùng mạng với đèn. Mạng khách có cách ly thiết bị, router chặn multicast hoặc máy chưa hỗ trợ mDNS có thể không mở được địa chỉ này. Khi đó xem IP trong Serial Monitor 115200 baud hoặc danh sách DHCP của router rồi mở http://&lt;IP-của-đèn&gt;. IP phụ thuộc router; có thể đặt DHCP reservation theo MAC nếu muốn giữ IP ổn định.</w:t>
+      </w:r>
+    </w:p>
+    <w:p>
+      <w:r>
+        <w:t>IP còn nằm trong danh sách DHCP của router chỉ cho biết router đã cấp địa chỉ trước đó, không chứng minh đèn đang online. Nếu cả .local và IP đều không mở, dùng quy trình phục hồi ở mục 11; chỉ lỗi tên .local còn IP mở được mới giúp tách riêng vấn đề phân giải tên.</w:t>
       </w:r>
     </w:p>
     <w:p>
@@ -3060,7 +3065,7 @@
         <w:pStyle w:val="ListBullet"/>
       </w:pPr>
       <w:r>
-        <w:t>OTA giữ kế hoạch: lưu các dòng/tọa độ, thực hiện OTA 1.3.0 rồi kiểm tra lại. Đợi SNTP đồng bộ sau reboot và đặt một sự kiện tương lai mới; sự kiện bị lỡ trong OTA không được chạy bù.</w:t>
+        <w:t>OTA giữ kế hoạch: lưu các dòng/tọa độ, thực hiện OTA 1.3.1 rồi kiểm tra lại. Đợi SNTP đồng bộ sau reboot và đặt một sự kiện tương lai mới; sự kiện bị lỡ trong OTA không được chạy bù.</w:t>
       </w:r>
     </w:p>
     <w:p>
@@ -3093,7 +3098,7 @@
     </w:p>
     <w:p>
       <w:r>
-        <w:t>Bản 1.3.0 tiếp tục đọc dữ liệu ánh sáng schema 1 và 2, ghi schema 2 như bản 1.2.x. Nâng cấp OTA từ 1.2.x giữ cấu hình đèn, cả 14 mã chế độ, ba mục yêu thích, WiFi, tên và tên truy cập. Kế hoạch tuần/bình minh/mặt trời lặn và tọa độ lưu riêng trong namespace NVS deco-plan; không đổi schema ánh sáng. Nâng cấp từ 1.1.0 giữ các cấu hình/mục yêu thích cũ vì sáu mã chế độ đầu không đổi. Nếu cần quay lại 1.1.0 sau khi dữ liệu đã lưu schema 2, dùng USB: firmware cũ có thể không đọc được schema mới và sẽ không ghi đè dữ liệu đó.</w:t>
+        <w:t>Bản 1.3.1 tiếp tục đọc dữ liệu ánh sáng schema 1 và 2, ghi schema 2 như bản 1.2.x/1.3.0. Nâng cấp từ 1.3.0 giữ cấu hình đèn, cả 14 mã chế độ, ba mục yêu thích, WiFi, tên và tên truy cập. Kế hoạch tuần/bình minh/mặt trời lặn và tọa độ lưu riêng trong namespace NVS deco-plan; không đổi schema ánh sáng. Nạp USB với Erase All Flash Disabled và giữ bảng phân vùng để giữ NVS. Nâng cấp từ 1.2.x/1.1.0 giữ dữ liệu cũ; nếu cần quay lại 1.1.0 sau khi dữ liệu đã lưu schema 2, dùng USB: firmware cũ có thể không đọc được schema mới và sẽ không ghi đè dữ liệu đó.</w:t>
       </w:r>
     </w:p>
     <w:p>
@@ -3116,7 +3121,7 @@
     </w:p>
     <w:p>
       <w:r>
-        <w:t>2. Tìm file ứng dụng DenDeco.ino.bin hoặc tên tương đương do IDE xuất. Không chọn .bootloader.bin, .partitions.bin, .merged.bin hoặc file dùng cho ESP32/S2/S3 khác. Gói bàn giao cũng có firmware/DenDeco-1.3.0-ota.bin; dùng để nâng cấp đèn đang chạy 1.2.x hoặc 1.1.0.</w:t>
+        <w:t>2. Tìm file ứng dụng DenDeco.ino.bin hoặc tên tương đương do IDE xuất. Không chọn .bootloader.bin, .partitions.bin, .merged.bin hoặc file dùng cho ESP32/S2/S3 khác. Gói bàn giao cũng có firmware/DenDeco-1.3.1-ota.bin; dùng để nâng cấp khi web vẫn truy cập được. Nếu cả IP/AP đều không mở, nạp sketch qua USB theo mục 11.</w:t>
       </w:r>
     </w:p>
     <w:p>
@@ -3146,7 +3151,7 @@
     </w:p>
     <w:p>
       <w:r>
-        <w:t>Giới hạn của phân vùng ứng dụng mặc định là 1.310.720 byte; kích thước file 1.3.0 được ghi trong BUILD_INFO.md. Nếu dùng sơ đồ phân vùng khác, giới hạn trên trang lấy từ phân vùng thực tế. Đổi bảng phân vùng phải nạp USB; OTA chỉ thay ứng dụng.</w:t>
+        <w:t>Giới hạn của phân vùng ứng dụng mặc định là 1.310.720 byte; kích thước file 1.3.1 được ghi trong BUILD_INFO.md. Nếu dùng sơ đồ phân vùng khác, giới hạn trên trang lấy từ phân vùng thực tế. Đổi bảng phân vùng phải nạp USB; OTA chỉ thay ứng dụng.</w:t>
       </w:r>
     </w:p>
     <w:p>
@@ -3219,7 +3224,889 @@
     </w:p>
     <w:p>
       <w:r>
-        <w:t>Thông tin biên dịch và kiểm tra logic/giao diện bằng mô phỏng được ghi trong BUILD_INFO.md và KIEM_THU.md. Người dùng đã thử bản 1.2.0 trên đèn, có phản hồi chuyển màu/Lấp lánh. Giờ SNTP, lịch tuần, bình minh và mặt trời lặn của bản 1.3.0 mới cần thử trên bo thật; mô phỏng không xác nhận đường mạng SNTP hoặc độ sáng cảm nhận. Sau nâng cấp, ưu tiên các ca A01–A12, giữ các ca ánh sáng/nguồn/cảm ứng để bổ sung kết quả; ghi kết quả trong KIEM_THU.md.</w:t>
+        <w:t>Thông tin biên dịch và kiểm tra logic/giao diện bằng mô phỏng được ghi trong BUILD_INFO.md và KIEM_THU.md. Người dùng đã nạp 1.3.0: lưu lại lịch mặt trời không đổi vẫn dùng được; đổi lịch rồi lưu nhận thông báo đã lưu, sau đó web/IP mất truy cập. Khi truy cập khôi phục, kế hoạch vẫn còn; LED/cảm ứng vẫn chạy. Chưa xác định nguyên nhân mất truy cập sau lưu hoặc kết quả reset +/−. Độ ổn định sau cập nhật 1.3.1 cần thử trên bộ đèn này; các ca SNTP/lịch/mặt trời chưa có kết quả riêng. Khi web đang dùng được, có thể cập nhật OTA; nếu mất web/AP, dùng mục 11. Sau nạp, ưu tiên W01–W10, giữ A01–A12 và các ca ánh sáng/nguồn/cảm ứng để bổ sung kết quả.</w:t>
+      </w:r>
+    </w:p>
+    <w:p>
+      <w:pPr>
+        <w:pStyle w:val="Heading2"/>
+      </w:pPr>
+      <w:r>
+        <w:t>11. Phục hồi khi web và AP không truy cập được</w:t>
+      </w:r>
+    </w:p>
+    <w:p>
+      <w:pPr>
+        <w:pStyle w:val="Heading3"/>
+      </w:pPr>
+      <w:r>
+        <w:t>Kiểm tra AP từ cảm ứng</w:t>
+      </w:r>
+    </w:p>
+    <w:p>
+      <w:r>
+        <w:t>Đợi đèn khởi động, thả hết bốn nút rồi giữ đúng + và − đồng thời 5 giây. Thả cả hai sau khi giữ đủ thời gian, tìm AP DenDeco-XXXXXX bằng điện thoại/PC. Thao tác này chỉ xóa SSID/mật khẩu WiFi nhà; giữ cấu hình ánh sáng, mục yêu thích, kế hoạch, tên và hostname. Nếu thấy AP, nối không mật khẩu và mở http://192.168.4.1. Có thể cập nhật file OTA 1.3.1 khi trang hoạt động hoặc nhập lại WiFi nhà sau khi cập nhật.</w:t>
+      </w:r>
+    </w:p>
+    <w:p>
+      <w:r>
+        <w:t>Nếu không thấy AP hoặc không mở được trang AP, tiếp tục nạp USB. Việc IP còn xuất hiện trong router và LED/cảm ứng vẫn hoạt động chưa đủ để xác nhận đường HTTP/WiFi đang online. Khi cả tên .local và IP đều lỗi, chưa thể kết luận lỗi DNS, mật khẩu đã lưu hay firmware OTA bị hỏng.</w:t>
+      </w:r>
+    </w:p>
+    <w:p>
+      <w:pPr>
+        <w:pStyle w:val="Heading3"/>
+      </w:pPr>
+      <w:r>
+        <w:t>Nạp lại bằng Arduino IDE trên Windows, giữ NVS</w:t>
+      </w:r>
+    </w:p>
+    <w:p>
+      <w:r>
+        <w:t>1. Tải DenDeco-1.3.1.zip, giải nén cả gói và mở DenDeco/DenDeco.ino cùng toàn bộ header. File .bin OTA là ảnh ứng dụng cho web; lần phục hồi USB này dùng chức năng Upload sketch của Arduino IDE.</w:t>
+      </w:r>
+    </w:p>
+    <w:p>
+      <w:r>
+        <w:t>2. Giữ core esp32 by Espressif Systems 3.3.1, Adafruit NeoPixel 1.15.5, ArduinoJson 7.4.3. Chọn ESP32C3 Dev Module, USB CDC On Boot = Enabled, flash 4 MB nếu đúng bo và Partition Scheme = Default 4MB with spiffs có OTA. Giữ bảng phân vùng đang dùng; Erase All Flash Before Sketch Upload = Disabled để giữ cấu hình NVS.</w:t>
+      </w:r>
+    </w:p>
+    <w:p>
+      <w:r>
+        <w:t>3. Tắt đèn bằng cảm ứng và chờ ít nhất 10 giây nếu có thay đổi ánh sáng cần lưu. Tháo nguồn 5 V hằng ngày và nguồn 5 V ngoài khác trước khi nối cáp dữ liệu USB-C từ PC. Chỉ dùng một nguồn USB khi nạp hoặc xem Serial, không cấp đồng thời 5 V ngoài vào bo với USB PC. Nếu cần tránh tải LED trên USB PC, tháo dây +5V LED khi đã ngắt nguồn rồi chỉ nạp bo.</w:t>
+      </w:r>
+    </w:p>
+    <w:p>
+      <w:r>
+        <w:t>4. Chọn COM, bấm Verify rồi Upload. Nếu chưa có COM, giữ BOOT, bấm/thả RESET rồi thả BOOT; chọn lại COM và nạp. Không bật Erase All Flash để xử lý lỗi kết nối.</w:t>
+      </w:r>
+    </w:p>
+    <w:p>
+      <w:r>
+        <w:t>5. Sau Upload, mở Serial Monitor 115200 baud, rồi bấm RESET nếu cần để xem từ dòng khởi động. Giữ cáp USB PC là nguồn duy nhất khi thu log. Firmware 1.3.1 in phiên bản/lý do reset, sự kiện STA/lần bắt đầu kết nối và bản tin mạng khoảng mỗi 10 giây: online, status, liên kết router, IP, AP, hostname, heap và uptime. Log không in mật khẩu.</w:t>
+      </w:r>
+    </w:p>
+    <w:p>
+      <w:r>
+        <w:t>6. Nếu WiFi nhà được giữ và kết nối lại, mở IP hiện tại từ Serial hoặc địa chỉ .local hiện tại. Nếu chưa kết nối được, kiểm tra AP sau 30 giây; AP có thể mở sớm hơn khi bước hủy driver bị kẹt. Sau khi xác nhận web hoạt động, tháo USB PC, nối lại nguồn/LED khi đã ngắt điện rồi dùng nguồn 5 V–2 A hằng ngày.</w:t>
+      </w:r>
+    </w:p>
+    <w:p>
+      <w:r>
+        <w:t>7. Kiểm tra lại cấu hình đèn, ba mục yêu thích, kế hoạch/tọa độ và tên. Nếu đã reset WiFi bằng +/−, nhập lại mạng nhà; giữ các cấu hình còn lại. Phục hồi thực tế được ghi ở bảng W01–W08, không suy ra thành công chỉ từ thông báo biên dịch/Upload.</w:t>
+      </w:r>
+    </w:p>
+    <w:p>
+      <w:pPr>
+        <w:pStyle w:val="Heading3"/>
+      </w:pPr>
+      <w:r>
+        <w:t>Đọc thông tin chẩn đoán</w:t>
+      </w:r>
+    </w:p>
+    <w:p>
+      <w:r>
+        <w:t>Lý do WiFi 2 = AUTH_EXPIRE cho biết trạng thái xác thực đã hết hiệu lực; thông báo này không tự chứng minh mật khẩu đã lưu sai. Với core 3.3.1, trạng thái cache có thể còn báo WL_CONNECTED sau sự kiện này, trong khi driver không còn liên kết thực với router. IDF thường xóa IP khi ngắt, nên riêng reason 2/cache cũ chưa chứng minh vì sao AP không xuất hiện. Bản 1.3.1 kiểm tra cả isConnected, liên kết driver và IP, rồi hủy lần kết nối driver đang chờ trước khi bắt đầu lần mới; AP dự phòng được quyết định theo trạng thái thực này.</w:t>
+      </w:r>
+    </w:p>
+    <w:p>
+      <w:r>
+        <w:t>Khi web đã truy cập được, mở Thông tin chẩn đoán kết nối trong cài đặt mạng để đọc thông tin nâng cao. JSON ở http://&lt;IP-hiện-tại&gt;/api/state có đối tượng wifiDiagnostics để đối chiếu với log Serial:</w:t>
+      </w:r>
+    </w:p>
+    <w:tbl>
+      <w:tblPr>
+        <w:tblStyle w:val="LightShading-Accent1"/>
+        <w:tblW w:type="auto" w:w="0"/>
+        <w:tblLook w:firstColumn="1" w:firstRow="1" w:lastColumn="0" w:lastRow="0" w:noHBand="0" w:noVBand="1" w:val="04A0"/>
+      </w:tblPr>
+      <w:tblGrid>
+        <w:gridCol w:w="4819"/>
+        <w:gridCol w:w="4819"/>
+      </w:tblGrid>
+      <w:tr>
+        <w:trPr>
+          <w:tblHeader/>
+        </w:trPr>
+        <w:tc>
+          <w:tcPr>
+            <w:tcW w:type="dxa" w:w="4819"/>
+          </w:tcPr>
+          <w:p>
+            <w:pPr>
+              <w:spacing w:after="60"/>
+            </w:pPr>
+            <w:r>
+              <w:rPr>
+                <w:b/>
+                <w:sz w:val="18"/>
+              </w:rPr>
+              <w:t>Trường</w:t>
+            </w:r>
+          </w:p>
+        </w:tc>
+        <w:tc>
+          <w:tcPr>
+            <w:tcW w:type="dxa" w:w="4819"/>
+          </w:tcPr>
+          <w:p>
+            <w:pPr>
+              <w:spacing w:after="60"/>
+            </w:pPr>
+            <w:r>
+              <w:rPr>
+                <w:b/>
+                <w:sz w:val="18"/>
+              </w:rPr>
+              <w:t>Ý nghĩa</w:t>
+            </w:r>
+          </w:p>
+        </w:tc>
+      </w:tr>
+      <w:tr>
+        <w:tc>
+          <w:tcPr>
+            <w:tcW w:type="dxa" w:w="4819"/>
+          </w:tcPr>
+          <w:p>
+            <w:pPr>
+              <w:spacing w:after="60"/>
+            </w:pPr>
+            <w:r>
+              <w:rPr>
+                <w:b w:val="0"/>
+                <w:sz w:val="18"/>
+              </w:rPr>
+              <w:t>status</w:t>
+            </w:r>
+          </w:p>
+        </w:tc>
+        <w:tc>
+          <w:tcPr>
+            <w:tcW w:type="dxa" w:w="4819"/>
+          </w:tcPr>
+          <w:p>
+            <w:pPr>
+              <w:spacing w:after="60"/>
+            </w:pPr>
+            <w:r>
+              <w:rPr>
+                <w:b w:val="0"/>
+                <w:sz w:val="18"/>
+              </w:rPr>
+              <w:t>Mã trạng thái cache Arduino, chỉ là thông tin quan sát</w:t>
+            </w:r>
+          </w:p>
+        </w:tc>
+      </w:tr>
+      <w:tr>
+        <w:tc>
+          <w:tcPr>
+            <w:tcW w:type="dxa" w:w="4819"/>
+          </w:tcPr>
+          <w:p>
+            <w:pPr>
+              <w:spacing w:after="60"/>
+            </w:pPr>
+            <w:r>
+              <w:rPr>
+                <w:b w:val="0"/>
+                <w:sz w:val="18"/>
+              </w:rPr>
+              <w:t>interfaceReady</w:t>
+            </w:r>
+          </w:p>
+        </w:tc>
+        <w:tc>
+          <w:tcPr>
+            <w:tcW w:type="dxa" w:w="4819"/>
+          </w:tcPr>
+          <w:p>
+            <w:pPr>
+              <w:spacing w:after="60"/>
+            </w:pPr>
+            <w:r>
+              <w:rPr>
+                <w:b w:val="0"/>
+                <w:sz w:val="18"/>
+              </w:rPr>
+              <w:t>Cờ isConnected của giao diện STA</w:t>
+            </w:r>
+          </w:p>
+        </w:tc>
+      </w:tr>
+      <w:tr>
+        <w:tc>
+          <w:tcPr>
+            <w:tcW w:type="dxa" w:w="4819"/>
+          </w:tcPr>
+          <w:p>
+            <w:pPr>
+              <w:spacing w:after="60"/>
+            </w:pPr>
+            <w:r>
+              <w:rPr>
+                <w:b w:val="0"/>
+                <w:sz w:val="18"/>
+              </w:rPr>
+              <w:t>associated</w:t>
+            </w:r>
+          </w:p>
+        </w:tc>
+        <w:tc>
+          <w:tcPr>
+            <w:tcW w:type="dxa" w:w="4819"/>
+          </w:tcPr>
+          <w:p>
+            <w:pPr>
+              <w:spacing w:after="60"/>
+            </w:pPr>
+            <w:r>
+              <w:rPr>
+                <w:b w:val="0"/>
+                <w:sz w:val="18"/>
+              </w:rPr>
+              <w:t>Driver hiện còn liên kết vật lý với router</w:t>
+            </w:r>
+          </w:p>
+        </w:tc>
+      </w:tr>
+      <w:tr>
+        <w:tc>
+          <w:tcPr>
+            <w:tcW w:type="dxa" w:w="4819"/>
+          </w:tcPr>
+          <w:p>
+            <w:pPr>
+              <w:spacing w:after="60"/>
+            </w:pPr>
+            <w:r>
+              <w:rPr>
+                <w:b w:val="0"/>
+                <w:sz w:val="18"/>
+              </w:rPr>
+              <w:t>beginResult</w:t>
+            </w:r>
+          </w:p>
+        </w:tc>
+        <w:tc>
+          <w:tcPr>
+            <w:tcW w:type="dxa" w:w="4819"/>
+          </w:tcPr>
+          <w:p>
+            <w:pPr>
+              <w:spacing w:after="60"/>
+            </w:pPr>
+            <w:r>
+              <w:rPr>
+                <w:b w:val="0"/>
+                <w:sz w:val="18"/>
+              </w:rPr>
+              <w:t>Kết quả số của lần begin cuối; −1 khi chưa gọi</w:t>
+            </w:r>
+          </w:p>
+        </w:tc>
+      </w:tr>
+      <w:tr>
+        <w:tc>
+          <w:tcPr>
+            <w:tcW w:type="dxa" w:w="4819"/>
+          </w:tcPr>
+          <w:p>
+            <w:pPr>
+              <w:spacing w:after="60"/>
+            </w:pPr>
+            <w:r>
+              <w:rPr>
+                <w:b w:val="0"/>
+                <w:sz w:val="18"/>
+              </w:rPr>
+              <w:t>beginAttempts</w:t>
+            </w:r>
+          </w:p>
+        </w:tc>
+        <w:tc>
+          <w:tcPr>
+            <w:tcW w:type="dxa" w:w="4819"/>
+          </w:tcPr>
+          <w:p>
+            <w:pPr>
+              <w:spacing w:after="60"/>
+            </w:pPr>
+            <w:r>
+              <w:rPr>
+                <w:b w:val="0"/>
+                <w:sz w:val="18"/>
+              </w:rPr>
+              <w:t>Số lần bắt đầu kết nối trong phiên chạy</w:t>
+            </w:r>
+          </w:p>
+        </w:tc>
+      </w:tr>
+      <w:tr>
+        <w:tc>
+          <w:tcPr>
+            <w:tcW w:type="dxa" w:w="4819"/>
+          </w:tcPr>
+          <w:p>
+            <w:pPr>
+              <w:spacing w:after="60"/>
+            </w:pPr>
+            <w:r>
+              <w:rPr>
+                <w:b w:val="0"/>
+                <w:sz w:val="18"/>
+              </w:rPr>
+              <w:t>pending</w:t>
+            </w:r>
+          </w:p>
+        </w:tc>
+        <w:tc>
+          <w:tcPr>
+            <w:tcW w:type="dxa" w:w="4819"/>
+          </w:tcPr>
+          <w:p>
+            <w:pPr>
+              <w:spacing w:after="60"/>
+            </w:pPr>
+            <w:r>
+              <w:rPr>
+                <w:b w:val="0"/>
+                <w:sz w:val="18"/>
+              </w:rPr>
+              <w:t>Đang chờ bước bắt đầu kết nối mới</w:t>
+            </w:r>
+          </w:p>
+        </w:tc>
+      </w:tr>
+      <w:tr>
+        <w:tc>
+          <w:tcPr>
+            <w:tcW w:type="dxa" w:w="4819"/>
+          </w:tcPr>
+          <w:p>
+            <w:pPr>
+              <w:spacing w:after="60"/>
+            </w:pPr>
+            <w:r>
+              <w:rPr>
+                <w:b w:val="0"/>
+                <w:sz w:val="18"/>
+              </w:rPr>
+              <w:t>cancelTimedOut</w:t>
+            </w:r>
+          </w:p>
+        </w:tc>
+        <w:tc>
+          <w:tcPr>
+            <w:tcW w:type="dxa" w:w="4819"/>
+          </w:tcPr>
+          <w:p>
+            <w:pPr>
+              <w:spacing w:after="60"/>
+            </w:pPr>
+            <w:r>
+              <w:rPr>
+                <w:b w:val="0"/>
+                <w:sz w:val="18"/>
+              </w:rPr>
+              <w:t>Bước hủy/chờ rời liên kết đã hết thời hạn</w:t>
+            </w:r>
+          </w:p>
+        </w:tc>
+      </w:tr>
+      <w:tr>
+        <w:tc>
+          <w:tcPr>
+            <w:tcW w:type="dxa" w:w="4819"/>
+          </w:tcPr>
+          <w:p>
+            <w:pPr>
+              <w:spacing w:after="60"/>
+            </w:pPr>
+            <w:r>
+              <w:rPr>
+                <w:b w:val="0"/>
+                <w:sz w:val="18"/>
+              </w:rPr>
+              <w:t>disconnectError</w:t>
+            </w:r>
+          </w:p>
+        </w:tc>
+        <w:tc>
+          <w:tcPr>
+            <w:tcW w:type="dxa" w:w="4819"/>
+          </w:tcPr>
+          <w:p>
+            <w:pPr>
+              <w:spacing w:after="60"/>
+            </w:pPr>
+            <w:r>
+              <w:rPr>
+                <w:b w:val="0"/>
+                <w:sz w:val="18"/>
+              </w:rPr>
+              <w:t>Lỗi từ API hủy kết nối driver; rỗng khi thành công hoặc driver đã không kết nối</w:t>
+            </w:r>
+          </w:p>
+        </w:tc>
+      </w:tr>
+      <w:tr>
+        <w:tc>
+          <w:tcPr>
+            <w:tcW w:type="dxa" w:w="4819"/>
+          </w:tcPr>
+          <w:p>
+            <w:pPr>
+              <w:spacing w:after="60"/>
+            </w:pPr>
+            <w:r>
+              <w:rPr>
+                <w:b w:val="0"/>
+                <w:sz w:val="18"/>
+              </w:rPr>
+              <w:t>lastEvent</w:t>
+            </w:r>
+          </w:p>
+        </w:tc>
+        <w:tc>
+          <w:tcPr>
+            <w:tcW w:type="dxa" w:w="4819"/>
+          </w:tcPr>
+          <w:p>
+            <w:pPr>
+              <w:spacing w:after="60"/>
+            </w:pPr>
+            <w:r>
+              <w:rPr>
+                <w:b w:val="0"/>
+                <w:sz w:val="18"/>
+              </w:rPr>
+              <w:t>Mã sự kiện WiFi cuối được ghi nhận</w:t>
+            </w:r>
+          </w:p>
+        </w:tc>
+      </w:tr>
+      <w:tr>
+        <w:tc>
+          <w:tcPr>
+            <w:tcW w:type="dxa" w:w="4819"/>
+          </w:tcPr>
+          <w:p>
+            <w:pPr>
+              <w:spacing w:after="60"/>
+            </w:pPr>
+            <w:r>
+              <w:rPr>
+                <w:b w:val="0"/>
+                <w:sz w:val="18"/>
+              </w:rPr>
+              <w:t>lastDisconnectReason, lastDisconnectAtMs</w:t>
+            </w:r>
+          </w:p>
+        </w:tc>
+        <w:tc>
+          <w:tcPr>
+            <w:tcW w:type="dxa" w:w="4819"/>
+          </w:tcPr>
+          <w:p>
+            <w:pPr>
+              <w:spacing w:after="60"/>
+            </w:pPr>
+            <w:r>
+              <w:rPr>
+                <w:b w:val="0"/>
+                <w:sz w:val="18"/>
+              </w:rPr>
+              <w:t>Lý do và thời điểm ms từ boot của lần ngắt được ghi gần nhất; bỏ qua ASSOC_LEAVE 8 do chủ động rời mạng</w:t>
+            </w:r>
+          </w:p>
+        </w:tc>
+      </w:tr>
+      <w:tr>
+        <w:tc>
+          <w:tcPr>
+            <w:tcW w:type="dxa" w:w="4819"/>
+          </w:tcPr>
+          <w:p>
+            <w:pPr>
+              <w:spacing w:after="60"/>
+            </w:pPr>
+            <w:r>
+              <w:rPr>
+                <w:b w:val="0"/>
+                <w:sz w:val="18"/>
+              </w:rPr>
+              <w:t>disconnectCount</w:t>
+            </w:r>
+          </w:p>
+        </w:tc>
+        <w:tc>
+          <w:tcPr>
+            <w:tcW w:type="dxa" w:w="4819"/>
+          </w:tcPr>
+          <w:p>
+            <w:pPr>
+              <w:spacing w:after="60"/>
+            </w:pPr>
+            <w:r>
+              <w:rPr>
+                <w:b w:val="0"/>
+                <w:sz w:val="18"/>
+              </w:rPr>
+              <w:t>Số lần ngắt được ghi trong phiên chạy, không tính lần chủ động rời nói trên</w:t>
+            </w:r>
+          </w:p>
+        </w:tc>
+      </w:tr>
+      <w:tr>
+        <w:tc>
+          <w:tcPr>
+            <w:tcW w:type="dxa" w:w="4819"/>
+          </w:tcPr>
+          <w:p>
+            <w:pPr>
+              <w:spacing w:after="60"/>
+            </w:pPr>
+            <w:r>
+              <w:rPr>
+                <w:b w:val="0"/>
+                <w:sz w:val="18"/>
+              </w:rPr>
+              <w:t>powerSave</w:t>
+            </w:r>
+          </w:p>
+        </w:tc>
+        <w:tc>
+          <w:tcPr>
+            <w:tcW w:type="dxa" w:w="4819"/>
+          </w:tcPr>
+          <w:p>
+            <w:pPr>
+              <w:spacing w:after="60"/>
+            </w:pPr>
+            <w:r>
+              <w:rPr>
+                <w:b w:val="0"/>
+                <w:sz w:val="18"/>
+              </w:rPr>
+              <w:t>Mã chế độ tiết kiệm WiFi đang dùng; −1 nếu không đọc được</w:t>
+            </w:r>
+          </w:p>
+        </w:tc>
+      </w:tr>
+    </w:tbl>
+    <w:p/>
+    <w:p>
+      <w:r>
+        <w:t>Mã cache, IP hoặc beginResult đơn lẻ không được dùng để kết luận online/thất bại. Đặc biệt, beginResult = 4 không tự xác nhận lần kết nối mới đã thất bại vì core có thể trả lại giá trị cache cũ. Đọc cùng interfaceReady, associated, IP hiện tại và trạng thái mạng trên trang. Ghi lại các bản tin trước/sau mất liên lạc để phân biệt lỗi driver, mạng và reset thiết bị.</w:t>
+      </w:r>
+    </w:p>
+    <w:p>
+      <w:r>
+        <w:t>Đối tượng resources ghi lý do reset (resetReason), heap đang trống (freeHeap), mức heap trống thấp nhất (minFreeHeap), khối heap trống lớn nhất (largestFreeBlock) và stack còn trống thấp nhất của loop (loopStackFree). Các giá trị bộ nhớ dùng byte. loopStackFree và planSaveDiagnostics.stackFree là mức thấp nhất còn trống trong vòng đời tác vụ theo ESP-IDF, không phải lượng stack trống tức thời và không nhân thêm 4.</w:t>
+      </w:r>
+    </w:p>
+    <w:p>
+      <w:r>
+        <w:t>Đối tượng planSaveDiagnostics ghi lần lưu lịch gần nhất:</w:t>
+      </w:r>
+    </w:p>
+    <w:tbl>
+      <w:tblPr>
+        <w:tblStyle w:val="LightShading-Accent1"/>
+        <w:tblW w:type="auto" w:w="0"/>
+        <w:tblLook w:firstColumn="1" w:firstRow="1" w:lastColumn="0" w:lastRow="0" w:noHBand="0" w:noVBand="1" w:val="04A0"/>
+      </w:tblPr>
+      <w:tblGrid>
+        <w:gridCol w:w="4819"/>
+        <w:gridCol w:w="4819"/>
+      </w:tblGrid>
+      <w:tr>
+        <w:trPr>
+          <w:tblHeader/>
+        </w:trPr>
+        <w:tc>
+          <w:tcPr>
+            <w:tcW w:type="dxa" w:w="4819"/>
+          </w:tcPr>
+          <w:p>
+            <w:pPr>
+              <w:spacing w:after="60"/>
+            </w:pPr>
+            <w:r>
+              <w:rPr>
+                <w:b/>
+                <w:sz w:val="18"/>
+              </w:rPr>
+              <w:t>Nhóm trường</w:t>
+            </w:r>
+          </w:p>
+        </w:tc>
+        <w:tc>
+          <w:tcPr>
+            <w:tcW w:type="dxa" w:w="4819"/>
+          </w:tcPr>
+          <w:p>
+            <w:pPr>
+              <w:spacing w:after="60"/>
+            </w:pPr>
+            <w:r>
+              <w:rPr>
+                <w:b/>
+                <w:sz w:val="18"/>
+              </w:rPr>
+              <w:t>Ý nghĩa</w:t>
+            </w:r>
+          </w:p>
+        </w:tc>
+      </w:tr>
+      <w:tr>
+        <w:tc>
+          <w:tcPr>
+            <w:tcW w:type="dxa" w:w="4819"/>
+          </w:tcPr>
+          <w:p>
+            <w:pPr>
+              <w:spacing w:after="60"/>
+            </w:pPr>
+            <w:r>
+              <w:rPr>
+                <w:b w:val="0"/>
+                <w:sz w:val="18"/>
+              </w:rPr>
+              <w:t>kind, stage, count</w:t>
+            </w:r>
+          </w:p>
+        </w:tc>
+        <w:tc>
+          <w:tcPr>
+            <w:tcW w:type="dxa" w:w="4819"/>
+          </w:tcPr>
+          <w:p>
+            <w:pPr>
+              <w:spacing w:after="60"/>
+            </w:pPr>
+            <w:r>
+              <w:rPr>
+                <w:b w:val="0"/>
+                <w:sz w:val="18"/>
+              </w:rPr>
+              <w:t>Loại lịch, checkpoint hiện tại và số lần lưu trong phiên</w:t>
+            </w:r>
+          </w:p>
+        </w:tc>
+      </w:tr>
+      <w:tr>
+        <w:tc>
+          <w:tcPr>
+            <w:tcW w:type="dxa" w:w="4819"/>
+          </w:tcPr>
+          <w:p>
+            <w:pPr>
+              <w:spacing w:after="60"/>
+            </w:pPr>
+            <w:r>
+              <w:rPr>
+                <w:b w:val="0"/>
+                <w:sz w:val="18"/>
+              </w:rPr>
+              <w:t>startedAtMs, totalMs</w:t>
+            </w:r>
+          </w:p>
+        </w:tc>
+        <w:tc>
+          <w:tcPr>
+            <w:tcW w:type="dxa" w:w="4819"/>
+          </w:tcPr>
+          <w:p>
+            <w:pPr>
+              <w:spacing w:after="60"/>
+            </w:pPr>
+            <w:r>
+              <w:rPr>
+                <w:b w:val="0"/>
+                <w:sz w:val="18"/>
+              </w:rPr>
+              <w:t>Mốc ms từ boot và thời gian xử lý đã ghi nhận</w:t>
+            </w:r>
+          </w:p>
+        </w:tc>
+      </w:tr>
+      <w:tr>
+        <w:tc>
+          <w:tcPr>
+            <w:tcW w:type="dxa" w:w="4819"/>
+          </w:tcPr>
+          <w:p>
+            <w:pPr>
+              <w:spacing w:after="60"/>
+            </w:pPr>
+            <w:r>
+              <w:rPr>
+                <w:b w:val="0"/>
+                <w:sz w:val="18"/>
+              </w:rPr>
+              <w:t>lightMs, planMs, applyMs, responseMs</w:t>
+            </w:r>
+          </w:p>
+        </w:tc>
+        <w:tc>
+          <w:tcPr>
+            <w:tcW w:type="dxa" w:w="4819"/>
+          </w:tcPr>
+          <w:p>
+            <w:pPr>
+              <w:spacing w:after="60"/>
+            </w:pPr>
+            <w:r>
+              <w:rPr>
+                <w:b w:val="0"/>
+                <w:sz w:val="18"/>
+              </w:rPr>
+              <w:t>Thời gian lưu ánh sáng, lưu kế hoạch, áp dụng và gọi hàm gửi phản hồi trên ESP</w:t>
+            </w:r>
+          </w:p>
+        </w:tc>
+      </w:tr>
+      <w:tr>
+        <w:tc>
+          <w:tcPr>
+            <w:tcW w:type="dxa" w:w="4819"/>
+          </w:tcPr>
+          <w:p>
+            <w:pPr>
+              <w:spacing w:after="60"/>
+            </w:pPr>
+            <w:r>
+              <w:rPr>
+                <w:b w:val="0"/>
+                <w:sz w:val="18"/>
+              </w:rPr>
+              <w:t>successful, lightWritten, planWritten</w:t>
+            </w:r>
+          </w:p>
+        </w:tc>
+        <w:tc>
+          <w:tcPr>
+            <w:tcW w:type="dxa" w:w="4819"/>
+          </w:tcPr>
+          <w:p>
+            <w:pPr>
+              <w:spacing w:after="60"/>
+            </w:pPr>
+            <w:r>
+              <w:rPr>
+                <w:b w:val="0"/>
+                <w:sz w:val="18"/>
+              </w:rPr>
+              <w:t>Bước lưu/kiểm tra storage thành công; hai cờ Written ghi nhận lần ghi ánh sáng/kế hoạch đã đọc kiểm tra thành công</w:t>
+            </w:r>
+          </w:p>
+        </w:tc>
+      </w:tr>
+      <w:tr>
+        <w:tc>
+          <w:tcPr>
+            <w:tcW w:type="dxa" w:w="4819"/>
+          </w:tcPr>
+          <w:p>
+            <w:pPr>
+              <w:spacing w:after="60"/>
+            </w:pPr>
+            <w:r>
+              <w:rPr>
+                <w:b w:val="0"/>
+                <w:sz w:val="18"/>
+              </w:rPr>
+              <w:t>heapBefore, heapAfter, stackFree</w:t>
+            </w:r>
+          </w:p>
+        </w:tc>
+        <w:tc>
+          <w:tcPr>
+            <w:tcW w:type="dxa" w:w="4819"/>
+          </w:tcPr>
+          <w:p>
+            <w:pPr>
+              <w:spacing w:after="60"/>
+            </w:pPr>
+            <w:r>
+              <w:rPr>
+                <w:b w:val="0"/>
+                <w:sz w:val="18"/>
+              </w:rPr>
+              <w:t>Heap trước/sau và mức stack trống thấp nhất của loop</w:t>
+            </w:r>
+          </w:p>
+        </w:tc>
+      </w:tr>
+      <w:tr>
+        <w:tc>
+          <w:tcPr>
+            <w:tcW w:type="dxa" w:w="4819"/>
+          </w:tcPr>
+          <w:p>
+            <w:pPr>
+              <w:spacing w:after="60"/>
+            </w:pPr>
+            <w:r>
+              <w:rPr>
+                <w:b w:val="0"/>
+                <w:sz w:val="18"/>
+              </w:rPr>
+              <w:t>onlineBefore/After, associatedBefore/After, interfaceBefore/After, ipBefore/After</w:t>
+            </w:r>
+          </w:p>
+        </w:tc>
+        <w:tc>
+          <w:tcPr>
+            <w:tcW w:type="dxa" w:w="4819"/>
+          </w:tcPr>
+          <w:p>
+            <w:pPr>
+              <w:spacing w:after="60"/>
+            </w:pPr>
+            <w:r>
+              <w:rPr>
+                <w:b w:val="0"/>
+                <w:sz w:val="18"/>
+              </w:rPr>
+              <w:t>Trạng thái online, liên kết driver, giao diện STA và IP trước/sau lưu</w:t>
+            </w:r>
+          </w:p>
+        </w:tc>
+      </w:tr>
+    </w:tbl>
+    <w:p/>
+    <w:p>
+      <w:r>
+        <w:t>Phản hồi lưu có thể ghi stage responding; lần cập nhật trạng thái kế tiếp mới thấy complete. successful=true xác nhận bước lưu/kiểm tra storage đã thành công; hai cờ Written chỉ được bật khi lần ghi đã đọc kiểm tra thành công. Khi một lần lưu lỗi, cờ Written=false vẫn có thể đã ghi flash nhưng đọc kiểm tra thất bại. complete/responseMs chỉ ghi hàm gửi phản hồi phía ESP đã trả về, không xác nhận trình duyệt nhận được dữ liệu. Các bản ghi chẩn đoán chỉ nằm trong RAM của phiên chạy, mất khi reboot và không tạo thêm ghi NVS.</w:t>
+      </w:r>
+    </w:p>
+    <w:p>
+      <w:r>
+        <w:t>Để lấy bằng chứng lỗi sau Lưu lịch mặt trời:</w:t>
+      </w:r>
+    </w:p>
+    <w:p>
+      <w:r>
+        <w:t>1. Khi web truy cập lại, mở Cài đặt &amp; kết nối → Thông tin chẩn đoán kết nối → Sao chép chẩn đoán trước khi reset nguồn. Bản sao dùng các trường được chọn sẵn, không chứa session token; tránh sao chép toàn bộ /api/state để chia sẻ.</w:t>
+      </w:r>
+    </w:p>
+    <w:p>
+      <w:r>
+        <w:t>2. Nếu tái thử, lưu lịch không đổi một lần, đợi một lần cập nhật trạng thái sau phản hồi rồi sao chép chẩn đoán.</w:t>
+      </w:r>
+    </w:p>
+    <w:p>
+      <w:r>
+        <w:t>3. Đổi một giá trị của lịch mặt trời, lưu một lần và thu bản sao/log Serial sau phản hồi hoặc ngay khi web trở lại. Không bấm lưu liên tục. Ghi thông báo, khả năng truy cập IP/AP và kế hoạch sau khi khôi phục để so sánh hai lần.</w:t>
+      </w:r>
+    </w:p>
+    <w:p>
+      <w:r>
+        <w:t>Kế hoạch còn giữ chứng minh dữ liệu đã phục hồi được; chưa đủ để quy nguyên nhân mất truy cập cho NVS, WiFi hoặc HTTP. Đối chiếu checkpoint/thời gian lưu, bộ nhớ và thời điểm/lý do ngắt mạng để tiếp tục xác định nguyên nhân.</w:t>
       </w:r>
     </w:p>
     <w:p>
@@ -3232,7 +4119,7 @@
         <w:pStyle w:val="Heading1"/>
       </w:pPr>
       <w:r>
-        <w:t>Cấu hình và kế hoạch Đèn Deco 1.3.0</w:t>
+        <w:t>Cấu hình và kế hoạch Đèn Deco 1.3.1</w:t>
       </w:r>
     </w:p>
     <w:p>
@@ -3246,6 +4133,31 @@
     <w:p>
       <w:r>
         <w:t>Phạm vi: firmware, web trên ESP và hướng dẫn đấu nối/nạp. Người dùng tự xử lý cơ khí/vỏ. ESP32-C3 SuperMini, bốn TTP223, 20 WS2812B và nguồn 5 V–2 A. Tên Đèn Deco; WiFi nhà + AP dự phòng. Máy nạp Windows, Arduino IDE. Bổ sung OTA qua web theo yêu cầu mới.</w:t>
+      </w:r>
+    </w:p>
+    <w:p>
+      <w:r>
+        <w:t>Bản 1.3.1 cải thiện phục hồi đường WiFi/web sau báo cáo trên 1.3.0: AUTH_EXPIRE (lý do 2) có lúc tự hồi, có lúc cả hostname và IP không truy cập, không thấy AP, LED/cảm ứng vẫn chạy. Bằng chứng mới thu hẹp trigger: lưu lịch mặt trời không đổi vẫn truy cập; sửa lịch rồi lưu nhận ACK đã lưu, sau đó web/IP mất truy cập; kế hoạch còn giữ sau khi web khôi phục. Kết quả reset +/− chưa xác nhận. Chưa xác định NVS, HTTP, WiFi hay tài nguyên RAM/stack là nguyên nhân của lần mất truy cập sau lưu.</w:t>
+      </w:r>
+    </w:p>
+    <w:p>
+      <w:r>
+        <w:t>Kiểm tra SDK/core 3.3.1 độc lập cho thấy cache WL_CONNECTED có thể không đổi sau AUTH_EXPIRE; wrapper WiFi.disconnect không hủy lần xác thực đang chờ khi cờ STA connected đã false. Bước bắt đầu lại dựa cache có thể kẹt chờ. IDF thường xóa IP DHCP khi ngắt; riêng AUTH_EXPIRE hoặc cache stale chưa đủ kết luận nguyên nhân của việc không thấy AP trên bo này. Cần đối chiếu RAM trước/sau lưu, checkpoint luồng lưu/HTTP và thời điểm/lý do ngắt khi tái thử trên thiết bị.</w:t>
+      </w:r>
+    </w:p>
+    <w:p>
+      <w:r>
+        <w:t>Luồng mới chỉ nhận online khi isConnected, liên kết vật lý từ driver và IP đều hợp lệ, không có bước bắt đầu mạng đang chờ. Gọi esp_wifi_disconnect để hủy lần đang chạy, rồi chờ hữu hạn: 50 ms khi có sự kiện ngắt mới, 150 ms nếu driver đã rời mà không phát sự kiện; driver vẫn liên kết thì giới hạn 1,5 giây trước khi chọn đường AP phục hồi. AP dự phòng sau 30 giây và chu kỳ thử lại khoảng 60 giây được giữ; timeout hủy driver có thể mở AP sớm. Giữ công suất/bảo mật WiFi, core 3.3.1, thuật toán mDNS, pinout, 14 mode và NVS/lịch.</w:t>
+      </w:r>
+    </w:p>
+    <w:p>
+      <w:r>
+        <w:t>JSON trạng thái bổ sung wifiDiagnostics; Serial ghi lý do reset lúc boot và sức khỏe mạng mỗi 10 giây, với IP/hostname/trạng thái driver để phục hồi USB. DHCP lease cũ hoặc status cache không chứng minh online; AUTH_EXPIRE không được mô tả là chắc chắn sai mật khẩu. Thông tin trực tiếp IP không mở cũng không đủ kết luận DNS/OTA hỏng. Hướng dẫn nạp USB giữ Erase All Flash Disabled, core/thư viện và bảng phân vùng; chỉ một nguồn 5 V khi nạp/thu Serial. Kết quả phục hồi thật trên bộ đèn đang chờ.</w:t>
+      </w:r>
+    </w:p>
+    <w:p>
+      <w:r>
+        <w:t>Chẩn đoán 1.3.1 bổ sung lần ngắt cuối/thời điểm/count và chế độ powerSave; resources ghi heap/reset/stack, planSaveDiagnostics ghi checkpoint/thời gian/ghi-readback/RAM/trạng thái mạng trước-sau lưu. Dữ liệu chỉ giữ RAM, reset khi boot và không tăng ghi NVS; bỏ qua ASSOC_LEAVE 8 chủ động trong bản ghi ngắt. High-water mark stack của ESP-IDF là byte trống thấp nhất trong vòng đời tác vụ, không phải tức thời/không nhân 4. successful nói bước lưu/kiểm tra storage thành công; stage responding trong ACK rồi complete ở GET sau chỉ xác nhận hàm gửi phía server trả về, không bảo đảm browser delivery. Nút Sao chép chẩn đoán dùng whitelist không có session token để thu sau phục hồi; so sánh một lần không đổi với một lần đổi lịch, tránh bấm lưu liên tục.</w:t>
       </w:r>
     </w:p>
     <w:p>
@@ -3742,7 +4654,7 @@
                 <w:b w:val="0"/>
                 <w:sz w:val="18"/>
               </w:rPr>
-              <w:t>Web nhúng, polling 250 ms; quét 2,4 GHz, trạng thái mạng, hostname và AP dự phòng</w:t>
+              <w:t>Web nhúng, polling 250 ms; quét 2,4 GHz, trạng thái thực driver/IP, AP dự phòng và diagnostics</w:t>
             </w:r>
           </w:p>
         </w:tc>
@@ -3759,7 +4671,7 @@
                 <w:b w:val="0"/>
                 <w:sz w:val="18"/>
               </w:rPr>
-              <w:t>Bản 1.1.0 cập nhật; kết quả kiểm tra ghi ở KIEM_THU.md</w:t>
+              <w:t>1.3.1 sửa phục hồi; kết quả host ghi ở KIEM_THU.md, phục hồi bo thật chờ xác nhận</w:t>
             </w:r>
           </w:p>
         </w:tc>
@@ -3990,7 +4902,7 @@
                 <w:b w:val="0"/>
                 <w:sz w:val="18"/>
               </w:rPr>
-              <w:t>OTA</w:t>
+              <w:t>OTA/USB phục hồi</w:t>
             </w:r>
           </w:p>
         </w:tc>
@@ -4007,7 +4919,7 @@
                 <w:b w:val="0"/>
                 <w:sz w:val="18"/>
               </w:rPr>
-              <w:t>File ứng dụng C3, phân vùng còn lại, giữ NVS, reboot sau thành công</w:t>
+              <w:t>File ứng dụng C3, giữ NVS/phân vùng; USB khi HTTP/AP mất</w:t>
             </w:r>
           </w:p>
         </w:tc>
@@ -4024,7 +4936,7 @@
                 <w:b w:val="0"/>
                 <w:sz w:val="18"/>
               </w:rPr>
-              <w:t>Nâng cấp 1.2.x → 1.3.0 giữ cấu hình và kế hoạch đã lưu</w:t>
+              <w:t>Nâng cấp 1.3.0 → 1.3.1 giữ cấu hình và kế hoạch, thử phục hồi W01–W10</w:t>
             </w:r>
           </w:p>
         </w:tc>
@@ -4060,7 +4972,7 @@
                 <w:b w:val="0"/>
                 <w:sz w:val="18"/>
               </w:rPr>
-              <w:t>Sketch, .bin OTA 1.3.0, hướng dẫn và checklist</w:t>
+              <w:t>Sketch, .bin OTA 1.3.1, hướng dẫn USB và checklist</w:t>
             </w:r>
           </w:p>
         </w:tc>
@@ -4130,7 +5042,7 @@
                 <w:b w:val="0"/>
                 <w:sz w:val="18"/>
               </w:rPr>
-              <w:t>Người dùng đã thử 1.2.0; tính năng 1.3.0 cần thử trên bo thật</w:t>
+              <w:t>Người dùng đã nạp 1.3.0 và báo WiFi/web lỗi; phục hồi 1.3.1 chờ xác nhận</w:t>
             </w:r>
           </w:p>
         </w:tc>
@@ -4230,7 +5142,31 @@
         <w:pStyle w:val="ListBullet"/>
       </w:pPr>
       <w:r>
-        <w:t>Cấu hình/mục yêu thích/bật tắt trước khi OTA 1.2.x → 1.3.0 và sau reboot; WiFi/tên giữ nguyên.</w:t>
+        <w:t>Cấu hình/mục yêu thích/bật tắt và kế hoạch trước khi nạp USB/OTA 1.3.0 → 1.3.1 và sau reboot; WiFi/tên giữ khi không reset riêng WiFi.</w:t>
+      </w:r>
+    </w:p>
+    <w:p>
+      <w:pPr>
+        <w:pStyle w:val="ListBullet"/>
+      </w:pPr>
+      <w:r>
+        <w:t>Khi AUTH_EXPIRE, đối chiếu status cache/liên kết thực/IP, AP và lần thử lại; kiểm tra router DHCP lease cũ không làm đèn báo online giả.</w:t>
+      </w:r>
+    </w:p>
+    <w:p>
+      <w:pPr>
+        <w:pStyle w:val="ListBullet"/>
+      </w:pPr>
+      <w:r>
+        <w:t>So sánh lưu lịch mặt trời không đổi với lưu có sửa: ACK, kế hoạch giữ sau phục hồi, heap/stack/checkpoint và thời điểm ngắt; không suy nguyên nhân chỉ từ việc nhận ACK hoặc dữ liệu còn giữ.</w:t>
+      </w:r>
+    </w:p>
+    <w:p>
+      <w:pPr>
+        <w:pStyle w:val="ListBullet"/>
+      </w:pPr>
+      <w:r>
+        <w:t>Phục hồi từ +/− 5 giây hoặc USB với Erase All Flash Disabled và một nguồn USB; ghi log boot/lý do reset/sức khỏe mạng.</w:t>
       </w:r>
     </w:p>
     <w:p>
@@ -4290,7 +5226,7 @@
         <w:pStyle w:val="Heading1"/>
       </w:pPr>
       <w:r>
-        <w:t>Kiểm thử và nghiệm thu Đèn Deco 1.3.0</w:t>
+        <w:t>Kiểm thử và nghiệm thu Đèn Deco 1.3.1</w:t>
       </w:r>
     </w:p>
     <w:p>
@@ -4303,7 +5239,7 @@
     </w:p>
     <w:p>
       <w:r>
-        <w:t>Các kiểm tra nền dưới đây đã chạy thành công cho mã nguồn 1.1.0; phần 1.2.0/1.2.1 giữ kết quả lịch sử riêng. Thông tin build và kết quả chạy mới cho 1.3.0 ghi trong BUILD_INFO.md và phần bổ sung bên dưới; không coi kết quả cũ là kết quả bản mới. Người dùng đã thử 1.2.0 trên đèn thật, có phản hồi chuyển màu/Lấp lánh. SNTP, lịch tuần và tự động mặt trời của bản 1.3.0 cần thử trên bo thật; host/web mock không xác nhận Internet SNTP, đồng hồ ESP hoặc ramp thực tế.</w:t>
+        <w:t>Các kiểm tra nền dưới đây đã chạy thành công cho mã nguồn 1.1.0; phần 1.2.0/1.2.1/1.3.0 giữ kết quả lịch sử riêng. Thông tin build và kết quả chạy mới cho 1.3.1 ghi trong BUILD_INFO.md và phần bổ sung bên dưới; không coi kết quả cũ là kết quả bản mới. Người dùng đã nạp 1.3.0: lưu lịch mặt trời không đổi vẫn truy cập; lưu có sửa nhận ACK đã lưu rồi web/IP mất truy cập. Kế hoạch còn giữ khi khôi phục; LED/cảm ứng vẫn hoạt động. Đã có reason WiFi 2 nhưng chưa xác định nguyên nhân lần mất truy cập sau lưu; reset +/− chưa xác nhận. Độ ổn định trên bộ đèn sau cập nhật 1.3.1 chưa xác nhận; host/web mock không xác nhận đường WiFi/HTTP/SNTP thật hoặc cảm nhận ramp.</w:t>
       </w:r>
     </w:p>
     <w:p>
@@ -6557,6 +7493,885 @@
     <w:p>
       <w:r>
         <w:t>Với A08/A09, chỉ dùng offset ±120 phút khi giờ hiện tại gần sự kiện mặt trời; nếu không, thử vào ngày/giờ thích hợp. Không giả đồng hồ để biến kiểm tra thuật toán thành kết quả phần cứng. Bảo vệ khỏi chạy bù sau clock jump được kiểm tra trên host; kết quả SNTP/ramp thật ghi riêng.</w:t>
+      </w:r>
+    </w:p>
+    <w:p>
+      <w:pPr>
+        <w:pStyle w:val="Heading2"/>
+      </w:pPr>
+      <w:r>
+        <w:t>Kiểm tra bổ sung bản 1.3.1</w:t>
+      </w:r>
+    </w:p>
+    <w:p>
+      <w:r>
+        <w:t>Ngày 13/10/2026, build cuối Arduino ESP32 3.3.1 và profile PlatformIO 2.0.17 đều PASS; kích thước/ảnh OTA/SHA ghi trong BUILD_INFO.md. Ba kiểm tra C++ network, storage, schedule_storage chạy với cảnh báo nghiêm ngặt và ASan/UBSan PASS. Bộ Playwright/Chromium đầy đủ PASS, gồm chẩn đoán mới, whitelist không có token/mật khẩu, sao chép qua HTTP/offline, firmware cũ thiếu trường, khóa OTA và các kiểm tra lịch/ánh sáng/WiFi đã có. Rà soát nguồn tích hợp hoàn tất; không tìm thấy lỗi xác định trong thứ tự lưu kế hoạch.</w:t>
+      </w:r>
+    </w:p>
+    <w:p>
+      <w:r>
+        <w:t>Phạm vi rà soát và các tiêu chí đối chiếu trên thiết bị:</w:t>
+      </w:r>
+    </w:p>
+    <w:p>
+      <w:pPr>
+        <w:pStyle w:val="ListBullet"/>
+      </w:pPr>
+      <w:r>
+        <w:t>SDK/core 3.3.1: AUTH_EXPIRE có thể để status cache còn WL_CONNECTED; wrapper disconnect không hủy kết nối xác thực khi STA connected=false. Luồng mới kiểm tra isConnected, liên kết driver và IP, không lấy DHCP/cache đơn lẻ làm bằng chứng online.</w:t>
+      </w:r>
+    </w:p>
+    <w:p>
+      <w:pPr>
+        <w:pStyle w:val="ListBullet"/>
+      </w:pPr>
+      <w:r>
+        <w:t>Mô hình cổng bắt đầu kết nối: driver đã rời thì chờ hữu hạn 50/150 ms rồi bắt đầu; driver vẫn liên kết thì timeout 1,5 giây; dùng API driver để hủy lần đang chạy. Kiểm tra millis tràn, không kẹt vòng lặp và timeout mở AP phục hồi.</w:t>
+      </w:r>
+    </w:p>
+    <w:p>
+      <w:pPr>
+        <w:pStyle w:val="ListBullet"/>
+      </w:pPr>
+      <w:r>
+        <w:t>Chính sách AP/thử lại: fallback 30 giây, thử lại theo chu kỳ khoảng 60 giây, AP còn dùng khi chưa online thật; quét và đổi mạng không tạo lần begin chồng nhau. AUTH_EXPIRE được mô tả đúng, không khẳng định sai mật khẩu.</w:t>
+      </w:r>
+    </w:p>
+    <w:p>
+      <w:pPr>
+        <w:pStyle w:val="ListBullet"/>
+      </w:pPr>
+      <w:r>
+        <w:t>JSON/Serial: wifiDiagnostics phản ánh status/liên kết/begin/pending/lỗi ngắt/sự kiện cuối, lần ngắt cuối và powerSave; resources ghi reset/heap/khối lớn nhất/stack. High-water mark stack phải trình bày là byte trống thấp nhất vòng đời tác vụ, không tức thời hoặc nhân 4. Log boot có lý do reset, bản tin mạng khoảng 10 giây; bỏ ngắt chủ động ASSOC_LEAVE 8 khỏi bản ghi lỗi ngắt cuối. UI tương thích khi trường chẩn đoán thiếu ở firmware cũ.</w:t>
+      </w:r>
+    </w:p>
+    <w:p>
+      <w:pPr>
+        <w:pStyle w:val="ListBullet"/>
+      </w:pPr>
+      <w:r>
+        <w:t>Lưu mặt trời: so sánh POST không đổi và có sửa, ACK/validation/ghi-readback/checkpoint; planSaveDiagnostics ghi thời gian, cờ ghi/đọc kiểm tra thành công và RAM/mạng trước-sau, chỉ RAM/reset sau boot, không thêm ghi NVS. Cờ Written=false khi lưu lỗi không chứng minh chưa chạm flash, vì readback có thể lỗi sau ghi. ACK stage responding, GET sau complete; successful chỉ xác nhận storage, hàm gửi HTTP trả về không chứng minh browser nhận. disconnectError rỗng khi hủy thành công hoặc driver không kết nối. Không quy nguyên nhân chỉ từ ACK hoặc kế hoạch giữ sau phục hồi.</w:t>
+      </w:r>
+    </w:p>
+    <w:p>
+      <w:pPr>
+        <w:pStyle w:val="ListBullet"/>
+      </w:pPr>
+      <w:r>
+        <w:t>Sao chép chẩn đoán: đúng whitelist loại session token, có WiFi/resources/plan save và hỗ trợ thiếu trường cũ; hướng dẫn thu ngay sau phục hồi trước reset, mỗi lần thử chỉ lưu một lần để giữ bản ghi liên quan.</w:t>
+      </w:r>
+    </w:p>
+    <w:p>
+      <w:pPr>
+        <w:pStyle w:val="ListBullet"/>
+      </w:pPr>
+      <w:r>
+        <w:t>Hồi quy ánh sáng, cảm ứng, NVS, tám lịch tuần, SNTP/mặt trời, draft và OTA; 14 ID/core/thư viện/phân vùng giữ như 1.3.0. Kiểm tra ảnh OTA và SHA theo BUILD_INFO.md.</w:t>
+      </w:r>
+    </w:p>
+    <w:p>
+      <w:r>
+        <w:t>Các kiểm tra driver/mô hình không thay cho lần phục hồi trên thiết bị đã báo lỗi. Chỉ đánh dấu các ca W là Đạt khi có log/truy cập thực tế.</w:t>
+      </w:r>
+    </w:p>
+    <w:p>
+      <w:pPr>
+        <w:pStyle w:val="Heading2"/>
+      </w:pPr>
+      <w:r>
+        <w:t>Chạy thử phục hồi bản 1.3.1 trên đèn</w:t>
+      </w:r>
+    </w:p>
+    <w:tbl>
+      <w:tblPr>
+        <w:tblStyle w:val="LightShading-Accent1"/>
+        <w:tblW w:type="auto" w:w="0"/>
+        <w:tblLook w:firstColumn="1" w:firstRow="1" w:lastColumn="0" w:lastRow="0" w:noHBand="0" w:noVBand="1" w:val="04A0"/>
+      </w:tblPr>
+      <w:tblGrid>
+        <w:gridCol w:w="2409"/>
+        <w:gridCol w:w="2409"/>
+        <w:gridCol w:w="2409"/>
+        <w:gridCol w:w="2409"/>
+      </w:tblGrid>
+      <w:tr>
+        <w:trPr>
+          <w:tblHeader/>
+        </w:trPr>
+        <w:tc>
+          <w:tcPr>
+            <w:tcW w:type="dxa" w:w="2409"/>
+          </w:tcPr>
+          <w:p>
+            <w:pPr>
+              <w:spacing w:after="60"/>
+            </w:pPr>
+            <w:r>
+              <w:rPr>
+                <w:b/>
+                <w:sz w:val="18"/>
+              </w:rPr>
+              <w:t>Mã</w:t>
+            </w:r>
+          </w:p>
+        </w:tc>
+        <w:tc>
+          <w:tcPr>
+            <w:tcW w:type="dxa" w:w="2409"/>
+          </w:tcPr>
+          <w:p>
+            <w:pPr>
+              <w:spacing w:after="60"/>
+            </w:pPr>
+            <w:r>
+              <w:rPr>
+                <w:b/>
+                <w:sz w:val="18"/>
+              </w:rPr>
+              <w:t>Kiểm tra</w:t>
+            </w:r>
+          </w:p>
+        </w:tc>
+        <w:tc>
+          <w:tcPr>
+            <w:tcW w:type="dxa" w:w="2409"/>
+          </w:tcPr>
+          <w:p>
+            <w:pPr>
+              <w:spacing w:after="60"/>
+            </w:pPr>
+            <w:r>
+              <w:rPr>
+                <w:b/>
+                <w:sz w:val="18"/>
+              </w:rPr>
+              <w:t>Cần đạt / cần ghi nhận</w:t>
+            </w:r>
+          </w:p>
+        </w:tc>
+        <w:tc>
+          <w:tcPr>
+            <w:tcW w:type="dxa" w:w="2409"/>
+          </w:tcPr>
+          <w:p>
+            <w:pPr>
+              <w:spacing w:after="60"/>
+            </w:pPr>
+            <w:r>
+              <w:rPr>
+                <w:b/>
+                <w:sz w:val="18"/>
+              </w:rPr>
+              <w:t>Kết quả thực tế</w:t>
+            </w:r>
+          </w:p>
+        </w:tc>
+      </w:tr>
+      <w:tr>
+        <w:tc>
+          <w:tcPr>
+            <w:tcW w:type="dxa" w:w="2409"/>
+          </w:tcPr>
+          <w:p>
+            <w:pPr>
+              <w:spacing w:after="60"/>
+            </w:pPr>
+            <w:r>
+              <w:rPr>
+                <w:b w:val="0"/>
+                <w:sz w:val="18"/>
+              </w:rPr>
+              <w:t>W01</w:t>
+            </w:r>
+          </w:p>
+        </w:tc>
+        <w:tc>
+          <w:tcPr>
+            <w:tcW w:type="dxa" w:w="2409"/>
+          </w:tcPr>
+          <w:p>
+            <w:pPr>
+              <w:spacing w:after="60"/>
+            </w:pPr>
+            <w:r>
+              <w:rPr>
+                <w:b w:val="0"/>
+                <w:sz w:val="18"/>
+              </w:rPr>
+              <w:t>Sau boot, thả hết rồi giữ +/− đúng 5 giây</w:t>
+            </w:r>
+          </w:p>
+        </w:tc>
+        <w:tc>
+          <w:tcPr>
+            <w:tcW w:type="dxa" w:w="2409"/>
+          </w:tcPr>
+          <w:p>
+            <w:pPr>
+              <w:spacing w:after="60"/>
+            </w:pPr>
+            <w:r>
+              <w:rPr>
+                <w:b w:val="0"/>
+                <w:sz w:val="18"/>
+              </w:rPr>
+              <w:t>AP không mật khẩu mở, vào http://192.168.4.1; giữ đèn/favorites/kế hoạch/tên, chỉ xóa WiFi</w:t>
+            </w:r>
+          </w:p>
+        </w:tc>
+        <w:tc>
+          <w:tcPr>
+            <w:tcW w:type="dxa" w:w="2409"/>
+          </w:tcPr>
+          <w:p>
+            <w:pPr>
+              <w:spacing w:after="60"/>
+            </w:pPr>
+            <w:r>
+              <w:rPr>
+                <w:b w:val="0"/>
+                <w:sz w:val="18"/>
+              </w:rPr>
+              <w:t>Chưa xác nhận</w:t>
+            </w:r>
+          </w:p>
+        </w:tc>
+      </w:tr>
+      <w:tr>
+        <w:tc>
+          <w:tcPr>
+            <w:tcW w:type="dxa" w:w="2409"/>
+          </w:tcPr>
+          <w:p>
+            <w:pPr>
+              <w:spacing w:after="60"/>
+            </w:pPr>
+            <w:r>
+              <w:rPr>
+                <w:b w:val="0"/>
+                <w:sz w:val="18"/>
+              </w:rPr>
+              <w:t>W02</w:t>
+            </w:r>
+          </w:p>
+        </w:tc>
+        <w:tc>
+          <w:tcPr>
+            <w:tcW w:type="dxa" w:w="2409"/>
+          </w:tcPr>
+          <w:p>
+            <w:pPr>
+              <w:spacing w:after="60"/>
+            </w:pPr>
+            <w:r>
+              <w:rPr>
+                <w:b w:val="0"/>
+                <w:sz w:val="18"/>
+              </w:rPr>
+              <w:t>USB Windows với Erase All Flash Disabled, đúng core/lib/phân vùng và một nguồn USB</w:t>
+            </w:r>
+          </w:p>
+        </w:tc>
+        <w:tc>
+          <w:tcPr>
+            <w:tcW w:type="dxa" w:w="2409"/>
+          </w:tcPr>
+          <w:p>
+            <w:pPr>
+              <w:spacing w:after="60"/>
+            </w:pPr>
+            <w:r>
+              <w:rPr>
+                <w:b w:val="0"/>
+                <w:sz w:val="18"/>
+              </w:rPr>
+              <w:t>Upload 1.3.1 thành công; cấu hình NVS, favorites/kế hoạch/tên giữ; không dùng nguồn 5 V ngoài song song PC</w:t>
+            </w:r>
+          </w:p>
+        </w:tc>
+        <w:tc>
+          <w:tcPr>
+            <w:tcW w:type="dxa" w:w="2409"/>
+          </w:tcPr>
+          <w:p>
+            <w:pPr>
+              <w:spacing w:after="60"/>
+            </w:pPr>
+            <w:r>
+              <w:rPr>
+                <w:b w:val="0"/>
+                <w:sz w:val="18"/>
+              </w:rPr>
+              <w:t>Chưa thử 1.3.1</w:t>
+            </w:r>
+          </w:p>
+        </w:tc>
+      </w:tr>
+      <w:tr>
+        <w:tc>
+          <w:tcPr>
+            <w:tcW w:type="dxa" w:w="2409"/>
+          </w:tcPr>
+          <w:p>
+            <w:pPr>
+              <w:spacing w:after="60"/>
+            </w:pPr>
+            <w:r>
+              <w:rPr>
+                <w:b w:val="0"/>
+                <w:sz w:val="18"/>
+              </w:rPr>
+              <w:t>W03</w:t>
+            </w:r>
+          </w:p>
+        </w:tc>
+        <w:tc>
+          <w:tcPr>
+            <w:tcW w:type="dxa" w:w="2409"/>
+          </w:tcPr>
+          <w:p>
+            <w:pPr>
+              <w:spacing w:after="60"/>
+            </w:pPr>
+            <w:r>
+              <w:rPr>
+                <w:b w:val="0"/>
+                <w:sz w:val="18"/>
+              </w:rPr>
+              <w:t>Boot và thu Serial 115200 ít nhất 30 giây</w:t>
+            </w:r>
+          </w:p>
+        </w:tc>
+        <w:tc>
+          <w:tcPr>
+            <w:tcW w:type="dxa" w:w="2409"/>
+          </w:tcPr>
+          <w:p>
+            <w:pPr>
+              <w:spacing w:after="60"/>
+            </w:pPr>
+            <w:r>
+              <w:rPr>
+                <w:b w:val="0"/>
+                <w:sz w:val="18"/>
+              </w:rPr>
+              <w:t>Thấy phiên bản/lý do reset, log mạng khoảng 10 giây; IP/hostname/trạng thái thực đối chiếu được</w:t>
+            </w:r>
+          </w:p>
+        </w:tc>
+        <w:tc>
+          <w:tcPr>
+            <w:tcW w:type="dxa" w:w="2409"/>
+          </w:tcPr>
+          <w:p>
+            <w:pPr>
+              <w:spacing w:after="60"/>
+            </w:pPr>
+            <w:r>
+              <w:rPr>
+                <w:b w:val="0"/>
+                <w:sz w:val="18"/>
+              </w:rPr>
+              <w:t>Chưa thử 1.3.1</w:t>
+            </w:r>
+          </w:p>
+        </w:tc>
+      </w:tr>
+      <w:tr>
+        <w:tc>
+          <w:tcPr>
+            <w:tcW w:type="dxa" w:w="2409"/>
+          </w:tcPr>
+          <w:p>
+            <w:pPr>
+              <w:spacing w:after="60"/>
+            </w:pPr>
+            <w:r>
+              <w:rPr>
+                <w:b w:val="0"/>
+                <w:sz w:val="18"/>
+              </w:rPr>
+              <w:t>W04</w:t>
+            </w:r>
+          </w:p>
+        </w:tc>
+        <w:tc>
+          <w:tcPr>
+            <w:tcW w:type="dxa" w:w="2409"/>
+          </w:tcPr>
+          <w:p>
+            <w:pPr>
+              <w:spacing w:after="60"/>
+            </w:pPr>
+            <w:r>
+              <w:rPr>
+                <w:b w:val="0"/>
+                <w:sz w:val="18"/>
+              </w:rPr>
+              <w:t>Mạng nhà ngắt/khôi phục; nếu AUTH_EXPIRE tái hiện, ghi reason/status/association</w:t>
+            </w:r>
+          </w:p>
+        </w:tc>
+        <w:tc>
+          <w:tcPr>
+            <w:tcW w:type="dxa" w:w="2409"/>
+          </w:tcPr>
+          <w:p>
+            <w:pPr>
+              <w:spacing w:after="60"/>
+            </w:pPr>
+            <w:r>
+              <w:rPr>
+                <w:b w:val="0"/>
+                <w:sz w:val="18"/>
+              </w:rPr>
+              <w:t>Đèn nhận offline thật dù cache còn connected; thử lại và mở AP đúng hạn; không kẹt chờ cache</w:t>
+            </w:r>
+          </w:p>
+        </w:tc>
+        <w:tc>
+          <w:tcPr>
+            <w:tcW w:type="dxa" w:w="2409"/>
+          </w:tcPr>
+          <w:p>
+            <w:pPr>
+              <w:spacing w:after="60"/>
+            </w:pPr>
+            <w:r>
+              <w:rPr>
+                <w:b w:val="0"/>
+                <w:sz w:val="18"/>
+              </w:rPr>
+              <w:t>Chưa thử 1.3.1</w:t>
+            </w:r>
+          </w:p>
+        </w:tc>
+      </w:tr>
+      <w:tr>
+        <w:tc>
+          <w:tcPr>
+            <w:tcW w:type="dxa" w:w="2409"/>
+          </w:tcPr>
+          <w:p>
+            <w:pPr>
+              <w:spacing w:after="60"/>
+            </w:pPr>
+            <w:r>
+              <w:rPr>
+                <w:b w:val="0"/>
+                <w:sz w:val="18"/>
+              </w:rPr>
+              <w:t>W05</w:t>
+            </w:r>
+          </w:p>
+        </w:tc>
+        <w:tc>
+          <w:tcPr>
+            <w:tcW w:type="dxa" w:w="2409"/>
+          </w:tcPr>
+          <w:p>
+            <w:pPr>
+              <w:spacing w:after="60"/>
+            </w:pPr>
+            <w:r>
+              <w:rPr>
+                <w:b w:val="0"/>
+                <w:sz w:val="18"/>
+              </w:rPr>
+              <w:t>Router còn DHCP lease nhưng đèn không liên kết</w:t>
+            </w:r>
+          </w:p>
+        </w:tc>
+        <w:tc>
+          <w:tcPr>
+            <w:tcW w:type="dxa" w:w="2409"/>
+          </w:tcPr>
+          <w:p>
+            <w:pPr>
+              <w:spacing w:after="60"/>
+            </w:pPr>
+            <w:r>
+              <w:rPr>
+                <w:b w:val="0"/>
+                <w:sz w:val="18"/>
+              </w:rPr>
+              <w:t>Không báo online chỉ vì IP/status cũ; AP dùng được khi mất mạng đủ thời gian</w:t>
+            </w:r>
+          </w:p>
+        </w:tc>
+        <w:tc>
+          <w:tcPr>
+            <w:tcW w:type="dxa" w:w="2409"/>
+          </w:tcPr>
+          <w:p>
+            <w:pPr>
+              <w:spacing w:after="60"/>
+            </w:pPr>
+            <w:r>
+              <w:rPr>
+                <w:b w:val="0"/>
+                <w:sz w:val="18"/>
+              </w:rPr>
+              <w:t>Chưa thử 1.3.1</w:t>
+            </w:r>
+          </w:p>
+        </w:tc>
+      </w:tr>
+      <w:tr>
+        <w:tc>
+          <w:tcPr>
+            <w:tcW w:type="dxa" w:w="2409"/>
+          </w:tcPr>
+          <w:p>
+            <w:pPr>
+              <w:spacing w:after="60"/>
+            </w:pPr>
+            <w:r>
+              <w:rPr>
+                <w:b w:val="0"/>
+                <w:sz w:val="18"/>
+              </w:rPr>
+              <w:t>W06</w:t>
+            </w:r>
+          </w:p>
+        </w:tc>
+        <w:tc>
+          <w:tcPr>
+            <w:tcW w:type="dxa" w:w="2409"/>
+          </w:tcPr>
+          <w:p>
+            <w:pPr>
+              <w:spacing w:after="60"/>
+            </w:pPr>
+            <w:r>
+              <w:rPr>
+                <w:b w:val="0"/>
+                <w:sz w:val="18"/>
+              </w:rPr>
+              <w:t>Kết nối nhà phục hồi, dùng IP hiện tại và .local</w:t>
+            </w:r>
+          </w:p>
+        </w:tc>
+        <w:tc>
+          <w:tcPr>
+            <w:tcW w:type="dxa" w:w="2409"/>
+          </w:tcPr>
+          <w:p>
+            <w:pPr>
+              <w:spacing w:after="60"/>
+            </w:pPr>
+            <w:r>
+              <w:rPr>
+                <w:b w:val="0"/>
+                <w:sz w:val="18"/>
+              </w:rPr>
+              <w:t>IP/web mở, AP tắt khi online thật; mDNS giữ thuật toán, không nhầm lease cũ với IP đang dùng</w:t>
+            </w:r>
+          </w:p>
+        </w:tc>
+        <w:tc>
+          <w:tcPr>
+            <w:tcW w:type="dxa" w:w="2409"/>
+          </w:tcPr>
+          <w:p>
+            <w:pPr>
+              <w:spacing w:after="60"/>
+            </w:pPr>
+            <w:r>
+              <w:rPr>
+                <w:b w:val="0"/>
+                <w:sz w:val="18"/>
+              </w:rPr>
+              <w:t>Chưa thử 1.3.1</w:t>
+            </w:r>
+          </w:p>
+        </w:tc>
+      </w:tr>
+      <w:tr>
+        <w:tc>
+          <w:tcPr>
+            <w:tcW w:type="dxa" w:w="2409"/>
+          </w:tcPr>
+          <w:p>
+            <w:pPr>
+              <w:spacing w:after="60"/>
+            </w:pPr>
+            <w:r>
+              <w:rPr>
+                <w:b w:val="0"/>
+                <w:sz w:val="18"/>
+              </w:rPr>
+              <w:t>W07</w:t>
+            </w:r>
+          </w:p>
+        </w:tc>
+        <w:tc>
+          <w:tcPr>
+            <w:tcW w:type="dxa" w:w="2409"/>
+          </w:tcPr>
+          <w:p>
+            <w:pPr>
+              <w:spacing w:after="60"/>
+            </w:pPr>
+            <w:r>
+              <w:rPr>
+                <w:b w:val="0"/>
+                <w:sz w:val="18"/>
+              </w:rPr>
+              <w:t>Chẩn đoán/copy và giao diện lúc mạng ổn/lỗi</w:t>
+            </w:r>
+          </w:p>
+        </w:tc>
+        <w:tc>
+          <w:tcPr>
+            <w:tcW w:type="dxa" w:w="2409"/>
+          </w:tcPr>
+          <w:p>
+            <w:pPr>
+              <w:spacing w:after="60"/>
+            </w:pPr>
+            <w:r>
+              <w:rPr>
+                <w:b w:val="0"/>
+                <w:sz w:val="18"/>
+              </w:rPr>
+              <w:t>WiFi/resources/plan save đúng; bản sao không có session token; thông báo/online đúng, không phát lại POST cũ</w:t>
+            </w:r>
+          </w:p>
+        </w:tc>
+        <w:tc>
+          <w:tcPr>
+            <w:tcW w:type="dxa" w:w="2409"/>
+          </w:tcPr>
+          <w:p>
+            <w:pPr>
+              <w:spacing w:after="60"/>
+            </w:pPr>
+            <w:r>
+              <w:rPr>
+                <w:b w:val="0"/>
+                <w:sz w:val="18"/>
+              </w:rPr>
+              <w:t>Chưa thử 1.3.1</w:t>
+            </w:r>
+          </w:p>
+        </w:tc>
+      </w:tr>
+      <w:tr>
+        <w:tc>
+          <w:tcPr>
+            <w:tcW w:type="dxa" w:w="2409"/>
+          </w:tcPr>
+          <w:p>
+            <w:pPr>
+              <w:spacing w:after="60"/>
+            </w:pPr>
+            <w:r>
+              <w:rPr>
+                <w:b w:val="0"/>
+                <w:sz w:val="18"/>
+              </w:rPr>
+              <w:t>W08</w:t>
+            </w:r>
+          </w:p>
+        </w:tc>
+        <w:tc>
+          <w:tcPr>
+            <w:tcW w:type="dxa" w:w="2409"/>
+          </w:tcPr>
+          <w:p>
+            <w:pPr>
+              <w:spacing w:after="60"/>
+            </w:pPr>
+            <w:r>
+              <w:rPr>
+                <w:b w:val="0"/>
+                <w:sz w:val="18"/>
+              </w:rPr>
+              <w:t>Bật/tắt/cảm ứng, 14 mode/favorites và kế hoạch sau phục hồi</w:t>
+            </w:r>
+          </w:p>
+        </w:tc>
+        <w:tc>
+          <w:tcPr>
+            <w:tcW w:type="dxa" w:w="2409"/>
+          </w:tcPr>
+          <w:p>
+            <w:pPr>
+              <w:spacing w:after="60"/>
+            </w:pPr>
+            <w:r>
+              <w:rPr>
+                <w:b w:val="0"/>
+                <w:sz w:val="18"/>
+              </w:rPr>
+              <w:t>Ánh sáng/config/lịch/TP.HCM giữ; SNTP chờ/holdover/no catch-up theo quy tắc đã có</w:t>
+            </w:r>
+          </w:p>
+        </w:tc>
+        <w:tc>
+          <w:tcPr>
+            <w:tcW w:type="dxa" w:w="2409"/>
+          </w:tcPr>
+          <w:p>
+            <w:pPr>
+              <w:spacing w:after="60"/>
+            </w:pPr>
+            <w:r>
+              <w:rPr>
+                <w:b w:val="0"/>
+                <w:sz w:val="18"/>
+              </w:rPr>
+              <w:t>Chưa thử 1.3.1</w:t>
+            </w:r>
+          </w:p>
+        </w:tc>
+      </w:tr>
+      <w:tr>
+        <w:tc>
+          <w:tcPr>
+            <w:tcW w:type="dxa" w:w="2409"/>
+          </w:tcPr>
+          <w:p>
+            <w:pPr>
+              <w:spacing w:after="60"/>
+            </w:pPr>
+            <w:r>
+              <w:rPr>
+                <w:b w:val="0"/>
+                <w:sz w:val="18"/>
+              </w:rPr>
+              <w:t>W09</w:t>
+            </w:r>
+          </w:p>
+        </w:tc>
+        <w:tc>
+          <w:tcPr>
+            <w:tcW w:type="dxa" w:w="2409"/>
+          </w:tcPr>
+          <w:p>
+            <w:pPr>
+              <w:spacing w:after="60"/>
+            </w:pPr>
+            <w:r>
+              <w:rPr>
+                <w:b w:val="0"/>
+                <w:sz w:val="18"/>
+              </w:rPr>
+              <w:t>Lưu lại lịch mặt trời không đổi một lần, chờ GET cập nhật</w:t>
+            </w:r>
+          </w:p>
+        </w:tc>
+        <w:tc>
+          <w:tcPr>
+            <w:tcW w:type="dxa" w:w="2409"/>
+          </w:tcPr>
+          <w:p>
+            <w:pPr>
+              <w:spacing w:after="60"/>
+            </w:pPr>
+            <w:r>
+              <w:rPr>
+                <w:b w:val="0"/>
+                <w:sz w:val="18"/>
+              </w:rPr>
+              <w:t>ACK/storage đúng, HTTP/IP vẫn truy cập; copy checkpoint/flags/RAM/mạng làm mẫu đối chiếu</w:t>
+            </w:r>
+          </w:p>
+        </w:tc>
+        <w:tc>
+          <w:tcPr>
+            <w:tcW w:type="dxa" w:w="2409"/>
+          </w:tcPr>
+          <w:p>
+            <w:pPr>
+              <w:spacing w:after="60"/>
+            </w:pPr>
+            <w:r>
+              <w:rPr>
+                <w:b w:val="0"/>
+                <w:sz w:val="18"/>
+              </w:rPr>
+              <w:t>Chưa thử 1.3.1</w:t>
+            </w:r>
+          </w:p>
+        </w:tc>
+      </w:tr>
+      <w:tr>
+        <w:tc>
+          <w:tcPr>
+            <w:tcW w:type="dxa" w:w="2409"/>
+          </w:tcPr>
+          <w:p>
+            <w:pPr>
+              <w:spacing w:after="60"/>
+            </w:pPr>
+            <w:r>
+              <w:rPr>
+                <w:b w:val="0"/>
+                <w:sz w:val="18"/>
+              </w:rPr>
+              <w:t>W10</w:t>
+            </w:r>
+          </w:p>
+        </w:tc>
+        <w:tc>
+          <w:tcPr>
+            <w:tcW w:type="dxa" w:w="2409"/>
+          </w:tcPr>
+          <w:p>
+            <w:pPr>
+              <w:spacing w:after="60"/>
+            </w:pPr>
+            <w:r>
+              <w:rPr>
+                <w:b w:val="0"/>
+                <w:sz w:val="18"/>
+              </w:rPr>
+              <w:t>Sửa một giá trị lịch mặt trời, lưu một lần rồi đọc/copy sau phản hồi hoặc phục hồi</w:t>
+            </w:r>
+          </w:p>
+        </w:tc>
+        <w:tc>
+          <w:tcPr>
+            <w:tcW w:type="dxa" w:w="2409"/>
+          </w:tcPr>
+          <w:p>
+            <w:pPr>
+              <w:spacing w:after="60"/>
+            </w:pPr>
+            <w:r>
+              <w:rPr>
+                <w:b w:val="0"/>
+                <w:sz w:val="18"/>
+              </w:rPr>
+              <w:t>ACK và dữ liệu đúng, HTTP/IP vẫn dùng; ghi checkpoint/thời điểm/lý do ngắt nếu lỗi; copy trước reset, so sánh W09</w:t>
+            </w:r>
+          </w:p>
+        </w:tc>
+        <w:tc>
+          <w:tcPr>
+            <w:tcW w:type="dxa" w:w="2409"/>
+          </w:tcPr>
+          <w:p>
+            <w:pPr>
+              <w:spacing w:after="60"/>
+            </w:pPr>
+            <w:r>
+              <w:rPr>
+                <w:b w:val="0"/>
+                <w:sz w:val="18"/>
+              </w:rPr>
+              <w:t>Chưa thử 1.3.1</w:t>
+            </w:r>
+          </w:p>
+        </w:tc>
+      </w:tr>
+    </w:tbl>
+    <w:p/>
+    <w:p>
+      <w:r>
+        <w:t>Nếu W01 vẫn không có AP, dùng nạp USB theo mục 11 của HUONG_DAN.md; không cần web để nạp sketch. Khi thu log chỉ cấp một nguồn USB. Kết quả router/AP/HTTP/SNTP phải ghi riêng với kết quả build hoặc test trên host.</w:t>
       </w:r>
     </w:p>
     <w:p>
@@ -9181,7 +10996,7 @@
     </w:p>
     <w:p>
       <w:r>
-        <w:t>Người dùng đã lắp và thử 1.2.0, có phản hồi chuyển màu/Lấp lánh; bảng nền chưa có kết quả từng ca để đánh dấu Đạt. Bản 1.3.0 ưu tiên A01–A12 trên ESP/router thật, đồng thời giữ F01–F04 để ghi kết quả ánh sáng khi thử lại.</w:t>
+        <w:t>Người dùng đã nạp 1.3.0 và báo mất truy cập sau khi thay đổi/lưu lịch mặt trời, còn lần lưu không đổi vẫn dùng được; bảng nền chưa có kết quả từng ca để đánh dấu Đạt. Bản 1.3.1 ưu tiên W01–W10 trên bộ đèn đó, đồng thời giữ A01–A12 và F01–F04 để ghi kết quả lịch/ánh sáng khi thử lại.</w:t>
       </w:r>
     </w:p>
     <w:sectPr>
@@ -9218,7 +11033,7 @@
       <w:pStyle w:val="Caption"/>
     </w:pPr>
     <w:r>
-      <w:t>ĐÈN DECO  |  ESP32-C3  |  FIRMWARE 1.3.0</w:t>
+      <w:t>ĐÈN DECO  |  ESP32-C3  |  FIRMWARE 1.3.1</w:t>
     </w:r>
   </w:p>
 </w:hdr>

</xml_diff>